<commit_message>
Add Group Orientation Scale (Kuppens et al., 2026) to full and short questionnaires
Co-Authored-By: Claude Sonnet 5.5 <noreply@anthropic.com>
Claude-Session: https://claude.ai/code/session_0117HPg2G3CcnRnb2QXnVBy9
</commit_message>
<xml_diff>
--- a/questionnaire-v3-short-en.docx
+++ b/questionnaire-v3-short-en.docx
@@ -188,7 +188,7 @@
           <w:szCs w:val="22"/>
           <w:rtl w:val="false"/>
         </w:rPr>
-        <w:t xml:space="preserve">Dear auditor, you are invited to take part in an academic study of working conditions in independent audit teams. The questionnaire asks about your experience in an audit team, your job conditions, personal characteristics and some behaviours related to audit performance. It takes about [18–21] minutes. Results are used for scientific purposes only; individual responses or identifiable team results are not shared with the audit firm, the team supervisor or the client. Throughout the questionnaire, "the reference engagement" means the financial-statement audit engagement whose team code is shown on this form. When answering questions about the team and the engagement, please consider only that engagement.</w:t>
+        <w:t xml:space="preserve">Dear auditor, you are invited to take part in an academic study of working conditions in independent audit teams. The questionnaire asks about your experience in an audit team, your job conditions, personal characteristics and some behaviours related to audit performance. It takes about [19–22] minutes. Results are used for scientific purposes only; individual responses or identifiable team results are not shared with the audit firm, the team supervisor or the client. Throughout the questionnaire, "the reference engagement" means the financial-statement audit engagement whose team code is shown on this form. When answering questions about the team and the engagement, please consider only that engagement.</w:t>
       </w:r>
     </w:p>
     <w:p>
@@ -35495,6 +35495,2945 @@
     </w:p>
     <w:p>
       <w:pPr>
+        <w:spacing w:after="80"/>
+      </w:pPr>
+    </w:p>
+    <w:p>
+      <w:pPr>
+        <w:bidi w:val="false"/>
+        <w:spacing w:after="100" w:line="300"/>
+      </w:pPr>
+      <w:r>
+        <w:rPr>
+          <w:rFonts w:ascii="Arial" w:cs="Arial" w:eastAsia="Arial" w:hAnsi="Arial"/>
+          <w:sz w:val="20"/>
+          <w:szCs w:val="20"/>
+          <w:rtl w:val="false"/>
+        </w:rPr>
+        <w:t xml:space="preserve">Orientation toward groups (a general scale about you, not about this team). −3 = Strongly disagree … 0 = Neither agree nor disagree … +3 = Strongly agree</w:t>
+      </w:r>
+    </w:p>
+    <w:tbl>
+      <w:tblPr>
+        <w:bidiVisual w:val="false"/>
+        <w:tblW w:type="dxa" w:w="9500"/>
+        <w:tblBorders>
+          <w:top w:val="single" w:color="auto" w:sz="4"/>
+          <w:left w:val="single" w:color="auto" w:sz="4"/>
+          <w:bottom w:val="single" w:color="auto" w:sz="4"/>
+          <w:right w:val="single" w:color="auto" w:sz="4"/>
+          <w:insideH w:val="single" w:color="auto" w:sz="4"/>
+          <w:insideV w:val="single" w:color="auto" w:sz="4"/>
+        </w:tblBorders>
+      </w:tblPr>
+      <w:tblGrid>
+        <w:gridCol w:w="650"/>
+        <w:gridCol w:w="4930"/>
+        <w:gridCol w:w="560"/>
+        <w:gridCol w:w="560"/>
+        <w:gridCol w:w="560"/>
+        <w:gridCol w:w="560"/>
+        <w:gridCol w:w="560"/>
+        <w:gridCol w:w="560"/>
+        <w:gridCol w:w="560"/>
+      </w:tblGrid>
+      <w:tr>
+        <w:trPr>
+          <w:cantSplit/>
+          <w:tblHeader/>
+        </w:trPr>
+        <w:tc>
+          <w:tcPr>
+            <w:tcW w:type="dxa" w:w="650"/>
+            <w:tcBorders>
+              <w:top w:val="single" w:color="A6A6A6" w:sz="4"/>
+              <w:left w:val="single" w:color="A6A6A6" w:sz="4"/>
+              <w:bottom w:val="single" w:color="A6A6A6" w:sz="4"/>
+              <w:right w:val="single" w:color="A6A6A6" w:sz="4"/>
+            </w:tcBorders>
+            <w:shd w:fill="D9E2F3" w:color="auto" w:val="clear"/>
+            <w:tcMar>
+              <w:top w:type="dxa" w:w="50"/>
+              <w:left w:type="dxa" w:w="60"/>
+              <w:bottom w:type="dxa" w:w="50"/>
+              <w:right w:type="dxa" w:w="60"/>
+            </w:tcMar>
+          </w:tcPr>
+          <w:p>
+            <w:pPr>
+              <w:bidi w:val="false"/>
+              <w:spacing w:after="0" w:line="260"/>
+              <w:jc w:val="center"/>
+            </w:pPr>
+            <w:r>
+              <w:rPr>
+                <w:rFonts w:ascii="Arial" w:cs="Arial" w:eastAsia="Arial" w:hAnsi="Arial"/>
+                <w:b/>
+                <w:bCs/>
+                <w:sz w:val="19"/>
+                <w:szCs w:val="19"/>
+                <w:rtl w:val="false"/>
+              </w:rPr>
+              <w:t xml:space="preserve"/>
+            </w:r>
+          </w:p>
+        </w:tc>
+        <w:tc>
+          <w:tcPr>
+            <w:tcW w:type="dxa" w:w="4930"/>
+            <w:tcBorders>
+              <w:top w:val="single" w:color="A6A6A6" w:sz="4"/>
+              <w:left w:val="single" w:color="A6A6A6" w:sz="4"/>
+              <w:bottom w:val="single" w:color="A6A6A6" w:sz="4"/>
+              <w:right w:val="single" w:color="A6A6A6" w:sz="4"/>
+            </w:tcBorders>
+            <w:shd w:fill="D9E2F3" w:color="auto" w:val="clear"/>
+            <w:tcMar>
+              <w:top w:type="dxa" w:w="50"/>
+              <w:left w:type="dxa" w:w="60"/>
+              <w:bottom w:type="dxa" w:w="50"/>
+              <w:right w:type="dxa" w:w="60"/>
+            </w:tcMar>
+          </w:tcPr>
+          <w:p>
+            <w:pPr>
+              <w:bidi w:val="false"/>
+              <w:spacing w:after="0" w:line="260"/>
+            </w:pPr>
+            <w:r>
+              <w:rPr>
+                <w:rFonts w:ascii="Arial" w:cs="Arial" w:eastAsia="Arial" w:hAnsi="Arial"/>
+                <w:b/>
+                <w:bCs/>
+                <w:sz w:val="19"/>
+                <w:szCs w:val="19"/>
+                <w:rtl w:val="false"/>
+              </w:rPr>
+              <w:t xml:space="preserve">Statement</w:t>
+            </w:r>
+          </w:p>
+        </w:tc>
+        <w:tc>
+          <w:tcPr>
+            <w:tcW w:type="dxa" w:w="560"/>
+            <w:tcBorders>
+              <w:top w:val="single" w:color="A6A6A6" w:sz="4"/>
+              <w:left w:val="single" w:color="A6A6A6" w:sz="4"/>
+              <w:bottom w:val="single" w:color="A6A6A6" w:sz="4"/>
+              <w:right w:val="single" w:color="A6A6A6" w:sz="4"/>
+            </w:tcBorders>
+            <w:shd w:fill="D9E2F3" w:color="auto" w:val="clear"/>
+            <w:tcMar>
+              <w:top w:type="dxa" w:w="50"/>
+              <w:left w:type="dxa" w:w="60"/>
+              <w:bottom w:type="dxa" w:w="50"/>
+              <w:right w:type="dxa" w:w="60"/>
+            </w:tcMar>
+          </w:tcPr>
+          <w:p>
+            <w:pPr>
+              <w:bidi w:val="false"/>
+              <w:spacing w:after="0" w:line="260"/>
+              <w:jc w:val="center"/>
+            </w:pPr>
+            <w:r>
+              <w:rPr>
+                <w:rFonts w:ascii="Arial" w:cs="Arial" w:eastAsia="Arial" w:hAnsi="Arial"/>
+                <w:b/>
+                <w:bCs/>
+                <w:sz w:val="15"/>
+                <w:szCs w:val="15"/>
+                <w:rtl w:val="false"/>
+              </w:rPr>
+              <w:t xml:space="preserve">-3</w:t>
+            </w:r>
+          </w:p>
+        </w:tc>
+        <w:tc>
+          <w:tcPr>
+            <w:tcW w:type="dxa" w:w="560"/>
+            <w:tcBorders>
+              <w:top w:val="single" w:color="A6A6A6" w:sz="4"/>
+              <w:left w:val="single" w:color="A6A6A6" w:sz="4"/>
+              <w:bottom w:val="single" w:color="A6A6A6" w:sz="4"/>
+              <w:right w:val="single" w:color="A6A6A6" w:sz="4"/>
+            </w:tcBorders>
+            <w:shd w:fill="D9E2F3" w:color="auto" w:val="clear"/>
+            <w:tcMar>
+              <w:top w:type="dxa" w:w="50"/>
+              <w:left w:type="dxa" w:w="60"/>
+              <w:bottom w:type="dxa" w:w="50"/>
+              <w:right w:type="dxa" w:w="60"/>
+            </w:tcMar>
+          </w:tcPr>
+          <w:p>
+            <w:pPr>
+              <w:bidi w:val="false"/>
+              <w:spacing w:after="0" w:line="260"/>
+              <w:jc w:val="center"/>
+            </w:pPr>
+            <w:r>
+              <w:rPr>
+                <w:rFonts w:ascii="Arial" w:cs="Arial" w:eastAsia="Arial" w:hAnsi="Arial"/>
+                <w:b/>
+                <w:bCs/>
+                <w:sz w:val="15"/>
+                <w:szCs w:val="15"/>
+                <w:rtl w:val="false"/>
+              </w:rPr>
+              <w:t xml:space="preserve">-2</w:t>
+            </w:r>
+          </w:p>
+        </w:tc>
+        <w:tc>
+          <w:tcPr>
+            <w:tcW w:type="dxa" w:w="560"/>
+            <w:tcBorders>
+              <w:top w:val="single" w:color="A6A6A6" w:sz="4"/>
+              <w:left w:val="single" w:color="A6A6A6" w:sz="4"/>
+              <w:bottom w:val="single" w:color="A6A6A6" w:sz="4"/>
+              <w:right w:val="single" w:color="A6A6A6" w:sz="4"/>
+            </w:tcBorders>
+            <w:shd w:fill="D9E2F3" w:color="auto" w:val="clear"/>
+            <w:tcMar>
+              <w:top w:type="dxa" w:w="50"/>
+              <w:left w:type="dxa" w:w="60"/>
+              <w:bottom w:type="dxa" w:w="50"/>
+              <w:right w:type="dxa" w:w="60"/>
+            </w:tcMar>
+          </w:tcPr>
+          <w:p>
+            <w:pPr>
+              <w:bidi w:val="false"/>
+              <w:spacing w:after="0" w:line="260"/>
+              <w:jc w:val="center"/>
+            </w:pPr>
+            <w:r>
+              <w:rPr>
+                <w:rFonts w:ascii="Arial" w:cs="Arial" w:eastAsia="Arial" w:hAnsi="Arial"/>
+                <w:b/>
+                <w:bCs/>
+                <w:sz w:val="15"/>
+                <w:szCs w:val="15"/>
+                <w:rtl w:val="false"/>
+              </w:rPr>
+              <w:t xml:space="preserve">-1</w:t>
+            </w:r>
+          </w:p>
+        </w:tc>
+        <w:tc>
+          <w:tcPr>
+            <w:tcW w:type="dxa" w:w="560"/>
+            <w:tcBorders>
+              <w:top w:val="single" w:color="A6A6A6" w:sz="4"/>
+              <w:left w:val="single" w:color="A6A6A6" w:sz="4"/>
+              <w:bottom w:val="single" w:color="A6A6A6" w:sz="4"/>
+              <w:right w:val="single" w:color="A6A6A6" w:sz="4"/>
+            </w:tcBorders>
+            <w:shd w:fill="D9E2F3" w:color="auto" w:val="clear"/>
+            <w:tcMar>
+              <w:top w:type="dxa" w:w="50"/>
+              <w:left w:type="dxa" w:w="60"/>
+              <w:bottom w:type="dxa" w:w="50"/>
+              <w:right w:type="dxa" w:w="60"/>
+            </w:tcMar>
+          </w:tcPr>
+          <w:p>
+            <w:pPr>
+              <w:bidi w:val="false"/>
+              <w:spacing w:after="0" w:line="260"/>
+              <w:jc w:val="center"/>
+            </w:pPr>
+            <w:r>
+              <w:rPr>
+                <w:rFonts w:ascii="Arial" w:cs="Arial" w:eastAsia="Arial" w:hAnsi="Arial"/>
+                <w:b/>
+                <w:bCs/>
+                <w:sz w:val="15"/>
+                <w:szCs w:val="15"/>
+                <w:rtl w:val="false"/>
+              </w:rPr>
+              <w:t xml:space="preserve">0</w:t>
+            </w:r>
+          </w:p>
+        </w:tc>
+        <w:tc>
+          <w:tcPr>
+            <w:tcW w:type="dxa" w:w="560"/>
+            <w:tcBorders>
+              <w:top w:val="single" w:color="A6A6A6" w:sz="4"/>
+              <w:left w:val="single" w:color="A6A6A6" w:sz="4"/>
+              <w:bottom w:val="single" w:color="A6A6A6" w:sz="4"/>
+              <w:right w:val="single" w:color="A6A6A6" w:sz="4"/>
+            </w:tcBorders>
+            <w:shd w:fill="D9E2F3" w:color="auto" w:val="clear"/>
+            <w:tcMar>
+              <w:top w:type="dxa" w:w="50"/>
+              <w:left w:type="dxa" w:w="60"/>
+              <w:bottom w:type="dxa" w:w="50"/>
+              <w:right w:type="dxa" w:w="60"/>
+            </w:tcMar>
+          </w:tcPr>
+          <w:p>
+            <w:pPr>
+              <w:bidi w:val="false"/>
+              <w:spacing w:after="0" w:line="260"/>
+              <w:jc w:val="center"/>
+            </w:pPr>
+            <w:r>
+              <w:rPr>
+                <w:rFonts w:ascii="Arial" w:cs="Arial" w:eastAsia="Arial" w:hAnsi="Arial"/>
+                <w:b/>
+                <w:bCs/>
+                <w:sz w:val="15"/>
+                <w:szCs w:val="15"/>
+                <w:rtl w:val="false"/>
+              </w:rPr>
+              <w:t xml:space="preserve">+1</w:t>
+            </w:r>
+          </w:p>
+        </w:tc>
+        <w:tc>
+          <w:tcPr>
+            <w:tcW w:type="dxa" w:w="560"/>
+            <w:tcBorders>
+              <w:top w:val="single" w:color="A6A6A6" w:sz="4"/>
+              <w:left w:val="single" w:color="A6A6A6" w:sz="4"/>
+              <w:bottom w:val="single" w:color="A6A6A6" w:sz="4"/>
+              <w:right w:val="single" w:color="A6A6A6" w:sz="4"/>
+            </w:tcBorders>
+            <w:shd w:fill="D9E2F3" w:color="auto" w:val="clear"/>
+            <w:tcMar>
+              <w:top w:type="dxa" w:w="50"/>
+              <w:left w:type="dxa" w:w="60"/>
+              <w:bottom w:type="dxa" w:w="50"/>
+              <w:right w:type="dxa" w:w="60"/>
+            </w:tcMar>
+          </w:tcPr>
+          <w:p>
+            <w:pPr>
+              <w:bidi w:val="false"/>
+              <w:spacing w:after="0" w:line="260"/>
+              <w:jc w:val="center"/>
+            </w:pPr>
+            <w:r>
+              <w:rPr>
+                <w:rFonts w:ascii="Arial" w:cs="Arial" w:eastAsia="Arial" w:hAnsi="Arial"/>
+                <w:b/>
+                <w:bCs/>
+                <w:sz w:val="15"/>
+                <w:szCs w:val="15"/>
+                <w:rtl w:val="false"/>
+              </w:rPr>
+              <w:t xml:space="preserve">+2</w:t>
+            </w:r>
+          </w:p>
+        </w:tc>
+        <w:tc>
+          <w:tcPr>
+            <w:tcW w:type="dxa" w:w="560"/>
+            <w:tcBorders>
+              <w:top w:val="single" w:color="A6A6A6" w:sz="4"/>
+              <w:left w:val="single" w:color="A6A6A6" w:sz="4"/>
+              <w:bottom w:val="single" w:color="A6A6A6" w:sz="4"/>
+              <w:right w:val="single" w:color="A6A6A6" w:sz="4"/>
+            </w:tcBorders>
+            <w:shd w:fill="D9E2F3" w:color="auto" w:val="clear"/>
+            <w:tcMar>
+              <w:top w:type="dxa" w:w="50"/>
+              <w:left w:type="dxa" w:w="60"/>
+              <w:bottom w:type="dxa" w:w="50"/>
+              <w:right w:type="dxa" w:w="60"/>
+            </w:tcMar>
+          </w:tcPr>
+          <w:p>
+            <w:pPr>
+              <w:bidi w:val="false"/>
+              <w:spacing w:after="0" w:line="260"/>
+              <w:jc w:val="center"/>
+            </w:pPr>
+            <w:r>
+              <w:rPr>
+                <w:rFonts w:ascii="Arial" w:cs="Arial" w:eastAsia="Arial" w:hAnsi="Arial"/>
+                <w:b/>
+                <w:bCs/>
+                <w:sz w:val="15"/>
+                <w:szCs w:val="15"/>
+                <w:rtl w:val="false"/>
+              </w:rPr>
+              <w:t xml:space="preserve">+3</w:t>
+            </w:r>
+          </w:p>
+        </w:tc>
+      </w:tr>
+      <w:tr>
+        <w:trPr>
+          <w:cantSplit/>
+          <w:tblHeader w:val="false"/>
+        </w:trPr>
+        <w:tc>
+          <w:tcPr>
+            <w:tcW w:type="dxa" w:w="650"/>
+            <w:tcBorders>
+              <w:top w:val="single" w:color="A6A6A6" w:sz="4"/>
+              <w:left w:val="single" w:color="A6A6A6" w:sz="4"/>
+              <w:bottom w:val="single" w:color="A6A6A6" w:sz="4"/>
+              <w:right w:val="single" w:color="A6A6A6" w:sz="4"/>
+            </w:tcBorders>
+            <w:tcMar>
+              <w:top w:type="dxa" w:w="50"/>
+              <w:left w:type="dxa" w:w="60"/>
+              <w:bottom w:type="dxa" w:w="50"/>
+              <w:right w:type="dxa" w:w="60"/>
+            </w:tcMar>
+          </w:tcPr>
+          <w:p>
+            <w:pPr>
+              <w:bidi w:val="false"/>
+              <w:spacing w:after="0" w:line="260"/>
+              <w:jc w:val="center"/>
+            </w:pPr>
+            <w:r>
+              <w:rPr>
+                <w:rFonts w:ascii="Arial" w:cs="Arial" w:eastAsia="Arial" w:hAnsi="Arial"/>
+                <w:b w:val="false"/>
+                <w:bCs w:val="false"/>
+                <w:sz w:val="19"/>
+                <w:szCs w:val="19"/>
+                <w:rtl w:val="false"/>
+              </w:rPr>
+              <w:t xml:space="preserve">GO1</w:t>
+            </w:r>
+          </w:p>
+        </w:tc>
+        <w:tc>
+          <w:tcPr>
+            <w:tcW w:type="dxa" w:w="4930"/>
+            <w:tcBorders>
+              <w:top w:val="single" w:color="A6A6A6" w:sz="4"/>
+              <w:left w:val="single" w:color="A6A6A6" w:sz="4"/>
+              <w:bottom w:val="single" w:color="A6A6A6" w:sz="4"/>
+              <w:right w:val="single" w:color="A6A6A6" w:sz="4"/>
+            </w:tcBorders>
+            <w:tcMar>
+              <w:top w:type="dxa" w:w="50"/>
+              <w:left w:type="dxa" w:w="60"/>
+              <w:bottom w:type="dxa" w:w="50"/>
+              <w:right w:type="dxa" w:w="60"/>
+            </w:tcMar>
+          </w:tcPr>
+          <w:p>
+            <w:pPr>
+              <w:bidi w:val="false"/>
+              <w:spacing w:after="0" w:line="260"/>
+            </w:pPr>
+            <w:r>
+              <w:rPr>
+                <w:rFonts w:ascii="Arial" w:cs="Arial" w:eastAsia="Arial" w:hAnsi="Arial"/>
+                <w:b w:val="false"/>
+                <w:bCs w:val="false"/>
+                <w:sz w:val="19"/>
+                <w:szCs w:val="19"/>
+                <w:rtl w:val="false"/>
+              </w:rPr>
+              <w:t xml:space="preserve">I can enjoy spending time with a group of people</w:t>
+            </w:r>
+          </w:p>
+        </w:tc>
+        <w:tc>
+          <w:tcPr>
+            <w:tcW w:type="dxa" w:w="560"/>
+            <w:tcBorders>
+              <w:top w:val="single" w:color="A6A6A6" w:sz="4"/>
+              <w:left w:val="single" w:color="A6A6A6" w:sz="4"/>
+              <w:bottom w:val="single" w:color="A6A6A6" w:sz="4"/>
+              <w:right w:val="single" w:color="A6A6A6" w:sz="4"/>
+            </w:tcBorders>
+            <w:tcMar>
+              <w:top w:type="dxa" w:w="50"/>
+              <w:left w:type="dxa" w:w="60"/>
+              <w:bottom w:type="dxa" w:w="50"/>
+              <w:right w:type="dxa" w:w="60"/>
+            </w:tcMar>
+          </w:tcPr>
+          <w:p>
+            <w:pPr>
+              <w:bidi w:val="false"/>
+              <w:spacing w:after="0" w:line="260"/>
+              <w:jc w:val="center"/>
+            </w:pPr>
+            <w:r>
+              <w:rPr>
+                <w:rFonts w:ascii="Arial" w:cs="Arial" w:eastAsia="Arial" w:hAnsi="Arial"/>
+                <w:b w:val="false"/>
+                <w:bCs w:val="false"/>
+                <w:sz w:val="19"/>
+                <w:szCs w:val="19"/>
+                <w:rtl w:val="false"/>
+              </w:rPr>
+              <w:t xml:space="preserve">☐</w:t>
+            </w:r>
+          </w:p>
+        </w:tc>
+        <w:tc>
+          <w:tcPr>
+            <w:tcW w:type="dxa" w:w="560"/>
+            <w:tcBorders>
+              <w:top w:val="single" w:color="A6A6A6" w:sz="4"/>
+              <w:left w:val="single" w:color="A6A6A6" w:sz="4"/>
+              <w:bottom w:val="single" w:color="A6A6A6" w:sz="4"/>
+              <w:right w:val="single" w:color="A6A6A6" w:sz="4"/>
+            </w:tcBorders>
+            <w:tcMar>
+              <w:top w:type="dxa" w:w="50"/>
+              <w:left w:type="dxa" w:w="60"/>
+              <w:bottom w:type="dxa" w:w="50"/>
+              <w:right w:type="dxa" w:w="60"/>
+            </w:tcMar>
+          </w:tcPr>
+          <w:p>
+            <w:pPr>
+              <w:bidi w:val="false"/>
+              <w:spacing w:after="0" w:line="260"/>
+              <w:jc w:val="center"/>
+            </w:pPr>
+            <w:r>
+              <w:rPr>
+                <w:rFonts w:ascii="Arial" w:cs="Arial" w:eastAsia="Arial" w:hAnsi="Arial"/>
+                <w:b w:val="false"/>
+                <w:bCs w:val="false"/>
+                <w:sz w:val="19"/>
+                <w:szCs w:val="19"/>
+                <w:rtl w:val="false"/>
+              </w:rPr>
+              <w:t xml:space="preserve">☐</w:t>
+            </w:r>
+          </w:p>
+        </w:tc>
+        <w:tc>
+          <w:tcPr>
+            <w:tcW w:type="dxa" w:w="560"/>
+            <w:tcBorders>
+              <w:top w:val="single" w:color="A6A6A6" w:sz="4"/>
+              <w:left w:val="single" w:color="A6A6A6" w:sz="4"/>
+              <w:bottom w:val="single" w:color="A6A6A6" w:sz="4"/>
+              <w:right w:val="single" w:color="A6A6A6" w:sz="4"/>
+            </w:tcBorders>
+            <w:tcMar>
+              <w:top w:type="dxa" w:w="50"/>
+              <w:left w:type="dxa" w:w="60"/>
+              <w:bottom w:type="dxa" w:w="50"/>
+              <w:right w:type="dxa" w:w="60"/>
+            </w:tcMar>
+          </w:tcPr>
+          <w:p>
+            <w:pPr>
+              <w:bidi w:val="false"/>
+              <w:spacing w:after="0" w:line="260"/>
+              <w:jc w:val="center"/>
+            </w:pPr>
+            <w:r>
+              <w:rPr>
+                <w:rFonts w:ascii="Arial" w:cs="Arial" w:eastAsia="Arial" w:hAnsi="Arial"/>
+                <w:b w:val="false"/>
+                <w:bCs w:val="false"/>
+                <w:sz w:val="19"/>
+                <w:szCs w:val="19"/>
+                <w:rtl w:val="false"/>
+              </w:rPr>
+              <w:t xml:space="preserve">☐</w:t>
+            </w:r>
+          </w:p>
+        </w:tc>
+        <w:tc>
+          <w:tcPr>
+            <w:tcW w:type="dxa" w:w="560"/>
+            <w:tcBorders>
+              <w:top w:val="single" w:color="A6A6A6" w:sz="4"/>
+              <w:left w:val="single" w:color="A6A6A6" w:sz="4"/>
+              <w:bottom w:val="single" w:color="A6A6A6" w:sz="4"/>
+              <w:right w:val="single" w:color="A6A6A6" w:sz="4"/>
+            </w:tcBorders>
+            <w:tcMar>
+              <w:top w:type="dxa" w:w="50"/>
+              <w:left w:type="dxa" w:w="60"/>
+              <w:bottom w:type="dxa" w:w="50"/>
+              <w:right w:type="dxa" w:w="60"/>
+            </w:tcMar>
+          </w:tcPr>
+          <w:p>
+            <w:pPr>
+              <w:bidi w:val="false"/>
+              <w:spacing w:after="0" w:line="260"/>
+              <w:jc w:val="center"/>
+            </w:pPr>
+            <w:r>
+              <w:rPr>
+                <w:rFonts w:ascii="Arial" w:cs="Arial" w:eastAsia="Arial" w:hAnsi="Arial"/>
+                <w:b w:val="false"/>
+                <w:bCs w:val="false"/>
+                <w:sz w:val="19"/>
+                <w:szCs w:val="19"/>
+                <w:rtl w:val="false"/>
+              </w:rPr>
+              <w:t xml:space="preserve">☐</w:t>
+            </w:r>
+          </w:p>
+        </w:tc>
+        <w:tc>
+          <w:tcPr>
+            <w:tcW w:type="dxa" w:w="560"/>
+            <w:tcBorders>
+              <w:top w:val="single" w:color="A6A6A6" w:sz="4"/>
+              <w:left w:val="single" w:color="A6A6A6" w:sz="4"/>
+              <w:bottom w:val="single" w:color="A6A6A6" w:sz="4"/>
+              <w:right w:val="single" w:color="A6A6A6" w:sz="4"/>
+            </w:tcBorders>
+            <w:tcMar>
+              <w:top w:type="dxa" w:w="50"/>
+              <w:left w:type="dxa" w:w="60"/>
+              <w:bottom w:type="dxa" w:w="50"/>
+              <w:right w:type="dxa" w:w="60"/>
+            </w:tcMar>
+          </w:tcPr>
+          <w:p>
+            <w:pPr>
+              <w:bidi w:val="false"/>
+              <w:spacing w:after="0" w:line="260"/>
+              <w:jc w:val="center"/>
+            </w:pPr>
+            <w:r>
+              <w:rPr>
+                <w:rFonts w:ascii="Arial" w:cs="Arial" w:eastAsia="Arial" w:hAnsi="Arial"/>
+                <w:b w:val="false"/>
+                <w:bCs w:val="false"/>
+                <w:sz w:val="19"/>
+                <w:szCs w:val="19"/>
+                <w:rtl w:val="false"/>
+              </w:rPr>
+              <w:t xml:space="preserve">☐</w:t>
+            </w:r>
+          </w:p>
+        </w:tc>
+        <w:tc>
+          <w:tcPr>
+            <w:tcW w:type="dxa" w:w="560"/>
+            <w:tcBorders>
+              <w:top w:val="single" w:color="A6A6A6" w:sz="4"/>
+              <w:left w:val="single" w:color="A6A6A6" w:sz="4"/>
+              <w:bottom w:val="single" w:color="A6A6A6" w:sz="4"/>
+              <w:right w:val="single" w:color="A6A6A6" w:sz="4"/>
+            </w:tcBorders>
+            <w:tcMar>
+              <w:top w:type="dxa" w:w="50"/>
+              <w:left w:type="dxa" w:w="60"/>
+              <w:bottom w:type="dxa" w:w="50"/>
+              <w:right w:type="dxa" w:w="60"/>
+            </w:tcMar>
+          </w:tcPr>
+          <w:p>
+            <w:pPr>
+              <w:bidi w:val="false"/>
+              <w:spacing w:after="0" w:line="260"/>
+              <w:jc w:val="center"/>
+            </w:pPr>
+            <w:r>
+              <w:rPr>
+                <w:rFonts w:ascii="Arial" w:cs="Arial" w:eastAsia="Arial" w:hAnsi="Arial"/>
+                <w:b w:val="false"/>
+                <w:bCs w:val="false"/>
+                <w:sz w:val="19"/>
+                <w:szCs w:val="19"/>
+                <w:rtl w:val="false"/>
+              </w:rPr>
+              <w:t xml:space="preserve">☐</w:t>
+            </w:r>
+          </w:p>
+        </w:tc>
+        <w:tc>
+          <w:tcPr>
+            <w:tcW w:type="dxa" w:w="560"/>
+            <w:tcBorders>
+              <w:top w:val="single" w:color="A6A6A6" w:sz="4"/>
+              <w:left w:val="single" w:color="A6A6A6" w:sz="4"/>
+              <w:bottom w:val="single" w:color="A6A6A6" w:sz="4"/>
+              <w:right w:val="single" w:color="A6A6A6" w:sz="4"/>
+            </w:tcBorders>
+            <w:tcMar>
+              <w:top w:type="dxa" w:w="50"/>
+              <w:left w:type="dxa" w:w="60"/>
+              <w:bottom w:type="dxa" w:w="50"/>
+              <w:right w:type="dxa" w:w="60"/>
+            </w:tcMar>
+          </w:tcPr>
+          <w:p>
+            <w:pPr>
+              <w:bidi w:val="false"/>
+              <w:spacing w:after="0" w:line="260"/>
+              <w:jc w:val="center"/>
+            </w:pPr>
+            <w:r>
+              <w:rPr>
+                <w:rFonts w:ascii="Arial" w:cs="Arial" w:eastAsia="Arial" w:hAnsi="Arial"/>
+                <w:b w:val="false"/>
+                <w:bCs w:val="false"/>
+                <w:sz w:val="19"/>
+                <w:szCs w:val="19"/>
+                <w:rtl w:val="false"/>
+              </w:rPr>
+              <w:t xml:space="preserve">☐</w:t>
+            </w:r>
+          </w:p>
+        </w:tc>
+      </w:tr>
+      <w:tr>
+        <w:trPr>
+          <w:cantSplit/>
+          <w:tblHeader w:val="false"/>
+        </w:trPr>
+        <w:tc>
+          <w:tcPr>
+            <w:tcW w:type="dxa" w:w="650"/>
+            <w:tcBorders>
+              <w:top w:val="single" w:color="A6A6A6" w:sz="4"/>
+              <w:left w:val="single" w:color="A6A6A6" w:sz="4"/>
+              <w:bottom w:val="single" w:color="A6A6A6" w:sz="4"/>
+              <w:right w:val="single" w:color="A6A6A6" w:sz="4"/>
+            </w:tcBorders>
+            <w:tcMar>
+              <w:top w:type="dxa" w:w="50"/>
+              <w:left w:type="dxa" w:w="60"/>
+              <w:bottom w:type="dxa" w:w="50"/>
+              <w:right w:type="dxa" w:w="60"/>
+            </w:tcMar>
+          </w:tcPr>
+          <w:p>
+            <w:pPr>
+              <w:bidi w:val="false"/>
+              <w:spacing w:after="0" w:line="260"/>
+              <w:jc w:val="center"/>
+            </w:pPr>
+            <w:r>
+              <w:rPr>
+                <w:rFonts w:ascii="Arial" w:cs="Arial" w:eastAsia="Arial" w:hAnsi="Arial"/>
+                <w:b w:val="false"/>
+                <w:bCs w:val="false"/>
+                <w:sz w:val="19"/>
+                <w:szCs w:val="19"/>
+                <w:rtl w:val="false"/>
+              </w:rPr>
+              <w:t xml:space="preserve">GO2</w:t>
+            </w:r>
+          </w:p>
+        </w:tc>
+        <w:tc>
+          <w:tcPr>
+            <w:tcW w:type="dxa" w:w="4930"/>
+            <w:tcBorders>
+              <w:top w:val="single" w:color="A6A6A6" w:sz="4"/>
+              <w:left w:val="single" w:color="A6A6A6" w:sz="4"/>
+              <w:bottom w:val="single" w:color="A6A6A6" w:sz="4"/>
+              <w:right w:val="single" w:color="A6A6A6" w:sz="4"/>
+            </w:tcBorders>
+            <w:tcMar>
+              <w:top w:type="dxa" w:w="50"/>
+              <w:left w:type="dxa" w:w="60"/>
+              <w:bottom w:type="dxa" w:w="50"/>
+              <w:right w:type="dxa" w:w="60"/>
+            </w:tcMar>
+          </w:tcPr>
+          <w:p>
+            <w:pPr>
+              <w:bidi w:val="false"/>
+              <w:spacing w:after="0" w:line="260"/>
+            </w:pPr>
+            <w:r>
+              <w:rPr>
+                <w:rFonts w:ascii="Arial" w:cs="Arial" w:eastAsia="Arial" w:hAnsi="Arial"/>
+                <w:b w:val="false"/>
+                <w:bCs w:val="false"/>
+                <w:sz w:val="19"/>
+                <w:szCs w:val="19"/>
+                <w:rtl w:val="false"/>
+              </w:rPr>
+              <w:t xml:space="preserve">I like building bonds with members of the same group</w:t>
+            </w:r>
+          </w:p>
+        </w:tc>
+        <w:tc>
+          <w:tcPr>
+            <w:tcW w:type="dxa" w:w="560"/>
+            <w:tcBorders>
+              <w:top w:val="single" w:color="A6A6A6" w:sz="4"/>
+              <w:left w:val="single" w:color="A6A6A6" w:sz="4"/>
+              <w:bottom w:val="single" w:color="A6A6A6" w:sz="4"/>
+              <w:right w:val="single" w:color="A6A6A6" w:sz="4"/>
+            </w:tcBorders>
+            <w:tcMar>
+              <w:top w:type="dxa" w:w="50"/>
+              <w:left w:type="dxa" w:w="60"/>
+              <w:bottom w:type="dxa" w:w="50"/>
+              <w:right w:type="dxa" w:w="60"/>
+            </w:tcMar>
+          </w:tcPr>
+          <w:p>
+            <w:pPr>
+              <w:bidi w:val="false"/>
+              <w:spacing w:after="0" w:line="260"/>
+              <w:jc w:val="center"/>
+            </w:pPr>
+            <w:r>
+              <w:rPr>
+                <w:rFonts w:ascii="Arial" w:cs="Arial" w:eastAsia="Arial" w:hAnsi="Arial"/>
+                <w:b w:val="false"/>
+                <w:bCs w:val="false"/>
+                <w:sz w:val="19"/>
+                <w:szCs w:val="19"/>
+                <w:rtl w:val="false"/>
+              </w:rPr>
+              <w:t xml:space="preserve">☐</w:t>
+            </w:r>
+          </w:p>
+        </w:tc>
+        <w:tc>
+          <w:tcPr>
+            <w:tcW w:type="dxa" w:w="560"/>
+            <w:tcBorders>
+              <w:top w:val="single" w:color="A6A6A6" w:sz="4"/>
+              <w:left w:val="single" w:color="A6A6A6" w:sz="4"/>
+              <w:bottom w:val="single" w:color="A6A6A6" w:sz="4"/>
+              <w:right w:val="single" w:color="A6A6A6" w:sz="4"/>
+            </w:tcBorders>
+            <w:tcMar>
+              <w:top w:type="dxa" w:w="50"/>
+              <w:left w:type="dxa" w:w="60"/>
+              <w:bottom w:type="dxa" w:w="50"/>
+              <w:right w:type="dxa" w:w="60"/>
+            </w:tcMar>
+          </w:tcPr>
+          <w:p>
+            <w:pPr>
+              <w:bidi w:val="false"/>
+              <w:spacing w:after="0" w:line="260"/>
+              <w:jc w:val="center"/>
+            </w:pPr>
+            <w:r>
+              <w:rPr>
+                <w:rFonts w:ascii="Arial" w:cs="Arial" w:eastAsia="Arial" w:hAnsi="Arial"/>
+                <w:b w:val="false"/>
+                <w:bCs w:val="false"/>
+                <w:sz w:val="19"/>
+                <w:szCs w:val="19"/>
+                <w:rtl w:val="false"/>
+              </w:rPr>
+              <w:t xml:space="preserve">☐</w:t>
+            </w:r>
+          </w:p>
+        </w:tc>
+        <w:tc>
+          <w:tcPr>
+            <w:tcW w:type="dxa" w:w="560"/>
+            <w:tcBorders>
+              <w:top w:val="single" w:color="A6A6A6" w:sz="4"/>
+              <w:left w:val="single" w:color="A6A6A6" w:sz="4"/>
+              <w:bottom w:val="single" w:color="A6A6A6" w:sz="4"/>
+              <w:right w:val="single" w:color="A6A6A6" w:sz="4"/>
+            </w:tcBorders>
+            <w:tcMar>
+              <w:top w:type="dxa" w:w="50"/>
+              <w:left w:type="dxa" w:w="60"/>
+              <w:bottom w:type="dxa" w:w="50"/>
+              <w:right w:type="dxa" w:w="60"/>
+            </w:tcMar>
+          </w:tcPr>
+          <w:p>
+            <w:pPr>
+              <w:bidi w:val="false"/>
+              <w:spacing w:after="0" w:line="260"/>
+              <w:jc w:val="center"/>
+            </w:pPr>
+            <w:r>
+              <w:rPr>
+                <w:rFonts w:ascii="Arial" w:cs="Arial" w:eastAsia="Arial" w:hAnsi="Arial"/>
+                <w:b w:val="false"/>
+                <w:bCs w:val="false"/>
+                <w:sz w:val="19"/>
+                <w:szCs w:val="19"/>
+                <w:rtl w:val="false"/>
+              </w:rPr>
+              <w:t xml:space="preserve">☐</w:t>
+            </w:r>
+          </w:p>
+        </w:tc>
+        <w:tc>
+          <w:tcPr>
+            <w:tcW w:type="dxa" w:w="560"/>
+            <w:tcBorders>
+              <w:top w:val="single" w:color="A6A6A6" w:sz="4"/>
+              <w:left w:val="single" w:color="A6A6A6" w:sz="4"/>
+              <w:bottom w:val="single" w:color="A6A6A6" w:sz="4"/>
+              <w:right w:val="single" w:color="A6A6A6" w:sz="4"/>
+            </w:tcBorders>
+            <w:tcMar>
+              <w:top w:type="dxa" w:w="50"/>
+              <w:left w:type="dxa" w:w="60"/>
+              <w:bottom w:type="dxa" w:w="50"/>
+              <w:right w:type="dxa" w:w="60"/>
+            </w:tcMar>
+          </w:tcPr>
+          <w:p>
+            <w:pPr>
+              <w:bidi w:val="false"/>
+              <w:spacing w:after="0" w:line="260"/>
+              <w:jc w:val="center"/>
+            </w:pPr>
+            <w:r>
+              <w:rPr>
+                <w:rFonts w:ascii="Arial" w:cs="Arial" w:eastAsia="Arial" w:hAnsi="Arial"/>
+                <w:b w:val="false"/>
+                <w:bCs w:val="false"/>
+                <w:sz w:val="19"/>
+                <w:szCs w:val="19"/>
+                <w:rtl w:val="false"/>
+              </w:rPr>
+              <w:t xml:space="preserve">☐</w:t>
+            </w:r>
+          </w:p>
+        </w:tc>
+        <w:tc>
+          <w:tcPr>
+            <w:tcW w:type="dxa" w:w="560"/>
+            <w:tcBorders>
+              <w:top w:val="single" w:color="A6A6A6" w:sz="4"/>
+              <w:left w:val="single" w:color="A6A6A6" w:sz="4"/>
+              <w:bottom w:val="single" w:color="A6A6A6" w:sz="4"/>
+              <w:right w:val="single" w:color="A6A6A6" w:sz="4"/>
+            </w:tcBorders>
+            <w:tcMar>
+              <w:top w:type="dxa" w:w="50"/>
+              <w:left w:type="dxa" w:w="60"/>
+              <w:bottom w:type="dxa" w:w="50"/>
+              <w:right w:type="dxa" w:w="60"/>
+            </w:tcMar>
+          </w:tcPr>
+          <w:p>
+            <w:pPr>
+              <w:bidi w:val="false"/>
+              <w:spacing w:after="0" w:line="260"/>
+              <w:jc w:val="center"/>
+            </w:pPr>
+            <w:r>
+              <w:rPr>
+                <w:rFonts w:ascii="Arial" w:cs="Arial" w:eastAsia="Arial" w:hAnsi="Arial"/>
+                <w:b w:val="false"/>
+                <w:bCs w:val="false"/>
+                <w:sz w:val="19"/>
+                <w:szCs w:val="19"/>
+                <w:rtl w:val="false"/>
+              </w:rPr>
+              <w:t xml:space="preserve">☐</w:t>
+            </w:r>
+          </w:p>
+        </w:tc>
+        <w:tc>
+          <w:tcPr>
+            <w:tcW w:type="dxa" w:w="560"/>
+            <w:tcBorders>
+              <w:top w:val="single" w:color="A6A6A6" w:sz="4"/>
+              <w:left w:val="single" w:color="A6A6A6" w:sz="4"/>
+              <w:bottom w:val="single" w:color="A6A6A6" w:sz="4"/>
+              <w:right w:val="single" w:color="A6A6A6" w:sz="4"/>
+            </w:tcBorders>
+            <w:tcMar>
+              <w:top w:type="dxa" w:w="50"/>
+              <w:left w:type="dxa" w:w="60"/>
+              <w:bottom w:type="dxa" w:w="50"/>
+              <w:right w:type="dxa" w:w="60"/>
+            </w:tcMar>
+          </w:tcPr>
+          <w:p>
+            <w:pPr>
+              <w:bidi w:val="false"/>
+              <w:spacing w:after="0" w:line="260"/>
+              <w:jc w:val="center"/>
+            </w:pPr>
+            <w:r>
+              <w:rPr>
+                <w:rFonts w:ascii="Arial" w:cs="Arial" w:eastAsia="Arial" w:hAnsi="Arial"/>
+                <w:b w:val="false"/>
+                <w:bCs w:val="false"/>
+                <w:sz w:val="19"/>
+                <w:szCs w:val="19"/>
+                <w:rtl w:val="false"/>
+              </w:rPr>
+              <w:t xml:space="preserve">☐</w:t>
+            </w:r>
+          </w:p>
+        </w:tc>
+        <w:tc>
+          <w:tcPr>
+            <w:tcW w:type="dxa" w:w="560"/>
+            <w:tcBorders>
+              <w:top w:val="single" w:color="A6A6A6" w:sz="4"/>
+              <w:left w:val="single" w:color="A6A6A6" w:sz="4"/>
+              <w:bottom w:val="single" w:color="A6A6A6" w:sz="4"/>
+              <w:right w:val="single" w:color="A6A6A6" w:sz="4"/>
+            </w:tcBorders>
+            <w:tcMar>
+              <w:top w:type="dxa" w:w="50"/>
+              <w:left w:type="dxa" w:w="60"/>
+              <w:bottom w:type="dxa" w:w="50"/>
+              <w:right w:type="dxa" w:w="60"/>
+            </w:tcMar>
+          </w:tcPr>
+          <w:p>
+            <w:pPr>
+              <w:bidi w:val="false"/>
+              <w:spacing w:after="0" w:line="260"/>
+              <w:jc w:val="center"/>
+            </w:pPr>
+            <w:r>
+              <w:rPr>
+                <w:rFonts w:ascii="Arial" w:cs="Arial" w:eastAsia="Arial" w:hAnsi="Arial"/>
+                <w:b w:val="false"/>
+                <w:bCs w:val="false"/>
+                <w:sz w:val="19"/>
+                <w:szCs w:val="19"/>
+                <w:rtl w:val="false"/>
+              </w:rPr>
+              <w:t xml:space="preserve">☐</w:t>
+            </w:r>
+          </w:p>
+        </w:tc>
+      </w:tr>
+      <w:tr>
+        <w:trPr>
+          <w:cantSplit/>
+          <w:tblHeader w:val="false"/>
+        </w:trPr>
+        <w:tc>
+          <w:tcPr>
+            <w:tcW w:type="dxa" w:w="650"/>
+            <w:tcBorders>
+              <w:top w:val="single" w:color="A6A6A6" w:sz="4"/>
+              <w:left w:val="single" w:color="A6A6A6" w:sz="4"/>
+              <w:bottom w:val="single" w:color="A6A6A6" w:sz="4"/>
+              <w:right w:val="single" w:color="A6A6A6" w:sz="4"/>
+            </w:tcBorders>
+            <w:tcMar>
+              <w:top w:type="dxa" w:w="50"/>
+              <w:left w:type="dxa" w:w="60"/>
+              <w:bottom w:type="dxa" w:w="50"/>
+              <w:right w:type="dxa" w:w="60"/>
+            </w:tcMar>
+          </w:tcPr>
+          <w:p>
+            <w:pPr>
+              <w:bidi w:val="false"/>
+              <w:spacing w:after="0" w:line="260"/>
+              <w:jc w:val="center"/>
+            </w:pPr>
+            <w:r>
+              <w:rPr>
+                <w:rFonts w:ascii="Arial" w:cs="Arial" w:eastAsia="Arial" w:hAnsi="Arial"/>
+                <w:b w:val="false"/>
+                <w:bCs w:val="false"/>
+                <w:sz w:val="19"/>
+                <w:szCs w:val="19"/>
+                <w:rtl w:val="false"/>
+              </w:rPr>
+              <w:t xml:space="preserve">GO3</w:t>
+            </w:r>
+          </w:p>
+        </w:tc>
+        <w:tc>
+          <w:tcPr>
+            <w:tcW w:type="dxa" w:w="4930"/>
+            <w:tcBorders>
+              <w:top w:val="single" w:color="A6A6A6" w:sz="4"/>
+              <w:left w:val="single" w:color="A6A6A6" w:sz="4"/>
+              <w:bottom w:val="single" w:color="A6A6A6" w:sz="4"/>
+              <w:right w:val="single" w:color="A6A6A6" w:sz="4"/>
+            </w:tcBorders>
+            <w:tcMar>
+              <w:top w:type="dxa" w:w="50"/>
+              <w:left w:type="dxa" w:w="60"/>
+              <w:bottom w:type="dxa" w:w="50"/>
+              <w:right w:type="dxa" w:w="60"/>
+            </w:tcMar>
+          </w:tcPr>
+          <w:p>
+            <w:pPr>
+              <w:bidi w:val="false"/>
+              <w:spacing w:after="0" w:line="260"/>
+            </w:pPr>
+            <w:r>
+              <w:rPr>
+                <w:rFonts w:ascii="Arial" w:cs="Arial" w:eastAsia="Arial" w:hAnsi="Arial"/>
+                <w:b w:val="false"/>
+                <w:bCs w:val="false"/>
+                <w:sz w:val="19"/>
+                <w:szCs w:val="19"/>
+                <w:rtl w:val="false"/>
+              </w:rPr>
+              <w:t xml:space="preserve">I don't like to be in a group</w:t>
+            </w:r>
+          </w:p>
+        </w:tc>
+        <w:tc>
+          <w:tcPr>
+            <w:tcW w:type="dxa" w:w="560"/>
+            <w:tcBorders>
+              <w:top w:val="single" w:color="A6A6A6" w:sz="4"/>
+              <w:left w:val="single" w:color="A6A6A6" w:sz="4"/>
+              <w:bottom w:val="single" w:color="A6A6A6" w:sz="4"/>
+              <w:right w:val="single" w:color="A6A6A6" w:sz="4"/>
+            </w:tcBorders>
+            <w:tcMar>
+              <w:top w:type="dxa" w:w="50"/>
+              <w:left w:type="dxa" w:w="60"/>
+              <w:bottom w:type="dxa" w:w="50"/>
+              <w:right w:type="dxa" w:w="60"/>
+            </w:tcMar>
+          </w:tcPr>
+          <w:p>
+            <w:pPr>
+              <w:bidi w:val="false"/>
+              <w:spacing w:after="0" w:line="260"/>
+              <w:jc w:val="center"/>
+            </w:pPr>
+            <w:r>
+              <w:rPr>
+                <w:rFonts w:ascii="Arial" w:cs="Arial" w:eastAsia="Arial" w:hAnsi="Arial"/>
+                <w:b w:val="false"/>
+                <w:bCs w:val="false"/>
+                <w:sz w:val="19"/>
+                <w:szCs w:val="19"/>
+                <w:rtl w:val="false"/>
+              </w:rPr>
+              <w:t xml:space="preserve">☐</w:t>
+            </w:r>
+          </w:p>
+        </w:tc>
+        <w:tc>
+          <w:tcPr>
+            <w:tcW w:type="dxa" w:w="560"/>
+            <w:tcBorders>
+              <w:top w:val="single" w:color="A6A6A6" w:sz="4"/>
+              <w:left w:val="single" w:color="A6A6A6" w:sz="4"/>
+              <w:bottom w:val="single" w:color="A6A6A6" w:sz="4"/>
+              <w:right w:val="single" w:color="A6A6A6" w:sz="4"/>
+            </w:tcBorders>
+            <w:tcMar>
+              <w:top w:type="dxa" w:w="50"/>
+              <w:left w:type="dxa" w:w="60"/>
+              <w:bottom w:type="dxa" w:w="50"/>
+              <w:right w:type="dxa" w:w="60"/>
+            </w:tcMar>
+          </w:tcPr>
+          <w:p>
+            <w:pPr>
+              <w:bidi w:val="false"/>
+              <w:spacing w:after="0" w:line="260"/>
+              <w:jc w:val="center"/>
+            </w:pPr>
+            <w:r>
+              <w:rPr>
+                <w:rFonts w:ascii="Arial" w:cs="Arial" w:eastAsia="Arial" w:hAnsi="Arial"/>
+                <w:b w:val="false"/>
+                <w:bCs w:val="false"/>
+                <w:sz w:val="19"/>
+                <w:szCs w:val="19"/>
+                <w:rtl w:val="false"/>
+              </w:rPr>
+              <w:t xml:space="preserve">☐</w:t>
+            </w:r>
+          </w:p>
+        </w:tc>
+        <w:tc>
+          <w:tcPr>
+            <w:tcW w:type="dxa" w:w="560"/>
+            <w:tcBorders>
+              <w:top w:val="single" w:color="A6A6A6" w:sz="4"/>
+              <w:left w:val="single" w:color="A6A6A6" w:sz="4"/>
+              <w:bottom w:val="single" w:color="A6A6A6" w:sz="4"/>
+              <w:right w:val="single" w:color="A6A6A6" w:sz="4"/>
+            </w:tcBorders>
+            <w:tcMar>
+              <w:top w:type="dxa" w:w="50"/>
+              <w:left w:type="dxa" w:w="60"/>
+              <w:bottom w:type="dxa" w:w="50"/>
+              <w:right w:type="dxa" w:w="60"/>
+            </w:tcMar>
+          </w:tcPr>
+          <w:p>
+            <w:pPr>
+              <w:bidi w:val="false"/>
+              <w:spacing w:after="0" w:line="260"/>
+              <w:jc w:val="center"/>
+            </w:pPr>
+            <w:r>
+              <w:rPr>
+                <w:rFonts w:ascii="Arial" w:cs="Arial" w:eastAsia="Arial" w:hAnsi="Arial"/>
+                <w:b w:val="false"/>
+                <w:bCs w:val="false"/>
+                <w:sz w:val="19"/>
+                <w:szCs w:val="19"/>
+                <w:rtl w:val="false"/>
+              </w:rPr>
+              <w:t xml:space="preserve">☐</w:t>
+            </w:r>
+          </w:p>
+        </w:tc>
+        <w:tc>
+          <w:tcPr>
+            <w:tcW w:type="dxa" w:w="560"/>
+            <w:tcBorders>
+              <w:top w:val="single" w:color="A6A6A6" w:sz="4"/>
+              <w:left w:val="single" w:color="A6A6A6" w:sz="4"/>
+              <w:bottom w:val="single" w:color="A6A6A6" w:sz="4"/>
+              <w:right w:val="single" w:color="A6A6A6" w:sz="4"/>
+            </w:tcBorders>
+            <w:tcMar>
+              <w:top w:type="dxa" w:w="50"/>
+              <w:left w:type="dxa" w:w="60"/>
+              <w:bottom w:type="dxa" w:w="50"/>
+              <w:right w:type="dxa" w:w="60"/>
+            </w:tcMar>
+          </w:tcPr>
+          <w:p>
+            <w:pPr>
+              <w:bidi w:val="false"/>
+              <w:spacing w:after="0" w:line="260"/>
+              <w:jc w:val="center"/>
+            </w:pPr>
+            <w:r>
+              <w:rPr>
+                <w:rFonts w:ascii="Arial" w:cs="Arial" w:eastAsia="Arial" w:hAnsi="Arial"/>
+                <w:b w:val="false"/>
+                <w:bCs w:val="false"/>
+                <w:sz w:val="19"/>
+                <w:szCs w:val="19"/>
+                <w:rtl w:val="false"/>
+              </w:rPr>
+              <w:t xml:space="preserve">☐</w:t>
+            </w:r>
+          </w:p>
+        </w:tc>
+        <w:tc>
+          <w:tcPr>
+            <w:tcW w:type="dxa" w:w="560"/>
+            <w:tcBorders>
+              <w:top w:val="single" w:color="A6A6A6" w:sz="4"/>
+              <w:left w:val="single" w:color="A6A6A6" w:sz="4"/>
+              <w:bottom w:val="single" w:color="A6A6A6" w:sz="4"/>
+              <w:right w:val="single" w:color="A6A6A6" w:sz="4"/>
+            </w:tcBorders>
+            <w:tcMar>
+              <w:top w:type="dxa" w:w="50"/>
+              <w:left w:type="dxa" w:w="60"/>
+              <w:bottom w:type="dxa" w:w="50"/>
+              <w:right w:type="dxa" w:w="60"/>
+            </w:tcMar>
+          </w:tcPr>
+          <w:p>
+            <w:pPr>
+              <w:bidi w:val="false"/>
+              <w:spacing w:after="0" w:line="260"/>
+              <w:jc w:val="center"/>
+            </w:pPr>
+            <w:r>
+              <w:rPr>
+                <w:rFonts w:ascii="Arial" w:cs="Arial" w:eastAsia="Arial" w:hAnsi="Arial"/>
+                <w:b w:val="false"/>
+                <w:bCs w:val="false"/>
+                <w:sz w:val="19"/>
+                <w:szCs w:val="19"/>
+                <w:rtl w:val="false"/>
+              </w:rPr>
+              <w:t xml:space="preserve">☐</w:t>
+            </w:r>
+          </w:p>
+        </w:tc>
+        <w:tc>
+          <w:tcPr>
+            <w:tcW w:type="dxa" w:w="560"/>
+            <w:tcBorders>
+              <w:top w:val="single" w:color="A6A6A6" w:sz="4"/>
+              <w:left w:val="single" w:color="A6A6A6" w:sz="4"/>
+              <w:bottom w:val="single" w:color="A6A6A6" w:sz="4"/>
+              <w:right w:val="single" w:color="A6A6A6" w:sz="4"/>
+            </w:tcBorders>
+            <w:tcMar>
+              <w:top w:type="dxa" w:w="50"/>
+              <w:left w:type="dxa" w:w="60"/>
+              <w:bottom w:type="dxa" w:w="50"/>
+              <w:right w:type="dxa" w:w="60"/>
+            </w:tcMar>
+          </w:tcPr>
+          <w:p>
+            <w:pPr>
+              <w:bidi w:val="false"/>
+              <w:spacing w:after="0" w:line="260"/>
+              <w:jc w:val="center"/>
+            </w:pPr>
+            <w:r>
+              <w:rPr>
+                <w:rFonts w:ascii="Arial" w:cs="Arial" w:eastAsia="Arial" w:hAnsi="Arial"/>
+                <w:b w:val="false"/>
+                <w:bCs w:val="false"/>
+                <w:sz w:val="19"/>
+                <w:szCs w:val="19"/>
+                <w:rtl w:val="false"/>
+              </w:rPr>
+              <w:t xml:space="preserve">☐</w:t>
+            </w:r>
+          </w:p>
+        </w:tc>
+        <w:tc>
+          <w:tcPr>
+            <w:tcW w:type="dxa" w:w="560"/>
+            <w:tcBorders>
+              <w:top w:val="single" w:color="A6A6A6" w:sz="4"/>
+              <w:left w:val="single" w:color="A6A6A6" w:sz="4"/>
+              <w:bottom w:val="single" w:color="A6A6A6" w:sz="4"/>
+              <w:right w:val="single" w:color="A6A6A6" w:sz="4"/>
+            </w:tcBorders>
+            <w:tcMar>
+              <w:top w:type="dxa" w:w="50"/>
+              <w:left w:type="dxa" w:w="60"/>
+              <w:bottom w:type="dxa" w:w="50"/>
+              <w:right w:type="dxa" w:w="60"/>
+            </w:tcMar>
+          </w:tcPr>
+          <w:p>
+            <w:pPr>
+              <w:bidi w:val="false"/>
+              <w:spacing w:after="0" w:line="260"/>
+              <w:jc w:val="center"/>
+            </w:pPr>
+            <w:r>
+              <w:rPr>
+                <w:rFonts w:ascii="Arial" w:cs="Arial" w:eastAsia="Arial" w:hAnsi="Arial"/>
+                <w:b w:val="false"/>
+                <w:bCs w:val="false"/>
+                <w:sz w:val="19"/>
+                <w:szCs w:val="19"/>
+                <w:rtl w:val="false"/>
+              </w:rPr>
+              <w:t xml:space="preserve">☐</w:t>
+            </w:r>
+          </w:p>
+        </w:tc>
+      </w:tr>
+      <w:tr>
+        <w:trPr>
+          <w:cantSplit/>
+          <w:tblHeader w:val="false"/>
+        </w:trPr>
+        <w:tc>
+          <w:tcPr>
+            <w:tcW w:type="dxa" w:w="650"/>
+            <w:tcBorders>
+              <w:top w:val="single" w:color="A6A6A6" w:sz="4"/>
+              <w:left w:val="single" w:color="A6A6A6" w:sz="4"/>
+              <w:bottom w:val="single" w:color="A6A6A6" w:sz="4"/>
+              <w:right w:val="single" w:color="A6A6A6" w:sz="4"/>
+            </w:tcBorders>
+            <w:tcMar>
+              <w:top w:type="dxa" w:w="50"/>
+              <w:left w:type="dxa" w:w="60"/>
+              <w:bottom w:type="dxa" w:w="50"/>
+              <w:right w:type="dxa" w:w="60"/>
+            </w:tcMar>
+          </w:tcPr>
+          <w:p>
+            <w:pPr>
+              <w:bidi w:val="false"/>
+              <w:spacing w:after="0" w:line="260"/>
+              <w:jc w:val="center"/>
+            </w:pPr>
+            <w:r>
+              <w:rPr>
+                <w:rFonts w:ascii="Arial" w:cs="Arial" w:eastAsia="Arial" w:hAnsi="Arial"/>
+                <w:b w:val="false"/>
+                <w:bCs w:val="false"/>
+                <w:sz w:val="19"/>
+                <w:szCs w:val="19"/>
+                <w:rtl w:val="false"/>
+              </w:rPr>
+              <w:t xml:space="preserve">GO4</w:t>
+            </w:r>
+          </w:p>
+        </w:tc>
+        <w:tc>
+          <w:tcPr>
+            <w:tcW w:type="dxa" w:w="4930"/>
+            <w:tcBorders>
+              <w:top w:val="single" w:color="A6A6A6" w:sz="4"/>
+              <w:left w:val="single" w:color="A6A6A6" w:sz="4"/>
+              <w:bottom w:val="single" w:color="A6A6A6" w:sz="4"/>
+              <w:right w:val="single" w:color="A6A6A6" w:sz="4"/>
+            </w:tcBorders>
+            <w:tcMar>
+              <w:top w:type="dxa" w:w="50"/>
+              <w:left w:type="dxa" w:w="60"/>
+              <w:bottom w:type="dxa" w:w="50"/>
+              <w:right w:type="dxa" w:w="60"/>
+            </w:tcMar>
+          </w:tcPr>
+          <w:p>
+            <w:pPr>
+              <w:bidi w:val="false"/>
+              <w:spacing w:after="0" w:line="260"/>
+            </w:pPr>
+            <w:r>
+              <w:rPr>
+                <w:rFonts w:ascii="Arial" w:cs="Arial" w:eastAsia="Arial" w:hAnsi="Arial"/>
+                <w:b w:val="false"/>
+                <w:bCs w:val="false"/>
+                <w:sz w:val="19"/>
+                <w:szCs w:val="19"/>
+                <w:rtl w:val="false"/>
+              </w:rPr>
+              <w:t xml:space="preserve">I enjoy spending time alone rather than in a group</w:t>
+            </w:r>
+          </w:p>
+        </w:tc>
+        <w:tc>
+          <w:tcPr>
+            <w:tcW w:type="dxa" w:w="560"/>
+            <w:tcBorders>
+              <w:top w:val="single" w:color="A6A6A6" w:sz="4"/>
+              <w:left w:val="single" w:color="A6A6A6" w:sz="4"/>
+              <w:bottom w:val="single" w:color="A6A6A6" w:sz="4"/>
+              <w:right w:val="single" w:color="A6A6A6" w:sz="4"/>
+            </w:tcBorders>
+            <w:tcMar>
+              <w:top w:type="dxa" w:w="50"/>
+              <w:left w:type="dxa" w:w="60"/>
+              <w:bottom w:type="dxa" w:w="50"/>
+              <w:right w:type="dxa" w:w="60"/>
+            </w:tcMar>
+          </w:tcPr>
+          <w:p>
+            <w:pPr>
+              <w:bidi w:val="false"/>
+              <w:spacing w:after="0" w:line="260"/>
+              <w:jc w:val="center"/>
+            </w:pPr>
+            <w:r>
+              <w:rPr>
+                <w:rFonts w:ascii="Arial" w:cs="Arial" w:eastAsia="Arial" w:hAnsi="Arial"/>
+                <w:b w:val="false"/>
+                <w:bCs w:val="false"/>
+                <w:sz w:val="19"/>
+                <w:szCs w:val="19"/>
+                <w:rtl w:val="false"/>
+              </w:rPr>
+              <w:t xml:space="preserve">☐</w:t>
+            </w:r>
+          </w:p>
+        </w:tc>
+        <w:tc>
+          <w:tcPr>
+            <w:tcW w:type="dxa" w:w="560"/>
+            <w:tcBorders>
+              <w:top w:val="single" w:color="A6A6A6" w:sz="4"/>
+              <w:left w:val="single" w:color="A6A6A6" w:sz="4"/>
+              <w:bottom w:val="single" w:color="A6A6A6" w:sz="4"/>
+              <w:right w:val="single" w:color="A6A6A6" w:sz="4"/>
+            </w:tcBorders>
+            <w:tcMar>
+              <w:top w:type="dxa" w:w="50"/>
+              <w:left w:type="dxa" w:w="60"/>
+              <w:bottom w:type="dxa" w:w="50"/>
+              <w:right w:type="dxa" w:w="60"/>
+            </w:tcMar>
+          </w:tcPr>
+          <w:p>
+            <w:pPr>
+              <w:bidi w:val="false"/>
+              <w:spacing w:after="0" w:line="260"/>
+              <w:jc w:val="center"/>
+            </w:pPr>
+            <w:r>
+              <w:rPr>
+                <w:rFonts w:ascii="Arial" w:cs="Arial" w:eastAsia="Arial" w:hAnsi="Arial"/>
+                <w:b w:val="false"/>
+                <w:bCs w:val="false"/>
+                <w:sz w:val="19"/>
+                <w:szCs w:val="19"/>
+                <w:rtl w:val="false"/>
+              </w:rPr>
+              <w:t xml:space="preserve">☐</w:t>
+            </w:r>
+          </w:p>
+        </w:tc>
+        <w:tc>
+          <w:tcPr>
+            <w:tcW w:type="dxa" w:w="560"/>
+            <w:tcBorders>
+              <w:top w:val="single" w:color="A6A6A6" w:sz="4"/>
+              <w:left w:val="single" w:color="A6A6A6" w:sz="4"/>
+              <w:bottom w:val="single" w:color="A6A6A6" w:sz="4"/>
+              <w:right w:val="single" w:color="A6A6A6" w:sz="4"/>
+            </w:tcBorders>
+            <w:tcMar>
+              <w:top w:type="dxa" w:w="50"/>
+              <w:left w:type="dxa" w:w="60"/>
+              <w:bottom w:type="dxa" w:w="50"/>
+              <w:right w:type="dxa" w:w="60"/>
+            </w:tcMar>
+          </w:tcPr>
+          <w:p>
+            <w:pPr>
+              <w:bidi w:val="false"/>
+              <w:spacing w:after="0" w:line="260"/>
+              <w:jc w:val="center"/>
+            </w:pPr>
+            <w:r>
+              <w:rPr>
+                <w:rFonts w:ascii="Arial" w:cs="Arial" w:eastAsia="Arial" w:hAnsi="Arial"/>
+                <w:b w:val="false"/>
+                <w:bCs w:val="false"/>
+                <w:sz w:val="19"/>
+                <w:szCs w:val="19"/>
+                <w:rtl w:val="false"/>
+              </w:rPr>
+              <w:t xml:space="preserve">☐</w:t>
+            </w:r>
+          </w:p>
+        </w:tc>
+        <w:tc>
+          <w:tcPr>
+            <w:tcW w:type="dxa" w:w="560"/>
+            <w:tcBorders>
+              <w:top w:val="single" w:color="A6A6A6" w:sz="4"/>
+              <w:left w:val="single" w:color="A6A6A6" w:sz="4"/>
+              <w:bottom w:val="single" w:color="A6A6A6" w:sz="4"/>
+              <w:right w:val="single" w:color="A6A6A6" w:sz="4"/>
+            </w:tcBorders>
+            <w:tcMar>
+              <w:top w:type="dxa" w:w="50"/>
+              <w:left w:type="dxa" w:w="60"/>
+              <w:bottom w:type="dxa" w:w="50"/>
+              <w:right w:type="dxa" w:w="60"/>
+            </w:tcMar>
+          </w:tcPr>
+          <w:p>
+            <w:pPr>
+              <w:bidi w:val="false"/>
+              <w:spacing w:after="0" w:line="260"/>
+              <w:jc w:val="center"/>
+            </w:pPr>
+            <w:r>
+              <w:rPr>
+                <w:rFonts w:ascii="Arial" w:cs="Arial" w:eastAsia="Arial" w:hAnsi="Arial"/>
+                <w:b w:val="false"/>
+                <w:bCs w:val="false"/>
+                <w:sz w:val="19"/>
+                <w:szCs w:val="19"/>
+                <w:rtl w:val="false"/>
+              </w:rPr>
+              <w:t xml:space="preserve">☐</w:t>
+            </w:r>
+          </w:p>
+        </w:tc>
+        <w:tc>
+          <w:tcPr>
+            <w:tcW w:type="dxa" w:w="560"/>
+            <w:tcBorders>
+              <w:top w:val="single" w:color="A6A6A6" w:sz="4"/>
+              <w:left w:val="single" w:color="A6A6A6" w:sz="4"/>
+              <w:bottom w:val="single" w:color="A6A6A6" w:sz="4"/>
+              <w:right w:val="single" w:color="A6A6A6" w:sz="4"/>
+            </w:tcBorders>
+            <w:tcMar>
+              <w:top w:type="dxa" w:w="50"/>
+              <w:left w:type="dxa" w:w="60"/>
+              <w:bottom w:type="dxa" w:w="50"/>
+              <w:right w:type="dxa" w:w="60"/>
+            </w:tcMar>
+          </w:tcPr>
+          <w:p>
+            <w:pPr>
+              <w:bidi w:val="false"/>
+              <w:spacing w:after="0" w:line="260"/>
+              <w:jc w:val="center"/>
+            </w:pPr>
+            <w:r>
+              <w:rPr>
+                <w:rFonts w:ascii="Arial" w:cs="Arial" w:eastAsia="Arial" w:hAnsi="Arial"/>
+                <w:b w:val="false"/>
+                <w:bCs w:val="false"/>
+                <w:sz w:val="19"/>
+                <w:szCs w:val="19"/>
+                <w:rtl w:val="false"/>
+              </w:rPr>
+              <w:t xml:space="preserve">☐</w:t>
+            </w:r>
+          </w:p>
+        </w:tc>
+        <w:tc>
+          <w:tcPr>
+            <w:tcW w:type="dxa" w:w="560"/>
+            <w:tcBorders>
+              <w:top w:val="single" w:color="A6A6A6" w:sz="4"/>
+              <w:left w:val="single" w:color="A6A6A6" w:sz="4"/>
+              <w:bottom w:val="single" w:color="A6A6A6" w:sz="4"/>
+              <w:right w:val="single" w:color="A6A6A6" w:sz="4"/>
+            </w:tcBorders>
+            <w:tcMar>
+              <w:top w:type="dxa" w:w="50"/>
+              <w:left w:type="dxa" w:w="60"/>
+              <w:bottom w:type="dxa" w:w="50"/>
+              <w:right w:type="dxa" w:w="60"/>
+            </w:tcMar>
+          </w:tcPr>
+          <w:p>
+            <w:pPr>
+              <w:bidi w:val="false"/>
+              <w:spacing w:after="0" w:line="260"/>
+              <w:jc w:val="center"/>
+            </w:pPr>
+            <w:r>
+              <w:rPr>
+                <w:rFonts w:ascii="Arial" w:cs="Arial" w:eastAsia="Arial" w:hAnsi="Arial"/>
+                <w:b w:val="false"/>
+                <w:bCs w:val="false"/>
+                <w:sz w:val="19"/>
+                <w:szCs w:val="19"/>
+                <w:rtl w:val="false"/>
+              </w:rPr>
+              <w:t xml:space="preserve">☐</w:t>
+            </w:r>
+          </w:p>
+        </w:tc>
+        <w:tc>
+          <w:tcPr>
+            <w:tcW w:type="dxa" w:w="560"/>
+            <w:tcBorders>
+              <w:top w:val="single" w:color="A6A6A6" w:sz="4"/>
+              <w:left w:val="single" w:color="A6A6A6" w:sz="4"/>
+              <w:bottom w:val="single" w:color="A6A6A6" w:sz="4"/>
+              <w:right w:val="single" w:color="A6A6A6" w:sz="4"/>
+            </w:tcBorders>
+            <w:tcMar>
+              <w:top w:type="dxa" w:w="50"/>
+              <w:left w:type="dxa" w:w="60"/>
+              <w:bottom w:type="dxa" w:w="50"/>
+              <w:right w:type="dxa" w:w="60"/>
+            </w:tcMar>
+          </w:tcPr>
+          <w:p>
+            <w:pPr>
+              <w:bidi w:val="false"/>
+              <w:spacing w:after="0" w:line="260"/>
+              <w:jc w:val="center"/>
+            </w:pPr>
+            <w:r>
+              <w:rPr>
+                <w:rFonts w:ascii="Arial" w:cs="Arial" w:eastAsia="Arial" w:hAnsi="Arial"/>
+                <w:b w:val="false"/>
+                <w:bCs w:val="false"/>
+                <w:sz w:val="19"/>
+                <w:szCs w:val="19"/>
+                <w:rtl w:val="false"/>
+              </w:rPr>
+              <w:t xml:space="preserve">☐</w:t>
+            </w:r>
+          </w:p>
+        </w:tc>
+      </w:tr>
+      <w:tr>
+        <w:trPr>
+          <w:cantSplit/>
+          <w:tblHeader w:val="false"/>
+        </w:trPr>
+        <w:tc>
+          <w:tcPr>
+            <w:tcW w:type="dxa" w:w="650"/>
+            <w:tcBorders>
+              <w:top w:val="single" w:color="A6A6A6" w:sz="4"/>
+              <w:left w:val="single" w:color="A6A6A6" w:sz="4"/>
+              <w:bottom w:val="single" w:color="A6A6A6" w:sz="4"/>
+              <w:right w:val="single" w:color="A6A6A6" w:sz="4"/>
+            </w:tcBorders>
+            <w:tcMar>
+              <w:top w:type="dxa" w:w="50"/>
+              <w:left w:type="dxa" w:w="60"/>
+              <w:bottom w:type="dxa" w:w="50"/>
+              <w:right w:type="dxa" w:w="60"/>
+            </w:tcMar>
+          </w:tcPr>
+          <w:p>
+            <w:pPr>
+              <w:bidi w:val="false"/>
+              <w:spacing w:after="0" w:line="260"/>
+              <w:jc w:val="center"/>
+            </w:pPr>
+            <w:r>
+              <w:rPr>
+                <w:rFonts w:ascii="Arial" w:cs="Arial" w:eastAsia="Arial" w:hAnsi="Arial"/>
+                <w:b w:val="false"/>
+                <w:bCs w:val="false"/>
+                <w:sz w:val="19"/>
+                <w:szCs w:val="19"/>
+                <w:rtl w:val="false"/>
+              </w:rPr>
+              <w:t xml:space="preserve">GO5</w:t>
+            </w:r>
+          </w:p>
+        </w:tc>
+        <w:tc>
+          <w:tcPr>
+            <w:tcW w:type="dxa" w:w="4930"/>
+            <w:tcBorders>
+              <w:top w:val="single" w:color="A6A6A6" w:sz="4"/>
+              <w:left w:val="single" w:color="A6A6A6" w:sz="4"/>
+              <w:bottom w:val="single" w:color="A6A6A6" w:sz="4"/>
+              <w:right w:val="single" w:color="A6A6A6" w:sz="4"/>
+            </w:tcBorders>
+            <w:tcMar>
+              <w:top w:type="dxa" w:w="50"/>
+              <w:left w:type="dxa" w:w="60"/>
+              <w:bottom w:type="dxa" w:w="50"/>
+              <w:right w:type="dxa" w:w="60"/>
+            </w:tcMar>
+          </w:tcPr>
+          <w:p>
+            <w:pPr>
+              <w:bidi w:val="false"/>
+              <w:spacing w:after="0" w:line="260"/>
+            </w:pPr>
+            <w:r>
+              <w:rPr>
+                <w:rFonts w:ascii="Arial" w:cs="Arial" w:eastAsia="Arial" w:hAnsi="Arial"/>
+                <w:b w:val="false"/>
+                <w:bCs w:val="false"/>
+                <w:sz w:val="19"/>
+                <w:szCs w:val="19"/>
+                <w:rtl w:val="false"/>
+              </w:rPr>
+              <w:t xml:space="preserve">When I am with a group, I easily merge with the others in the group</w:t>
+            </w:r>
+          </w:p>
+        </w:tc>
+        <w:tc>
+          <w:tcPr>
+            <w:tcW w:type="dxa" w:w="560"/>
+            <w:tcBorders>
+              <w:top w:val="single" w:color="A6A6A6" w:sz="4"/>
+              <w:left w:val="single" w:color="A6A6A6" w:sz="4"/>
+              <w:bottom w:val="single" w:color="A6A6A6" w:sz="4"/>
+              <w:right w:val="single" w:color="A6A6A6" w:sz="4"/>
+            </w:tcBorders>
+            <w:tcMar>
+              <w:top w:type="dxa" w:w="50"/>
+              <w:left w:type="dxa" w:w="60"/>
+              <w:bottom w:type="dxa" w:w="50"/>
+              <w:right w:type="dxa" w:w="60"/>
+            </w:tcMar>
+          </w:tcPr>
+          <w:p>
+            <w:pPr>
+              <w:bidi w:val="false"/>
+              <w:spacing w:after="0" w:line="260"/>
+              <w:jc w:val="center"/>
+            </w:pPr>
+            <w:r>
+              <w:rPr>
+                <w:rFonts w:ascii="Arial" w:cs="Arial" w:eastAsia="Arial" w:hAnsi="Arial"/>
+                <w:b w:val="false"/>
+                <w:bCs w:val="false"/>
+                <w:sz w:val="19"/>
+                <w:szCs w:val="19"/>
+                <w:rtl w:val="false"/>
+              </w:rPr>
+              <w:t xml:space="preserve">☐</w:t>
+            </w:r>
+          </w:p>
+        </w:tc>
+        <w:tc>
+          <w:tcPr>
+            <w:tcW w:type="dxa" w:w="560"/>
+            <w:tcBorders>
+              <w:top w:val="single" w:color="A6A6A6" w:sz="4"/>
+              <w:left w:val="single" w:color="A6A6A6" w:sz="4"/>
+              <w:bottom w:val="single" w:color="A6A6A6" w:sz="4"/>
+              <w:right w:val="single" w:color="A6A6A6" w:sz="4"/>
+            </w:tcBorders>
+            <w:tcMar>
+              <w:top w:type="dxa" w:w="50"/>
+              <w:left w:type="dxa" w:w="60"/>
+              <w:bottom w:type="dxa" w:w="50"/>
+              <w:right w:type="dxa" w:w="60"/>
+            </w:tcMar>
+          </w:tcPr>
+          <w:p>
+            <w:pPr>
+              <w:bidi w:val="false"/>
+              <w:spacing w:after="0" w:line="260"/>
+              <w:jc w:val="center"/>
+            </w:pPr>
+            <w:r>
+              <w:rPr>
+                <w:rFonts w:ascii="Arial" w:cs="Arial" w:eastAsia="Arial" w:hAnsi="Arial"/>
+                <w:b w:val="false"/>
+                <w:bCs w:val="false"/>
+                <w:sz w:val="19"/>
+                <w:szCs w:val="19"/>
+                <w:rtl w:val="false"/>
+              </w:rPr>
+              <w:t xml:space="preserve">☐</w:t>
+            </w:r>
+          </w:p>
+        </w:tc>
+        <w:tc>
+          <w:tcPr>
+            <w:tcW w:type="dxa" w:w="560"/>
+            <w:tcBorders>
+              <w:top w:val="single" w:color="A6A6A6" w:sz="4"/>
+              <w:left w:val="single" w:color="A6A6A6" w:sz="4"/>
+              <w:bottom w:val="single" w:color="A6A6A6" w:sz="4"/>
+              <w:right w:val="single" w:color="A6A6A6" w:sz="4"/>
+            </w:tcBorders>
+            <w:tcMar>
+              <w:top w:type="dxa" w:w="50"/>
+              <w:left w:type="dxa" w:w="60"/>
+              <w:bottom w:type="dxa" w:w="50"/>
+              <w:right w:type="dxa" w:w="60"/>
+            </w:tcMar>
+          </w:tcPr>
+          <w:p>
+            <w:pPr>
+              <w:bidi w:val="false"/>
+              <w:spacing w:after="0" w:line="260"/>
+              <w:jc w:val="center"/>
+            </w:pPr>
+            <w:r>
+              <w:rPr>
+                <w:rFonts w:ascii="Arial" w:cs="Arial" w:eastAsia="Arial" w:hAnsi="Arial"/>
+                <w:b w:val="false"/>
+                <w:bCs w:val="false"/>
+                <w:sz w:val="19"/>
+                <w:szCs w:val="19"/>
+                <w:rtl w:val="false"/>
+              </w:rPr>
+              <w:t xml:space="preserve">☐</w:t>
+            </w:r>
+          </w:p>
+        </w:tc>
+        <w:tc>
+          <w:tcPr>
+            <w:tcW w:type="dxa" w:w="560"/>
+            <w:tcBorders>
+              <w:top w:val="single" w:color="A6A6A6" w:sz="4"/>
+              <w:left w:val="single" w:color="A6A6A6" w:sz="4"/>
+              <w:bottom w:val="single" w:color="A6A6A6" w:sz="4"/>
+              <w:right w:val="single" w:color="A6A6A6" w:sz="4"/>
+            </w:tcBorders>
+            <w:tcMar>
+              <w:top w:type="dxa" w:w="50"/>
+              <w:left w:type="dxa" w:w="60"/>
+              <w:bottom w:type="dxa" w:w="50"/>
+              <w:right w:type="dxa" w:w="60"/>
+            </w:tcMar>
+          </w:tcPr>
+          <w:p>
+            <w:pPr>
+              <w:bidi w:val="false"/>
+              <w:spacing w:after="0" w:line="260"/>
+              <w:jc w:val="center"/>
+            </w:pPr>
+            <w:r>
+              <w:rPr>
+                <w:rFonts w:ascii="Arial" w:cs="Arial" w:eastAsia="Arial" w:hAnsi="Arial"/>
+                <w:b w:val="false"/>
+                <w:bCs w:val="false"/>
+                <w:sz w:val="19"/>
+                <w:szCs w:val="19"/>
+                <w:rtl w:val="false"/>
+              </w:rPr>
+              <w:t xml:space="preserve">☐</w:t>
+            </w:r>
+          </w:p>
+        </w:tc>
+        <w:tc>
+          <w:tcPr>
+            <w:tcW w:type="dxa" w:w="560"/>
+            <w:tcBorders>
+              <w:top w:val="single" w:color="A6A6A6" w:sz="4"/>
+              <w:left w:val="single" w:color="A6A6A6" w:sz="4"/>
+              <w:bottom w:val="single" w:color="A6A6A6" w:sz="4"/>
+              <w:right w:val="single" w:color="A6A6A6" w:sz="4"/>
+            </w:tcBorders>
+            <w:tcMar>
+              <w:top w:type="dxa" w:w="50"/>
+              <w:left w:type="dxa" w:w="60"/>
+              <w:bottom w:type="dxa" w:w="50"/>
+              <w:right w:type="dxa" w:w="60"/>
+            </w:tcMar>
+          </w:tcPr>
+          <w:p>
+            <w:pPr>
+              <w:bidi w:val="false"/>
+              <w:spacing w:after="0" w:line="260"/>
+              <w:jc w:val="center"/>
+            </w:pPr>
+            <w:r>
+              <w:rPr>
+                <w:rFonts w:ascii="Arial" w:cs="Arial" w:eastAsia="Arial" w:hAnsi="Arial"/>
+                <w:b w:val="false"/>
+                <w:bCs w:val="false"/>
+                <w:sz w:val="19"/>
+                <w:szCs w:val="19"/>
+                <w:rtl w:val="false"/>
+              </w:rPr>
+              <w:t xml:space="preserve">☐</w:t>
+            </w:r>
+          </w:p>
+        </w:tc>
+        <w:tc>
+          <w:tcPr>
+            <w:tcW w:type="dxa" w:w="560"/>
+            <w:tcBorders>
+              <w:top w:val="single" w:color="A6A6A6" w:sz="4"/>
+              <w:left w:val="single" w:color="A6A6A6" w:sz="4"/>
+              <w:bottom w:val="single" w:color="A6A6A6" w:sz="4"/>
+              <w:right w:val="single" w:color="A6A6A6" w:sz="4"/>
+            </w:tcBorders>
+            <w:tcMar>
+              <w:top w:type="dxa" w:w="50"/>
+              <w:left w:type="dxa" w:w="60"/>
+              <w:bottom w:type="dxa" w:w="50"/>
+              <w:right w:type="dxa" w:w="60"/>
+            </w:tcMar>
+          </w:tcPr>
+          <w:p>
+            <w:pPr>
+              <w:bidi w:val="false"/>
+              <w:spacing w:after="0" w:line="260"/>
+              <w:jc w:val="center"/>
+            </w:pPr>
+            <w:r>
+              <w:rPr>
+                <w:rFonts w:ascii="Arial" w:cs="Arial" w:eastAsia="Arial" w:hAnsi="Arial"/>
+                <w:b w:val="false"/>
+                <w:bCs w:val="false"/>
+                <w:sz w:val="19"/>
+                <w:szCs w:val="19"/>
+                <w:rtl w:val="false"/>
+              </w:rPr>
+              <w:t xml:space="preserve">☐</w:t>
+            </w:r>
+          </w:p>
+        </w:tc>
+        <w:tc>
+          <w:tcPr>
+            <w:tcW w:type="dxa" w:w="560"/>
+            <w:tcBorders>
+              <w:top w:val="single" w:color="A6A6A6" w:sz="4"/>
+              <w:left w:val="single" w:color="A6A6A6" w:sz="4"/>
+              <w:bottom w:val="single" w:color="A6A6A6" w:sz="4"/>
+              <w:right w:val="single" w:color="A6A6A6" w:sz="4"/>
+            </w:tcBorders>
+            <w:tcMar>
+              <w:top w:type="dxa" w:w="50"/>
+              <w:left w:type="dxa" w:w="60"/>
+              <w:bottom w:type="dxa" w:w="50"/>
+              <w:right w:type="dxa" w:w="60"/>
+            </w:tcMar>
+          </w:tcPr>
+          <w:p>
+            <w:pPr>
+              <w:bidi w:val="false"/>
+              <w:spacing w:after="0" w:line="260"/>
+              <w:jc w:val="center"/>
+            </w:pPr>
+            <w:r>
+              <w:rPr>
+                <w:rFonts w:ascii="Arial" w:cs="Arial" w:eastAsia="Arial" w:hAnsi="Arial"/>
+                <w:b w:val="false"/>
+                <w:bCs w:val="false"/>
+                <w:sz w:val="19"/>
+                <w:szCs w:val="19"/>
+                <w:rtl w:val="false"/>
+              </w:rPr>
+              <w:t xml:space="preserve">☐</w:t>
+            </w:r>
+          </w:p>
+        </w:tc>
+      </w:tr>
+      <w:tr>
+        <w:trPr>
+          <w:cantSplit/>
+          <w:tblHeader w:val="false"/>
+        </w:trPr>
+        <w:tc>
+          <w:tcPr>
+            <w:tcW w:type="dxa" w:w="650"/>
+            <w:tcBorders>
+              <w:top w:val="single" w:color="A6A6A6" w:sz="4"/>
+              <w:left w:val="single" w:color="A6A6A6" w:sz="4"/>
+              <w:bottom w:val="single" w:color="A6A6A6" w:sz="4"/>
+              <w:right w:val="single" w:color="A6A6A6" w:sz="4"/>
+            </w:tcBorders>
+            <w:tcMar>
+              <w:top w:type="dxa" w:w="50"/>
+              <w:left w:type="dxa" w:w="60"/>
+              <w:bottom w:type="dxa" w:w="50"/>
+              <w:right w:type="dxa" w:w="60"/>
+            </w:tcMar>
+          </w:tcPr>
+          <w:p>
+            <w:pPr>
+              <w:bidi w:val="false"/>
+              <w:spacing w:after="0" w:line="260"/>
+              <w:jc w:val="center"/>
+            </w:pPr>
+            <w:r>
+              <w:rPr>
+                <w:rFonts w:ascii="Arial" w:cs="Arial" w:eastAsia="Arial" w:hAnsi="Arial"/>
+                <w:b w:val="false"/>
+                <w:bCs w:val="false"/>
+                <w:sz w:val="19"/>
+                <w:szCs w:val="19"/>
+                <w:rtl w:val="false"/>
+              </w:rPr>
+              <w:t xml:space="preserve">GO6</w:t>
+            </w:r>
+          </w:p>
+        </w:tc>
+        <w:tc>
+          <w:tcPr>
+            <w:tcW w:type="dxa" w:w="4930"/>
+            <w:tcBorders>
+              <w:top w:val="single" w:color="A6A6A6" w:sz="4"/>
+              <w:left w:val="single" w:color="A6A6A6" w:sz="4"/>
+              <w:bottom w:val="single" w:color="A6A6A6" w:sz="4"/>
+              <w:right w:val="single" w:color="A6A6A6" w:sz="4"/>
+            </w:tcBorders>
+            <w:tcMar>
+              <w:top w:type="dxa" w:w="50"/>
+              <w:left w:type="dxa" w:w="60"/>
+              <w:bottom w:type="dxa" w:w="50"/>
+              <w:right w:type="dxa" w:w="60"/>
+            </w:tcMar>
+          </w:tcPr>
+          <w:p>
+            <w:pPr>
+              <w:bidi w:val="false"/>
+              <w:spacing w:after="0" w:line="260"/>
+            </w:pPr>
+            <w:r>
+              <w:rPr>
+                <w:rFonts w:ascii="Arial" w:cs="Arial" w:eastAsia="Arial" w:hAnsi="Arial"/>
+                <w:b w:val="false"/>
+                <w:bCs w:val="false"/>
+                <w:sz w:val="19"/>
+                <w:szCs w:val="19"/>
+                <w:rtl w:val="false"/>
+              </w:rPr>
+              <w:t xml:space="preserve">I easily identify with the groups that I belong to</w:t>
+            </w:r>
+          </w:p>
+        </w:tc>
+        <w:tc>
+          <w:tcPr>
+            <w:tcW w:type="dxa" w:w="560"/>
+            <w:tcBorders>
+              <w:top w:val="single" w:color="A6A6A6" w:sz="4"/>
+              <w:left w:val="single" w:color="A6A6A6" w:sz="4"/>
+              <w:bottom w:val="single" w:color="A6A6A6" w:sz="4"/>
+              <w:right w:val="single" w:color="A6A6A6" w:sz="4"/>
+            </w:tcBorders>
+            <w:tcMar>
+              <w:top w:type="dxa" w:w="50"/>
+              <w:left w:type="dxa" w:w="60"/>
+              <w:bottom w:type="dxa" w:w="50"/>
+              <w:right w:type="dxa" w:w="60"/>
+            </w:tcMar>
+          </w:tcPr>
+          <w:p>
+            <w:pPr>
+              <w:bidi w:val="false"/>
+              <w:spacing w:after="0" w:line="260"/>
+              <w:jc w:val="center"/>
+            </w:pPr>
+            <w:r>
+              <w:rPr>
+                <w:rFonts w:ascii="Arial" w:cs="Arial" w:eastAsia="Arial" w:hAnsi="Arial"/>
+                <w:b w:val="false"/>
+                <w:bCs w:val="false"/>
+                <w:sz w:val="19"/>
+                <w:szCs w:val="19"/>
+                <w:rtl w:val="false"/>
+              </w:rPr>
+              <w:t xml:space="preserve">☐</w:t>
+            </w:r>
+          </w:p>
+        </w:tc>
+        <w:tc>
+          <w:tcPr>
+            <w:tcW w:type="dxa" w:w="560"/>
+            <w:tcBorders>
+              <w:top w:val="single" w:color="A6A6A6" w:sz="4"/>
+              <w:left w:val="single" w:color="A6A6A6" w:sz="4"/>
+              <w:bottom w:val="single" w:color="A6A6A6" w:sz="4"/>
+              <w:right w:val="single" w:color="A6A6A6" w:sz="4"/>
+            </w:tcBorders>
+            <w:tcMar>
+              <w:top w:type="dxa" w:w="50"/>
+              <w:left w:type="dxa" w:w="60"/>
+              <w:bottom w:type="dxa" w:w="50"/>
+              <w:right w:type="dxa" w:w="60"/>
+            </w:tcMar>
+          </w:tcPr>
+          <w:p>
+            <w:pPr>
+              <w:bidi w:val="false"/>
+              <w:spacing w:after="0" w:line="260"/>
+              <w:jc w:val="center"/>
+            </w:pPr>
+            <w:r>
+              <w:rPr>
+                <w:rFonts w:ascii="Arial" w:cs="Arial" w:eastAsia="Arial" w:hAnsi="Arial"/>
+                <w:b w:val="false"/>
+                <w:bCs w:val="false"/>
+                <w:sz w:val="19"/>
+                <w:szCs w:val="19"/>
+                <w:rtl w:val="false"/>
+              </w:rPr>
+              <w:t xml:space="preserve">☐</w:t>
+            </w:r>
+          </w:p>
+        </w:tc>
+        <w:tc>
+          <w:tcPr>
+            <w:tcW w:type="dxa" w:w="560"/>
+            <w:tcBorders>
+              <w:top w:val="single" w:color="A6A6A6" w:sz="4"/>
+              <w:left w:val="single" w:color="A6A6A6" w:sz="4"/>
+              <w:bottom w:val="single" w:color="A6A6A6" w:sz="4"/>
+              <w:right w:val="single" w:color="A6A6A6" w:sz="4"/>
+            </w:tcBorders>
+            <w:tcMar>
+              <w:top w:type="dxa" w:w="50"/>
+              <w:left w:type="dxa" w:w="60"/>
+              <w:bottom w:type="dxa" w:w="50"/>
+              <w:right w:type="dxa" w:w="60"/>
+            </w:tcMar>
+          </w:tcPr>
+          <w:p>
+            <w:pPr>
+              <w:bidi w:val="false"/>
+              <w:spacing w:after="0" w:line="260"/>
+              <w:jc w:val="center"/>
+            </w:pPr>
+            <w:r>
+              <w:rPr>
+                <w:rFonts w:ascii="Arial" w:cs="Arial" w:eastAsia="Arial" w:hAnsi="Arial"/>
+                <w:b w:val="false"/>
+                <w:bCs w:val="false"/>
+                <w:sz w:val="19"/>
+                <w:szCs w:val="19"/>
+                <w:rtl w:val="false"/>
+              </w:rPr>
+              <w:t xml:space="preserve">☐</w:t>
+            </w:r>
+          </w:p>
+        </w:tc>
+        <w:tc>
+          <w:tcPr>
+            <w:tcW w:type="dxa" w:w="560"/>
+            <w:tcBorders>
+              <w:top w:val="single" w:color="A6A6A6" w:sz="4"/>
+              <w:left w:val="single" w:color="A6A6A6" w:sz="4"/>
+              <w:bottom w:val="single" w:color="A6A6A6" w:sz="4"/>
+              <w:right w:val="single" w:color="A6A6A6" w:sz="4"/>
+            </w:tcBorders>
+            <w:tcMar>
+              <w:top w:type="dxa" w:w="50"/>
+              <w:left w:type="dxa" w:w="60"/>
+              <w:bottom w:type="dxa" w:w="50"/>
+              <w:right w:type="dxa" w:w="60"/>
+            </w:tcMar>
+          </w:tcPr>
+          <w:p>
+            <w:pPr>
+              <w:bidi w:val="false"/>
+              <w:spacing w:after="0" w:line="260"/>
+              <w:jc w:val="center"/>
+            </w:pPr>
+            <w:r>
+              <w:rPr>
+                <w:rFonts w:ascii="Arial" w:cs="Arial" w:eastAsia="Arial" w:hAnsi="Arial"/>
+                <w:b w:val="false"/>
+                <w:bCs w:val="false"/>
+                <w:sz w:val="19"/>
+                <w:szCs w:val="19"/>
+                <w:rtl w:val="false"/>
+              </w:rPr>
+              <w:t xml:space="preserve">☐</w:t>
+            </w:r>
+          </w:p>
+        </w:tc>
+        <w:tc>
+          <w:tcPr>
+            <w:tcW w:type="dxa" w:w="560"/>
+            <w:tcBorders>
+              <w:top w:val="single" w:color="A6A6A6" w:sz="4"/>
+              <w:left w:val="single" w:color="A6A6A6" w:sz="4"/>
+              <w:bottom w:val="single" w:color="A6A6A6" w:sz="4"/>
+              <w:right w:val="single" w:color="A6A6A6" w:sz="4"/>
+            </w:tcBorders>
+            <w:tcMar>
+              <w:top w:type="dxa" w:w="50"/>
+              <w:left w:type="dxa" w:w="60"/>
+              <w:bottom w:type="dxa" w:w="50"/>
+              <w:right w:type="dxa" w:w="60"/>
+            </w:tcMar>
+          </w:tcPr>
+          <w:p>
+            <w:pPr>
+              <w:bidi w:val="false"/>
+              <w:spacing w:after="0" w:line="260"/>
+              <w:jc w:val="center"/>
+            </w:pPr>
+            <w:r>
+              <w:rPr>
+                <w:rFonts w:ascii="Arial" w:cs="Arial" w:eastAsia="Arial" w:hAnsi="Arial"/>
+                <w:b w:val="false"/>
+                <w:bCs w:val="false"/>
+                <w:sz w:val="19"/>
+                <w:szCs w:val="19"/>
+                <w:rtl w:val="false"/>
+              </w:rPr>
+              <w:t xml:space="preserve">☐</w:t>
+            </w:r>
+          </w:p>
+        </w:tc>
+        <w:tc>
+          <w:tcPr>
+            <w:tcW w:type="dxa" w:w="560"/>
+            <w:tcBorders>
+              <w:top w:val="single" w:color="A6A6A6" w:sz="4"/>
+              <w:left w:val="single" w:color="A6A6A6" w:sz="4"/>
+              <w:bottom w:val="single" w:color="A6A6A6" w:sz="4"/>
+              <w:right w:val="single" w:color="A6A6A6" w:sz="4"/>
+            </w:tcBorders>
+            <w:tcMar>
+              <w:top w:type="dxa" w:w="50"/>
+              <w:left w:type="dxa" w:w="60"/>
+              <w:bottom w:type="dxa" w:w="50"/>
+              <w:right w:type="dxa" w:w="60"/>
+            </w:tcMar>
+          </w:tcPr>
+          <w:p>
+            <w:pPr>
+              <w:bidi w:val="false"/>
+              <w:spacing w:after="0" w:line="260"/>
+              <w:jc w:val="center"/>
+            </w:pPr>
+            <w:r>
+              <w:rPr>
+                <w:rFonts w:ascii="Arial" w:cs="Arial" w:eastAsia="Arial" w:hAnsi="Arial"/>
+                <w:b w:val="false"/>
+                <w:bCs w:val="false"/>
+                <w:sz w:val="19"/>
+                <w:szCs w:val="19"/>
+                <w:rtl w:val="false"/>
+              </w:rPr>
+              <w:t xml:space="preserve">☐</w:t>
+            </w:r>
+          </w:p>
+        </w:tc>
+        <w:tc>
+          <w:tcPr>
+            <w:tcW w:type="dxa" w:w="560"/>
+            <w:tcBorders>
+              <w:top w:val="single" w:color="A6A6A6" w:sz="4"/>
+              <w:left w:val="single" w:color="A6A6A6" w:sz="4"/>
+              <w:bottom w:val="single" w:color="A6A6A6" w:sz="4"/>
+              <w:right w:val="single" w:color="A6A6A6" w:sz="4"/>
+            </w:tcBorders>
+            <w:tcMar>
+              <w:top w:type="dxa" w:w="50"/>
+              <w:left w:type="dxa" w:w="60"/>
+              <w:bottom w:type="dxa" w:w="50"/>
+              <w:right w:type="dxa" w:w="60"/>
+            </w:tcMar>
+          </w:tcPr>
+          <w:p>
+            <w:pPr>
+              <w:bidi w:val="false"/>
+              <w:spacing w:after="0" w:line="260"/>
+              <w:jc w:val="center"/>
+            </w:pPr>
+            <w:r>
+              <w:rPr>
+                <w:rFonts w:ascii="Arial" w:cs="Arial" w:eastAsia="Arial" w:hAnsi="Arial"/>
+                <w:b w:val="false"/>
+                <w:bCs w:val="false"/>
+                <w:sz w:val="19"/>
+                <w:szCs w:val="19"/>
+                <w:rtl w:val="false"/>
+              </w:rPr>
+              <w:t xml:space="preserve">☐</w:t>
+            </w:r>
+          </w:p>
+        </w:tc>
+      </w:tr>
+      <w:tr>
+        <w:trPr>
+          <w:cantSplit/>
+          <w:tblHeader w:val="false"/>
+        </w:trPr>
+        <w:tc>
+          <w:tcPr>
+            <w:tcW w:type="dxa" w:w="650"/>
+            <w:tcBorders>
+              <w:top w:val="single" w:color="A6A6A6" w:sz="4"/>
+              <w:left w:val="single" w:color="A6A6A6" w:sz="4"/>
+              <w:bottom w:val="single" w:color="A6A6A6" w:sz="4"/>
+              <w:right w:val="single" w:color="A6A6A6" w:sz="4"/>
+            </w:tcBorders>
+            <w:tcMar>
+              <w:top w:type="dxa" w:w="50"/>
+              <w:left w:type="dxa" w:w="60"/>
+              <w:bottom w:type="dxa" w:w="50"/>
+              <w:right w:type="dxa" w:w="60"/>
+            </w:tcMar>
+          </w:tcPr>
+          <w:p>
+            <w:pPr>
+              <w:bidi w:val="false"/>
+              <w:spacing w:after="0" w:line="260"/>
+              <w:jc w:val="center"/>
+            </w:pPr>
+            <w:r>
+              <w:rPr>
+                <w:rFonts w:ascii="Arial" w:cs="Arial" w:eastAsia="Arial" w:hAnsi="Arial"/>
+                <w:b w:val="false"/>
+                <w:bCs w:val="false"/>
+                <w:sz w:val="19"/>
+                <w:szCs w:val="19"/>
+                <w:rtl w:val="false"/>
+              </w:rPr>
+              <w:t xml:space="preserve">GO7</w:t>
+            </w:r>
+          </w:p>
+        </w:tc>
+        <w:tc>
+          <w:tcPr>
+            <w:tcW w:type="dxa" w:w="4930"/>
+            <w:tcBorders>
+              <w:top w:val="single" w:color="A6A6A6" w:sz="4"/>
+              <w:left w:val="single" w:color="A6A6A6" w:sz="4"/>
+              <w:bottom w:val="single" w:color="A6A6A6" w:sz="4"/>
+              <w:right w:val="single" w:color="A6A6A6" w:sz="4"/>
+            </w:tcBorders>
+            <w:tcMar>
+              <w:top w:type="dxa" w:w="50"/>
+              <w:left w:type="dxa" w:w="60"/>
+              <w:bottom w:type="dxa" w:w="50"/>
+              <w:right w:type="dxa" w:w="60"/>
+            </w:tcMar>
+          </w:tcPr>
+          <w:p>
+            <w:pPr>
+              <w:bidi w:val="false"/>
+              <w:spacing w:after="0" w:line="260"/>
+            </w:pPr>
+            <w:r>
+              <w:rPr>
+                <w:rFonts w:ascii="Arial" w:cs="Arial" w:eastAsia="Arial" w:hAnsi="Arial"/>
+                <w:b w:val="false"/>
+                <w:bCs w:val="false"/>
+                <w:sz w:val="19"/>
+                <w:szCs w:val="19"/>
+                <w:rtl w:val="false"/>
+              </w:rPr>
+              <w:t xml:space="preserve">I take pleasure in collaborating in groups</w:t>
+            </w:r>
+          </w:p>
+        </w:tc>
+        <w:tc>
+          <w:tcPr>
+            <w:tcW w:type="dxa" w:w="560"/>
+            <w:tcBorders>
+              <w:top w:val="single" w:color="A6A6A6" w:sz="4"/>
+              <w:left w:val="single" w:color="A6A6A6" w:sz="4"/>
+              <w:bottom w:val="single" w:color="A6A6A6" w:sz="4"/>
+              <w:right w:val="single" w:color="A6A6A6" w:sz="4"/>
+            </w:tcBorders>
+            <w:tcMar>
+              <w:top w:type="dxa" w:w="50"/>
+              <w:left w:type="dxa" w:w="60"/>
+              <w:bottom w:type="dxa" w:w="50"/>
+              <w:right w:type="dxa" w:w="60"/>
+            </w:tcMar>
+          </w:tcPr>
+          <w:p>
+            <w:pPr>
+              <w:bidi w:val="false"/>
+              <w:spacing w:after="0" w:line="260"/>
+              <w:jc w:val="center"/>
+            </w:pPr>
+            <w:r>
+              <w:rPr>
+                <w:rFonts w:ascii="Arial" w:cs="Arial" w:eastAsia="Arial" w:hAnsi="Arial"/>
+                <w:b w:val="false"/>
+                <w:bCs w:val="false"/>
+                <w:sz w:val="19"/>
+                <w:szCs w:val="19"/>
+                <w:rtl w:val="false"/>
+              </w:rPr>
+              <w:t xml:space="preserve">☐</w:t>
+            </w:r>
+          </w:p>
+        </w:tc>
+        <w:tc>
+          <w:tcPr>
+            <w:tcW w:type="dxa" w:w="560"/>
+            <w:tcBorders>
+              <w:top w:val="single" w:color="A6A6A6" w:sz="4"/>
+              <w:left w:val="single" w:color="A6A6A6" w:sz="4"/>
+              <w:bottom w:val="single" w:color="A6A6A6" w:sz="4"/>
+              <w:right w:val="single" w:color="A6A6A6" w:sz="4"/>
+            </w:tcBorders>
+            <w:tcMar>
+              <w:top w:type="dxa" w:w="50"/>
+              <w:left w:type="dxa" w:w="60"/>
+              <w:bottom w:type="dxa" w:w="50"/>
+              <w:right w:type="dxa" w:w="60"/>
+            </w:tcMar>
+          </w:tcPr>
+          <w:p>
+            <w:pPr>
+              <w:bidi w:val="false"/>
+              <w:spacing w:after="0" w:line="260"/>
+              <w:jc w:val="center"/>
+            </w:pPr>
+            <w:r>
+              <w:rPr>
+                <w:rFonts w:ascii="Arial" w:cs="Arial" w:eastAsia="Arial" w:hAnsi="Arial"/>
+                <w:b w:val="false"/>
+                <w:bCs w:val="false"/>
+                <w:sz w:val="19"/>
+                <w:szCs w:val="19"/>
+                <w:rtl w:val="false"/>
+              </w:rPr>
+              <w:t xml:space="preserve">☐</w:t>
+            </w:r>
+          </w:p>
+        </w:tc>
+        <w:tc>
+          <w:tcPr>
+            <w:tcW w:type="dxa" w:w="560"/>
+            <w:tcBorders>
+              <w:top w:val="single" w:color="A6A6A6" w:sz="4"/>
+              <w:left w:val="single" w:color="A6A6A6" w:sz="4"/>
+              <w:bottom w:val="single" w:color="A6A6A6" w:sz="4"/>
+              <w:right w:val="single" w:color="A6A6A6" w:sz="4"/>
+            </w:tcBorders>
+            <w:tcMar>
+              <w:top w:type="dxa" w:w="50"/>
+              <w:left w:type="dxa" w:w="60"/>
+              <w:bottom w:type="dxa" w:w="50"/>
+              <w:right w:type="dxa" w:w="60"/>
+            </w:tcMar>
+          </w:tcPr>
+          <w:p>
+            <w:pPr>
+              <w:bidi w:val="false"/>
+              <w:spacing w:after="0" w:line="260"/>
+              <w:jc w:val="center"/>
+            </w:pPr>
+            <w:r>
+              <w:rPr>
+                <w:rFonts w:ascii="Arial" w:cs="Arial" w:eastAsia="Arial" w:hAnsi="Arial"/>
+                <w:b w:val="false"/>
+                <w:bCs w:val="false"/>
+                <w:sz w:val="19"/>
+                <w:szCs w:val="19"/>
+                <w:rtl w:val="false"/>
+              </w:rPr>
+              <w:t xml:space="preserve">☐</w:t>
+            </w:r>
+          </w:p>
+        </w:tc>
+        <w:tc>
+          <w:tcPr>
+            <w:tcW w:type="dxa" w:w="560"/>
+            <w:tcBorders>
+              <w:top w:val="single" w:color="A6A6A6" w:sz="4"/>
+              <w:left w:val="single" w:color="A6A6A6" w:sz="4"/>
+              <w:bottom w:val="single" w:color="A6A6A6" w:sz="4"/>
+              <w:right w:val="single" w:color="A6A6A6" w:sz="4"/>
+            </w:tcBorders>
+            <w:tcMar>
+              <w:top w:type="dxa" w:w="50"/>
+              <w:left w:type="dxa" w:w="60"/>
+              <w:bottom w:type="dxa" w:w="50"/>
+              <w:right w:type="dxa" w:w="60"/>
+            </w:tcMar>
+          </w:tcPr>
+          <w:p>
+            <w:pPr>
+              <w:bidi w:val="false"/>
+              <w:spacing w:after="0" w:line="260"/>
+              <w:jc w:val="center"/>
+            </w:pPr>
+            <w:r>
+              <w:rPr>
+                <w:rFonts w:ascii="Arial" w:cs="Arial" w:eastAsia="Arial" w:hAnsi="Arial"/>
+                <w:b w:val="false"/>
+                <w:bCs w:val="false"/>
+                <w:sz w:val="19"/>
+                <w:szCs w:val="19"/>
+                <w:rtl w:val="false"/>
+              </w:rPr>
+              <w:t xml:space="preserve">☐</w:t>
+            </w:r>
+          </w:p>
+        </w:tc>
+        <w:tc>
+          <w:tcPr>
+            <w:tcW w:type="dxa" w:w="560"/>
+            <w:tcBorders>
+              <w:top w:val="single" w:color="A6A6A6" w:sz="4"/>
+              <w:left w:val="single" w:color="A6A6A6" w:sz="4"/>
+              <w:bottom w:val="single" w:color="A6A6A6" w:sz="4"/>
+              <w:right w:val="single" w:color="A6A6A6" w:sz="4"/>
+            </w:tcBorders>
+            <w:tcMar>
+              <w:top w:type="dxa" w:w="50"/>
+              <w:left w:type="dxa" w:w="60"/>
+              <w:bottom w:type="dxa" w:w="50"/>
+              <w:right w:type="dxa" w:w="60"/>
+            </w:tcMar>
+          </w:tcPr>
+          <w:p>
+            <w:pPr>
+              <w:bidi w:val="false"/>
+              <w:spacing w:after="0" w:line="260"/>
+              <w:jc w:val="center"/>
+            </w:pPr>
+            <w:r>
+              <w:rPr>
+                <w:rFonts w:ascii="Arial" w:cs="Arial" w:eastAsia="Arial" w:hAnsi="Arial"/>
+                <w:b w:val="false"/>
+                <w:bCs w:val="false"/>
+                <w:sz w:val="19"/>
+                <w:szCs w:val="19"/>
+                <w:rtl w:val="false"/>
+              </w:rPr>
+              <w:t xml:space="preserve">☐</w:t>
+            </w:r>
+          </w:p>
+        </w:tc>
+        <w:tc>
+          <w:tcPr>
+            <w:tcW w:type="dxa" w:w="560"/>
+            <w:tcBorders>
+              <w:top w:val="single" w:color="A6A6A6" w:sz="4"/>
+              <w:left w:val="single" w:color="A6A6A6" w:sz="4"/>
+              <w:bottom w:val="single" w:color="A6A6A6" w:sz="4"/>
+              <w:right w:val="single" w:color="A6A6A6" w:sz="4"/>
+            </w:tcBorders>
+            <w:tcMar>
+              <w:top w:type="dxa" w:w="50"/>
+              <w:left w:type="dxa" w:w="60"/>
+              <w:bottom w:type="dxa" w:w="50"/>
+              <w:right w:type="dxa" w:w="60"/>
+            </w:tcMar>
+          </w:tcPr>
+          <w:p>
+            <w:pPr>
+              <w:bidi w:val="false"/>
+              <w:spacing w:after="0" w:line="260"/>
+              <w:jc w:val="center"/>
+            </w:pPr>
+            <w:r>
+              <w:rPr>
+                <w:rFonts w:ascii="Arial" w:cs="Arial" w:eastAsia="Arial" w:hAnsi="Arial"/>
+                <w:b w:val="false"/>
+                <w:bCs w:val="false"/>
+                <w:sz w:val="19"/>
+                <w:szCs w:val="19"/>
+                <w:rtl w:val="false"/>
+              </w:rPr>
+              <w:t xml:space="preserve">☐</w:t>
+            </w:r>
+          </w:p>
+        </w:tc>
+        <w:tc>
+          <w:tcPr>
+            <w:tcW w:type="dxa" w:w="560"/>
+            <w:tcBorders>
+              <w:top w:val="single" w:color="A6A6A6" w:sz="4"/>
+              <w:left w:val="single" w:color="A6A6A6" w:sz="4"/>
+              <w:bottom w:val="single" w:color="A6A6A6" w:sz="4"/>
+              <w:right w:val="single" w:color="A6A6A6" w:sz="4"/>
+            </w:tcBorders>
+            <w:tcMar>
+              <w:top w:type="dxa" w:w="50"/>
+              <w:left w:type="dxa" w:w="60"/>
+              <w:bottom w:type="dxa" w:w="50"/>
+              <w:right w:type="dxa" w:w="60"/>
+            </w:tcMar>
+          </w:tcPr>
+          <w:p>
+            <w:pPr>
+              <w:bidi w:val="false"/>
+              <w:spacing w:after="0" w:line="260"/>
+              <w:jc w:val="center"/>
+            </w:pPr>
+            <w:r>
+              <w:rPr>
+                <w:rFonts w:ascii="Arial" w:cs="Arial" w:eastAsia="Arial" w:hAnsi="Arial"/>
+                <w:b w:val="false"/>
+                <w:bCs w:val="false"/>
+                <w:sz w:val="19"/>
+                <w:szCs w:val="19"/>
+                <w:rtl w:val="false"/>
+              </w:rPr>
+              <w:t xml:space="preserve">☐</w:t>
+            </w:r>
+          </w:p>
+        </w:tc>
+      </w:tr>
+      <w:tr>
+        <w:trPr>
+          <w:cantSplit/>
+          <w:tblHeader w:val="false"/>
+        </w:trPr>
+        <w:tc>
+          <w:tcPr>
+            <w:tcW w:type="dxa" w:w="650"/>
+            <w:tcBorders>
+              <w:top w:val="single" w:color="A6A6A6" w:sz="4"/>
+              <w:left w:val="single" w:color="A6A6A6" w:sz="4"/>
+              <w:bottom w:val="single" w:color="A6A6A6" w:sz="4"/>
+              <w:right w:val="single" w:color="A6A6A6" w:sz="4"/>
+            </w:tcBorders>
+            <w:tcMar>
+              <w:top w:type="dxa" w:w="50"/>
+              <w:left w:type="dxa" w:w="60"/>
+              <w:bottom w:type="dxa" w:w="50"/>
+              <w:right w:type="dxa" w:w="60"/>
+            </w:tcMar>
+          </w:tcPr>
+          <w:p>
+            <w:pPr>
+              <w:bidi w:val="false"/>
+              <w:spacing w:after="0" w:line="260"/>
+              <w:jc w:val="center"/>
+            </w:pPr>
+            <w:r>
+              <w:rPr>
+                <w:rFonts w:ascii="Arial" w:cs="Arial" w:eastAsia="Arial" w:hAnsi="Arial"/>
+                <w:b w:val="false"/>
+                <w:bCs w:val="false"/>
+                <w:sz w:val="19"/>
+                <w:szCs w:val="19"/>
+                <w:rtl w:val="false"/>
+              </w:rPr>
+              <w:t xml:space="preserve">GO8</w:t>
+            </w:r>
+          </w:p>
+        </w:tc>
+        <w:tc>
+          <w:tcPr>
+            <w:tcW w:type="dxa" w:w="4930"/>
+            <w:tcBorders>
+              <w:top w:val="single" w:color="A6A6A6" w:sz="4"/>
+              <w:left w:val="single" w:color="A6A6A6" w:sz="4"/>
+              <w:bottom w:val="single" w:color="A6A6A6" w:sz="4"/>
+              <w:right w:val="single" w:color="A6A6A6" w:sz="4"/>
+            </w:tcBorders>
+            <w:tcMar>
+              <w:top w:type="dxa" w:w="50"/>
+              <w:left w:type="dxa" w:w="60"/>
+              <w:bottom w:type="dxa" w:w="50"/>
+              <w:right w:type="dxa" w:w="60"/>
+            </w:tcMar>
+          </w:tcPr>
+          <w:p>
+            <w:pPr>
+              <w:bidi w:val="false"/>
+              <w:spacing w:after="0" w:line="260"/>
+            </w:pPr>
+            <w:r>
+              <w:rPr>
+                <w:rFonts w:ascii="Arial" w:cs="Arial" w:eastAsia="Arial" w:hAnsi="Arial"/>
+                <w:b w:val="false"/>
+                <w:bCs w:val="false"/>
+                <w:sz w:val="19"/>
+                <w:szCs w:val="19"/>
+                <w:rtl w:val="false"/>
+              </w:rPr>
+              <w:t xml:space="preserve">I enjoy working to a group goal</w:t>
+            </w:r>
+          </w:p>
+        </w:tc>
+        <w:tc>
+          <w:tcPr>
+            <w:tcW w:type="dxa" w:w="560"/>
+            <w:tcBorders>
+              <w:top w:val="single" w:color="A6A6A6" w:sz="4"/>
+              <w:left w:val="single" w:color="A6A6A6" w:sz="4"/>
+              <w:bottom w:val="single" w:color="A6A6A6" w:sz="4"/>
+              <w:right w:val="single" w:color="A6A6A6" w:sz="4"/>
+            </w:tcBorders>
+            <w:tcMar>
+              <w:top w:type="dxa" w:w="50"/>
+              <w:left w:type="dxa" w:w="60"/>
+              <w:bottom w:type="dxa" w:w="50"/>
+              <w:right w:type="dxa" w:w="60"/>
+            </w:tcMar>
+          </w:tcPr>
+          <w:p>
+            <w:pPr>
+              <w:bidi w:val="false"/>
+              <w:spacing w:after="0" w:line="260"/>
+              <w:jc w:val="center"/>
+            </w:pPr>
+            <w:r>
+              <w:rPr>
+                <w:rFonts w:ascii="Arial" w:cs="Arial" w:eastAsia="Arial" w:hAnsi="Arial"/>
+                <w:b w:val="false"/>
+                <w:bCs w:val="false"/>
+                <w:sz w:val="19"/>
+                <w:szCs w:val="19"/>
+                <w:rtl w:val="false"/>
+              </w:rPr>
+              <w:t xml:space="preserve">☐</w:t>
+            </w:r>
+          </w:p>
+        </w:tc>
+        <w:tc>
+          <w:tcPr>
+            <w:tcW w:type="dxa" w:w="560"/>
+            <w:tcBorders>
+              <w:top w:val="single" w:color="A6A6A6" w:sz="4"/>
+              <w:left w:val="single" w:color="A6A6A6" w:sz="4"/>
+              <w:bottom w:val="single" w:color="A6A6A6" w:sz="4"/>
+              <w:right w:val="single" w:color="A6A6A6" w:sz="4"/>
+            </w:tcBorders>
+            <w:tcMar>
+              <w:top w:type="dxa" w:w="50"/>
+              <w:left w:type="dxa" w:w="60"/>
+              <w:bottom w:type="dxa" w:w="50"/>
+              <w:right w:type="dxa" w:w="60"/>
+            </w:tcMar>
+          </w:tcPr>
+          <w:p>
+            <w:pPr>
+              <w:bidi w:val="false"/>
+              <w:spacing w:after="0" w:line="260"/>
+              <w:jc w:val="center"/>
+            </w:pPr>
+            <w:r>
+              <w:rPr>
+                <w:rFonts w:ascii="Arial" w:cs="Arial" w:eastAsia="Arial" w:hAnsi="Arial"/>
+                <w:b w:val="false"/>
+                <w:bCs w:val="false"/>
+                <w:sz w:val="19"/>
+                <w:szCs w:val="19"/>
+                <w:rtl w:val="false"/>
+              </w:rPr>
+              <w:t xml:space="preserve">☐</w:t>
+            </w:r>
+          </w:p>
+        </w:tc>
+        <w:tc>
+          <w:tcPr>
+            <w:tcW w:type="dxa" w:w="560"/>
+            <w:tcBorders>
+              <w:top w:val="single" w:color="A6A6A6" w:sz="4"/>
+              <w:left w:val="single" w:color="A6A6A6" w:sz="4"/>
+              <w:bottom w:val="single" w:color="A6A6A6" w:sz="4"/>
+              <w:right w:val="single" w:color="A6A6A6" w:sz="4"/>
+            </w:tcBorders>
+            <w:tcMar>
+              <w:top w:type="dxa" w:w="50"/>
+              <w:left w:type="dxa" w:w="60"/>
+              <w:bottom w:type="dxa" w:w="50"/>
+              <w:right w:type="dxa" w:w="60"/>
+            </w:tcMar>
+          </w:tcPr>
+          <w:p>
+            <w:pPr>
+              <w:bidi w:val="false"/>
+              <w:spacing w:after="0" w:line="260"/>
+              <w:jc w:val="center"/>
+            </w:pPr>
+            <w:r>
+              <w:rPr>
+                <w:rFonts w:ascii="Arial" w:cs="Arial" w:eastAsia="Arial" w:hAnsi="Arial"/>
+                <w:b w:val="false"/>
+                <w:bCs w:val="false"/>
+                <w:sz w:val="19"/>
+                <w:szCs w:val="19"/>
+                <w:rtl w:val="false"/>
+              </w:rPr>
+              <w:t xml:space="preserve">☐</w:t>
+            </w:r>
+          </w:p>
+        </w:tc>
+        <w:tc>
+          <w:tcPr>
+            <w:tcW w:type="dxa" w:w="560"/>
+            <w:tcBorders>
+              <w:top w:val="single" w:color="A6A6A6" w:sz="4"/>
+              <w:left w:val="single" w:color="A6A6A6" w:sz="4"/>
+              <w:bottom w:val="single" w:color="A6A6A6" w:sz="4"/>
+              <w:right w:val="single" w:color="A6A6A6" w:sz="4"/>
+            </w:tcBorders>
+            <w:tcMar>
+              <w:top w:type="dxa" w:w="50"/>
+              <w:left w:type="dxa" w:w="60"/>
+              <w:bottom w:type="dxa" w:w="50"/>
+              <w:right w:type="dxa" w:w="60"/>
+            </w:tcMar>
+          </w:tcPr>
+          <w:p>
+            <w:pPr>
+              <w:bidi w:val="false"/>
+              <w:spacing w:after="0" w:line="260"/>
+              <w:jc w:val="center"/>
+            </w:pPr>
+            <w:r>
+              <w:rPr>
+                <w:rFonts w:ascii="Arial" w:cs="Arial" w:eastAsia="Arial" w:hAnsi="Arial"/>
+                <w:b w:val="false"/>
+                <w:bCs w:val="false"/>
+                <w:sz w:val="19"/>
+                <w:szCs w:val="19"/>
+                <w:rtl w:val="false"/>
+              </w:rPr>
+              <w:t xml:space="preserve">☐</w:t>
+            </w:r>
+          </w:p>
+        </w:tc>
+        <w:tc>
+          <w:tcPr>
+            <w:tcW w:type="dxa" w:w="560"/>
+            <w:tcBorders>
+              <w:top w:val="single" w:color="A6A6A6" w:sz="4"/>
+              <w:left w:val="single" w:color="A6A6A6" w:sz="4"/>
+              <w:bottom w:val="single" w:color="A6A6A6" w:sz="4"/>
+              <w:right w:val="single" w:color="A6A6A6" w:sz="4"/>
+            </w:tcBorders>
+            <w:tcMar>
+              <w:top w:type="dxa" w:w="50"/>
+              <w:left w:type="dxa" w:w="60"/>
+              <w:bottom w:type="dxa" w:w="50"/>
+              <w:right w:type="dxa" w:w="60"/>
+            </w:tcMar>
+          </w:tcPr>
+          <w:p>
+            <w:pPr>
+              <w:bidi w:val="false"/>
+              <w:spacing w:after="0" w:line="260"/>
+              <w:jc w:val="center"/>
+            </w:pPr>
+            <w:r>
+              <w:rPr>
+                <w:rFonts w:ascii="Arial" w:cs="Arial" w:eastAsia="Arial" w:hAnsi="Arial"/>
+                <w:b w:val="false"/>
+                <w:bCs w:val="false"/>
+                <w:sz w:val="19"/>
+                <w:szCs w:val="19"/>
+                <w:rtl w:val="false"/>
+              </w:rPr>
+              <w:t xml:space="preserve">☐</w:t>
+            </w:r>
+          </w:p>
+        </w:tc>
+        <w:tc>
+          <w:tcPr>
+            <w:tcW w:type="dxa" w:w="560"/>
+            <w:tcBorders>
+              <w:top w:val="single" w:color="A6A6A6" w:sz="4"/>
+              <w:left w:val="single" w:color="A6A6A6" w:sz="4"/>
+              <w:bottom w:val="single" w:color="A6A6A6" w:sz="4"/>
+              <w:right w:val="single" w:color="A6A6A6" w:sz="4"/>
+            </w:tcBorders>
+            <w:tcMar>
+              <w:top w:type="dxa" w:w="50"/>
+              <w:left w:type="dxa" w:w="60"/>
+              <w:bottom w:type="dxa" w:w="50"/>
+              <w:right w:type="dxa" w:w="60"/>
+            </w:tcMar>
+          </w:tcPr>
+          <w:p>
+            <w:pPr>
+              <w:bidi w:val="false"/>
+              <w:spacing w:after="0" w:line="260"/>
+              <w:jc w:val="center"/>
+            </w:pPr>
+            <w:r>
+              <w:rPr>
+                <w:rFonts w:ascii="Arial" w:cs="Arial" w:eastAsia="Arial" w:hAnsi="Arial"/>
+                <w:b w:val="false"/>
+                <w:bCs w:val="false"/>
+                <w:sz w:val="19"/>
+                <w:szCs w:val="19"/>
+                <w:rtl w:val="false"/>
+              </w:rPr>
+              <w:t xml:space="preserve">☐</w:t>
+            </w:r>
+          </w:p>
+        </w:tc>
+        <w:tc>
+          <w:tcPr>
+            <w:tcW w:type="dxa" w:w="560"/>
+            <w:tcBorders>
+              <w:top w:val="single" w:color="A6A6A6" w:sz="4"/>
+              <w:left w:val="single" w:color="A6A6A6" w:sz="4"/>
+              <w:bottom w:val="single" w:color="A6A6A6" w:sz="4"/>
+              <w:right w:val="single" w:color="A6A6A6" w:sz="4"/>
+            </w:tcBorders>
+            <w:tcMar>
+              <w:top w:type="dxa" w:w="50"/>
+              <w:left w:type="dxa" w:w="60"/>
+              <w:bottom w:type="dxa" w:w="50"/>
+              <w:right w:type="dxa" w:w="60"/>
+            </w:tcMar>
+          </w:tcPr>
+          <w:p>
+            <w:pPr>
+              <w:bidi w:val="false"/>
+              <w:spacing w:after="0" w:line="260"/>
+              <w:jc w:val="center"/>
+            </w:pPr>
+            <w:r>
+              <w:rPr>
+                <w:rFonts w:ascii="Arial" w:cs="Arial" w:eastAsia="Arial" w:hAnsi="Arial"/>
+                <w:b w:val="false"/>
+                <w:bCs w:val="false"/>
+                <w:sz w:val="19"/>
+                <w:szCs w:val="19"/>
+                <w:rtl w:val="false"/>
+              </w:rPr>
+              <w:t xml:space="preserve">☐</w:t>
+            </w:r>
+          </w:p>
+        </w:tc>
+      </w:tr>
+    </w:tbl>
+    <w:p>
+      <w:pPr>
+        <w:spacing w:after="80"/>
+      </w:pPr>
+    </w:p>
+    <w:p>
+      <w:pPr>
         <w:bidi w:val="false"/>
         <w:spacing w:after="100" w:line="300"/>
       </w:pPr>
@@ -39387,6 +42326,182 @@
                 <w:szCs w:val="19"/>
                 <w:rtl w:val="false"/>
               </w:rPr>
+              <w:t xml:space="preserve">Group orientation (GOS)</w:t>
+            </w:r>
+          </w:p>
+        </w:tc>
+        <w:tc>
+          <w:tcPr>
+            <w:tcW w:type="dxa" w:w="2200"/>
+            <w:tcBorders>
+              <w:top w:val="single" w:color="A6A6A6" w:sz="4"/>
+              <w:left w:val="single" w:color="A6A6A6" w:sz="4"/>
+              <w:bottom w:val="single" w:color="A6A6A6" w:sz="4"/>
+              <w:right w:val="single" w:color="A6A6A6" w:sz="4"/>
+            </w:tcBorders>
+            <w:tcMar>
+              <w:top w:type="dxa" w:w="50"/>
+              <w:left w:type="dxa" w:w="60"/>
+              <w:bottom w:type="dxa" w:w="50"/>
+              <w:right w:type="dxa" w:w="60"/>
+            </w:tcMar>
+          </w:tcPr>
+          <w:p>
+            <w:pPr>
+              <w:bidi w:val="false"/>
+              <w:spacing w:after="0" w:line="260"/>
+            </w:pPr>
+            <w:r>
+              <w:rPr>
+                <w:rFonts w:ascii="Arial" w:cs="Arial" w:eastAsia="Arial" w:hAnsi="Arial"/>
+                <w:b w:val="false"/>
+                <w:bCs w:val="false"/>
+                <w:sz w:val="19"/>
+                <w:szCs w:val="19"/>
+                <w:rtl w:val="false"/>
+              </w:rPr>
+              <w:t xml:space="preserve">Kuppens, Manstead, Spears &amp; Sweetman (2026), Table 2</w:t>
+            </w:r>
+          </w:p>
+        </w:tc>
+        <w:tc>
+          <w:tcPr>
+            <w:tcW w:type="dxa" w:w="800"/>
+            <w:tcBorders>
+              <w:top w:val="single" w:color="A6A6A6" w:sz="4"/>
+              <w:left w:val="single" w:color="A6A6A6" w:sz="4"/>
+              <w:bottom w:val="single" w:color="A6A6A6" w:sz="4"/>
+              <w:right w:val="single" w:color="A6A6A6" w:sz="4"/>
+            </w:tcBorders>
+            <w:tcMar>
+              <w:top w:type="dxa" w:w="50"/>
+              <w:left w:type="dxa" w:w="60"/>
+              <w:bottom w:type="dxa" w:w="50"/>
+              <w:right w:type="dxa" w:w="60"/>
+            </w:tcMar>
+          </w:tcPr>
+          <w:p>
+            <w:pPr>
+              <w:bidi w:val="false"/>
+              <w:spacing w:after="0" w:line="260"/>
+            </w:pPr>
+            <w:r>
+              <w:rPr>
+                <w:rFonts w:ascii="Arial" w:cs="Arial" w:eastAsia="Arial" w:hAnsi="Arial"/>
+                <w:b w:val="false"/>
+                <w:bCs w:val="false"/>
+                <w:sz w:val="19"/>
+                <w:szCs w:val="19"/>
+                <w:rtl w:val="false"/>
+              </w:rPr>
+              <w:t xml:space="preserve">8</w:t>
+            </w:r>
+          </w:p>
+        </w:tc>
+        <w:tc>
+          <w:tcPr>
+            <w:tcW w:type="dxa" w:w="3000"/>
+            <w:tcBorders>
+              <w:top w:val="single" w:color="A6A6A6" w:sz="4"/>
+              <w:left w:val="single" w:color="A6A6A6" w:sz="4"/>
+              <w:bottom w:val="single" w:color="A6A6A6" w:sz="4"/>
+              <w:right w:val="single" w:color="A6A6A6" w:sz="4"/>
+            </w:tcBorders>
+            <w:tcMar>
+              <w:top w:type="dxa" w:w="50"/>
+              <w:left w:type="dxa" w:w="60"/>
+              <w:bottom w:type="dxa" w:w="50"/>
+              <w:right w:type="dxa" w:w="60"/>
+            </w:tcMar>
+          </w:tcPr>
+          <w:p>
+            <w:pPr>
+              <w:bidi w:val="false"/>
+              <w:spacing w:after="0" w:line="260"/>
+            </w:pPr>
+            <w:r>
+              <w:rPr>
+                <w:rFonts w:ascii="Arial" w:cs="Arial" w:eastAsia="Arial" w:hAnsi="Arial"/>
+                <w:b w:val="false"/>
+                <w:bCs w:val="false"/>
+                <w:sz w:val="19"/>
+                <w:szCs w:val="19"/>
+                <w:rtl w:val="false"/>
+              </w:rPr>
+              <w:t xml:space="preserve">VERIFIED against the paper (your report): eight final items verbatim; 7-point −3 to +3 (only endpoints and midpoint labelled); GO3 and GO4 reversed (sign change); alpha .76–.90 across 8 samples (n = 3,209). The scale is unidimensional; do not read items 7–8 as a subscale of collective goals. Do not restore dropped items 11 and 14 (individual vs group goals). A general individual trait, not a perception of this team. Licence: "© The Author(s) 2026"; no explicit CC BY seen (a search snippet had said CC: inconsistent)</w:t>
+            </w:r>
+          </w:p>
+        </w:tc>
+        <w:tc>
+          <w:tcPr>
+            <w:tcW w:type="dxa" w:w="2000"/>
+            <w:tcBorders>
+              <w:top w:val="single" w:color="A6A6A6" w:sz="4"/>
+              <w:left w:val="single" w:color="A6A6A6" w:sz="4"/>
+              <w:bottom w:val="single" w:color="A6A6A6" w:sz="4"/>
+              <w:right w:val="single" w:color="A6A6A6" w:sz="4"/>
+            </w:tcBorders>
+            <w:tcMar>
+              <w:top w:type="dxa" w:w="50"/>
+              <w:left w:type="dxa" w:w="60"/>
+              <w:bottom w:type="dxa" w:w="50"/>
+              <w:right w:type="dxa" w:w="60"/>
+            </w:tcMar>
+          </w:tcPr>
+          <w:p>
+            <w:pPr>
+              <w:bidi w:val="false"/>
+              <w:spacing w:after="0" w:line="260"/>
+            </w:pPr>
+            <w:r>
+              <w:rPr>
+                <w:rFonts w:ascii="Arial" w:cs="Arial" w:eastAsia="Arial" w:hAnsi="Arial"/>
+                <w:b w:val="false"/>
+                <w:bCs w:val="false"/>
+                <w:sz w:val="19"/>
+                <w:szCs w:val="19"/>
+                <w:rtl w:val="false"/>
+              </w:rPr>
+              <w:t xml:space="preserve">Check the licence on the PDF; name it "individual group orientation"</w:t>
+            </w:r>
+          </w:p>
+        </w:tc>
+      </w:tr>
+      <w:tr>
+        <w:trPr>
+          <w:cantSplit/>
+          <w:tblHeader w:val="false"/>
+        </w:trPr>
+        <w:tc>
+          <w:tcPr>
+            <w:tcW w:type="dxa" w:w="1500"/>
+            <w:tcBorders>
+              <w:top w:val="single" w:color="A6A6A6" w:sz="4"/>
+              <w:left w:val="single" w:color="A6A6A6" w:sz="4"/>
+              <w:bottom w:val="single" w:color="A6A6A6" w:sz="4"/>
+              <w:right w:val="single" w:color="A6A6A6" w:sz="4"/>
+            </w:tcBorders>
+            <w:tcMar>
+              <w:top w:type="dxa" w:w="50"/>
+              <w:left w:type="dxa" w:w="60"/>
+              <w:bottom w:type="dxa" w:w="50"/>
+              <w:right w:type="dxa" w:w="60"/>
+            </w:tcMar>
+          </w:tcPr>
+          <w:p>
+            <w:pPr>
+              <w:bidi w:val="false"/>
+              <w:spacing w:after="0" w:line="260"/>
+            </w:pPr>
+            <w:r>
+              <w:rPr>
+                <w:rFonts w:ascii="Arial" w:cs="Arial" w:eastAsia="Arial" w:hAnsi="Arial"/>
+                <w:b w:val="false"/>
+                <w:bCs w:val="false"/>
+                <w:sz w:val="19"/>
+                <w:szCs w:val="19"/>
+                <w:rtl w:val="false"/>
+              </w:rPr>
               <w:t xml:space="preserve">Obedience and conformity pressure</w:t>
             </w:r>
           </w:p>
@@ -40724,7 +43839,7 @@
                 <w:szCs w:val="19"/>
                 <w:rtl w:val="false"/>
               </w:rPr>
-              <w:t xml:space="preserve">— (candidates searched: goal interdependence — Van der Vegt et al. 1998; Campion et al. 1993; item text not found)</w:t>
+              <w:t xml:space="preserve">Group orientation (GOS; Kuppens et al. 2026, 8 items) as an individual trait; not a perception of the team</w:t>
             </w:r>
           </w:p>
         </w:tc>
@@ -40758,7 +43873,7 @@
                 <w:szCs w:val="19"/>
                 <w:rtl w:val="false"/>
               </w:rPr>
-              <w:t xml:space="preserve">No verifiable instrument found</w:t>
+              <w:t xml:space="preserve">Weak/indirect coverage</w:t>
             </w:r>
           </w:p>
         </w:tc>
@@ -44001,6 +47116,216 @@
                 <w:szCs w:val="19"/>
                 <w:rtl w:val="false"/>
               </w:rPr>
+              <w:t xml:space="preserve">Group orientation</w:t>
+            </w:r>
+          </w:p>
+        </w:tc>
+        <w:tc>
+          <w:tcPr>
+            <w:tcW w:type="dxa" w:w="1700"/>
+            <w:tcBorders>
+              <w:top w:val="single" w:color="A6A6A6" w:sz="4"/>
+              <w:left w:val="single" w:color="A6A6A6" w:sz="4"/>
+              <w:bottom w:val="single" w:color="A6A6A6" w:sz="4"/>
+              <w:right w:val="single" w:color="A6A6A6" w:sz="4"/>
+            </w:tcBorders>
+            <w:tcMar>
+              <w:top w:type="dxa" w:w="50"/>
+              <w:left w:type="dxa" w:w="60"/>
+              <w:bottom w:type="dxa" w:w="50"/>
+              <w:right w:type="dxa" w:w="60"/>
+            </w:tcMar>
+          </w:tcPr>
+          <w:p>
+            <w:pPr>
+              <w:bidi w:val="false"/>
+              <w:spacing w:after="0" w:line="260"/>
+            </w:pPr>
+            <w:r>
+              <w:rPr>
+                <w:rFonts w:ascii="Arial" w:cs="Arial" w:eastAsia="Arial" w:hAnsi="Arial"/>
+                <w:b w:val="false"/>
+                <w:bCs w:val="false"/>
+                <w:sz w:val="19"/>
+                <w:szCs w:val="19"/>
+                <w:rtl w:val="false"/>
+              </w:rPr>
+              <w:t xml:space="preserve">GO1–GO8</w:t>
+            </w:r>
+          </w:p>
+        </w:tc>
+        <w:tc>
+          <w:tcPr>
+            <w:tcW w:type="dxa" w:w="700"/>
+            <w:tcBorders>
+              <w:top w:val="single" w:color="A6A6A6" w:sz="4"/>
+              <w:left w:val="single" w:color="A6A6A6" w:sz="4"/>
+              <w:bottom w:val="single" w:color="A6A6A6" w:sz="4"/>
+              <w:right w:val="single" w:color="A6A6A6" w:sz="4"/>
+            </w:tcBorders>
+            <w:tcMar>
+              <w:top w:type="dxa" w:w="50"/>
+              <w:left w:type="dxa" w:w="60"/>
+              <w:bottom w:type="dxa" w:w="50"/>
+              <w:right w:type="dxa" w:w="60"/>
+            </w:tcMar>
+          </w:tcPr>
+          <w:p>
+            <w:pPr>
+              <w:bidi w:val="false"/>
+              <w:spacing w:after="0" w:line="260"/>
+            </w:pPr>
+            <w:r>
+              <w:rPr>
+                <w:rFonts w:ascii="Arial" w:cs="Arial" w:eastAsia="Arial" w:hAnsi="Arial"/>
+                <w:b w:val="false"/>
+                <w:bCs w:val="false"/>
+                <w:sz w:val="19"/>
+                <w:szCs w:val="19"/>
+                <w:rtl w:val="false"/>
+              </w:rPr>
+              <w:t xml:space="preserve">8</w:t>
+            </w:r>
+          </w:p>
+        </w:tc>
+        <w:tc>
+          <w:tcPr>
+            <w:tcW w:type="dxa" w:w="1700"/>
+            <w:tcBorders>
+              <w:top w:val="single" w:color="A6A6A6" w:sz="4"/>
+              <w:left w:val="single" w:color="A6A6A6" w:sz="4"/>
+              <w:bottom w:val="single" w:color="A6A6A6" w:sz="4"/>
+              <w:right w:val="single" w:color="A6A6A6" w:sz="4"/>
+            </w:tcBorders>
+            <w:tcMar>
+              <w:top w:type="dxa" w:w="50"/>
+              <w:left w:type="dxa" w:w="60"/>
+              <w:bottom w:type="dxa" w:w="50"/>
+              <w:right w:type="dxa" w:w="60"/>
+            </w:tcMar>
+          </w:tcPr>
+          <w:p>
+            <w:pPr>
+              <w:bidi w:val="false"/>
+              <w:spacing w:after="0" w:line="260"/>
+            </w:pPr>
+            <w:r>
+              <w:rPr>
+                <w:rFonts w:ascii="Arial" w:cs="Arial" w:eastAsia="Arial" w:hAnsi="Arial"/>
+                <w:b w:val="false"/>
+                <w:bCs w:val="false"/>
+                <w:sz w:val="19"/>
+                <w:szCs w:val="19"/>
+                <w:rtl w:val="false"/>
+              </w:rPr>
+              <w:t xml:space="preserve">−3 to +3</w:t>
+            </w:r>
+          </w:p>
+        </w:tc>
+        <w:tc>
+          <w:tcPr>
+            <w:tcW w:type="dxa" w:w="1700"/>
+            <w:tcBorders>
+              <w:top w:val="single" w:color="A6A6A6" w:sz="4"/>
+              <w:left w:val="single" w:color="A6A6A6" w:sz="4"/>
+              <w:bottom w:val="single" w:color="A6A6A6" w:sz="4"/>
+              <w:right w:val="single" w:color="A6A6A6" w:sz="4"/>
+            </w:tcBorders>
+            <w:tcMar>
+              <w:top w:type="dxa" w:w="50"/>
+              <w:left w:type="dxa" w:w="60"/>
+              <w:bottom w:type="dxa" w:w="50"/>
+              <w:right w:type="dxa" w:w="60"/>
+            </w:tcMar>
+          </w:tcPr>
+          <w:p>
+            <w:pPr>
+              <w:bidi w:val="false"/>
+              <w:spacing w:after="0" w:line="260"/>
+            </w:pPr>
+            <w:r>
+              <w:rPr>
+                <w:rFonts w:ascii="Arial" w:cs="Arial" w:eastAsia="Arial" w:hAnsi="Arial"/>
+                <w:b w:val="false"/>
+                <w:bCs w:val="false"/>
+                <w:sz w:val="19"/>
+                <w:szCs w:val="19"/>
+                <w:rtl w:val="false"/>
+              </w:rPr>
+              <w:t xml:space="preserve">Individual</w:t>
+            </w:r>
+          </w:p>
+        </w:tc>
+        <w:tc>
+          <w:tcPr>
+            <w:tcW w:type="dxa" w:w="2000"/>
+            <w:tcBorders>
+              <w:top w:val="single" w:color="A6A6A6" w:sz="4"/>
+              <w:left w:val="single" w:color="A6A6A6" w:sz="4"/>
+              <w:bottom w:val="single" w:color="A6A6A6" w:sz="4"/>
+              <w:right w:val="single" w:color="A6A6A6" w:sz="4"/>
+            </w:tcBorders>
+            <w:tcMar>
+              <w:top w:type="dxa" w:w="50"/>
+              <w:left w:type="dxa" w:w="60"/>
+              <w:bottom w:type="dxa" w:w="50"/>
+              <w:right w:type="dxa" w:w="60"/>
+            </w:tcMar>
+          </w:tcPr>
+          <w:p>
+            <w:pPr>
+              <w:bidi w:val="false"/>
+              <w:spacing w:after="0" w:line="260"/>
+            </w:pPr>
+            <w:r>
+              <w:rPr>
+                <w:rFonts w:ascii="Arial" w:cs="Arial" w:eastAsia="Arial" w:hAnsi="Arial"/>
+                <w:b w:val="false"/>
+                <w:bCs w:val="false"/>
+                <w:sz w:val="19"/>
+                <w:szCs w:val="19"/>
+                <w:rtl w:val="false"/>
+              </w:rPr>
+              <w:t xml:space="preserve">GO3, GO4 reversed (sign change)</w:t>
+            </w:r>
+          </w:p>
+        </w:tc>
+      </w:tr>
+      <w:tr>
+        <w:trPr>
+          <w:cantSplit/>
+          <w:tblHeader w:val="false"/>
+        </w:trPr>
+        <w:tc>
+          <w:tcPr>
+            <w:tcW w:type="dxa" w:w="1700"/>
+            <w:tcBorders>
+              <w:top w:val="single" w:color="A6A6A6" w:sz="4"/>
+              <w:left w:val="single" w:color="A6A6A6" w:sz="4"/>
+              <w:bottom w:val="single" w:color="A6A6A6" w:sz="4"/>
+              <w:right w:val="single" w:color="A6A6A6" w:sz="4"/>
+            </w:tcBorders>
+            <w:tcMar>
+              <w:top w:type="dxa" w:w="50"/>
+              <w:left w:type="dxa" w:w="60"/>
+              <w:bottom w:type="dxa" w:w="50"/>
+              <w:right w:type="dxa" w:w="60"/>
+            </w:tcMar>
+          </w:tcPr>
+          <w:p>
+            <w:pPr>
+              <w:bidi w:val="false"/>
+              <w:spacing w:after="0" w:line="260"/>
+            </w:pPr>
+            <w:r>
+              <w:rPr>
+                <w:rFonts w:ascii="Arial" w:cs="Arial" w:eastAsia="Arial" w:hAnsi="Arial"/>
+                <w:b w:val="false"/>
+                <w:bCs w:val="false"/>
+                <w:sz w:val="19"/>
+                <w:szCs w:val="19"/>
+                <w:rtl w:val="false"/>
+              </w:rPr>
               <w:t xml:space="preserve">Marker</w:t>
             </w:r>
           </w:p>
@@ -44694,7 +48019,7 @@
                 <w:szCs w:val="19"/>
                 <w:rtl w:val="false"/>
               </w:rPr>
-              <w:t xml:space="preserve">This short version (about 117 items, 18–21 minutes) is for the main data collection. Compared with the full version these are removed: continuance commitment, occupation and organization (12 items); moral-identity symbolization (5); client-related burnout (6); intent to remain (3); leader coaching (3); goal similarity (3); conflict resolution (3); liking (4); team learning (7); team performance (5). Appendix tables are filtered for the removed rows; the commitment rows (which still mention continuance) and the Lencioni coverage table are identical to the full version.</w:t>
+              <w:t xml:space="preserve">This short version (about 125 items, 19–22 minutes) is for the main data collection. Compared with the full version these are removed: continuance commitment, occupation and organization (12 items); moral-identity symbolization (5); client-related burnout (6); intent to remain (3); leader coaching (3); goal similarity (3); conflict resolution (3); liking (4); team learning (7); team performance (5). Appendix tables are filtered for the removed rows; the commitment rows (which still mention continuance) and the Lencioni coverage table are identical to the full version.</w:t>
             </w:r>
           </w:p>
         </w:tc>
@@ -44920,6 +48245,21 @@
           <w:szCs w:val="20"/>
         </w:rPr>
         <w:t xml:space="preserve">Kristensen, T. S., Borritz, M., Villadsen, E., &amp; Christensen, K. B. (2005). The Copenhagen Burnout Inventory: A new tool for the assessment of burnout. Work &amp; Stress, 19(3), 192–207. https://doi.org/10.1080/02678370500297720</w:t>
+      </w:r>
+    </w:p>
+    <w:p>
+      <w:pPr>
+        <w:bidi w:val="false"/>
+        <w:spacing w:after="80"/>
+        <w:ind w:left="360" w:hanging="360"/>
+      </w:pPr>
+      <w:r>
+        <w:rPr>
+          <w:rFonts w:ascii="Arial" w:cs="Arial" w:eastAsia="Arial" w:hAnsi="Arial"/>
+          <w:sz w:val="20"/>
+          <w:szCs w:val="20"/>
+        </w:rPr>
+        <w:t xml:space="preserve">Kuppens, T., Manstead, A. S. R., Spears, R., &amp; Sweetman, J. (2026). Who cares about groups? The Group Orientation Scale measures differences in the general motivation for group belonging and concern for group goals. Group Processes &amp; Intergroup Relations, 29(3), 446–470. https://doi.org/10.1177/13684302251406210</w:t>
       </w:r>
     </w:p>
     <w:p>

</xml_diff>

<commit_message>
Leave inattention-to-results slot blank, add PCQ-24 licence placeholder, update Jehn details
Co-Authored-By: Claude Sonnet 5.5 <noreply@anthropic.com>
Claude-Session: https://claude.ai/code/session_0117HPg2G3CcnRnb2QXnVBy9
</commit_message>
<xml_diff>
--- a/questionnaire-v3-short-en.docx
+++ b/questionnaire-v3-short-en.docx
@@ -188,7 +188,7 @@
           <w:szCs w:val="22"/>
           <w:rtl w:val="false"/>
         </w:rPr>
-        <w:t xml:space="preserve">Dear auditor, you are invited to take part in an academic study of working conditions in independent audit teams. The questionnaire asks about your experience in an audit team, your job conditions, personal characteristics and some behaviours related to audit performance. It takes about [19–22] minutes. Results are used for scientific purposes only; individual responses or identifiable team results are not shared with the audit firm, the team supervisor or the client. Throughout the questionnaire, "the reference engagement" means the financial-statement audit engagement whose team code is shown on this form. When answering questions about the team and the engagement, please consider only that engagement.</w:t>
+        <w:t xml:space="preserve">Dear auditor, you are invited to take part in an academic study of working conditions in independent audit teams. The questionnaire asks about your experience in an audit team, your job conditions, personal characteristics and some behaviours related to audit performance. It takes about [18–21] minutes. Results are used for scientific purposes only; individual responses or identifiable team results are not shared with the audit firm, the team supervisor or the client. Throughout the questionnaire, "the reference engagement" means the financial-statement audit engagement whose team code is shown on this form. When answering questions about the team and the engagement, please consider only that engagement.</w:t>
       </w:r>
     </w:p>
     <w:p>
@@ -9150,6 +9150,109 @@
         <w:spacing w:after="80"/>
       </w:pPr>
     </w:p>
+    <w:tbl>
+      <w:tblPr>
+        <w:bidiVisual w:val="false"/>
+        <w:tblW w:type="dxa" w:w="9500"/>
+        <w:tblBorders>
+          <w:top w:val="single" w:color="auto" w:sz="4"/>
+          <w:left w:val="single" w:color="auto" w:sz="4"/>
+          <w:bottom w:val="single" w:color="auto" w:sz="4"/>
+          <w:right w:val="single" w:color="auto" w:sz="4"/>
+          <w:insideH w:val="single" w:color="auto" w:sz="4"/>
+          <w:insideV w:val="single" w:color="auto" w:sz="4"/>
+        </w:tblBorders>
+      </w:tblPr>
+      <w:tblGrid>
+        <w:gridCol w:w="9500"/>
+      </w:tblGrid>
+      <w:tr>
+        <w:trPr>
+          <w:cantSplit/>
+          <w:tblHeader/>
+        </w:trPr>
+        <w:tc>
+          <w:tcPr>
+            <w:tcW w:type="dxa" w:w="9500"/>
+            <w:tcBorders>
+              <w:top w:val="single" w:color="A6A6A6" w:sz="4"/>
+              <w:left w:val="single" w:color="A6A6A6" w:sz="4"/>
+              <w:bottom w:val="single" w:color="A6A6A6" w:sz="4"/>
+              <w:right w:val="single" w:color="A6A6A6" w:sz="4"/>
+            </w:tcBorders>
+            <w:shd w:fill="FCE4D6" w:color="auto" w:val="clear"/>
+            <w:tcMar>
+              <w:top w:type="dxa" w:w="50"/>
+              <w:left w:type="dxa" w:w="60"/>
+              <w:bottom w:type="dxa" w:w="50"/>
+              <w:right w:type="dxa" w:w="60"/>
+            </w:tcMar>
+          </w:tcPr>
+          <w:p>
+            <w:pPr>
+              <w:bidi w:val="false"/>
+              <w:spacing w:after="0" w:line="260"/>
+            </w:pPr>
+            <w:r>
+              <w:rPr>
+                <w:rFonts w:ascii="Arial" w:cs="Arial" w:eastAsia="Arial" w:hAnsi="Arial"/>
+                <w:b/>
+                <w:bCs/>
+                <w:sz w:val="19"/>
+                <w:szCs w:val="19"/>
+                <w:rtl w:val="false"/>
+              </w:rPr>
+              <w:t xml:space="preserve">Placeholder: inattention to collective results</w:t>
+            </w:r>
+          </w:p>
+        </w:tc>
+      </w:tr>
+      <w:tr>
+        <w:trPr>
+          <w:cantSplit/>
+          <w:tblHeader w:val="false"/>
+        </w:trPr>
+        <w:tc>
+          <w:tcPr>
+            <w:tcW w:type="dxa" w:w="9500"/>
+            <w:tcBorders>
+              <w:top w:val="single" w:color="A6A6A6" w:sz="4"/>
+              <w:left w:val="single" w:color="A6A6A6" w:sz="4"/>
+              <w:bottom w:val="single" w:color="A6A6A6" w:sz="4"/>
+              <w:right w:val="single" w:color="A6A6A6" w:sz="4"/>
+            </w:tcBorders>
+            <w:tcMar>
+              <w:top w:type="dxa" w:w="50"/>
+              <w:left w:type="dxa" w:w="60"/>
+              <w:bottom w:type="dxa" w:w="50"/>
+              <w:right w:type="dxa" w:w="60"/>
+            </w:tcMar>
+          </w:tcPr>
+          <w:p>
+            <w:pPr>
+              <w:bidi w:val="false"/>
+              <w:spacing w:after="0" w:line="260"/>
+            </w:pPr>
+            <w:r>
+              <w:rPr>
+                <w:rFonts w:ascii="Arial" w:cs="Arial" w:eastAsia="Arial" w:hAnsi="Arial"/>
+                <w:b w:val="false"/>
+                <w:bCs w:val="false"/>
+                <w:sz w:val="19"/>
+                <w:szCs w:val="19"/>
+                <w:rtl w:val="false"/>
+              </w:rPr>
+              <w:t xml:space="preserve">[No verifiable published instrument was found for this Lencioni dimension. The slot is left blank on purpose; no researcher-made or ill-fitting substitute (such as individual group-orientation scales) has been put in it.]</w:t>
+            </w:r>
+          </w:p>
+        </w:tc>
+      </w:tr>
+    </w:tbl>
+    <w:p>
+      <w:pPr>
+        <w:spacing w:after="80"/>
+      </w:pPr>
+    </w:p>
     <w:p>
       <w:pPr>
         <w:bidi w:val="false"/>
@@ -35454,2945 +35557,6 @@
         <w:tc>
           <w:tcPr>
             <w:tcW w:type="dxa" w:w="640"/>
-            <w:tcBorders>
-              <w:top w:val="single" w:color="A6A6A6" w:sz="4"/>
-              <w:left w:val="single" w:color="A6A6A6" w:sz="4"/>
-              <w:bottom w:val="single" w:color="A6A6A6" w:sz="4"/>
-              <w:right w:val="single" w:color="A6A6A6" w:sz="4"/>
-            </w:tcBorders>
-            <w:tcMar>
-              <w:top w:type="dxa" w:w="50"/>
-              <w:left w:type="dxa" w:w="60"/>
-              <w:bottom w:type="dxa" w:w="50"/>
-              <w:right w:type="dxa" w:w="60"/>
-            </w:tcMar>
-          </w:tcPr>
-          <w:p>
-            <w:pPr>
-              <w:bidi w:val="false"/>
-              <w:spacing w:after="0" w:line="260"/>
-              <w:jc w:val="center"/>
-            </w:pPr>
-            <w:r>
-              <w:rPr>
-                <w:rFonts w:ascii="Arial" w:cs="Arial" w:eastAsia="Arial" w:hAnsi="Arial"/>
-                <w:b w:val="false"/>
-                <w:bCs w:val="false"/>
-                <w:sz w:val="19"/>
-                <w:szCs w:val="19"/>
-                <w:rtl w:val="false"/>
-              </w:rPr>
-              <w:t xml:space="preserve">☐</w:t>
-            </w:r>
-          </w:p>
-        </w:tc>
-      </w:tr>
-    </w:tbl>
-    <w:p>
-      <w:pPr>
-        <w:spacing w:after="80"/>
-      </w:pPr>
-    </w:p>
-    <w:p>
-      <w:pPr>
-        <w:spacing w:after="80"/>
-      </w:pPr>
-    </w:p>
-    <w:p>
-      <w:pPr>
-        <w:bidi w:val="false"/>
-        <w:spacing w:after="100" w:line="300"/>
-      </w:pPr>
-      <w:r>
-        <w:rPr>
-          <w:rFonts w:ascii="Arial" w:cs="Arial" w:eastAsia="Arial" w:hAnsi="Arial"/>
-          <w:sz w:val="20"/>
-          <w:szCs w:val="20"/>
-          <w:rtl w:val="false"/>
-        </w:rPr>
-        <w:t xml:space="preserve">Orientation toward groups (a general scale about you, not about this team). −3 = Strongly disagree … 0 = Neither agree nor disagree … +3 = Strongly agree</w:t>
-      </w:r>
-    </w:p>
-    <w:tbl>
-      <w:tblPr>
-        <w:bidiVisual w:val="false"/>
-        <w:tblW w:type="dxa" w:w="9500"/>
-        <w:tblBorders>
-          <w:top w:val="single" w:color="auto" w:sz="4"/>
-          <w:left w:val="single" w:color="auto" w:sz="4"/>
-          <w:bottom w:val="single" w:color="auto" w:sz="4"/>
-          <w:right w:val="single" w:color="auto" w:sz="4"/>
-          <w:insideH w:val="single" w:color="auto" w:sz="4"/>
-          <w:insideV w:val="single" w:color="auto" w:sz="4"/>
-        </w:tblBorders>
-      </w:tblPr>
-      <w:tblGrid>
-        <w:gridCol w:w="650"/>
-        <w:gridCol w:w="4930"/>
-        <w:gridCol w:w="560"/>
-        <w:gridCol w:w="560"/>
-        <w:gridCol w:w="560"/>
-        <w:gridCol w:w="560"/>
-        <w:gridCol w:w="560"/>
-        <w:gridCol w:w="560"/>
-        <w:gridCol w:w="560"/>
-      </w:tblGrid>
-      <w:tr>
-        <w:trPr>
-          <w:cantSplit/>
-          <w:tblHeader/>
-        </w:trPr>
-        <w:tc>
-          <w:tcPr>
-            <w:tcW w:type="dxa" w:w="650"/>
-            <w:tcBorders>
-              <w:top w:val="single" w:color="A6A6A6" w:sz="4"/>
-              <w:left w:val="single" w:color="A6A6A6" w:sz="4"/>
-              <w:bottom w:val="single" w:color="A6A6A6" w:sz="4"/>
-              <w:right w:val="single" w:color="A6A6A6" w:sz="4"/>
-            </w:tcBorders>
-            <w:shd w:fill="D9E2F3" w:color="auto" w:val="clear"/>
-            <w:tcMar>
-              <w:top w:type="dxa" w:w="50"/>
-              <w:left w:type="dxa" w:w="60"/>
-              <w:bottom w:type="dxa" w:w="50"/>
-              <w:right w:type="dxa" w:w="60"/>
-            </w:tcMar>
-          </w:tcPr>
-          <w:p>
-            <w:pPr>
-              <w:bidi w:val="false"/>
-              <w:spacing w:after="0" w:line="260"/>
-              <w:jc w:val="center"/>
-            </w:pPr>
-            <w:r>
-              <w:rPr>
-                <w:rFonts w:ascii="Arial" w:cs="Arial" w:eastAsia="Arial" w:hAnsi="Arial"/>
-                <w:b/>
-                <w:bCs/>
-                <w:sz w:val="19"/>
-                <w:szCs w:val="19"/>
-                <w:rtl w:val="false"/>
-              </w:rPr>
-              <w:t xml:space="preserve"/>
-            </w:r>
-          </w:p>
-        </w:tc>
-        <w:tc>
-          <w:tcPr>
-            <w:tcW w:type="dxa" w:w="4930"/>
-            <w:tcBorders>
-              <w:top w:val="single" w:color="A6A6A6" w:sz="4"/>
-              <w:left w:val="single" w:color="A6A6A6" w:sz="4"/>
-              <w:bottom w:val="single" w:color="A6A6A6" w:sz="4"/>
-              <w:right w:val="single" w:color="A6A6A6" w:sz="4"/>
-            </w:tcBorders>
-            <w:shd w:fill="D9E2F3" w:color="auto" w:val="clear"/>
-            <w:tcMar>
-              <w:top w:type="dxa" w:w="50"/>
-              <w:left w:type="dxa" w:w="60"/>
-              <w:bottom w:type="dxa" w:w="50"/>
-              <w:right w:type="dxa" w:w="60"/>
-            </w:tcMar>
-          </w:tcPr>
-          <w:p>
-            <w:pPr>
-              <w:bidi w:val="false"/>
-              <w:spacing w:after="0" w:line="260"/>
-            </w:pPr>
-            <w:r>
-              <w:rPr>
-                <w:rFonts w:ascii="Arial" w:cs="Arial" w:eastAsia="Arial" w:hAnsi="Arial"/>
-                <w:b/>
-                <w:bCs/>
-                <w:sz w:val="19"/>
-                <w:szCs w:val="19"/>
-                <w:rtl w:val="false"/>
-              </w:rPr>
-              <w:t xml:space="preserve">Statement</w:t>
-            </w:r>
-          </w:p>
-        </w:tc>
-        <w:tc>
-          <w:tcPr>
-            <w:tcW w:type="dxa" w:w="560"/>
-            <w:tcBorders>
-              <w:top w:val="single" w:color="A6A6A6" w:sz="4"/>
-              <w:left w:val="single" w:color="A6A6A6" w:sz="4"/>
-              <w:bottom w:val="single" w:color="A6A6A6" w:sz="4"/>
-              <w:right w:val="single" w:color="A6A6A6" w:sz="4"/>
-            </w:tcBorders>
-            <w:shd w:fill="D9E2F3" w:color="auto" w:val="clear"/>
-            <w:tcMar>
-              <w:top w:type="dxa" w:w="50"/>
-              <w:left w:type="dxa" w:w="60"/>
-              <w:bottom w:type="dxa" w:w="50"/>
-              <w:right w:type="dxa" w:w="60"/>
-            </w:tcMar>
-          </w:tcPr>
-          <w:p>
-            <w:pPr>
-              <w:bidi w:val="false"/>
-              <w:spacing w:after="0" w:line="260"/>
-              <w:jc w:val="center"/>
-            </w:pPr>
-            <w:r>
-              <w:rPr>
-                <w:rFonts w:ascii="Arial" w:cs="Arial" w:eastAsia="Arial" w:hAnsi="Arial"/>
-                <w:b/>
-                <w:bCs/>
-                <w:sz w:val="15"/>
-                <w:szCs w:val="15"/>
-                <w:rtl w:val="false"/>
-              </w:rPr>
-              <w:t xml:space="preserve">-3</w:t>
-            </w:r>
-          </w:p>
-        </w:tc>
-        <w:tc>
-          <w:tcPr>
-            <w:tcW w:type="dxa" w:w="560"/>
-            <w:tcBorders>
-              <w:top w:val="single" w:color="A6A6A6" w:sz="4"/>
-              <w:left w:val="single" w:color="A6A6A6" w:sz="4"/>
-              <w:bottom w:val="single" w:color="A6A6A6" w:sz="4"/>
-              <w:right w:val="single" w:color="A6A6A6" w:sz="4"/>
-            </w:tcBorders>
-            <w:shd w:fill="D9E2F3" w:color="auto" w:val="clear"/>
-            <w:tcMar>
-              <w:top w:type="dxa" w:w="50"/>
-              <w:left w:type="dxa" w:w="60"/>
-              <w:bottom w:type="dxa" w:w="50"/>
-              <w:right w:type="dxa" w:w="60"/>
-            </w:tcMar>
-          </w:tcPr>
-          <w:p>
-            <w:pPr>
-              <w:bidi w:val="false"/>
-              <w:spacing w:after="0" w:line="260"/>
-              <w:jc w:val="center"/>
-            </w:pPr>
-            <w:r>
-              <w:rPr>
-                <w:rFonts w:ascii="Arial" w:cs="Arial" w:eastAsia="Arial" w:hAnsi="Arial"/>
-                <w:b/>
-                <w:bCs/>
-                <w:sz w:val="15"/>
-                <w:szCs w:val="15"/>
-                <w:rtl w:val="false"/>
-              </w:rPr>
-              <w:t xml:space="preserve">-2</w:t>
-            </w:r>
-          </w:p>
-        </w:tc>
-        <w:tc>
-          <w:tcPr>
-            <w:tcW w:type="dxa" w:w="560"/>
-            <w:tcBorders>
-              <w:top w:val="single" w:color="A6A6A6" w:sz="4"/>
-              <w:left w:val="single" w:color="A6A6A6" w:sz="4"/>
-              <w:bottom w:val="single" w:color="A6A6A6" w:sz="4"/>
-              <w:right w:val="single" w:color="A6A6A6" w:sz="4"/>
-            </w:tcBorders>
-            <w:shd w:fill="D9E2F3" w:color="auto" w:val="clear"/>
-            <w:tcMar>
-              <w:top w:type="dxa" w:w="50"/>
-              <w:left w:type="dxa" w:w="60"/>
-              <w:bottom w:type="dxa" w:w="50"/>
-              <w:right w:type="dxa" w:w="60"/>
-            </w:tcMar>
-          </w:tcPr>
-          <w:p>
-            <w:pPr>
-              <w:bidi w:val="false"/>
-              <w:spacing w:after="0" w:line="260"/>
-              <w:jc w:val="center"/>
-            </w:pPr>
-            <w:r>
-              <w:rPr>
-                <w:rFonts w:ascii="Arial" w:cs="Arial" w:eastAsia="Arial" w:hAnsi="Arial"/>
-                <w:b/>
-                <w:bCs/>
-                <w:sz w:val="15"/>
-                <w:szCs w:val="15"/>
-                <w:rtl w:val="false"/>
-              </w:rPr>
-              <w:t xml:space="preserve">-1</w:t>
-            </w:r>
-          </w:p>
-        </w:tc>
-        <w:tc>
-          <w:tcPr>
-            <w:tcW w:type="dxa" w:w="560"/>
-            <w:tcBorders>
-              <w:top w:val="single" w:color="A6A6A6" w:sz="4"/>
-              <w:left w:val="single" w:color="A6A6A6" w:sz="4"/>
-              <w:bottom w:val="single" w:color="A6A6A6" w:sz="4"/>
-              <w:right w:val="single" w:color="A6A6A6" w:sz="4"/>
-            </w:tcBorders>
-            <w:shd w:fill="D9E2F3" w:color="auto" w:val="clear"/>
-            <w:tcMar>
-              <w:top w:type="dxa" w:w="50"/>
-              <w:left w:type="dxa" w:w="60"/>
-              <w:bottom w:type="dxa" w:w="50"/>
-              <w:right w:type="dxa" w:w="60"/>
-            </w:tcMar>
-          </w:tcPr>
-          <w:p>
-            <w:pPr>
-              <w:bidi w:val="false"/>
-              <w:spacing w:after="0" w:line="260"/>
-              <w:jc w:val="center"/>
-            </w:pPr>
-            <w:r>
-              <w:rPr>
-                <w:rFonts w:ascii="Arial" w:cs="Arial" w:eastAsia="Arial" w:hAnsi="Arial"/>
-                <w:b/>
-                <w:bCs/>
-                <w:sz w:val="15"/>
-                <w:szCs w:val="15"/>
-                <w:rtl w:val="false"/>
-              </w:rPr>
-              <w:t xml:space="preserve">0</w:t>
-            </w:r>
-          </w:p>
-        </w:tc>
-        <w:tc>
-          <w:tcPr>
-            <w:tcW w:type="dxa" w:w="560"/>
-            <w:tcBorders>
-              <w:top w:val="single" w:color="A6A6A6" w:sz="4"/>
-              <w:left w:val="single" w:color="A6A6A6" w:sz="4"/>
-              <w:bottom w:val="single" w:color="A6A6A6" w:sz="4"/>
-              <w:right w:val="single" w:color="A6A6A6" w:sz="4"/>
-            </w:tcBorders>
-            <w:shd w:fill="D9E2F3" w:color="auto" w:val="clear"/>
-            <w:tcMar>
-              <w:top w:type="dxa" w:w="50"/>
-              <w:left w:type="dxa" w:w="60"/>
-              <w:bottom w:type="dxa" w:w="50"/>
-              <w:right w:type="dxa" w:w="60"/>
-            </w:tcMar>
-          </w:tcPr>
-          <w:p>
-            <w:pPr>
-              <w:bidi w:val="false"/>
-              <w:spacing w:after="0" w:line="260"/>
-              <w:jc w:val="center"/>
-            </w:pPr>
-            <w:r>
-              <w:rPr>
-                <w:rFonts w:ascii="Arial" w:cs="Arial" w:eastAsia="Arial" w:hAnsi="Arial"/>
-                <w:b/>
-                <w:bCs/>
-                <w:sz w:val="15"/>
-                <w:szCs w:val="15"/>
-                <w:rtl w:val="false"/>
-              </w:rPr>
-              <w:t xml:space="preserve">+1</w:t>
-            </w:r>
-          </w:p>
-        </w:tc>
-        <w:tc>
-          <w:tcPr>
-            <w:tcW w:type="dxa" w:w="560"/>
-            <w:tcBorders>
-              <w:top w:val="single" w:color="A6A6A6" w:sz="4"/>
-              <w:left w:val="single" w:color="A6A6A6" w:sz="4"/>
-              <w:bottom w:val="single" w:color="A6A6A6" w:sz="4"/>
-              <w:right w:val="single" w:color="A6A6A6" w:sz="4"/>
-            </w:tcBorders>
-            <w:shd w:fill="D9E2F3" w:color="auto" w:val="clear"/>
-            <w:tcMar>
-              <w:top w:type="dxa" w:w="50"/>
-              <w:left w:type="dxa" w:w="60"/>
-              <w:bottom w:type="dxa" w:w="50"/>
-              <w:right w:type="dxa" w:w="60"/>
-            </w:tcMar>
-          </w:tcPr>
-          <w:p>
-            <w:pPr>
-              <w:bidi w:val="false"/>
-              <w:spacing w:after="0" w:line="260"/>
-              <w:jc w:val="center"/>
-            </w:pPr>
-            <w:r>
-              <w:rPr>
-                <w:rFonts w:ascii="Arial" w:cs="Arial" w:eastAsia="Arial" w:hAnsi="Arial"/>
-                <w:b/>
-                <w:bCs/>
-                <w:sz w:val="15"/>
-                <w:szCs w:val="15"/>
-                <w:rtl w:val="false"/>
-              </w:rPr>
-              <w:t xml:space="preserve">+2</w:t>
-            </w:r>
-          </w:p>
-        </w:tc>
-        <w:tc>
-          <w:tcPr>
-            <w:tcW w:type="dxa" w:w="560"/>
-            <w:tcBorders>
-              <w:top w:val="single" w:color="A6A6A6" w:sz="4"/>
-              <w:left w:val="single" w:color="A6A6A6" w:sz="4"/>
-              <w:bottom w:val="single" w:color="A6A6A6" w:sz="4"/>
-              <w:right w:val="single" w:color="A6A6A6" w:sz="4"/>
-            </w:tcBorders>
-            <w:shd w:fill="D9E2F3" w:color="auto" w:val="clear"/>
-            <w:tcMar>
-              <w:top w:type="dxa" w:w="50"/>
-              <w:left w:type="dxa" w:w="60"/>
-              <w:bottom w:type="dxa" w:w="50"/>
-              <w:right w:type="dxa" w:w="60"/>
-            </w:tcMar>
-          </w:tcPr>
-          <w:p>
-            <w:pPr>
-              <w:bidi w:val="false"/>
-              <w:spacing w:after="0" w:line="260"/>
-              <w:jc w:val="center"/>
-            </w:pPr>
-            <w:r>
-              <w:rPr>
-                <w:rFonts w:ascii="Arial" w:cs="Arial" w:eastAsia="Arial" w:hAnsi="Arial"/>
-                <w:b/>
-                <w:bCs/>
-                <w:sz w:val="15"/>
-                <w:szCs w:val="15"/>
-                <w:rtl w:val="false"/>
-              </w:rPr>
-              <w:t xml:space="preserve">+3</w:t>
-            </w:r>
-          </w:p>
-        </w:tc>
-      </w:tr>
-      <w:tr>
-        <w:trPr>
-          <w:cantSplit/>
-          <w:tblHeader w:val="false"/>
-        </w:trPr>
-        <w:tc>
-          <w:tcPr>
-            <w:tcW w:type="dxa" w:w="650"/>
-            <w:tcBorders>
-              <w:top w:val="single" w:color="A6A6A6" w:sz="4"/>
-              <w:left w:val="single" w:color="A6A6A6" w:sz="4"/>
-              <w:bottom w:val="single" w:color="A6A6A6" w:sz="4"/>
-              <w:right w:val="single" w:color="A6A6A6" w:sz="4"/>
-            </w:tcBorders>
-            <w:tcMar>
-              <w:top w:type="dxa" w:w="50"/>
-              <w:left w:type="dxa" w:w="60"/>
-              <w:bottom w:type="dxa" w:w="50"/>
-              <w:right w:type="dxa" w:w="60"/>
-            </w:tcMar>
-          </w:tcPr>
-          <w:p>
-            <w:pPr>
-              <w:bidi w:val="false"/>
-              <w:spacing w:after="0" w:line="260"/>
-              <w:jc w:val="center"/>
-            </w:pPr>
-            <w:r>
-              <w:rPr>
-                <w:rFonts w:ascii="Arial" w:cs="Arial" w:eastAsia="Arial" w:hAnsi="Arial"/>
-                <w:b w:val="false"/>
-                <w:bCs w:val="false"/>
-                <w:sz w:val="19"/>
-                <w:szCs w:val="19"/>
-                <w:rtl w:val="false"/>
-              </w:rPr>
-              <w:t xml:space="preserve">GO1</w:t>
-            </w:r>
-          </w:p>
-        </w:tc>
-        <w:tc>
-          <w:tcPr>
-            <w:tcW w:type="dxa" w:w="4930"/>
-            <w:tcBorders>
-              <w:top w:val="single" w:color="A6A6A6" w:sz="4"/>
-              <w:left w:val="single" w:color="A6A6A6" w:sz="4"/>
-              <w:bottom w:val="single" w:color="A6A6A6" w:sz="4"/>
-              <w:right w:val="single" w:color="A6A6A6" w:sz="4"/>
-            </w:tcBorders>
-            <w:tcMar>
-              <w:top w:type="dxa" w:w="50"/>
-              <w:left w:type="dxa" w:w="60"/>
-              <w:bottom w:type="dxa" w:w="50"/>
-              <w:right w:type="dxa" w:w="60"/>
-            </w:tcMar>
-          </w:tcPr>
-          <w:p>
-            <w:pPr>
-              <w:bidi w:val="false"/>
-              <w:spacing w:after="0" w:line="260"/>
-            </w:pPr>
-            <w:r>
-              <w:rPr>
-                <w:rFonts w:ascii="Arial" w:cs="Arial" w:eastAsia="Arial" w:hAnsi="Arial"/>
-                <w:b w:val="false"/>
-                <w:bCs w:val="false"/>
-                <w:sz w:val="19"/>
-                <w:szCs w:val="19"/>
-                <w:rtl w:val="false"/>
-              </w:rPr>
-              <w:t xml:space="preserve">I can enjoy spending time with a group of people</w:t>
-            </w:r>
-          </w:p>
-        </w:tc>
-        <w:tc>
-          <w:tcPr>
-            <w:tcW w:type="dxa" w:w="560"/>
-            <w:tcBorders>
-              <w:top w:val="single" w:color="A6A6A6" w:sz="4"/>
-              <w:left w:val="single" w:color="A6A6A6" w:sz="4"/>
-              <w:bottom w:val="single" w:color="A6A6A6" w:sz="4"/>
-              <w:right w:val="single" w:color="A6A6A6" w:sz="4"/>
-            </w:tcBorders>
-            <w:tcMar>
-              <w:top w:type="dxa" w:w="50"/>
-              <w:left w:type="dxa" w:w="60"/>
-              <w:bottom w:type="dxa" w:w="50"/>
-              <w:right w:type="dxa" w:w="60"/>
-            </w:tcMar>
-          </w:tcPr>
-          <w:p>
-            <w:pPr>
-              <w:bidi w:val="false"/>
-              <w:spacing w:after="0" w:line="260"/>
-              <w:jc w:val="center"/>
-            </w:pPr>
-            <w:r>
-              <w:rPr>
-                <w:rFonts w:ascii="Arial" w:cs="Arial" w:eastAsia="Arial" w:hAnsi="Arial"/>
-                <w:b w:val="false"/>
-                <w:bCs w:val="false"/>
-                <w:sz w:val="19"/>
-                <w:szCs w:val="19"/>
-                <w:rtl w:val="false"/>
-              </w:rPr>
-              <w:t xml:space="preserve">☐</w:t>
-            </w:r>
-          </w:p>
-        </w:tc>
-        <w:tc>
-          <w:tcPr>
-            <w:tcW w:type="dxa" w:w="560"/>
-            <w:tcBorders>
-              <w:top w:val="single" w:color="A6A6A6" w:sz="4"/>
-              <w:left w:val="single" w:color="A6A6A6" w:sz="4"/>
-              <w:bottom w:val="single" w:color="A6A6A6" w:sz="4"/>
-              <w:right w:val="single" w:color="A6A6A6" w:sz="4"/>
-            </w:tcBorders>
-            <w:tcMar>
-              <w:top w:type="dxa" w:w="50"/>
-              <w:left w:type="dxa" w:w="60"/>
-              <w:bottom w:type="dxa" w:w="50"/>
-              <w:right w:type="dxa" w:w="60"/>
-            </w:tcMar>
-          </w:tcPr>
-          <w:p>
-            <w:pPr>
-              <w:bidi w:val="false"/>
-              <w:spacing w:after="0" w:line="260"/>
-              <w:jc w:val="center"/>
-            </w:pPr>
-            <w:r>
-              <w:rPr>
-                <w:rFonts w:ascii="Arial" w:cs="Arial" w:eastAsia="Arial" w:hAnsi="Arial"/>
-                <w:b w:val="false"/>
-                <w:bCs w:val="false"/>
-                <w:sz w:val="19"/>
-                <w:szCs w:val="19"/>
-                <w:rtl w:val="false"/>
-              </w:rPr>
-              <w:t xml:space="preserve">☐</w:t>
-            </w:r>
-          </w:p>
-        </w:tc>
-        <w:tc>
-          <w:tcPr>
-            <w:tcW w:type="dxa" w:w="560"/>
-            <w:tcBorders>
-              <w:top w:val="single" w:color="A6A6A6" w:sz="4"/>
-              <w:left w:val="single" w:color="A6A6A6" w:sz="4"/>
-              <w:bottom w:val="single" w:color="A6A6A6" w:sz="4"/>
-              <w:right w:val="single" w:color="A6A6A6" w:sz="4"/>
-            </w:tcBorders>
-            <w:tcMar>
-              <w:top w:type="dxa" w:w="50"/>
-              <w:left w:type="dxa" w:w="60"/>
-              <w:bottom w:type="dxa" w:w="50"/>
-              <w:right w:type="dxa" w:w="60"/>
-            </w:tcMar>
-          </w:tcPr>
-          <w:p>
-            <w:pPr>
-              <w:bidi w:val="false"/>
-              <w:spacing w:after="0" w:line="260"/>
-              <w:jc w:val="center"/>
-            </w:pPr>
-            <w:r>
-              <w:rPr>
-                <w:rFonts w:ascii="Arial" w:cs="Arial" w:eastAsia="Arial" w:hAnsi="Arial"/>
-                <w:b w:val="false"/>
-                <w:bCs w:val="false"/>
-                <w:sz w:val="19"/>
-                <w:szCs w:val="19"/>
-                <w:rtl w:val="false"/>
-              </w:rPr>
-              <w:t xml:space="preserve">☐</w:t>
-            </w:r>
-          </w:p>
-        </w:tc>
-        <w:tc>
-          <w:tcPr>
-            <w:tcW w:type="dxa" w:w="560"/>
-            <w:tcBorders>
-              <w:top w:val="single" w:color="A6A6A6" w:sz="4"/>
-              <w:left w:val="single" w:color="A6A6A6" w:sz="4"/>
-              <w:bottom w:val="single" w:color="A6A6A6" w:sz="4"/>
-              <w:right w:val="single" w:color="A6A6A6" w:sz="4"/>
-            </w:tcBorders>
-            <w:tcMar>
-              <w:top w:type="dxa" w:w="50"/>
-              <w:left w:type="dxa" w:w="60"/>
-              <w:bottom w:type="dxa" w:w="50"/>
-              <w:right w:type="dxa" w:w="60"/>
-            </w:tcMar>
-          </w:tcPr>
-          <w:p>
-            <w:pPr>
-              <w:bidi w:val="false"/>
-              <w:spacing w:after="0" w:line="260"/>
-              <w:jc w:val="center"/>
-            </w:pPr>
-            <w:r>
-              <w:rPr>
-                <w:rFonts w:ascii="Arial" w:cs="Arial" w:eastAsia="Arial" w:hAnsi="Arial"/>
-                <w:b w:val="false"/>
-                <w:bCs w:val="false"/>
-                <w:sz w:val="19"/>
-                <w:szCs w:val="19"/>
-                <w:rtl w:val="false"/>
-              </w:rPr>
-              <w:t xml:space="preserve">☐</w:t>
-            </w:r>
-          </w:p>
-        </w:tc>
-        <w:tc>
-          <w:tcPr>
-            <w:tcW w:type="dxa" w:w="560"/>
-            <w:tcBorders>
-              <w:top w:val="single" w:color="A6A6A6" w:sz="4"/>
-              <w:left w:val="single" w:color="A6A6A6" w:sz="4"/>
-              <w:bottom w:val="single" w:color="A6A6A6" w:sz="4"/>
-              <w:right w:val="single" w:color="A6A6A6" w:sz="4"/>
-            </w:tcBorders>
-            <w:tcMar>
-              <w:top w:type="dxa" w:w="50"/>
-              <w:left w:type="dxa" w:w="60"/>
-              <w:bottom w:type="dxa" w:w="50"/>
-              <w:right w:type="dxa" w:w="60"/>
-            </w:tcMar>
-          </w:tcPr>
-          <w:p>
-            <w:pPr>
-              <w:bidi w:val="false"/>
-              <w:spacing w:after="0" w:line="260"/>
-              <w:jc w:val="center"/>
-            </w:pPr>
-            <w:r>
-              <w:rPr>
-                <w:rFonts w:ascii="Arial" w:cs="Arial" w:eastAsia="Arial" w:hAnsi="Arial"/>
-                <w:b w:val="false"/>
-                <w:bCs w:val="false"/>
-                <w:sz w:val="19"/>
-                <w:szCs w:val="19"/>
-                <w:rtl w:val="false"/>
-              </w:rPr>
-              <w:t xml:space="preserve">☐</w:t>
-            </w:r>
-          </w:p>
-        </w:tc>
-        <w:tc>
-          <w:tcPr>
-            <w:tcW w:type="dxa" w:w="560"/>
-            <w:tcBorders>
-              <w:top w:val="single" w:color="A6A6A6" w:sz="4"/>
-              <w:left w:val="single" w:color="A6A6A6" w:sz="4"/>
-              <w:bottom w:val="single" w:color="A6A6A6" w:sz="4"/>
-              <w:right w:val="single" w:color="A6A6A6" w:sz="4"/>
-            </w:tcBorders>
-            <w:tcMar>
-              <w:top w:type="dxa" w:w="50"/>
-              <w:left w:type="dxa" w:w="60"/>
-              <w:bottom w:type="dxa" w:w="50"/>
-              <w:right w:type="dxa" w:w="60"/>
-            </w:tcMar>
-          </w:tcPr>
-          <w:p>
-            <w:pPr>
-              <w:bidi w:val="false"/>
-              <w:spacing w:after="0" w:line="260"/>
-              <w:jc w:val="center"/>
-            </w:pPr>
-            <w:r>
-              <w:rPr>
-                <w:rFonts w:ascii="Arial" w:cs="Arial" w:eastAsia="Arial" w:hAnsi="Arial"/>
-                <w:b w:val="false"/>
-                <w:bCs w:val="false"/>
-                <w:sz w:val="19"/>
-                <w:szCs w:val="19"/>
-                <w:rtl w:val="false"/>
-              </w:rPr>
-              <w:t xml:space="preserve">☐</w:t>
-            </w:r>
-          </w:p>
-        </w:tc>
-        <w:tc>
-          <w:tcPr>
-            <w:tcW w:type="dxa" w:w="560"/>
-            <w:tcBorders>
-              <w:top w:val="single" w:color="A6A6A6" w:sz="4"/>
-              <w:left w:val="single" w:color="A6A6A6" w:sz="4"/>
-              <w:bottom w:val="single" w:color="A6A6A6" w:sz="4"/>
-              <w:right w:val="single" w:color="A6A6A6" w:sz="4"/>
-            </w:tcBorders>
-            <w:tcMar>
-              <w:top w:type="dxa" w:w="50"/>
-              <w:left w:type="dxa" w:w="60"/>
-              <w:bottom w:type="dxa" w:w="50"/>
-              <w:right w:type="dxa" w:w="60"/>
-            </w:tcMar>
-          </w:tcPr>
-          <w:p>
-            <w:pPr>
-              <w:bidi w:val="false"/>
-              <w:spacing w:after="0" w:line="260"/>
-              <w:jc w:val="center"/>
-            </w:pPr>
-            <w:r>
-              <w:rPr>
-                <w:rFonts w:ascii="Arial" w:cs="Arial" w:eastAsia="Arial" w:hAnsi="Arial"/>
-                <w:b w:val="false"/>
-                <w:bCs w:val="false"/>
-                <w:sz w:val="19"/>
-                <w:szCs w:val="19"/>
-                <w:rtl w:val="false"/>
-              </w:rPr>
-              <w:t xml:space="preserve">☐</w:t>
-            </w:r>
-          </w:p>
-        </w:tc>
-      </w:tr>
-      <w:tr>
-        <w:trPr>
-          <w:cantSplit/>
-          <w:tblHeader w:val="false"/>
-        </w:trPr>
-        <w:tc>
-          <w:tcPr>
-            <w:tcW w:type="dxa" w:w="650"/>
-            <w:tcBorders>
-              <w:top w:val="single" w:color="A6A6A6" w:sz="4"/>
-              <w:left w:val="single" w:color="A6A6A6" w:sz="4"/>
-              <w:bottom w:val="single" w:color="A6A6A6" w:sz="4"/>
-              <w:right w:val="single" w:color="A6A6A6" w:sz="4"/>
-            </w:tcBorders>
-            <w:tcMar>
-              <w:top w:type="dxa" w:w="50"/>
-              <w:left w:type="dxa" w:w="60"/>
-              <w:bottom w:type="dxa" w:w="50"/>
-              <w:right w:type="dxa" w:w="60"/>
-            </w:tcMar>
-          </w:tcPr>
-          <w:p>
-            <w:pPr>
-              <w:bidi w:val="false"/>
-              <w:spacing w:after="0" w:line="260"/>
-              <w:jc w:val="center"/>
-            </w:pPr>
-            <w:r>
-              <w:rPr>
-                <w:rFonts w:ascii="Arial" w:cs="Arial" w:eastAsia="Arial" w:hAnsi="Arial"/>
-                <w:b w:val="false"/>
-                <w:bCs w:val="false"/>
-                <w:sz w:val="19"/>
-                <w:szCs w:val="19"/>
-                <w:rtl w:val="false"/>
-              </w:rPr>
-              <w:t xml:space="preserve">GO2</w:t>
-            </w:r>
-          </w:p>
-        </w:tc>
-        <w:tc>
-          <w:tcPr>
-            <w:tcW w:type="dxa" w:w="4930"/>
-            <w:tcBorders>
-              <w:top w:val="single" w:color="A6A6A6" w:sz="4"/>
-              <w:left w:val="single" w:color="A6A6A6" w:sz="4"/>
-              <w:bottom w:val="single" w:color="A6A6A6" w:sz="4"/>
-              <w:right w:val="single" w:color="A6A6A6" w:sz="4"/>
-            </w:tcBorders>
-            <w:tcMar>
-              <w:top w:type="dxa" w:w="50"/>
-              <w:left w:type="dxa" w:w="60"/>
-              <w:bottom w:type="dxa" w:w="50"/>
-              <w:right w:type="dxa" w:w="60"/>
-            </w:tcMar>
-          </w:tcPr>
-          <w:p>
-            <w:pPr>
-              <w:bidi w:val="false"/>
-              <w:spacing w:after="0" w:line="260"/>
-            </w:pPr>
-            <w:r>
-              <w:rPr>
-                <w:rFonts w:ascii="Arial" w:cs="Arial" w:eastAsia="Arial" w:hAnsi="Arial"/>
-                <w:b w:val="false"/>
-                <w:bCs w:val="false"/>
-                <w:sz w:val="19"/>
-                <w:szCs w:val="19"/>
-                <w:rtl w:val="false"/>
-              </w:rPr>
-              <w:t xml:space="preserve">I like building bonds with members of the same group</w:t>
-            </w:r>
-          </w:p>
-        </w:tc>
-        <w:tc>
-          <w:tcPr>
-            <w:tcW w:type="dxa" w:w="560"/>
-            <w:tcBorders>
-              <w:top w:val="single" w:color="A6A6A6" w:sz="4"/>
-              <w:left w:val="single" w:color="A6A6A6" w:sz="4"/>
-              <w:bottom w:val="single" w:color="A6A6A6" w:sz="4"/>
-              <w:right w:val="single" w:color="A6A6A6" w:sz="4"/>
-            </w:tcBorders>
-            <w:tcMar>
-              <w:top w:type="dxa" w:w="50"/>
-              <w:left w:type="dxa" w:w="60"/>
-              <w:bottom w:type="dxa" w:w="50"/>
-              <w:right w:type="dxa" w:w="60"/>
-            </w:tcMar>
-          </w:tcPr>
-          <w:p>
-            <w:pPr>
-              <w:bidi w:val="false"/>
-              <w:spacing w:after="0" w:line="260"/>
-              <w:jc w:val="center"/>
-            </w:pPr>
-            <w:r>
-              <w:rPr>
-                <w:rFonts w:ascii="Arial" w:cs="Arial" w:eastAsia="Arial" w:hAnsi="Arial"/>
-                <w:b w:val="false"/>
-                <w:bCs w:val="false"/>
-                <w:sz w:val="19"/>
-                <w:szCs w:val="19"/>
-                <w:rtl w:val="false"/>
-              </w:rPr>
-              <w:t xml:space="preserve">☐</w:t>
-            </w:r>
-          </w:p>
-        </w:tc>
-        <w:tc>
-          <w:tcPr>
-            <w:tcW w:type="dxa" w:w="560"/>
-            <w:tcBorders>
-              <w:top w:val="single" w:color="A6A6A6" w:sz="4"/>
-              <w:left w:val="single" w:color="A6A6A6" w:sz="4"/>
-              <w:bottom w:val="single" w:color="A6A6A6" w:sz="4"/>
-              <w:right w:val="single" w:color="A6A6A6" w:sz="4"/>
-            </w:tcBorders>
-            <w:tcMar>
-              <w:top w:type="dxa" w:w="50"/>
-              <w:left w:type="dxa" w:w="60"/>
-              <w:bottom w:type="dxa" w:w="50"/>
-              <w:right w:type="dxa" w:w="60"/>
-            </w:tcMar>
-          </w:tcPr>
-          <w:p>
-            <w:pPr>
-              <w:bidi w:val="false"/>
-              <w:spacing w:after="0" w:line="260"/>
-              <w:jc w:val="center"/>
-            </w:pPr>
-            <w:r>
-              <w:rPr>
-                <w:rFonts w:ascii="Arial" w:cs="Arial" w:eastAsia="Arial" w:hAnsi="Arial"/>
-                <w:b w:val="false"/>
-                <w:bCs w:val="false"/>
-                <w:sz w:val="19"/>
-                <w:szCs w:val="19"/>
-                <w:rtl w:val="false"/>
-              </w:rPr>
-              <w:t xml:space="preserve">☐</w:t>
-            </w:r>
-          </w:p>
-        </w:tc>
-        <w:tc>
-          <w:tcPr>
-            <w:tcW w:type="dxa" w:w="560"/>
-            <w:tcBorders>
-              <w:top w:val="single" w:color="A6A6A6" w:sz="4"/>
-              <w:left w:val="single" w:color="A6A6A6" w:sz="4"/>
-              <w:bottom w:val="single" w:color="A6A6A6" w:sz="4"/>
-              <w:right w:val="single" w:color="A6A6A6" w:sz="4"/>
-            </w:tcBorders>
-            <w:tcMar>
-              <w:top w:type="dxa" w:w="50"/>
-              <w:left w:type="dxa" w:w="60"/>
-              <w:bottom w:type="dxa" w:w="50"/>
-              <w:right w:type="dxa" w:w="60"/>
-            </w:tcMar>
-          </w:tcPr>
-          <w:p>
-            <w:pPr>
-              <w:bidi w:val="false"/>
-              <w:spacing w:after="0" w:line="260"/>
-              <w:jc w:val="center"/>
-            </w:pPr>
-            <w:r>
-              <w:rPr>
-                <w:rFonts w:ascii="Arial" w:cs="Arial" w:eastAsia="Arial" w:hAnsi="Arial"/>
-                <w:b w:val="false"/>
-                <w:bCs w:val="false"/>
-                <w:sz w:val="19"/>
-                <w:szCs w:val="19"/>
-                <w:rtl w:val="false"/>
-              </w:rPr>
-              <w:t xml:space="preserve">☐</w:t>
-            </w:r>
-          </w:p>
-        </w:tc>
-        <w:tc>
-          <w:tcPr>
-            <w:tcW w:type="dxa" w:w="560"/>
-            <w:tcBorders>
-              <w:top w:val="single" w:color="A6A6A6" w:sz="4"/>
-              <w:left w:val="single" w:color="A6A6A6" w:sz="4"/>
-              <w:bottom w:val="single" w:color="A6A6A6" w:sz="4"/>
-              <w:right w:val="single" w:color="A6A6A6" w:sz="4"/>
-            </w:tcBorders>
-            <w:tcMar>
-              <w:top w:type="dxa" w:w="50"/>
-              <w:left w:type="dxa" w:w="60"/>
-              <w:bottom w:type="dxa" w:w="50"/>
-              <w:right w:type="dxa" w:w="60"/>
-            </w:tcMar>
-          </w:tcPr>
-          <w:p>
-            <w:pPr>
-              <w:bidi w:val="false"/>
-              <w:spacing w:after="0" w:line="260"/>
-              <w:jc w:val="center"/>
-            </w:pPr>
-            <w:r>
-              <w:rPr>
-                <w:rFonts w:ascii="Arial" w:cs="Arial" w:eastAsia="Arial" w:hAnsi="Arial"/>
-                <w:b w:val="false"/>
-                <w:bCs w:val="false"/>
-                <w:sz w:val="19"/>
-                <w:szCs w:val="19"/>
-                <w:rtl w:val="false"/>
-              </w:rPr>
-              <w:t xml:space="preserve">☐</w:t>
-            </w:r>
-          </w:p>
-        </w:tc>
-        <w:tc>
-          <w:tcPr>
-            <w:tcW w:type="dxa" w:w="560"/>
-            <w:tcBorders>
-              <w:top w:val="single" w:color="A6A6A6" w:sz="4"/>
-              <w:left w:val="single" w:color="A6A6A6" w:sz="4"/>
-              <w:bottom w:val="single" w:color="A6A6A6" w:sz="4"/>
-              <w:right w:val="single" w:color="A6A6A6" w:sz="4"/>
-            </w:tcBorders>
-            <w:tcMar>
-              <w:top w:type="dxa" w:w="50"/>
-              <w:left w:type="dxa" w:w="60"/>
-              <w:bottom w:type="dxa" w:w="50"/>
-              <w:right w:type="dxa" w:w="60"/>
-            </w:tcMar>
-          </w:tcPr>
-          <w:p>
-            <w:pPr>
-              <w:bidi w:val="false"/>
-              <w:spacing w:after="0" w:line="260"/>
-              <w:jc w:val="center"/>
-            </w:pPr>
-            <w:r>
-              <w:rPr>
-                <w:rFonts w:ascii="Arial" w:cs="Arial" w:eastAsia="Arial" w:hAnsi="Arial"/>
-                <w:b w:val="false"/>
-                <w:bCs w:val="false"/>
-                <w:sz w:val="19"/>
-                <w:szCs w:val="19"/>
-                <w:rtl w:val="false"/>
-              </w:rPr>
-              <w:t xml:space="preserve">☐</w:t>
-            </w:r>
-          </w:p>
-        </w:tc>
-        <w:tc>
-          <w:tcPr>
-            <w:tcW w:type="dxa" w:w="560"/>
-            <w:tcBorders>
-              <w:top w:val="single" w:color="A6A6A6" w:sz="4"/>
-              <w:left w:val="single" w:color="A6A6A6" w:sz="4"/>
-              <w:bottom w:val="single" w:color="A6A6A6" w:sz="4"/>
-              <w:right w:val="single" w:color="A6A6A6" w:sz="4"/>
-            </w:tcBorders>
-            <w:tcMar>
-              <w:top w:type="dxa" w:w="50"/>
-              <w:left w:type="dxa" w:w="60"/>
-              <w:bottom w:type="dxa" w:w="50"/>
-              <w:right w:type="dxa" w:w="60"/>
-            </w:tcMar>
-          </w:tcPr>
-          <w:p>
-            <w:pPr>
-              <w:bidi w:val="false"/>
-              <w:spacing w:after="0" w:line="260"/>
-              <w:jc w:val="center"/>
-            </w:pPr>
-            <w:r>
-              <w:rPr>
-                <w:rFonts w:ascii="Arial" w:cs="Arial" w:eastAsia="Arial" w:hAnsi="Arial"/>
-                <w:b w:val="false"/>
-                <w:bCs w:val="false"/>
-                <w:sz w:val="19"/>
-                <w:szCs w:val="19"/>
-                <w:rtl w:val="false"/>
-              </w:rPr>
-              <w:t xml:space="preserve">☐</w:t>
-            </w:r>
-          </w:p>
-        </w:tc>
-        <w:tc>
-          <w:tcPr>
-            <w:tcW w:type="dxa" w:w="560"/>
-            <w:tcBorders>
-              <w:top w:val="single" w:color="A6A6A6" w:sz="4"/>
-              <w:left w:val="single" w:color="A6A6A6" w:sz="4"/>
-              <w:bottom w:val="single" w:color="A6A6A6" w:sz="4"/>
-              <w:right w:val="single" w:color="A6A6A6" w:sz="4"/>
-            </w:tcBorders>
-            <w:tcMar>
-              <w:top w:type="dxa" w:w="50"/>
-              <w:left w:type="dxa" w:w="60"/>
-              <w:bottom w:type="dxa" w:w="50"/>
-              <w:right w:type="dxa" w:w="60"/>
-            </w:tcMar>
-          </w:tcPr>
-          <w:p>
-            <w:pPr>
-              <w:bidi w:val="false"/>
-              <w:spacing w:after="0" w:line="260"/>
-              <w:jc w:val="center"/>
-            </w:pPr>
-            <w:r>
-              <w:rPr>
-                <w:rFonts w:ascii="Arial" w:cs="Arial" w:eastAsia="Arial" w:hAnsi="Arial"/>
-                <w:b w:val="false"/>
-                <w:bCs w:val="false"/>
-                <w:sz w:val="19"/>
-                <w:szCs w:val="19"/>
-                <w:rtl w:val="false"/>
-              </w:rPr>
-              <w:t xml:space="preserve">☐</w:t>
-            </w:r>
-          </w:p>
-        </w:tc>
-      </w:tr>
-      <w:tr>
-        <w:trPr>
-          <w:cantSplit/>
-          <w:tblHeader w:val="false"/>
-        </w:trPr>
-        <w:tc>
-          <w:tcPr>
-            <w:tcW w:type="dxa" w:w="650"/>
-            <w:tcBorders>
-              <w:top w:val="single" w:color="A6A6A6" w:sz="4"/>
-              <w:left w:val="single" w:color="A6A6A6" w:sz="4"/>
-              <w:bottom w:val="single" w:color="A6A6A6" w:sz="4"/>
-              <w:right w:val="single" w:color="A6A6A6" w:sz="4"/>
-            </w:tcBorders>
-            <w:tcMar>
-              <w:top w:type="dxa" w:w="50"/>
-              <w:left w:type="dxa" w:w="60"/>
-              <w:bottom w:type="dxa" w:w="50"/>
-              <w:right w:type="dxa" w:w="60"/>
-            </w:tcMar>
-          </w:tcPr>
-          <w:p>
-            <w:pPr>
-              <w:bidi w:val="false"/>
-              <w:spacing w:after="0" w:line="260"/>
-              <w:jc w:val="center"/>
-            </w:pPr>
-            <w:r>
-              <w:rPr>
-                <w:rFonts w:ascii="Arial" w:cs="Arial" w:eastAsia="Arial" w:hAnsi="Arial"/>
-                <w:b w:val="false"/>
-                <w:bCs w:val="false"/>
-                <w:sz w:val="19"/>
-                <w:szCs w:val="19"/>
-                <w:rtl w:val="false"/>
-              </w:rPr>
-              <w:t xml:space="preserve">GO3</w:t>
-            </w:r>
-          </w:p>
-        </w:tc>
-        <w:tc>
-          <w:tcPr>
-            <w:tcW w:type="dxa" w:w="4930"/>
-            <w:tcBorders>
-              <w:top w:val="single" w:color="A6A6A6" w:sz="4"/>
-              <w:left w:val="single" w:color="A6A6A6" w:sz="4"/>
-              <w:bottom w:val="single" w:color="A6A6A6" w:sz="4"/>
-              <w:right w:val="single" w:color="A6A6A6" w:sz="4"/>
-            </w:tcBorders>
-            <w:tcMar>
-              <w:top w:type="dxa" w:w="50"/>
-              <w:left w:type="dxa" w:w="60"/>
-              <w:bottom w:type="dxa" w:w="50"/>
-              <w:right w:type="dxa" w:w="60"/>
-            </w:tcMar>
-          </w:tcPr>
-          <w:p>
-            <w:pPr>
-              <w:bidi w:val="false"/>
-              <w:spacing w:after="0" w:line="260"/>
-            </w:pPr>
-            <w:r>
-              <w:rPr>
-                <w:rFonts w:ascii="Arial" w:cs="Arial" w:eastAsia="Arial" w:hAnsi="Arial"/>
-                <w:b w:val="false"/>
-                <w:bCs w:val="false"/>
-                <w:sz w:val="19"/>
-                <w:szCs w:val="19"/>
-                <w:rtl w:val="false"/>
-              </w:rPr>
-              <w:t xml:space="preserve">I don't like to be in a group</w:t>
-            </w:r>
-          </w:p>
-        </w:tc>
-        <w:tc>
-          <w:tcPr>
-            <w:tcW w:type="dxa" w:w="560"/>
-            <w:tcBorders>
-              <w:top w:val="single" w:color="A6A6A6" w:sz="4"/>
-              <w:left w:val="single" w:color="A6A6A6" w:sz="4"/>
-              <w:bottom w:val="single" w:color="A6A6A6" w:sz="4"/>
-              <w:right w:val="single" w:color="A6A6A6" w:sz="4"/>
-            </w:tcBorders>
-            <w:tcMar>
-              <w:top w:type="dxa" w:w="50"/>
-              <w:left w:type="dxa" w:w="60"/>
-              <w:bottom w:type="dxa" w:w="50"/>
-              <w:right w:type="dxa" w:w="60"/>
-            </w:tcMar>
-          </w:tcPr>
-          <w:p>
-            <w:pPr>
-              <w:bidi w:val="false"/>
-              <w:spacing w:after="0" w:line="260"/>
-              <w:jc w:val="center"/>
-            </w:pPr>
-            <w:r>
-              <w:rPr>
-                <w:rFonts w:ascii="Arial" w:cs="Arial" w:eastAsia="Arial" w:hAnsi="Arial"/>
-                <w:b w:val="false"/>
-                <w:bCs w:val="false"/>
-                <w:sz w:val="19"/>
-                <w:szCs w:val="19"/>
-                <w:rtl w:val="false"/>
-              </w:rPr>
-              <w:t xml:space="preserve">☐</w:t>
-            </w:r>
-          </w:p>
-        </w:tc>
-        <w:tc>
-          <w:tcPr>
-            <w:tcW w:type="dxa" w:w="560"/>
-            <w:tcBorders>
-              <w:top w:val="single" w:color="A6A6A6" w:sz="4"/>
-              <w:left w:val="single" w:color="A6A6A6" w:sz="4"/>
-              <w:bottom w:val="single" w:color="A6A6A6" w:sz="4"/>
-              <w:right w:val="single" w:color="A6A6A6" w:sz="4"/>
-            </w:tcBorders>
-            <w:tcMar>
-              <w:top w:type="dxa" w:w="50"/>
-              <w:left w:type="dxa" w:w="60"/>
-              <w:bottom w:type="dxa" w:w="50"/>
-              <w:right w:type="dxa" w:w="60"/>
-            </w:tcMar>
-          </w:tcPr>
-          <w:p>
-            <w:pPr>
-              <w:bidi w:val="false"/>
-              <w:spacing w:after="0" w:line="260"/>
-              <w:jc w:val="center"/>
-            </w:pPr>
-            <w:r>
-              <w:rPr>
-                <w:rFonts w:ascii="Arial" w:cs="Arial" w:eastAsia="Arial" w:hAnsi="Arial"/>
-                <w:b w:val="false"/>
-                <w:bCs w:val="false"/>
-                <w:sz w:val="19"/>
-                <w:szCs w:val="19"/>
-                <w:rtl w:val="false"/>
-              </w:rPr>
-              <w:t xml:space="preserve">☐</w:t>
-            </w:r>
-          </w:p>
-        </w:tc>
-        <w:tc>
-          <w:tcPr>
-            <w:tcW w:type="dxa" w:w="560"/>
-            <w:tcBorders>
-              <w:top w:val="single" w:color="A6A6A6" w:sz="4"/>
-              <w:left w:val="single" w:color="A6A6A6" w:sz="4"/>
-              <w:bottom w:val="single" w:color="A6A6A6" w:sz="4"/>
-              <w:right w:val="single" w:color="A6A6A6" w:sz="4"/>
-            </w:tcBorders>
-            <w:tcMar>
-              <w:top w:type="dxa" w:w="50"/>
-              <w:left w:type="dxa" w:w="60"/>
-              <w:bottom w:type="dxa" w:w="50"/>
-              <w:right w:type="dxa" w:w="60"/>
-            </w:tcMar>
-          </w:tcPr>
-          <w:p>
-            <w:pPr>
-              <w:bidi w:val="false"/>
-              <w:spacing w:after="0" w:line="260"/>
-              <w:jc w:val="center"/>
-            </w:pPr>
-            <w:r>
-              <w:rPr>
-                <w:rFonts w:ascii="Arial" w:cs="Arial" w:eastAsia="Arial" w:hAnsi="Arial"/>
-                <w:b w:val="false"/>
-                <w:bCs w:val="false"/>
-                <w:sz w:val="19"/>
-                <w:szCs w:val="19"/>
-                <w:rtl w:val="false"/>
-              </w:rPr>
-              <w:t xml:space="preserve">☐</w:t>
-            </w:r>
-          </w:p>
-        </w:tc>
-        <w:tc>
-          <w:tcPr>
-            <w:tcW w:type="dxa" w:w="560"/>
-            <w:tcBorders>
-              <w:top w:val="single" w:color="A6A6A6" w:sz="4"/>
-              <w:left w:val="single" w:color="A6A6A6" w:sz="4"/>
-              <w:bottom w:val="single" w:color="A6A6A6" w:sz="4"/>
-              <w:right w:val="single" w:color="A6A6A6" w:sz="4"/>
-            </w:tcBorders>
-            <w:tcMar>
-              <w:top w:type="dxa" w:w="50"/>
-              <w:left w:type="dxa" w:w="60"/>
-              <w:bottom w:type="dxa" w:w="50"/>
-              <w:right w:type="dxa" w:w="60"/>
-            </w:tcMar>
-          </w:tcPr>
-          <w:p>
-            <w:pPr>
-              <w:bidi w:val="false"/>
-              <w:spacing w:after="0" w:line="260"/>
-              <w:jc w:val="center"/>
-            </w:pPr>
-            <w:r>
-              <w:rPr>
-                <w:rFonts w:ascii="Arial" w:cs="Arial" w:eastAsia="Arial" w:hAnsi="Arial"/>
-                <w:b w:val="false"/>
-                <w:bCs w:val="false"/>
-                <w:sz w:val="19"/>
-                <w:szCs w:val="19"/>
-                <w:rtl w:val="false"/>
-              </w:rPr>
-              <w:t xml:space="preserve">☐</w:t>
-            </w:r>
-          </w:p>
-        </w:tc>
-        <w:tc>
-          <w:tcPr>
-            <w:tcW w:type="dxa" w:w="560"/>
-            <w:tcBorders>
-              <w:top w:val="single" w:color="A6A6A6" w:sz="4"/>
-              <w:left w:val="single" w:color="A6A6A6" w:sz="4"/>
-              <w:bottom w:val="single" w:color="A6A6A6" w:sz="4"/>
-              <w:right w:val="single" w:color="A6A6A6" w:sz="4"/>
-            </w:tcBorders>
-            <w:tcMar>
-              <w:top w:type="dxa" w:w="50"/>
-              <w:left w:type="dxa" w:w="60"/>
-              <w:bottom w:type="dxa" w:w="50"/>
-              <w:right w:type="dxa" w:w="60"/>
-            </w:tcMar>
-          </w:tcPr>
-          <w:p>
-            <w:pPr>
-              <w:bidi w:val="false"/>
-              <w:spacing w:after="0" w:line="260"/>
-              <w:jc w:val="center"/>
-            </w:pPr>
-            <w:r>
-              <w:rPr>
-                <w:rFonts w:ascii="Arial" w:cs="Arial" w:eastAsia="Arial" w:hAnsi="Arial"/>
-                <w:b w:val="false"/>
-                <w:bCs w:val="false"/>
-                <w:sz w:val="19"/>
-                <w:szCs w:val="19"/>
-                <w:rtl w:val="false"/>
-              </w:rPr>
-              <w:t xml:space="preserve">☐</w:t>
-            </w:r>
-          </w:p>
-        </w:tc>
-        <w:tc>
-          <w:tcPr>
-            <w:tcW w:type="dxa" w:w="560"/>
-            <w:tcBorders>
-              <w:top w:val="single" w:color="A6A6A6" w:sz="4"/>
-              <w:left w:val="single" w:color="A6A6A6" w:sz="4"/>
-              <w:bottom w:val="single" w:color="A6A6A6" w:sz="4"/>
-              <w:right w:val="single" w:color="A6A6A6" w:sz="4"/>
-            </w:tcBorders>
-            <w:tcMar>
-              <w:top w:type="dxa" w:w="50"/>
-              <w:left w:type="dxa" w:w="60"/>
-              <w:bottom w:type="dxa" w:w="50"/>
-              <w:right w:type="dxa" w:w="60"/>
-            </w:tcMar>
-          </w:tcPr>
-          <w:p>
-            <w:pPr>
-              <w:bidi w:val="false"/>
-              <w:spacing w:after="0" w:line="260"/>
-              <w:jc w:val="center"/>
-            </w:pPr>
-            <w:r>
-              <w:rPr>
-                <w:rFonts w:ascii="Arial" w:cs="Arial" w:eastAsia="Arial" w:hAnsi="Arial"/>
-                <w:b w:val="false"/>
-                <w:bCs w:val="false"/>
-                <w:sz w:val="19"/>
-                <w:szCs w:val="19"/>
-                <w:rtl w:val="false"/>
-              </w:rPr>
-              <w:t xml:space="preserve">☐</w:t>
-            </w:r>
-          </w:p>
-        </w:tc>
-        <w:tc>
-          <w:tcPr>
-            <w:tcW w:type="dxa" w:w="560"/>
-            <w:tcBorders>
-              <w:top w:val="single" w:color="A6A6A6" w:sz="4"/>
-              <w:left w:val="single" w:color="A6A6A6" w:sz="4"/>
-              <w:bottom w:val="single" w:color="A6A6A6" w:sz="4"/>
-              <w:right w:val="single" w:color="A6A6A6" w:sz="4"/>
-            </w:tcBorders>
-            <w:tcMar>
-              <w:top w:type="dxa" w:w="50"/>
-              <w:left w:type="dxa" w:w="60"/>
-              <w:bottom w:type="dxa" w:w="50"/>
-              <w:right w:type="dxa" w:w="60"/>
-            </w:tcMar>
-          </w:tcPr>
-          <w:p>
-            <w:pPr>
-              <w:bidi w:val="false"/>
-              <w:spacing w:after="0" w:line="260"/>
-              <w:jc w:val="center"/>
-            </w:pPr>
-            <w:r>
-              <w:rPr>
-                <w:rFonts w:ascii="Arial" w:cs="Arial" w:eastAsia="Arial" w:hAnsi="Arial"/>
-                <w:b w:val="false"/>
-                <w:bCs w:val="false"/>
-                <w:sz w:val="19"/>
-                <w:szCs w:val="19"/>
-                <w:rtl w:val="false"/>
-              </w:rPr>
-              <w:t xml:space="preserve">☐</w:t>
-            </w:r>
-          </w:p>
-        </w:tc>
-      </w:tr>
-      <w:tr>
-        <w:trPr>
-          <w:cantSplit/>
-          <w:tblHeader w:val="false"/>
-        </w:trPr>
-        <w:tc>
-          <w:tcPr>
-            <w:tcW w:type="dxa" w:w="650"/>
-            <w:tcBorders>
-              <w:top w:val="single" w:color="A6A6A6" w:sz="4"/>
-              <w:left w:val="single" w:color="A6A6A6" w:sz="4"/>
-              <w:bottom w:val="single" w:color="A6A6A6" w:sz="4"/>
-              <w:right w:val="single" w:color="A6A6A6" w:sz="4"/>
-            </w:tcBorders>
-            <w:tcMar>
-              <w:top w:type="dxa" w:w="50"/>
-              <w:left w:type="dxa" w:w="60"/>
-              <w:bottom w:type="dxa" w:w="50"/>
-              <w:right w:type="dxa" w:w="60"/>
-            </w:tcMar>
-          </w:tcPr>
-          <w:p>
-            <w:pPr>
-              <w:bidi w:val="false"/>
-              <w:spacing w:after="0" w:line="260"/>
-              <w:jc w:val="center"/>
-            </w:pPr>
-            <w:r>
-              <w:rPr>
-                <w:rFonts w:ascii="Arial" w:cs="Arial" w:eastAsia="Arial" w:hAnsi="Arial"/>
-                <w:b w:val="false"/>
-                <w:bCs w:val="false"/>
-                <w:sz w:val="19"/>
-                <w:szCs w:val="19"/>
-                <w:rtl w:val="false"/>
-              </w:rPr>
-              <w:t xml:space="preserve">GO4</w:t>
-            </w:r>
-          </w:p>
-        </w:tc>
-        <w:tc>
-          <w:tcPr>
-            <w:tcW w:type="dxa" w:w="4930"/>
-            <w:tcBorders>
-              <w:top w:val="single" w:color="A6A6A6" w:sz="4"/>
-              <w:left w:val="single" w:color="A6A6A6" w:sz="4"/>
-              <w:bottom w:val="single" w:color="A6A6A6" w:sz="4"/>
-              <w:right w:val="single" w:color="A6A6A6" w:sz="4"/>
-            </w:tcBorders>
-            <w:tcMar>
-              <w:top w:type="dxa" w:w="50"/>
-              <w:left w:type="dxa" w:w="60"/>
-              <w:bottom w:type="dxa" w:w="50"/>
-              <w:right w:type="dxa" w:w="60"/>
-            </w:tcMar>
-          </w:tcPr>
-          <w:p>
-            <w:pPr>
-              <w:bidi w:val="false"/>
-              <w:spacing w:after="0" w:line="260"/>
-            </w:pPr>
-            <w:r>
-              <w:rPr>
-                <w:rFonts w:ascii="Arial" w:cs="Arial" w:eastAsia="Arial" w:hAnsi="Arial"/>
-                <w:b w:val="false"/>
-                <w:bCs w:val="false"/>
-                <w:sz w:val="19"/>
-                <w:szCs w:val="19"/>
-                <w:rtl w:val="false"/>
-              </w:rPr>
-              <w:t xml:space="preserve">I enjoy spending time alone rather than in a group</w:t>
-            </w:r>
-          </w:p>
-        </w:tc>
-        <w:tc>
-          <w:tcPr>
-            <w:tcW w:type="dxa" w:w="560"/>
-            <w:tcBorders>
-              <w:top w:val="single" w:color="A6A6A6" w:sz="4"/>
-              <w:left w:val="single" w:color="A6A6A6" w:sz="4"/>
-              <w:bottom w:val="single" w:color="A6A6A6" w:sz="4"/>
-              <w:right w:val="single" w:color="A6A6A6" w:sz="4"/>
-            </w:tcBorders>
-            <w:tcMar>
-              <w:top w:type="dxa" w:w="50"/>
-              <w:left w:type="dxa" w:w="60"/>
-              <w:bottom w:type="dxa" w:w="50"/>
-              <w:right w:type="dxa" w:w="60"/>
-            </w:tcMar>
-          </w:tcPr>
-          <w:p>
-            <w:pPr>
-              <w:bidi w:val="false"/>
-              <w:spacing w:after="0" w:line="260"/>
-              <w:jc w:val="center"/>
-            </w:pPr>
-            <w:r>
-              <w:rPr>
-                <w:rFonts w:ascii="Arial" w:cs="Arial" w:eastAsia="Arial" w:hAnsi="Arial"/>
-                <w:b w:val="false"/>
-                <w:bCs w:val="false"/>
-                <w:sz w:val="19"/>
-                <w:szCs w:val="19"/>
-                <w:rtl w:val="false"/>
-              </w:rPr>
-              <w:t xml:space="preserve">☐</w:t>
-            </w:r>
-          </w:p>
-        </w:tc>
-        <w:tc>
-          <w:tcPr>
-            <w:tcW w:type="dxa" w:w="560"/>
-            <w:tcBorders>
-              <w:top w:val="single" w:color="A6A6A6" w:sz="4"/>
-              <w:left w:val="single" w:color="A6A6A6" w:sz="4"/>
-              <w:bottom w:val="single" w:color="A6A6A6" w:sz="4"/>
-              <w:right w:val="single" w:color="A6A6A6" w:sz="4"/>
-            </w:tcBorders>
-            <w:tcMar>
-              <w:top w:type="dxa" w:w="50"/>
-              <w:left w:type="dxa" w:w="60"/>
-              <w:bottom w:type="dxa" w:w="50"/>
-              <w:right w:type="dxa" w:w="60"/>
-            </w:tcMar>
-          </w:tcPr>
-          <w:p>
-            <w:pPr>
-              <w:bidi w:val="false"/>
-              <w:spacing w:after="0" w:line="260"/>
-              <w:jc w:val="center"/>
-            </w:pPr>
-            <w:r>
-              <w:rPr>
-                <w:rFonts w:ascii="Arial" w:cs="Arial" w:eastAsia="Arial" w:hAnsi="Arial"/>
-                <w:b w:val="false"/>
-                <w:bCs w:val="false"/>
-                <w:sz w:val="19"/>
-                <w:szCs w:val="19"/>
-                <w:rtl w:val="false"/>
-              </w:rPr>
-              <w:t xml:space="preserve">☐</w:t>
-            </w:r>
-          </w:p>
-        </w:tc>
-        <w:tc>
-          <w:tcPr>
-            <w:tcW w:type="dxa" w:w="560"/>
-            <w:tcBorders>
-              <w:top w:val="single" w:color="A6A6A6" w:sz="4"/>
-              <w:left w:val="single" w:color="A6A6A6" w:sz="4"/>
-              <w:bottom w:val="single" w:color="A6A6A6" w:sz="4"/>
-              <w:right w:val="single" w:color="A6A6A6" w:sz="4"/>
-            </w:tcBorders>
-            <w:tcMar>
-              <w:top w:type="dxa" w:w="50"/>
-              <w:left w:type="dxa" w:w="60"/>
-              <w:bottom w:type="dxa" w:w="50"/>
-              <w:right w:type="dxa" w:w="60"/>
-            </w:tcMar>
-          </w:tcPr>
-          <w:p>
-            <w:pPr>
-              <w:bidi w:val="false"/>
-              <w:spacing w:after="0" w:line="260"/>
-              <w:jc w:val="center"/>
-            </w:pPr>
-            <w:r>
-              <w:rPr>
-                <w:rFonts w:ascii="Arial" w:cs="Arial" w:eastAsia="Arial" w:hAnsi="Arial"/>
-                <w:b w:val="false"/>
-                <w:bCs w:val="false"/>
-                <w:sz w:val="19"/>
-                <w:szCs w:val="19"/>
-                <w:rtl w:val="false"/>
-              </w:rPr>
-              <w:t xml:space="preserve">☐</w:t>
-            </w:r>
-          </w:p>
-        </w:tc>
-        <w:tc>
-          <w:tcPr>
-            <w:tcW w:type="dxa" w:w="560"/>
-            <w:tcBorders>
-              <w:top w:val="single" w:color="A6A6A6" w:sz="4"/>
-              <w:left w:val="single" w:color="A6A6A6" w:sz="4"/>
-              <w:bottom w:val="single" w:color="A6A6A6" w:sz="4"/>
-              <w:right w:val="single" w:color="A6A6A6" w:sz="4"/>
-            </w:tcBorders>
-            <w:tcMar>
-              <w:top w:type="dxa" w:w="50"/>
-              <w:left w:type="dxa" w:w="60"/>
-              <w:bottom w:type="dxa" w:w="50"/>
-              <w:right w:type="dxa" w:w="60"/>
-            </w:tcMar>
-          </w:tcPr>
-          <w:p>
-            <w:pPr>
-              <w:bidi w:val="false"/>
-              <w:spacing w:after="0" w:line="260"/>
-              <w:jc w:val="center"/>
-            </w:pPr>
-            <w:r>
-              <w:rPr>
-                <w:rFonts w:ascii="Arial" w:cs="Arial" w:eastAsia="Arial" w:hAnsi="Arial"/>
-                <w:b w:val="false"/>
-                <w:bCs w:val="false"/>
-                <w:sz w:val="19"/>
-                <w:szCs w:val="19"/>
-                <w:rtl w:val="false"/>
-              </w:rPr>
-              <w:t xml:space="preserve">☐</w:t>
-            </w:r>
-          </w:p>
-        </w:tc>
-        <w:tc>
-          <w:tcPr>
-            <w:tcW w:type="dxa" w:w="560"/>
-            <w:tcBorders>
-              <w:top w:val="single" w:color="A6A6A6" w:sz="4"/>
-              <w:left w:val="single" w:color="A6A6A6" w:sz="4"/>
-              <w:bottom w:val="single" w:color="A6A6A6" w:sz="4"/>
-              <w:right w:val="single" w:color="A6A6A6" w:sz="4"/>
-            </w:tcBorders>
-            <w:tcMar>
-              <w:top w:type="dxa" w:w="50"/>
-              <w:left w:type="dxa" w:w="60"/>
-              <w:bottom w:type="dxa" w:w="50"/>
-              <w:right w:type="dxa" w:w="60"/>
-            </w:tcMar>
-          </w:tcPr>
-          <w:p>
-            <w:pPr>
-              <w:bidi w:val="false"/>
-              <w:spacing w:after="0" w:line="260"/>
-              <w:jc w:val="center"/>
-            </w:pPr>
-            <w:r>
-              <w:rPr>
-                <w:rFonts w:ascii="Arial" w:cs="Arial" w:eastAsia="Arial" w:hAnsi="Arial"/>
-                <w:b w:val="false"/>
-                <w:bCs w:val="false"/>
-                <w:sz w:val="19"/>
-                <w:szCs w:val="19"/>
-                <w:rtl w:val="false"/>
-              </w:rPr>
-              <w:t xml:space="preserve">☐</w:t>
-            </w:r>
-          </w:p>
-        </w:tc>
-        <w:tc>
-          <w:tcPr>
-            <w:tcW w:type="dxa" w:w="560"/>
-            <w:tcBorders>
-              <w:top w:val="single" w:color="A6A6A6" w:sz="4"/>
-              <w:left w:val="single" w:color="A6A6A6" w:sz="4"/>
-              <w:bottom w:val="single" w:color="A6A6A6" w:sz="4"/>
-              <w:right w:val="single" w:color="A6A6A6" w:sz="4"/>
-            </w:tcBorders>
-            <w:tcMar>
-              <w:top w:type="dxa" w:w="50"/>
-              <w:left w:type="dxa" w:w="60"/>
-              <w:bottom w:type="dxa" w:w="50"/>
-              <w:right w:type="dxa" w:w="60"/>
-            </w:tcMar>
-          </w:tcPr>
-          <w:p>
-            <w:pPr>
-              <w:bidi w:val="false"/>
-              <w:spacing w:after="0" w:line="260"/>
-              <w:jc w:val="center"/>
-            </w:pPr>
-            <w:r>
-              <w:rPr>
-                <w:rFonts w:ascii="Arial" w:cs="Arial" w:eastAsia="Arial" w:hAnsi="Arial"/>
-                <w:b w:val="false"/>
-                <w:bCs w:val="false"/>
-                <w:sz w:val="19"/>
-                <w:szCs w:val="19"/>
-                <w:rtl w:val="false"/>
-              </w:rPr>
-              <w:t xml:space="preserve">☐</w:t>
-            </w:r>
-          </w:p>
-        </w:tc>
-        <w:tc>
-          <w:tcPr>
-            <w:tcW w:type="dxa" w:w="560"/>
-            <w:tcBorders>
-              <w:top w:val="single" w:color="A6A6A6" w:sz="4"/>
-              <w:left w:val="single" w:color="A6A6A6" w:sz="4"/>
-              <w:bottom w:val="single" w:color="A6A6A6" w:sz="4"/>
-              <w:right w:val="single" w:color="A6A6A6" w:sz="4"/>
-            </w:tcBorders>
-            <w:tcMar>
-              <w:top w:type="dxa" w:w="50"/>
-              <w:left w:type="dxa" w:w="60"/>
-              <w:bottom w:type="dxa" w:w="50"/>
-              <w:right w:type="dxa" w:w="60"/>
-            </w:tcMar>
-          </w:tcPr>
-          <w:p>
-            <w:pPr>
-              <w:bidi w:val="false"/>
-              <w:spacing w:after="0" w:line="260"/>
-              <w:jc w:val="center"/>
-            </w:pPr>
-            <w:r>
-              <w:rPr>
-                <w:rFonts w:ascii="Arial" w:cs="Arial" w:eastAsia="Arial" w:hAnsi="Arial"/>
-                <w:b w:val="false"/>
-                <w:bCs w:val="false"/>
-                <w:sz w:val="19"/>
-                <w:szCs w:val="19"/>
-                <w:rtl w:val="false"/>
-              </w:rPr>
-              <w:t xml:space="preserve">☐</w:t>
-            </w:r>
-          </w:p>
-        </w:tc>
-      </w:tr>
-      <w:tr>
-        <w:trPr>
-          <w:cantSplit/>
-          <w:tblHeader w:val="false"/>
-        </w:trPr>
-        <w:tc>
-          <w:tcPr>
-            <w:tcW w:type="dxa" w:w="650"/>
-            <w:tcBorders>
-              <w:top w:val="single" w:color="A6A6A6" w:sz="4"/>
-              <w:left w:val="single" w:color="A6A6A6" w:sz="4"/>
-              <w:bottom w:val="single" w:color="A6A6A6" w:sz="4"/>
-              <w:right w:val="single" w:color="A6A6A6" w:sz="4"/>
-            </w:tcBorders>
-            <w:tcMar>
-              <w:top w:type="dxa" w:w="50"/>
-              <w:left w:type="dxa" w:w="60"/>
-              <w:bottom w:type="dxa" w:w="50"/>
-              <w:right w:type="dxa" w:w="60"/>
-            </w:tcMar>
-          </w:tcPr>
-          <w:p>
-            <w:pPr>
-              <w:bidi w:val="false"/>
-              <w:spacing w:after="0" w:line="260"/>
-              <w:jc w:val="center"/>
-            </w:pPr>
-            <w:r>
-              <w:rPr>
-                <w:rFonts w:ascii="Arial" w:cs="Arial" w:eastAsia="Arial" w:hAnsi="Arial"/>
-                <w:b w:val="false"/>
-                <w:bCs w:val="false"/>
-                <w:sz w:val="19"/>
-                <w:szCs w:val="19"/>
-                <w:rtl w:val="false"/>
-              </w:rPr>
-              <w:t xml:space="preserve">GO5</w:t>
-            </w:r>
-          </w:p>
-        </w:tc>
-        <w:tc>
-          <w:tcPr>
-            <w:tcW w:type="dxa" w:w="4930"/>
-            <w:tcBorders>
-              <w:top w:val="single" w:color="A6A6A6" w:sz="4"/>
-              <w:left w:val="single" w:color="A6A6A6" w:sz="4"/>
-              <w:bottom w:val="single" w:color="A6A6A6" w:sz="4"/>
-              <w:right w:val="single" w:color="A6A6A6" w:sz="4"/>
-            </w:tcBorders>
-            <w:tcMar>
-              <w:top w:type="dxa" w:w="50"/>
-              <w:left w:type="dxa" w:w="60"/>
-              <w:bottom w:type="dxa" w:w="50"/>
-              <w:right w:type="dxa" w:w="60"/>
-            </w:tcMar>
-          </w:tcPr>
-          <w:p>
-            <w:pPr>
-              <w:bidi w:val="false"/>
-              <w:spacing w:after="0" w:line="260"/>
-            </w:pPr>
-            <w:r>
-              <w:rPr>
-                <w:rFonts w:ascii="Arial" w:cs="Arial" w:eastAsia="Arial" w:hAnsi="Arial"/>
-                <w:b w:val="false"/>
-                <w:bCs w:val="false"/>
-                <w:sz w:val="19"/>
-                <w:szCs w:val="19"/>
-                <w:rtl w:val="false"/>
-              </w:rPr>
-              <w:t xml:space="preserve">When I am with a group, I easily merge with the others in the group</w:t>
-            </w:r>
-          </w:p>
-        </w:tc>
-        <w:tc>
-          <w:tcPr>
-            <w:tcW w:type="dxa" w:w="560"/>
-            <w:tcBorders>
-              <w:top w:val="single" w:color="A6A6A6" w:sz="4"/>
-              <w:left w:val="single" w:color="A6A6A6" w:sz="4"/>
-              <w:bottom w:val="single" w:color="A6A6A6" w:sz="4"/>
-              <w:right w:val="single" w:color="A6A6A6" w:sz="4"/>
-            </w:tcBorders>
-            <w:tcMar>
-              <w:top w:type="dxa" w:w="50"/>
-              <w:left w:type="dxa" w:w="60"/>
-              <w:bottom w:type="dxa" w:w="50"/>
-              <w:right w:type="dxa" w:w="60"/>
-            </w:tcMar>
-          </w:tcPr>
-          <w:p>
-            <w:pPr>
-              <w:bidi w:val="false"/>
-              <w:spacing w:after="0" w:line="260"/>
-              <w:jc w:val="center"/>
-            </w:pPr>
-            <w:r>
-              <w:rPr>
-                <w:rFonts w:ascii="Arial" w:cs="Arial" w:eastAsia="Arial" w:hAnsi="Arial"/>
-                <w:b w:val="false"/>
-                <w:bCs w:val="false"/>
-                <w:sz w:val="19"/>
-                <w:szCs w:val="19"/>
-                <w:rtl w:val="false"/>
-              </w:rPr>
-              <w:t xml:space="preserve">☐</w:t>
-            </w:r>
-          </w:p>
-        </w:tc>
-        <w:tc>
-          <w:tcPr>
-            <w:tcW w:type="dxa" w:w="560"/>
-            <w:tcBorders>
-              <w:top w:val="single" w:color="A6A6A6" w:sz="4"/>
-              <w:left w:val="single" w:color="A6A6A6" w:sz="4"/>
-              <w:bottom w:val="single" w:color="A6A6A6" w:sz="4"/>
-              <w:right w:val="single" w:color="A6A6A6" w:sz="4"/>
-            </w:tcBorders>
-            <w:tcMar>
-              <w:top w:type="dxa" w:w="50"/>
-              <w:left w:type="dxa" w:w="60"/>
-              <w:bottom w:type="dxa" w:w="50"/>
-              <w:right w:type="dxa" w:w="60"/>
-            </w:tcMar>
-          </w:tcPr>
-          <w:p>
-            <w:pPr>
-              <w:bidi w:val="false"/>
-              <w:spacing w:after="0" w:line="260"/>
-              <w:jc w:val="center"/>
-            </w:pPr>
-            <w:r>
-              <w:rPr>
-                <w:rFonts w:ascii="Arial" w:cs="Arial" w:eastAsia="Arial" w:hAnsi="Arial"/>
-                <w:b w:val="false"/>
-                <w:bCs w:val="false"/>
-                <w:sz w:val="19"/>
-                <w:szCs w:val="19"/>
-                <w:rtl w:val="false"/>
-              </w:rPr>
-              <w:t xml:space="preserve">☐</w:t>
-            </w:r>
-          </w:p>
-        </w:tc>
-        <w:tc>
-          <w:tcPr>
-            <w:tcW w:type="dxa" w:w="560"/>
-            <w:tcBorders>
-              <w:top w:val="single" w:color="A6A6A6" w:sz="4"/>
-              <w:left w:val="single" w:color="A6A6A6" w:sz="4"/>
-              <w:bottom w:val="single" w:color="A6A6A6" w:sz="4"/>
-              <w:right w:val="single" w:color="A6A6A6" w:sz="4"/>
-            </w:tcBorders>
-            <w:tcMar>
-              <w:top w:type="dxa" w:w="50"/>
-              <w:left w:type="dxa" w:w="60"/>
-              <w:bottom w:type="dxa" w:w="50"/>
-              <w:right w:type="dxa" w:w="60"/>
-            </w:tcMar>
-          </w:tcPr>
-          <w:p>
-            <w:pPr>
-              <w:bidi w:val="false"/>
-              <w:spacing w:after="0" w:line="260"/>
-              <w:jc w:val="center"/>
-            </w:pPr>
-            <w:r>
-              <w:rPr>
-                <w:rFonts w:ascii="Arial" w:cs="Arial" w:eastAsia="Arial" w:hAnsi="Arial"/>
-                <w:b w:val="false"/>
-                <w:bCs w:val="false"/>
-                <w:sz w:val="19"/>
-                <w:szCs w:val="19"/>
-                <w:rtl w:val="false"/>
-              </w:rPr>
-              <w:t xml:space="preserve">☐</w:t>
-            </w:r>
-          </w:p>
-        </w:tc>
-        <w:tc>
-          <w:tcPr>
-            <w:tcW w:type="dxa" w:w="560"/>
-            <w:tcBorders>
-              <w:top w:val="single" w:color="A6A6A6" w:sz="4"/>
-              <w:left w:val="single" w:color="A6A6A6" w:sz="4"/>
-              <w:bottom w:val="single" w:color="A6A6A6" w:sz="4"/>
-              <w:right w:val="single" w:color="A6A6A6" w:sz="4"/>
-            </w:tcBorders>
-            <w:tcMar>
-              <w:top w:type="dxa" w:w="50"/>
-              <w:left w:type="dxa" w:w="60"/>
-              <w:bottom w:type="dxa" w:w="50"/>
-              <w:right w:type="dxa" w:w="60"/>
-            </w:tcMar>
-          </w:tcPr>
-          <w:p>
-            <w:pPr>
-              <w:bidi w:val="false"/>
-              <w:spacing w:after="0" w:line="260"/>
-              <w:jc w:val="center"/>
-            </w:pPr>
-            <w:r>
-              <w:rPr>
-                <w:rFonts w:ascii="Arial" w:cs="Arial" w:eastAsia="Arial" w:hAnsi="Arial"/>
-                <w:b w:val="false"/>
-                <w:bCs w:val="false"/>
-                <w:sz w:val="19"/>
-                <w:szCs w:val="19"/>
-                <w:rtl w:val="false"/>
-              </w:rPr>
-              <w:t xml:space="preserve">☐</w:t>
-            </w:r>
-          </w:p>
-        </w:tc>
-        <w:tc>
-          <w:tcPr>
-            <w:tcW w:type="dxa" w:w="560"/>
-            <w:tcBorders>
-              <w:top w:val="single" w:color="A6A6A6" w:sz="4"/>
-              <w:left w:val="single" w:color="A6A6A6" w:sz="4"/>
-              <w:bottom w:val="single" w:color="A6A6A6" w:sz="4"/>
-              <w:right w:val="single" w:color="A6A6A6" w:sz="4"/>
-            </w:tcBorders>
-            <w:tcMar>
-              <w:top w:type="dxa" w:w="50"/>
-              <w:left w:type="dxa" w:w="60"/>
-              <w:bottom w:type="dxa" w:w="50"/>
-              <w:right w:type="dxa" w:w="60"/>
-            </w:tcMar>
-          </w:tcPr>
-          <w:p>
-            <w:pPr>
-              <w:bidi w:val="false"/>
-              <w:spacing w:after="0" w:line="260"/>
-              <w:jc w:val="center"/>
-            </w:pPr>
-            <w:r>
-              <w:rPr>
-                <w:rFonts w:ascii="Arial" w:cs="Arial" w:eastAsia="Arial" w:hAnsi="Arial"/>
-                <w:b w:val="false"/>
-                <w:bCs w:val="false"/>
-                <w:sz w:val="19"/>
-                <w:szCs w:val="19"/>
-                <w:rtl w:val="false"/>
-              </w:rPr>
-              <w:t xml:space="preserve">☐</w:t>
-            </w:r>
-          </w:p>
-        </w:tc>
-        <w:tc>
-          <w:tcPr>
-            <w:tcW w:type="dxa" w:w="560"/>
-            <w:tcBorders>
-              <w:top w:val="single" w:color="A6A6A6" w:sz="4"/>
-              <w:left w:val="single" w:color="A6A6A6" w:sz="4"/>
-              <w:bottom w:val="single" w:color="A6A6A6" w:sz="4"/>
-              <w:right w:val="single" w:color="A6A6A6" w:sz="4"/>
-            </w:tcBorders>
-            <w:tcMar>
-              <w:top w:type="dxa" w:w="50"/>
-              <w:left w:type="dxa" w:w="60"/>
-              <w:bottom w:type="dxa" w:w="50"/>
-              <w:right w:type="dxa" w:w="60"/>
-            </w:tcMar>
-          </w:tcPr>
-          <w:p>
-            <w:pPr>
-              <w:bidi w:val="false"/>
-              <w:spacing w:after="0" w:line="260"/>
-              <w:jc w:val="center"/>
-            </w:pPr>
-            <w:r>
-              <w:rPr>
-                <w:rFonts w:ascii="Arial" w:cs="Arial" w:eastAsia="Arial" w:hAnsi="Arial"/>
-                <w:b w:val="false"/>
-                <w:bCs w:val="false"/>
-                <w:sz w:val="19"/>
-                <w:szCs w:val="19"/>
-                <w:rtl w:val="false"/>
-              </w:rPr>
-              <w:t xml:space="preserve">☐</w:t>
-            </w:r>
-          </w:p>
-        </w:tc>
-        <w:tc>
-          <w:tcPr>
-            <w:tcW w:type="dxa" w:w="560"/>
-            <w:tcBorders>
-              <w:top w:val="single" w:color="A6A6A6" w:sz="4"/>
-              <w:left w:val="single" w:color="A6A6A6" w:sz="4"/>
-              <w:bottom w:val="single" w:color="A6A6A6" w:sz="4"/>
-              <w:right w:val="single" w:color="A6A6A6" w:sz="4"/>
-            </w:tcBorders>
-            <w:tcMar>
-              <w:top w:type="dxa" w:w="50"/>
-              <w:left w:type="dxa" w:w="60"/>
-              <w:bottom w:type="dxa" w:w="50"/>
-              <w:right w:type="dxa" w:w="60"/>
-            </w:tcMar>
-          </w:tcPr>
-          <w:p>
-            <w:pPr>
-              <w:bidi w:val="false"/>
-              <w:spacing w:after="0" w:line="260"/>
-              <w:jc w:val="center"/>
-            </w:pPr>
-            <w:r>
-              <w:rPr>
-                <w:rFonts w:ascii="Arial" w:cs="Arial" w:eastAsia="Arial" w:hAnsi="Arial"/>
-                <w:b w:val="false"/>
-                <w:bCs w:val="false"/>
-                <w:sz w:val="19"/>
-                <w:szCs w:val="19"/>
-                <w:rtl w:val="false"/>
-              </w:rPr>
-              <w:t xml:space="preserve">☐</w:t>
-            </w:r>
-          </w:p>
-        </w:tc>
-      </w:tr>
-      <w:tr>
-        <w:trPr>
-          <w:cantSplit/>
-          <w:tblHeader w:val="false"/>
-        </w:trPr>
-        <w:tc>
-          <w:tcPr>
-            <w:tcW w:type="dxa" w:w="650"/>
-            <w:tcBorders>
-              <w:top w:val="single" w:color="A6A6A6" w:sz="4"/>
-              <w:left w:val="single" w:color="A6A6A6" w:sz="4"/>
-              <w:bottom w:val="single" w:color="A6A6A6" w:sz="4"/>
-              <w:right w:val="single" w:color="A6A6A6" w:sz="4"/>
-            </w:tcBorders>
-            <w:tcMar>
-              <w:top w:type="dxa" w:w="50"/>
-              <w:left w:type="dxa" w:w="60"/>
-              <w:bottom w:type="dxa" w:w="50"/>
-              <w:right w:type="dxa" w:w="60"/>
-            </w:tcMar>
-          </w:tcPr>
-          <w:p>
-            <w:pPr>
-              <w:bidi w:val="false"/>
-              <w:spacing w:after="0" w:line="260"/>
-              <w:jc w:val="center"/>
-            </w:pPr>
-            <w:r>
-              <w:rPr>
-                <w:rFonts w:ascii="Arial" w:cs="Arial" w:eastAsia="Arial" w:hAnsi="Arial"/>
-                <w:b w:val="false"/>
-                <w:bCs w:val="false"/>
-                <w:sz w:val="19"/>
-                <w:szCs w:val="19"/>
-                <w:rtl w:val="false"/>
-              </w:rPr>
-              <w:t xml:space="preserve">GO6</w:t>
-            </w:r>
-          </w:p>
-        </w:tc>
-        <w:tc>
-          <w:tcPr>
-            <w:tcW w:type="dxa" w:w="4930"/>
-            <w:tcBorders>
-              <w:top w:val="single" w:color="A6A6A6" w:sz="4"/>
-              <w:left w:val="single" w:color="A6A6A6" w:sz="4"/>
-              <w:bottom w:val="single" w:color="A6A6A6" w:sz="4"/>
-              <w:right w:val="single" w:color="A6A6A6" w:sz="4"/>
-            </w:tcBorders>
-            <w:tcMar>
-              <w:top w:type="dxa" w:w="50"/>
-              <w:left w:type="dxa" w:w="60"/>
-              <w:bottom w:type="dxa" w:w="50"/>
-              <w:right w:type="dxa" w:w="60"/>
-            </w:tcMar>
-          </w:tcPr>
-          <w:p>
-            <w:pPr>
-              <w:bidi w:val="false"/>
-              <w:spacing w:after="0" w:line="260"/>
-            </w:pPr>
-            <w:r>
-              <w:rPr>
-                <w:rFonts w:ascii="Arial" w:cs="Arial" w:eastAsia="Arial" w:hAnsi="Arial"/>
-                <w:b w:val="false"/>
-                <w:bCs w:val="false"/>
-                <w:sz w:val="19"/>
-                <w:szCs w:val="19"/>
-                <w:rtl w:val="false"/>
-              </w:rPr>
-              <w:t xml:space="preserve">I easily identify with the groups that I belong to</w:t>
-            </w:r>
-          </w:p>
-        </w:tc>
-        <w:tc>
-          <w:tcPr>
-            <w:tcW w:type="dxa" w:w="560"/>
-            <w:tcBorders>
-              <w:top w:val="single" w:color="A6A6A6" w:sz="4"/>
-              <w:left w:val="single" w:color="A6A6A6" w:sz="4"/>
-              <w:bottom w:val="single" w:color="A6A6A6" w:sz="4"/>
-              <w:right w:val="single" w:color="A6A6A6" w:sz="4"/>
-            </w:tcBorders>
-            <w:tcMar>
-              <w:top w:type="dxa" w:w="50"/>
-              <w:left w:type="dxa" w:w="60"/>
-              <w:bottom w:type="dxa" w:w="50"/>
-              <w:right w:type="dxa" w:w="60"/>
-            </w:tcMar>
-          </w:tcPr>
-          <w:p>
-            <w:pPr>
-              <w:bidi w:val="false"/>
-              <w:spacing w:after="0" w:line="260"/>
-              <w:jc w:val="center"/>
-            </w:pPr>
-            <w:r>
-              <w:rPr>
-                <w:rFonts w:ascii="Arial" w:cs="Arial" w:eastAsia="Arial" w:hAnsi="Arial"/>
-                <w:b w:val="false"/>
-                <w:bCs w:val="false"/>
-                <w:sz w:val="19"/>
-                <w:szCs w:val="19"/>
-                <w:rtl w:val="false"/>
-              </w:rPr>
-              <w:t xml:space="preserve">☐</w:t>
-            </w:r>
-          </w:p>
-        </w:tc>
-        <w:tc>
-          <w:tcPr>
-            <w:tcW w:type="dxa" w:w="560"/>
-            <w:tcBorders>
-              <w:top w:val="single" w:color="A6A6A6" w:sz="4"/>
-              <w:left w:val="single" w:color="A6A6A6" w:sz="4"/>
-              <w:bottom w:val="single" w:color="A6A6A6" w:sz="4"/>
-              <w:right w:val="single" w:color="A6A6A6" w:sz="4"/>
-            </w:tcBorders>
-            <w:tcMar>
-              <w:top w:type="dxa" w:w="50"/>
-              <w:left w:type="dxa" w:w="60"/>
-              <w:bottom w:type="dxa" w:w="50"/>
-              <w:right w:type="dxa" w:w="60"/>
-            </w:tcMar>
-          </w:tcPr>
-          <w:p>
-            <w:pPr>
-              <w:bidi w:val="false"/>
-              <w:spacing w:after="0" w:line="260"/>
-              <w:jc w:val="center"/>
-            </w:pPr>
-            <w:r>
-              <w:rPr>
-                <w:rFonts w:ascii="Arial" w:cs="Arial" w:eastAsia="Arial" w:hAnsi="Arial"/>
-                <w:b w:val="false"/>
-                <w:bCs w:val="false"/>
-                <w:sz w:val="19"/>
-                <w:szCs w:val="19"/>
-                <w:rtl w:val="false"/>
-              </w:rPr>
-              <w:t xml:space="preserve">☐</w:t>
-            </w:r>
-          </w:p>
-        </w:tc>
-        <w:tc>
-          <w:tcPr>
-            <w:tcW w:type="dxa" w:w="560"/>
-            <w:tcBorders>
-              <w:top w:val="single" w:color="A6A6A6" w:sz="4"/>
-              <w:left w:val="single" w:color="A6A6A6" w:sz="4"/>
-              <w:bottom w:val="single" w:color="A6A6A6" w:sz="4"/>
-              <w:right w:val="single" w:color="A6A6A6" w:sz="4"/>
-            </w:tcBorders>
-            <w:tcMar>
-              <w:top w:type="dxa" w:w="50"/>
-              <w:left w:type="dxa" w:w="60"/>
-              <w:bottom w:type="dxa" w:w="50"/>
-              <w:right w:type="dxa" w:w="60"/>
-            </w:tcMar>
-          </w:tcPr>
-          <w:p>
-            <w:pPr>
-              <w:bidi w:val="false"/>
-              <w:spacing w:after="0" w:line="260"/>
-              <w:jc w:val="center"/>
-            </w:pPr>
-            <w:r>
-              <w:rPr>
-                <w:rFonts w:ascii="Arial" w:cs="Arial" w:eastAsia="Arial" w:hAnsi="Arial"/>
-                <w:b w:val="false"/>
-                <w:bCs w:val="false"/>
-                <w:sz w:val="19"/>
-                <w:szCs w:val="19"/>
-                <w:rtl w:val="false"/>
-              </w:rPr>
-              <w:t xml:space="preserve">☐</w:t>
-            </w:r>
-          </w:p>
-        </w:tc>
-        <w:tc>
-          <w:tcPr>
-            <w:tcW w:type="dxa" w:w="560"/>
-            <w:tcBorders>
-              <w:top w:val="single" w:color="A6A6A6" w:sz="4"/>
-              <w:left w:val="single" w:color="A6A6A6" w:sz="4"/>
-              <w:bottom w:val="single" w:color="A6A6A6" w:sz="4"/>
-              <w:right w:val="single" w:color="A6A6A6" w:sz="4"/>
-            </w:tcBorders>
-            <w:tcMar>
-              <w:top w:type="dxa" w:w="50"/>
-              <w:left w:type="dxa" w:w="60"/>
-              <w:bottom w:type="dxa" w:w="50"/>
-              <w:right w:type="dxa" w:w="60"/>
-            </w:tcMar>
-          </w:tcPr>
-          <w:p>
-            <w:pPr>
-              <w:bidi w:val="false"/>
-              <w:spacing w:after="0" w:line="260"/>
-              <w:jc w:val="center"/>
-            </w:pPr>
-            <w:r>
-              <w:rPr>
-                <w:rFonts w:ascii="Arial" w:cs="Arial" w:eastAsia="Arial" w:hAnsi="Arial"/>
-                <w:b w:val="false"/>
-                <w:bCs w:val="false"/>
-                <w:sz w:val="19"/>
-                <w:szCs w:val="19"/>
-                <w:rtl w:val="false"/>
-              </w:rPr>
-              <w:t xml:space="preserve">☐</w:t>
-            </w:r>
-          </w:p>
-        </w:tc>
-        <w:tc>
-          <w:tcPr>
-            <w:tcW w:type="dxa" w:w="560"/>
-            <w:tcBorders>
-              <w:top w:val="single" w:color="A6A6A6" w:sz="4"/>
-              <w:left w:val="single" w:color="A6A6A6" w:sz="4"/>
-              <w:bottom w:val="single" w:color="A6A6A6" w:sz="4"/>
-              <w:right w:val="single" w:color="A6A6A6" w:sz="4"/>
-            </w:tcBorders>
-            <w:tcMar>
-              <w:top w:type="dxa" w:w="50"/>
-              <w:left w:type="dxa" w:w="60"/>
-              <w:bottom w:type="dxa" w:w="50"/>
-              <w:right w:type="dxa" w:w="60"/>
-            </w:tcMar>
-          </w:tcPr>
-          <w:p>
-            <w:pPr>
-              <w:bidi w:val="false"/>
-              <w:spacing w:after="0" w:line="260"/>
-              <w:jc w:val="center"/>
-            </w:pPr>
-            <w:r>
-              <w:rPr>
-                <w:rFonts w:ascii="Arial" w:cs="Arial" w:eastAsia="Arial" w:hAnsi="Arial"/>
-                <w:b w:val="false"/>
-                <w:bCs w:val="false"/>
-                <w:sz w:val="19"/>
-                <w:szCs w:val="19"/>
-                <w:rtl w:val="false"/>
-              </w:rPr>
-              <w:t xml:space="preserve">☐</w:t>
-            </w:r>
-          </w:p>
-        </w:tc>
-        <w:tc>
-          <w:tcPr>
-            <w:tcW w:type="dxa" w:w="560"/>
-            <w:tcBorders>
-              <w:top w:val="single" w:color="A6A6A6" w:sz="4"/>
-              <w:left w:val="single" w:color="A6A6A6" w:sz="4"/>
-              <w:bottom w:val="single" w:color="A6A6A6" w:sz="4"/>
-              <w:right w:val="single" w:color="A6A6A6" w:sz="4"/>
-            </w:tcBorders>
-            <w:tcMar>
-              <w:top w:type="dxa" w:w="50"/>
-              <w:left w:type="dxa" w:w="60"/>
-              <w:bottom w:type="dxa" w:w="50"/>
-              <w:right w:type="dxa" w:w="60"/>
-            </w:tcMar>
-          </w:tcPr>
-          <w:p>
-            <w:pPr>
-              <w:bidi w:val="false"/>
-              <w:spacing w:after="0" w:line="260"/>
-              <w:jc w:val="center"/>
-            </w:pPr>
-            <w:r>
-              <w:rPr>
-                <w:rFonts w:ascii="Arial" w:cs="Arial" w:eastAsia="Arial" w:hAnsi="Arial"/>
-                <w:b w:val="false"/>
-                <w:bCs w:val="false"/>
-                <w:sz w:val="19"/>
-                <w:szCs w:val="19"/>
-                <w:rtl w:val="false"/>
-              </w:rPr>
-              <w:t xml:space="preserve">☐</w:t>
-            </w:r>
-          </w:p>
-        </w:tc>
-        <w:tc>
-          <w:tcPr>
-            <w:tcW w:type="dxa" w:w="560"/>
-            <w:tcBorders>
-              <w:top w:val="single" w:color="A6A6A6" w:sz="4"/>
-              <w:left w:val="single" w:color="A6A6A6" w:sz="4"/>
-              <w:bottom w:val="single" w:color="A6A6A6" w:sz="4"/>
-              <w:right w:val="single" w:color="A6A6A6" w:sz="4"/>
-            </w:tcBorders>
-            <w:tcMar>
-              <w:top w:type="dxa" w:w="50"/>
-              <w:left w:type="dxa" w:w="60"/>
-              <w:bottom w:type="dxa" w:w="50"/>
-              <w:right w:type="dxa" w:w="60"/>
-            </w:tcMar>
-          </w:tcPr>
-          <w:p>
-            <w:pPr>
-              <w:bidi w:val="false"/>
-              <w:spacing w:after="0" w:line="260"/>
-              <w:jc w:val="center"/>
-            </w:pPr>
-            <w:r>
-              <w:rPr>
-                <w:rFonts w:ascii="Arial" w:cs="Arial" w:eastAsia="Arial" w:hAnsi="Arial"/>
-                <w:b w:val="false"/>
-                <w:bCs w:val="false"/>
-                <w:sz w:val="19"/>
-                <w:szCs w:val="19"/>
-                <w:rtl w:val="false"/>
-              </w:rPr>
-              <w:t xml:space="preserve">☐</w:t>
-            </w:r>
-          </w:p>
-        </w:tc>
-      </w:tr>
-      <w:tr>
-        <w:trPr>
-          <w:cantSplit/>
-          <w:tblHeader w:val="false"/>
-        </w:trPr>
-        <w:tc>
-          <w:tcPr>
-            <w:tcW w:type="dxa" w:w="650"/>
-            <w:tcBorders>
-              <w:top w:val="single" w:color="A6A6A6" w:sz="4"/>
-              <w:left w:val="single" w:color="A6A6A6" w:sz="4"/>
-              <w:bottom w:val="single" w:color="A6A6A6" w:sz="4"/>
-              <w:right w:val="single" w:color="A6A6A6" w:sz="4"/>
-            </w:tcBorders>
-            <w:tcMar>
-              <w:top w:type="dxa" w:w="50"/>
-              <w:left w:type="dxa" w:w="60"/>
-              <w:bottom w:type="dxa" w:w="50"/>
-              <w:right w:type="dxa" w:w="60"/>
-            </w:tcMar>
-          </w:tcPr>
-          <w:p>
-            <w:pPr>
-              <w:bidi w:val="false"/>
-              <w:spacing w:after="0" w:line="260"/>
-              <w:jc w:val="center"/>
-            </w:pPr>
-            <w:r>
-              <w:rPr>
-                <w:rFonts w:ascii="Arial" w:cs="Arial" w:eastAsia="Arial" w:hAnsi="Arial"/>
-                <w:b w:val="false"/>
-                <w:bCs w:val="false"/>
-                <w:sz w:val="19"/>
-                <w:szCs w:val="19"/>
-                <w:rtl w:val="false"/>
-              </w:rPr>
-              <w:t xml:space="preserve">GO7</w:t>
-            </w:r>
-          </w:p>
-        </w:tc>
-        <w:tc>
-          <w:tcPr>
-            <w:tcW w:type="dxa" w:w="4930"/>
-            <w:tcBorders>
-              <w:top w:val="single" w:color="A6A6A6" w:sz="4"/>
-              <w:left w:val="single" w:color="A6A6A6" w:sz="4"/>
-              <w:bottom w:val="single" w:color="A6A6A6" w:sz="4"/>
-              <w:right w:val="single" w:color="A6A6A6" w:sz="4"/>
-            </w:tcBorders>
-            <w:tcMar>
-              <w:top w:type="dxa" w:w="50"/>
-              <w:left w:type="dxa" w:w="60"/>
-              <w:bottom w:type="dxa" w:w="50"/>
-              <w:right w:type="dxa" w:w="60"/>
-            </w:tcMar>
-          </w:tcPr>
-          <w:p>
-            <w:pPr>
-              <w:bidi w:val="false"/>
-              <w:spacing w:after="0" w:line="260"/>
-            </w:pPr>
-            <w:r>
-              <w:rPr>
-                <w:rFonts w:ascii="Arial" w:cs="Arial" w:eastAsia="Arial" w:hAnsi="Arial"/>
-                <w:b w:val="false"/>
-                <w:bCs w:val="false"/>
-                <w:sz w:val="19"/>
-                <w:szCs w:val="19"/>
-                <w:rtl w:val="false"/>
-              </w:rPr>
-              <w:t xml:space="preserve">I take pleasure in collaborating in groups</w:t>
-            </w:r>
-          </w:p>
-        </w:tc>
-        <w:tc>
-          <w:tcPr>
-            <w:tcW w:type="dxa" w:w="560"/>
-            <w:tcBorders>
-              <w:top w:val="single" w:color="A6A6A6" w:sz="4"/>
-              <w:left w:val="single" w:color="A6A6A6" w:sz="4"/>
-              <w:bottom w:val="single" w:color="A6A6A6" w:sz="4"/>
-              <w:right w:val="single" w:color="A6A6A6" w:sz="4"/>
-            </w:tcBorders>
-            <w:tcMar>
-              <w:top w:type="dxa" w:w="50"/>
-              <w:left w:type="dxa" w:w="60"/>
-              <w:bottom w:type="dxa" w:w="50"/>
-              <w:right w:type="dxa" w:w="60"/>
-            </w:tcMar>
-          </w:tcPr>
-          <w:p>
-            <w:pPr>
-              <w:bidi w:val="false"/>
-              <w:spacing w:after="0" w:line="260"/>
-              <w:jc w:val="center"/>
-            </w:pPr>
-            <w:r>
-              <w:rPr>
-                <w:rFonts w:ascii="Arial" w:cs="Arial" w:eastAsia="Arial" w:hAnsi="Arial"/>
-                <w:b w:val="false"/>
-                <w:bCs w:val="false"/>
-                <w:sz w:val="19"/>
-                <w:szCs w:val="19"/>
-                <w:rtl w:val="false"/>
-              </w:rPr>
-              <w:t xml:space="preserve">☐</w:t>
-            </w:r>
-          </w:p>
-        </w:tc>
-        <w:tc>
-          <w:tcPr>
-            <w:tcW w:type="dxa" w:w="560"/>
-            <w:tcBorders>
-              <w:top w:val="single" w:color="A6A6A6" w:sz="4"/>
-              <w:left w:val="single" w:color="A6A6A6" w:sz="4"/>
-              <w:bottom w:val="single" w:color="A6A6A6" w:sz="4"/>
-              <w:right w:val="single" w:color="A6A6A6" w:sz="4"/>
-            </w:tcBorders>
-            <w:tcMar>
-              <w:top w:type="dxa" w:w="50"/>
-              <w:left w:type="dxa" w:w="60"/>
-              <w:bottom w:type="dxa" w:w="50"/>
-              <w:right w:type="dxa" w:w="60"/>
-            </w:tcMar>
-          </w:tcPr>
-          <w:p>
-            <w:pPr>
-              <w:bidi w:val="false"/>
-              <w:spacing w:after="0" w:line="260"/>
-              <w:jc w:val="center"/>
-            </w:pPr>
-            <w:r>
-              <w:rPr>
-                <w:rFonts w:ascii="Arial" w:cs="Arial" w:eastAsia="Arial" w:hAnsi="Arial"/>
-                <w:b w:val="false"/>
-                <w:bCs w:val="false"/>
-                <w:sz w:val="19"/>
-                <w:szCs w:val="19"/>
-                <w:rtl w:val="false"/>
-              </w:rPr>
-              <w:t xml:space="preserve">☐</w:t>
-            </w:r>
-          </w:p>
-        </w:tc>
-        <w:tc>
-          <w:tcPr>
-            <w:tcW w:type="dxa" w:w="560"/>
-            <w:tcBorders>
-              <w:top w:val="single" w:color="A6A6A6" w:sz="4"/>
-              <w:left w:val="single" w:color="A6A6A6" w:sz="4"/>
-              <w:bottom w:val="single" w:color="A6A6A6" w:sz="4"/>
-              <w:right w:val="single" w:color="A6A6A6" w:sz="4"/>
-            </w:tcBorders>
-            <w:tcMar>
-              <w:top w:type="dxa" w:w="50"/>
-              <w:left w:type="dxa" w:w="60"/>
-              <w:bottom w:type="dxa" w:w="50"/>
-              <w:right w:type="dxa" w:w="60"/>
-            </w:tcMar>
-          </w:tcPr>
-          <w:p>
-            <w:pPr>
-              <w:bidi w:val="false"/>
-              <w:spacing w:after="0" w:line="260"/>
-              <w:jc w:val="center"/>
-            </w:pPr>
-            <w:r>
-              <w:rPr>
-                <w:rFonts w:ascii="Arial" w:cs="Arial" w:eastAsia="Arial" w:hAnsi="Arial"/>
-                <w:b w:val="false"/>
-                <w:bCs w:val="false"/>
-                <w:sz w:val="19"/>
-                <w:szCs w:val="19"/>
-                <w:rtl w:val="false"/>
-              </w:rPr>
-              <w:t xml:space="preserve">☐</w:t>
-            </w:r>
-          </w:p>
-        </w:tc>
-        <w:tc>
-          <w:tcPr>
-            <w:tcW w:type="dxa" w:w="560"/>
-            <w:tcBorders>
-              <w:top w:val="single" w:color="A6A6A6" w:sz="4"/>
-              <w:left w:val="single" w:color="A6A6A6" w:sz="4"/>
-              <w:bottom w:val="single" w:color="A6A6A6" w:sz="4"/>
-              <w:right w:val="single" w:color="A6A6A6" w:sz="4"/>
-            </w:tcBorders>
-            <w:tcMar>
-              <w:top w:type="dxa" w:w="50"/>
-              <w:left w:type="dxa" w:w="60"/>
-              <w:bottom w:type="dxa" w:w="50"/>
-              <w:right w:type="dxa" w:w="60"/>
-            </w:tcMar>
-          </w:tcPr>
-          <w:p>
-            <w:pPr>
-              <w:bidi w:val="false"/>
-              <w:spacing w:after="0" w:line="260"/>
-              <w:jc w:val="center"/>
-            </w:pPr>
-            <w:r>
-              <w:rPr>
-                <w:rFonts w:ascii="Arial" w:cs="Arial" w:eastAsia="Arial" w:hAnsi="Arial"/>
-                <w:b w:val="false"/>
-                <w:bCs w:val="false"/>
-                <w:sz w:val="19"/>
-                <w:szCs w:val="19"/>
-                <w:rtl w:val="false"/>
-              </w:rPr>
-              <w:t xml:space="preserve">☐</w:t>
-            </w:r>
-          </w:p>
-        </w:tc>
-        <w:tc>
-          <w:tcPr>
-            <w:tcW w:type="dxa" w:w="560"/>
-            <w:tcBorders>
-              <w:top w:val="single" w:color="A6A6A6" w:sz="4"/>
-              <w:left w:val="single" w:color="A6A6A6" w:sz="4"/>
-              <w:bottom w:val="single" w:color="A6A6A6" w:sz="4"/>
-              <w:right w:val="single" w:color="A6A6A6" w:sz="4"/>
-            </w:tcBorders>
-            <w:tcMar>
-              <w:top w:type="dxa" w:w="50"/>
-              <w:left w:type="dxa" w:w="60"/>
-              <w:bottom w:type="dxa" w:w="50"/>
-              <w:right w:type="dxa" w:w="60"/>
-            </w:tcMar>
-          </w:tcPr>
-          <w:p>
-            <w:pPr>
-              <w:bidi w:val="false"/>
-              <w:spacing w:after="0" w:line="260"/>
-              <w:jc w:val="center"/>
-            </w:pPr>
-            <w:r>
-              <w:rPr>
-                <w:rFonts w:ascii="Arial" w:cs="Arial" w:eastAsia="Arial" w:hAnsi="Arial"/>
-                <w:b w:val="false"/>
-                <w:bCs w:val="false"/>
-                <w:sz w:val="19"/>
-                <w:szCs w:val="19"/>
-                <w:rtl w:val="false"/>
-              </w:rPr>
-              <w:t xml:space="preserve">☐</w:t>
-            </w:r>
-          </w:p>
-        </w:tc>
-        <w:tc>
-          <w:tcPr>
-            <w:tcW w:type="dxa" w:w="560"/>
-            <w:tcBorders>
-              <w:top w:val="single" w:color="A6A6A6" w:sz="4"/>
-              <w:left w:val="single" w:color="A6A6A6" w:sz="4"/>
-              <w:bottom w:val="single" w:color="A6A6A6" w:sz="4"/>
-              <w:right w:val="single" w:color="A6A6A6" w:sz="4"/>
-            </w:tcBorders>
-            <w:tcMar>
-              <w:top w:type="dxa" w:w="50"/>
-              <w:left w:type="dxa" w:w="60"/>
-              <w:bottom w:type="dxa" w:w="50"/>
-              <w:right w:type="dxa" w:w="60"/>
-            </w:tcMar>
-          </w:tcPr>
-          <w:p>
-            <w:pPr>
-              <w:bidi w:val="false"/>
-              <w:spacing w:after="0" w:line="260"/>
-              <w:jc w:val="center"/>
-            </w:pPr>
-            <w:r>
-              <w:rPr>
-                <w:rFonts w:ascii="Arial" w:cs="Arial" w:eastAsia="Arial" w:hAnsi="Arial"/>
-                <w:b w:val="false"/>
-                <w:bCs w:val="false"/>
-                <w:sz w:val="19"/>
-                <w:szCs w:val="19"/>
-                <w:rtl w:val="false"/>
-              </w:rPr>
-              <w:t xml:space="preserve">☐</w:t>
-            </w:r>
-          </w:p>
-        </w:tc>
-        <w:tc>
-          <w:tcPr>
-            <w:tcW w:type="dxa" w:w="560"/>
-            <w:tcBorders>
-              <w:top w:val="single" w:color="A6A6A6" w:sz="4"/>
-              <w:left w:val="single" w:color="A6A6A6" w:sz="4"/>
-              <w:bottom w:val="single" w:color="A6A6A6" w:sz="4"/>
-              <w:right w:val="single" w:color="A6A6A6" w:sz="4"/>
-            </w:tcBorders>
-            <w:tcMar>
-              <w:top w:type="dxa" w:w="50"/>
-              <w:left w:type="dxa" w:w="60"/>
-              <w:bottom w:type="dxa" w:w="50"/>
-              <w:right w:type="dxa" w:w="60"/>
-            </w:tcMar>
-          </w:tcPr>
-          <w:p>
-            <w:pPr>
-              <w:bidi w:val="false"/>
-              <w:spacing w:after="0" w:line="260"/>
-              <w:jc w:val="center"/>
-            </w:pPr>
-            <w:r>
-              <w:rPr>
-                <w:rFonts w:ascii="Arial" w:cs="Arial" w:eastAsia="Arial" w:hAnsi="Arial"/>
-                <w:b w:val="false"/>
-                <w:bCs w:val="false"/>
-                <w:sz w:val="19"/>
-                <w:szCs w:val="19"/>
-                <w:rtl w:val="false"/>
-              </w:rPr>
-              <w:t xml:space="preserve">☐</w:t>
-            </w:r>
-          </w:p>
-        </w:tc>
-      </w:tr>
-      <w:tr>
-        <w:trPr>
-          <w:cantSplit/>
-          <w:tblHeader w:val="false"/>
-        </w:trPr>
-        <w:tc>
-          <w:tcPr>
-            <w:tcW w:type="dxa" w:w="650"/>
-            <w:tcBorders>
-              <w:top w:val="single" w:color="A6A6A6" w:sz="4"/>
-              <w:left w:val="single" w:color="A6A6A6" w:sz="4"/>
-              <w:bottom w:val="single" w:color="A6A6A6" w:sz="4"/>
-              <w:right w:val="single" w:color="A6A6A6" w:sz="4"/>
-            </w:tcBorders>
-            <w:tcMar>
-              <w:top w:type="dxa" w:w="50"/>
-              <w:left w:type="dxa" w:w="60"/>
-              <w:bottom w:type="dxa" w:w="50"/>
-              <w:right w:type="dxa" w:w="60"/>
-            </w:tcMar>
-          </w:tcPr>
-          <w:p>
-            <w:pPr>
-              <w:bidi w:val="false"/>
-              <w:spacing w:after="0" w:line="260"/>
-              <w:jc w:val="center"/>
-            </w:pPr>
-            <w:r>
-              <w:rPr>
-                <w:rFonts w:ascii="Arial" w:cs="Arial" w:eastAsia="Arial" w:hAnsi="Arial"/>
-                <w:b w:val="false"/>
-                <w:bCs w:val="false"/>
-                <w:sz w:val="19"/>
-                <w:szCs w:val="19"/>
-                <w:rtl w:val="false"/>
-              </w:rPr>
-              <w:t xml:space="preserve">GO8</w:t>
-            </w:r>
-          </w:p>
-        </w:tc>
-        <w:tc>
-          <w:tcPr>
-            <w:tcW w:type="dxa" w:w="4930"/>
-            <w:tcBorders>
-              <w:top w:val="single" w:color="A6A6A6" w:sz="4"/>
-              <w:left w:val="single" w:color="A6A6A6" w:sz="4"/>
-              <w:bottom w:val="single" w:color="A6A6A6" w:sz="4"/>
-              <w:right w:val="single" w:color="A6A6A6" w:sz="4"/>
-            </w:tcBorders>
-            <w:tcMar>
-              <w:top w:type="dxa" w:w="50"/>
-              <w:left w:type="dxa" w:w="60"/>
-              <w:bottom w:type="dxa" w:w="50"/>
-              <w:right w:type="dxa" w:w="60"/>
-            </w:tcMar>
-          </w:tcPr>
-          <w:p>
-            <w:pPr>
-              <w:bidi w:val="false"/>
-              <w:spacing w:after="0" w:line="260"/>
-            </w:pPr>
-            <w:r>
-              <w:rPr>
-                <w:rFonts w:ascii="Arial" w:cs="Arial" w:eastAsia="Arial" w:hAnsi="Arial"/>
-                <w:b w:val="false"/>
-                <w:bCs w:val="false"/>
-                <w:sz w:val="19"/>
-                <w:szCs w:val="19"/>
-                <w:rtl w:val="false"/>
-              </w:rPr>
-              <w:t xml:space="preserve">I enjoy working to a group goal</w:t>
-            </w:r>
-          </w:p>
-        </w:tc>
-        <w:tc>
-          <w:tcPr>
-            <w:tcW w:type="dxa" w:w="560"/>
-            <w:tcBorders>
-              <w:top w:val="single" w:color="A6A6A6" w:sz="4"/>
-              <w:left w:val="single" w:color="A6A6A6" w:sz="4"/>
-              <w:bottom w:val="single" w:color="A6A6A6" w:sz="4"/>
-              <w:right w:val="single" w:color="A6A6A6" w:sz="4"/>
-            </w:tcBorders>
-            <w:tcMar>
-              <w:top w:type="dxa" w:w="50"/>
-              <w:left w:type="dxa" w:w="60"/>
-              <w:bottom w:type="dxa" w:w="50"/>
-              <w:right w:type="dxa" w:w="60"/>
-            </w:tcMar>
-          </w:tcPr>
-          <w:p>
-            <w:pPr>
-              <w:bidi w:val="false"/>
-              <w:spacing w:after="0" w:line="260"/>
-              <w:jc w:val="center"/>
-            </w:pPr>
-            <w:r>
-              <w:rPr>
-                <w:rFonts w:ascii="Arial" w:cs="Arial" w:eastAsia="Arial" w:hAnsi="Arial"/>
-                <w:b w:val="false"/>
-                <w:bCs w:val="false"/>
-                <w:sz w:val="19"/>
-                <w:szCs w:val="19"/>
-                <w:rtl w:val="false"/>
-              </w:rPr>
-              <w:t xml:space="preserve">☐</w:t>
-            </w:r>
-          </w:p>
-        </w:tc>
-        <w:tc>
-          <w:tcPr>
-            <w:tcW w:type="dxa" w:w="560"/>
-            <w:tcBorders>
-              <w:top w:val="single" w:color="A6A6A6" w:sz="4"/>
-              <w:left w:val="single" w:color="A6A6A6" w:sz="4"/>
-              <w:bottom w:val="single" w:color="A6A6A6" w:sz="4"/>
-              <w:right w:val="single" w:color="A6A6A6" w:sz="4"/>
-            </w:tcBorders>
-            <w:tcMar>
-              <w:top w:type="dxa" w:w="50"/>
-              <w:left w:type="dxa" w:w="60"/>
-              <w:bottom w:type="dxa" w:w="50"/>
-              <w:right w:type="dxa" w:w="60"/>
-            </w:tcMar>
-          </w:tcPr>
-          <w:p>
-            <w:pPr>
-              <w:bidi w:val="false"/>
-              <w:spacing w:after="0" w:line="260"/>
-              <w:jc w:val="center"/>
-            </w:pPr>
-            <w:r>
-              <w:rPr>
-                <w:rFonts w:ascii="Arial" w:cs="Arial" w:eastAsia="Arial" w:hAnsi="Arial"/>
-                <w:b w:val="false"/>
-                <w:bCs w:val="false"/>
-                <w:sz w:val="19"/>
-                <w:szCs w:val="19"/>
-                <w:rtl w:val="false"/>
-              </w:rPr>
-              <w:t xml:space="preserve">☐</w:t>
-            </w:r>
-          </w:p>
-        </w:tc>
-        <w:tc>
-          <w:tcPr>
-            <w:tcW w:type="dxa" w:w="560"/>
-            <w:tcBorders>
-              <w:top w:val="single" w:color="A6A6A6" w:sz="4"/>
-              <w:left w:val="single" w:color="A6A6A6" w:sz="4"/>
-              <w:bottom w:val="single" w:color="A6A6A6" w:sz="4"/>
-              <w:right w:val="single" w:color="A6A6A6" w:sz="4"/>
-            </w:tcBorders>
-            <w:tcMar>
-              <w:top w:type="dxa" w:w="50"/>
-              <w:left w:type="dxa" w:w="60"/>
-              <w:bottom w:type="dxa" w:w="50"/>
-              <w:right w:type="dxa" w:w="60"/>
-            </w:tcMar>
-          </w:tcPr>
-          <w:p>
-            <w:pPr>
-              <w:bidi w:val="false"/>
-              <w:spacing w:after="0" w:line="260"/>
-              <w:jc w:val="center"/>
-            </w:pPr>
-            <w:r>
-              <w:rPr>
-                <w:rFonts w:ascii="Arial" w:cs="Arial" w:eastAsia="Arial" w:hAnsi="Arial"/>
-                <w:b w:val="false"/>
-                <w:bCs w:val="false"/>
-                <w:sz w:val="19"/>
-                <w:szCs w:val="19"/>
-                <w:rtl w:val="false"/>
-              </w:rPr>
-              <w:t xml:space="preserve">☐</w:t>
-            </w:r>
-          </w:p>
-        </w:tc>
-        <w:tc>
-          <w:tcPr>
-            <w:tcW w:type="dxa" w:w="560"/>
-            <w:tcBorders>
-              <w:top w:val="single" w:color="A6A6A6" w:sz="4"/>
-              <w:left w:val="single" w:color="A6A6A6" w:sz="4"/>
-              <w:bottom w:val="single" w:color="A6A6A6" w:sz="4"/>
-              <w:right w:val="single" w:color="A6A6A6" w:sz="4"/>
-            </w:tcBorders>
-            <w:tcMar>
-              <w:top w:type="dxa" w:w="50"/>
-              <w:left w:type="dxa" w:w="60"/>
-              <w:bottom w:type="dxa" w:w="50"/>
-              <w:right w:type="dxa" w:w="60"/>
-            </w:tcMar>
-          </w:tcPr>
-          <w:p>
-            <w:pPr>
-              <w:bidi w:val="false"/>
-              <w:spacing w:after="0" w:line="260"/>
-              <w:jc w:val="center"/>
-            </w:pPr>
-            <w:r>
-              <w:rPr>
-                <w:rFonts w:ascii="Arial" w:cs="Arial" w:eastAsia="Arial" w:hAnsi="Arial"/>
-                <w:b w:val="false"/>
-                <w:bCs w:val="false"/>
-                <w:sz w:val="19"/>
-                <w:szCs w:val="19"/>
-                <w:rtl w:val="false"/>
-              </w:rPr>
-              <w:t xml:space="preserve">☐</w:t>
-            </w:r>
-          </w:p>
-        </w:tc>
-        <w:tc>
-          <w:tcPr>
-            <w:tcW w:type="dxa" w:w="560"/>
-            <w:tcBorders>
-              <w:top w:val="single" w:color="A6A6A6" w:sz="4"/>
-              <w:left w:val="single" w:color="A6A6A6" w:sz="4"/>
-              <w:bottom w:val="single" w:color="A6A6A6" w:sz="4"/>
-              <w:right w:val="single" w:color="A6A6A6" w:sz="4"/>
-            </w:tcBorders>
-            <w:tcMar>
-              <w:top w:type="dxa" w:w="50"/>
-              <w:left w:type="dxa" w:w="60"/>
-              <w:bottom w:type="dxa" w:w="50"/>
-              <w:right w:type="dxa" w:w="60"/>
-            </w:tcMar>
-          </w:tcPr>
-          <w:p>
-            <w:pPr>
-              <w:bidi w:val="false"/>
-              <w:spacing w:after="0" w:line="260"/>
-              <w:jc w:val="center"/>
-            </w:pPr>
-            <w:r>
-              <w:rPr>
-                <w:rFonts w:ascii="Arial" w:cs="Arial" w:eastAsia="Arial" w:hAnsi="Arial"/>
-                <w:b w:val="false"/>
-                <w:bCs w:val="false"/>
-                <w:sz w:val="19"/>
-                <w:szCs w:val="19"/>
-                <w:rtl w:val="false"/>
-              </w:rPr>
-              <w:t xml:space="preserve">☐</w:t>
-            </w:r>
-          </w:p>
-        </w:tc>
-        <w:tc>
-          <w:tcPr>
-            <w:tcW w:type="dxa" w:w="560"/>
-            <w:tcBorders>
-              <w:top w:val="single" w:color="A6A6A6" w:sz="4"/>
-              <w:left w:val="single" w:color="A6A6A6" w:sz="4"/>
-              <w:bottom w:val="single" w:color="A6A6A6" w:sz="4"/>
-              <w:right w:val="single" w:color="A6A6A6" w:sz="4"/>
-            </w:tcBorders>
-            <w:tcMar>
-              <w:top w:type="dxa" w:w="50"/>
-              <w:left w:type="dxa" w:w="60"/>
-              <w:bottom w:type="dxa" w:w="50"/>
-              <w:right w:type="dxa" w:w="60"/>
-            </w:tcMar>
-          </w:tcPr>
-          <w:p>
-            <w:pPr>
-              <w:bidi w:val="false"/>
-              <w:spacing w:after="0" w:line="260"/>
-              <w:jc w:val="center"/>
-            </w:pPr>
-            <w:r>
-              <w:rPr>
-                <w:rFonts w:ascii="Arial" w:cs="Arial" w:eastAsia="Arial" w:hAnsi="Arial"/>
-                <w:b w:val="false"/>
-                <w:bCs w:val="false"/>
-                <w:sz w:val="19"/>
-                <w:szCs w:val="19"/>
-                <w:rtl w:val="false"/>
-              </w:rPr>
-              <w:t xml:space="preserve">☐</w:t>
-            </w:r>
-          </w:p>
-        </w:tc>
-        <w:tc>
-          <w:tcPr>
-            <w:tcW w:type="dxa" w:w="560"/>
             <w:tcBorders>
               <w:top w:val="single" w:color="A6A6A6" w:sz="4"/>
               <w:left w:val="single" w:color="A6A6A6" w:sz="4"/>
@@ -41372,7 +38536,7 @@
                 <w:szCs w:val="19"/>
                 <w:rtl w:val="false"/>
               </w:rPr>
-              <w:t xml:space="preserve">4 items from your report (Table 1); 5-point, 1 = None to 5 = A lot. I have not seen Table 1 myself</w:t>
+              <w:t xml:space="preserve">Eight items on the presence of conflict (4 relationship + 4 task), 5-point, 1 = None to 5 = A lot; the scale and alphas (.92 relationship, .87 task) verified against the text of the paper. The four relationship items come from your report; I have not seen Table 1 myself</w:t>
             </w:r>
           </w:p>
         </w:tc>
@@ -41548,7 +38712,7 @@
                 <w:szCs w:val="19"/>
                 <w:rtl w:val="false"/>
               </w:rPr>
-              <w:t xml:space="preserve">VERIFIED against Appendix A (your text): 7 items; asterisk (reverse) on items 2, 3, 4, 7. Response scale not in the pasted text (5-point agreement assumed). Direct coverage of Lencioni "fear of conflict"</w:t>
+              <w:t xml:space="preserve">VERIFIED against Appendix A (your text): 7 items; asterisk (reverse) on items 2, 3, 4, 7. Based on Cosier &amp; Dalton's (1990) openness scale, adapted to the group level; response format not given (5-point agreement assumed). Direct coverage of Lencioni "fear of conflict"</w:t>
             </w:r>
           </w:p>
         </w:tc>
@@ -42287,182 +39451,6 @@
                 <w:rtl w:val="false"/>
               </w:rPr>
               <w:t xml:space="preserve">Report symbolization separately</w:t>
-            </w:r>
-          </w:p>
-        </w:tc>
-      </w:tr>
-      <w:tr>
-        <w:trPr>
-          <w:cantSplit/>
-          <w:tblHeader w:val="false"/>
-        </w:trPr>
-        <w:tc>
-          <w:tcPr>
-            <w:tcW w:type="dxa" w:w="1500"/>
-            <w:tcBorders>
-              <w:top w:val="single" w:color="A6A6A6" w:sz="4"/>
-              <w:left w:val="single" w:color="A6A6A6" w:sz="4"/>
-              <w:bottom w:val="single" w:color="A6A6A6" w:sz="4"/>
-              <w:right w:val="single" w:color="A6A6A6" w:sz="4"/>
-            </w:tcBorders>
-            <w:tcMar>
-              <w:top w:type="dxa" w:w="50"/>
-              <w:left w:type="dxa" w:w="60"/>
-              <w:bottom w:type="dxa" w:w="50"/>
-              <w:right w:type="dxa" w:w="60"/>
-            </w:tcMar>
-          </w:tcPr>
-          <w:p>
-            <w:pPr>
-              <w:bidi w:val="false"/>
-              <w:spacing w:after="0" w:line="260"/>
-            </w:pPr>
-            <w:r>
-              <w:rPr>
-                <w:rFonts w:ascii="Arial" w:cs="Arial" w:eastAsia="Arial" w:hAnsi="Arial"/>
-                <w:b w:val="false"/>
-                <w:bCs w:val="false"/>
-                <w:sz w:val="19"/>
-                <w:szCs w:val="19"/>
-                <w:rtl w:val="false"/>
-              </w:rPr>
-              <w:t xml:space="preserve">Group orientation (GOS)</w:t>
-            </w:r>
-          </w:p>
-        </w:tc>
-        <w:tc>
-          <w:tcPr>
-            <w:tcW w:type="dxa" w:w="2200"/>
-            <w:tcBorders>
-              <w:top w:val="single" w:color="A6A6A6" w:sz="4"/>
-              <w:left w:val="single" w:color="A6A6A6" w:sz="4"/>
-              <w:bottom w:val="single" w:color="A6A6A6" w:sz="4"/>
-              <w:right w:val="single" w:color="A6A6A6" w:sz="4"/>
-            </w:tcBorders>
-            <w:tcMar>
-              <w:top w:type="dxa" w:w="50"/>
-              <w:left w:type="dxa" w:w="60"/>
-              <w:bottom w:type="dxa" w:w="50"/>
-              <w:right w:type="dxa" w:w="60"/>
-            </w:tcMar>
-          </w:tcPr>
-          <w:p>
-            <w:pPr>
-              <w:bidi w:val="false"/>
-              <w:spacing w:after="0" w:line="260"/>
-            </w:pPr>
-            <w:r>
-              <w:rPr>
-                <w:rFonts w:ascii="Arial" w:cs="Arial" w:eastAsia="Arial" w:hAnsi="Arial"/>
-                <w:b w:val="false"/>
-                <w:bCs w:val="false"/>
-                <w:sz w:val="19"/>
-                <w:szCs w:val="19"/>
-                <w:rtl w:val="false"/>
-              </w:rPr>
-              <w:t xml:space="preserve">Kuppens, Manstead, Spears &amp; Sweetman (2026), Table 2</w:t>
-            </w:r>
-          </w:p>
-        </w:tc>
-        <w:tc>
-          <w:tcPr>
-            <w:tcW w:type="dxa" w:w="800"/>
-            <w:tcBorders>
-              <w:top w:val="single" w:color="A6A6A6" w:sz="4"/>
-              <w:left w:val="single" w:color="A6A6A6" w:sz="4"/>
-              <w:bottom w:val="single" w:color="A6A6A6" w:sz="4"/>
-              <w:right w:val="single" w:color="A6A6A6" w:sz="4"/>
-            </w:tcBorders>
-            <w:tcMar>
-              <w:top w:type="dxa" w:w="50"/>
-              <w:left w:type="dxa" w:w="60"/>
-              <w:bottom w:type="dxa" w:w="50"/>
-              <w:right w:type="dxa" w:w="60"/>
-            </w:tcMar>
-          </w:tcPr>
-          <w:p>
-            <w:pPr>
-              <w:bidi w:val="false"/>
-              <w:spacing w:after="0" w:line="260"/>
-            </w:pPr>
-            <w:r>
-              <w:rPr>
-                <w:rFonts w:ascii="Arial" w:cs="Arial" w:eastAsia="Arial" w:hAnsi="Arial"/>
-                <w:b w:val="false"/>
-                <w:bCs w:val="false"/>
-                <w:sz w:val="19"/>
-                <w:szCs w:val="19"/>
-                <w:rtl w:val="false"/>
-              </w:rPr>
-              <w:t xml:space="preserve">8</w:t>
-            </w:r>
-          </w:p>
-        </w:tc>
-        <w:tc>
-          <w:tcPr>
-            <w:tcW w:type="dxa" w:w="3000"/>
-            <w:tcBorders>
-              <w:top w:val="single" w:color="A6A6A6" w:sz="4"/>
-              <w:left w:val="single" w:color="A6A6A6" w:sz="4"/>
-              <w:bottom w:val="single" w:color="A6A6A6" w:sz="4"/>
-              <w:right w:val="single" w:color="A6A6A6" w:sz="4"/>
-            </w:tcBorders>
-            <w:tcMar>
-              <w:top w:type="dxa" w:w="50"/>
-              <w:left w:type="dxa" w:w="60"/>
-              <w:bottom w:type="dxa" w:w="50"/>
-              <w:right w:type="dxa" w:w="60"/>
-            </w:tcMar>
-          </w:tcPr>
-          <w:p>
-            <w:pPr>
-              <w:bidi w:val="false"/>
-              <w:spacing w:after="0" w:line="260"/>
-            </w:pPr>
-            <w:r>
-              <w:rPr>
-                <w:rFonts w:ascii="Arial" w:cs="Arial" w:eastAsia="Arial" w:hAnsi="Arial"/>
-                <w:b w:val="false"/>
-                <w:bCs w:val="false"/>
-                <w:sz w:val="19"/>
-                <w:szCs w:val="19"/>
-                <w:rtl w:val="false"/>
-              </w:rPr>
-              <w:t xml:space="preserve">VERIFIED against the paper (your report): eight final items verbatim; 7-point −3 to +3 (only endpoints and midpoint labelled); GO3 and GO4 reversed (sign change); alpha .76–.90 across 8 samples (n = 3,209). The scale is unidimensional; do not read items 7–8 as a subscale of collective goals. Do not restore dropped items 11 and 14 (individual vs group goals). A general individual trait, not a perception of this team. Licence: "© The Author(s) 2026"; no explicit CC BY seen (a search snippet had said CC: inconsistent)</w:t>
-            </w:r>
-          </w:p>
-        </w:tc>
-        <w:tc>
-          <w:tcPr>
-            <w:tcW w:type="dxa" w:w="2000"/>
-            <w:tcBorders>
-              <w:top w:val="single" w:color="A6A6A6" w:sz="4"/>
-              <w:left w:val="single" w:color="A6A6A6" w:sz="4"/>
-              <w:bottom w:val="single" w:color="A6A6A6" w:sz="4"/>
-              <w:right w:val="single" w:color="A6A6A6" w:sz="4"/>
-            </w:tcBorders>
-            <w:tcMar>
-              <w:top w:type="dxa" w:w="50"/>
-              <w:left w:type="dxa" w:w="60"/>
-              <w:bottom w:type="dxa" w:w="50"/>
-              <w:right w:type="dxa" w:w="60"/>
-            </w:tcMar>
-          </w:tcPr>
-          <w:p>
-            <w:pPr>
-              <w:bidi w:val="false"/>
-              <w:spacing w:after="0" w:line="260"/>
-            </w:pPr>
-            <w:r>
-              <w:rPr>
-                <w:rFonts w:ascii="Arial" w:cs="Arial" w:eastAsia="Arial" w:hAnsi="Arial"/>
-                <w:b w:val="false"/>
-                <w:bCs w:val="false"/>
-                <w:sz w:val="19"/>
-                <w:szCs w:val="19"/>
-                <w:rtl w:val="false"/>
-              </w:rPr>
-              <w:t xml:space="preserve">Check the licence on the PDF; name it "individual group orientation"</w:t>
             </w:r>
           </w:p>
         </w:tc>
@@ -43839,7 +40827,7 @@
                 <w:szCs w:val="19"/>
                 <w:rtl w:val="false"/>
               </w:rPr>
-              <w:t xml:space="preserve">Group orientation (GOS; Kuppens et al. 2026, 8 items) as an individual trait; not a perception of the team</w:t>
+              <w:t xml:space="preserve">— (left blank)</w:t>
             </w:r>
           </w:p>
         </w:tc>
@@ -43873,7 +40861,7 @@
                 <w:szCs w:val="19"/>
                 <w:rtl w:val="false"/>
               </w:rPr>
-              <w:t xml:space="preserve">Weak/indirect coverage</w:t>
+              <w:t xml:space="preserve">No verifiable published instrument found; considered and set aside: Group Orientation Scale (individual trait), goal interdependence (item text not found)</w:t>
             </w:r>
           </w:p>
         </w:tc>
@@ -47116,216 +44104,6 @@
                 <w:szCs w:val="19"/>
                 <w:rtl w:val="false"/>
               </w:rPr>
-              <w:t xml:space="preserve">Group orientation</w:t>
-            </w:r>
-          </w:p>
-        </w:tc>
-        <w:tc>
-          <w:tcPr>
-            <w:tcW w:type="dxa" w:w="1700"/>
-            <w:tcBorders>
-              <w:top w:val="single" w:color="A6A6A6" w:sz="4"/>
-              <w:left w:val="single" w:color="A6A6A6" w:sz="4"/>
-              <w:bottom w:val="single" w:color="A6A6A6" w:sz="4"/>
-              <w:right w:val="single" w:color="A6A6A6" w:sz="4"/>
-            </w:tcBorders>
-            <w:tcMar>
-              <w:top w:type="dxa" w:w="50"/>
-              <w:left w:type="dxa" w:w="60"/>
-              <w:bottom w:type="dxa" w:w="50"/>
-              <w:right w:type="dxa" w:w="60"/>
-            </w:tcMar>
-          </w:tcPr>
-          <w:p>
-            <w:pPr>
-              <w:bidi w:val="false"/>
-              <w:spacing w:after="0" w:line="260"/>
-            </w:pPr>
-            <w:r>
-              <w:rPr>
-                <w:rFonts w:ascii="Arial" w:cs="Arial" w:eastAsia="Arial" w:hAnsi="Arial"/>
-                <w:b w:val="false"/>
-                <w:bCs w:val="false"/>
-                <w:sz w:val="19"/>
-                <w:szCs w:val="19"/>
-                <w:rtl w:val="false"/>
-              </w:rPr>
-              <w:t xml:space="preserve">GO1–GO8</w:t>
-            </w:r>
-          </w:p>
-        </w:tc>
-        <w:tc>
-          <w:tcPr>
-            <w:tcW w:type="dxa" w:w="700"/>
-            <w:tcBorders>
-              <w:top w:val="single" w:color="A6A6A6" w:sz="4"/>
-              <w:left w:val="single" w:color="A6A6A6" w:sz="4"/>
-              <w:bottom w:val="single" w:color="A6A6A6" w:sz="4"/>
-              <w:right w:val="single" w:color="A6A6A6" w:sz="4"/>
-            </w:tcBorders>
-            <w:tcMar>
-              <w:top w:type="dxa" w:w="50"/>
-              <w:left w:type="dxa" w:w="60"/>
-              <w:bottom w:type="dxa" w:w="50"/>
-              <w:right w:type="dxa" w:w="60"/>
-            </w:tcMar>
-          </w:tcPr>
-          <w:p>
-            <w:pPr>
-              <w:bidi w:val="false"/>
-              <w:spacing w:after="0" w:line="260"/>
-            </w:pPr>
-            <w:r>
-              <w:rPr>
-                <w:rFonts w:ascii="Arial" w:cs="Arial" w:eastAsia="Arial" w:hAnsi="Arial"/>
-                <w:b w:val="false"/>
-                <w:bCs w:val="false"/>
-                <w:sz w:val="19"/>
-                <w:szCs w:val="19"/>
-                <w:rtl w:val="false"/>
-              </w:rPr>
-              <w:t xml:space="preserve">8</w:t>
-            </w:r>
-          </w:p>
-        </w:tc>
-        <w:tc>
-          <w:tcPr>
-            <w:tcW w:type="dxa" w:w="1700"/>
-            <w:tcBorders>
-              <w:top w:val="single" w:color="A6A6A6" w:sz="4"/>
-              <w:left w:val="single" w:color="A6A6A6" w:sz="4"/>
-              <w:bottom w:val="single" w:color="A6A6A6" w:sz="4"/>
-              <w:right w:val="single" w:color="A6A6A6" w:sz="4"/>
-            </w:tcBorders>
-            <w:tcMar>
-              <w:top w:type="dxa" w:w="50"/>
-              <w:left w:type="dxa" w:w="60"/>
-              <w:bottom w:type="dxa" w:w="50"/>
-              <w:right w:type="dxa" w:w="60"/>
-            </w:tcMar>
-          </w:tcPr>
-          <w:p>
-            <w:pPr>
-              <w:bidi w:val="false"/>
-              <w:spacing w:after="0" w:line="260"/>
-            </w:pPr>
-            <w:r>
-              <w:rPr>
-                <w:rFonts w:ascii="Arial" w:cs="Arial" w:eastAsia="Arial" w:hAnsi="Arial"/>
-                <w:b w:val="false"/>
-                <w:bCs w:val="false"/>
-                <w:sz w:val="19"/>
-                <w:szCs w:val="19"/>
-                <w:rtl w:val="false"/>
-              </w:rPr>
-              <w:t xml:space="preserve">−3 to +3</w:t>
-            </w:r>
-          </w:p>
-        </w:tc>
-        <w:tc>
-          <w:tcPr>
-            <w:tcW w:type="dxa" w:w="1700"/>
-            <w:tcBorders>
-              <w:top w:val="single" w:color="A6A6A6" w:sz="4"/>
-              <w:left w:val="single" w:color="A6A6A6" w:sz="4"/>
-              <w:bottom w:val="single" w:color="A6A6A6" w:sz="4"/>
-              <w:right w:val="single" w:color="A6A6A6" w:sz="4"/>
-            </w:tcBorders>
-            <w:tcMar>
-              <w:top w:type="dxa" w:w="50"/>
-              <w:left w:type="dxa" w:w="60"/>
-              <w:bottom w:type="dxa" w:w="50"/>
-              <w:right w:type="dxa" w:w="60"/>
-            </w:tcMar>
-          </w:tcPr>
-          <w:p>
-            <w:pPr>
-              <w:bidi w:val="false"/>
-              <w:spacing w:after="0" w:line="260"/>
-            </w:pPr>
-            <w:r>
-              <w:rPr>
-                <w:rFonts w:ascii="Arial" w:cs="Arial" w:eastAsia="Arial" w:hAnsi="Arial"/>
-                <w:b w:val="false"/>
-                <w:bCs w:val="false"/>
-                <w:sz w:val="19"/>
-                <w:szCs w:val="19"/>
-                <w:rtl w:val="false"/>
-              </w:rPr>
-              <w:t xml:space="preserve">Individual</w:t>
-            </w:r>
-          </w:p>
-        </w:tc>
-        <w:tc>
-          <w:tcPr>
-            <w:tcW w:type="dxa" w:w="2000"/>
-            <w:tcBorders>
-              <w:top w:val="single" w:color="A6A6A6" w:sz="4"/>
-              <w:left w:val="single" w:color="A6A6A6" w:sz="4"/>
-              <w:bottom w:val="single" w:color="A6A6A6" w:sz="4"/>
-              <w:right w:val="single" w:color="A6A6A6" w:sz="4"/>
-            </w:tcBorders>
-            <w:tcMar>
-              <w:top w:type="dxa" w:w="50"/>
-              <w:left w:type="dxa" w:w="60"/>
-              <w:bottom w:type="dxa" w:w="50"/>
-              <w:right w:type="dxa" w:w="60"/>
-            </w:tcMar>
-          </w:tcPr>
-          <w:p>
-            <w:pPr>
-              <w:bidi w:val="false"/>
-              <w:spacing w:after="0" w:line="260"/>
-            </w:pPr>
-            <w:r>
-              <w:rPr>
-                <w:rFonts w:ascii="Arial" w:cs="Arial" w:eastAsia="Arial" w:hAnsi="Arial"/>
-                <w:b w:val="false"/>
-                <w:bCs w:val="false"/>
-                <w:sz w:val="19"/>
-                <w:szCs w:val="19"/>
-                <w:rtl w:val="false"/>
-              </w:rPr>
-              <w:t xml:space="preserve">GO3, GO4 reversed (sign change)</w:t>
-            </w:r>
-          </w:p>
-        </w:tc>
-      </w:tr>
-      <w:tr>
-        <w:trPr>
-          <w:cantSplit/>
-          <w:tblHeader w:val="false"/>
-        </w:trPr>
-        <w:tc>
-          <w:tcPr>
-            <w:tcW w:type="dxa" w:w="1700"/>
-            <w:tcBorders>
-              <w:top w:val="single" w:color="A6A6A6" w:sz="4"/>
-              <w:left w:val="single" w:color="A6A6A6" w:sz="4"/>
-              <w:bottom w:val="single" w:color="A6A6A6" w:sz="4"/>
-              <w:right w:val="single" w:color="A6A6A6" w:sz="4"/>
-            </w:tcBorders>
-            <w:tcMar>
-              <w:top w:type="dxa" w:w="50"/>
-              <w:left w:type="dxa" w:w="60"/>
-              <w:bottom w:type="dxa" w:w="50"/>
-              <w:right w:type="dxa" w:w="60"/>
-            </w:tcMar>
-          </w:tcPr>
-          <w:p>
-            <w:pPr>
-              <w:bidi w:val="false"/>
-              <w:spacing w:after="0" w:line="260"/>
-            </w:pPr>
-            <w:r>
-              <w:rPr>
-                <w:rFonts w:ascii="Arial" w:cs="Arial" w:eastAsia="Arial" w:hAnsi="Arial"/>
-                <w:b w:val="false"/>
-                <w:bCs w:val="false"/>
-                <w:sz w:val="19"/>
-                <w:szCs w:val="19"/>
-                <w:rtl w:val="false"/>
-              </w:rPr>
               <w:t xml:space="preserve">Marker</w:t>
             </w:r>
           </w:p>
@@ -48019,7 +44797,7 @@
                 <w:szCs w:val="19"/>
                 <w:rtl w:val="false"/>
               </w:rPr>
-              <w:t xml:space="preserve">This short version (about 125 items, 19–22 minutes) is for the main data collection. Compared with the full version these are removed: continuance commitment, occupation and organization (12 items); moral-identity symbolization (5); client-related burnout (6); intent to remain (3); leader coaching (3); goal similarity (3); conflict resolution (3); liking (4); team learning (7); team performance (5). Appendix tables are filtered for the removed rows; the commitment rows (which still mention continuance) and the Lencioni coverage table are identical to the full version.</w:t>
+              <w:t xml:space="preserve">This short version (about 117 items, 18–21 minutes) is for the main data collection. Compared with the full version these are removed: continuance commitment, occupation and organization (12 items); moral-identity symbolization (5); client-related burnout (6); intent to remain (3); leader coaching (3); goal similarity (3); conflict resolution (3); liking (4); team learning (7); team performance (5); psychological capital PCQ-24 (24, once licensed). Appendix tables are filtered for the removed rows; the commitment rows (which still mention continuance) and the Lencioni coverage table are identical to the full version.</w:t>
             </w:r>
           </w:p>
         </w:tc>
@@ -48245,21 +45023,6 @@
           <w:szCs w:val="20"/>
         </w:rPr>
         <w:t xml:space="preserve">Kristensen, T. S., Borritz, M., Villadsen, E., &amp; Christensen, K. B. (2005). The Copenhagen Burnout Inventory: A new tool for the assessment of burnout. Work &amp; Stress, 19(3), 192–207. https://doi.org/10.1080/02678370500297720</w:t>
-      </w:r>
-    </w:p>
-    <w:p>
-      <w:pPr>
-        <w:bidi w:val="false"/>
-        <w:spacing w:after="80"/>
-        <w:ind w:left="360" w:hanging="360"/>
-      </w:pPr>
-      <w:r>
-        <w:rPr>
-          <w:rFonts w:ascii="Arial" w:cs="Arial" w:eastAsia="Arial" w:hAnsi="Arial"/>
-          <w:sz w:val="20"/>
-          <w:szCs w:val="20"/>
-        </w:rPr>
-        <w:t xml:space="preserve">Kuppens, T., Manstead, A. S. R., Spears, R., &amp; Sweetman, J. (2026). Who cares about groups? The Group Orientation Scale measures differences in the general motivation for group belonging and concern for group goals. Group Processes &amp; Intergroup Relations, 29(3), 446–470. https://doi.org/10.1177/13684302251406210</w:t>
       </w:r>
     </w:p>
     <w:p>

</xml_diff>

<commit_message>
Confirm 7-point scale for Meyer, Allen & Smith commitment items
Co-Authored-By: Claude Sonnet 5.5 <noreply@anthropic.com>
Claude-Session: https://claude.ai/code/session_0117HPg2G3CcnRnb2QXnVBy9
</commit_message>
<xml_diff>
--- a/questionnaire-v3-short-en.docx
+++ b/questionnaire-v3-short-en.docx
@@ -37480,7 +37480,7 @@
                 <w:szCs w:val="19"/>
                 <w:rtl w:val="false"/>
               </w:rPr>
-              <w:t xml:space="preserve">VERIFIED against Table 3 (your image): 6+6+6 items; "nursing" replaced by "auditing". Reverse: OC2, OC4, OC5, OCC5, ONM2. Scale not shown in the table; 7-point assumed (my knowledge, unverified)</w:t>
+              <w:t xml:space="preserve">VERIFIED against Table 3 (your image): 6+6+6 items; "nursing" replaced by "auditing". Reverse: OC2, OC4, OC5, OCC5, ONM2. 7-point scale (1 = strongly disagree, 7 = strongly agree), items averaged into composite scores — verified against the Methods section of the paper (your images). The sample in the paper was 603 Ontario nurses; transfer to auditing is an adaptation</w:t>
             </w:r>
           </w:p>
         </w:tc>
@@ -37514,7 +37514,7 @@
                 <w:szCs w:val="19"/>
                 <w:rtl w:val="false"/>
               </w:rPr>
-              <w:t xml:space="preserve">Notify/permission; check the scale</w:t>
+              <w:t xml:space="preserve">Notify/permission; report the adaptation from nursing to auditing</w:t>
             </w:r>
           </w:p>
         </w:tc>
@@ -42316,7 +42316,7 @@
                 <w:szCs w:val="19"/>
                 <w:rtl w:val="false"/>
               </w:rPr>
-              <w:t xml:space="preserve">7-pt (assumed)</w:t>
+              <w:t xml:space="preserve">7-pt</w:t>
             </w:r>
           </w:p>
         </w:tc>
@@ -42526,7 +42526,7 @@
                 <w:szCs w:val="19"/>
                 <w:rtl w:val="false"/>
               </w:rPr>
-              <w:t xml:space="preserve">7-pt (assumed)</w:t>
+              <w:t xml:space="preserve">7-pt</w:t>
             </w:r>
           </w:p>
         </w:tc>

</xml_diff>

<commit_message>
Add researcher notes (reference, scoring, direct/reverse items) under each instrument; add intention to leave, outcome slots and results-dimension slots
Co-Authored-By: Claude Sonnet 5.5 <noreply@anthropic.com>
Claude-Session: https://claude.ai/code/session_0117HPg2G3CcnRnb2QXnVBy9
</commit_message>
<xml_diff>
--- a/questionnaire-v3-short-en.docx
+++ b/questionnaire-v3-short-en.docx
@@ -2226,6 +2226,109 @@
         </w:tc>
       </w:tr>
     </w:tbl>
+    <w:tbl>
+      <w:tblPr>
+        <w:bidiVisual w:val="false"/>
+        <w:tblW w:type="dxa" w:w="9500"/>
+        <w:tblBorders>
+          <w:top w:val="single" w:color="auto" w:sz="4"/>
+          <w:left w:val="single" w:color="auto" w:sz="4"/>
+          <w:bottom w:val="single" w:color="auto" w:sz="4"/>
+          <w:right w:val="single" w:color="auto" w:sz="4"/>
+          <w:insideH w:val="single" w:color="auto" w:sz="4"/>
+          <w:insideV w:val="single" w:color="auto" w:sz="4"/>
+        </w:tblBorders>
+      </w:tblPr>
+      <w:tblGrid>
+        <w:gridCol w:w="9500"/>
+      </w:tblGrid>
+      <w:tr>
+        <w:trPr>
+          <w:cantSplit/>
+          <w:tblHeader/>
+        </w:trPr>
+        <w:tc>
+          <w:tcPr>
+            <w:tcW w:type="dxa" w:w="9500"/>
+            <w:tcBorders>
+              <w:top w:val="single" w:color="A6A6A6" w:sz="4"/>
+              <w:left w:val="single" w:color="A6A6A6" w:sz="4"/>
+              <w:bottom w:val="single" w:color="A6A6A6" w:sz="4"/>
+              <w:right w:val="single" w:color="A6A6A6" w:sz="4"/>
+            </w:tcBorders>
+            <w:shd w:fill="E7E6E6" w:color="auto" w:val="clear"/>
+            <w:tcMar>
+              <w:top w:type="dxa" w:w="50"/>
+              <w:left w:type="dxa" w:w="60"/>
+              <w:bottom w:type="dxa" w:w="50"/>
+              <w:right w:type="dxa" w:w="60"/>
+            </w:tcMar>
+          </w:tcPr>
+          <w:p>
+            <w:pPr>
+              <w:bidi w:val="false"/>
+              <w:spacing w:after="0" w:line="260"/>
+            </w:pPr>
+            <w:r>
+              <w:rPr>
+                <w:rFonts w:ascii="Arial" w:cs="Arial" w:eastAsia="Arial" w:hAnsi="Arial"/>
+                <w:b/>
+                <w:bCs/>
+                <w:sz w:val="19"/>
+                <w:szCs w:val="19"/>
+                <w:rtl w:val="false"/>
+              </w:rPr>
+              <w:t xml:space="preserve">Researcher note (remove from the respondent version)</w:t>
+            </w:r>
+          </w:p>
+        </w:tc>
+      </w:tr>
+      <w:tr>
+        <w:trPr>
+          <w:cantSplit/>
+          <w:tblHeader w:val="false"/>
+        </w:trPr>
+        <w:tc>
+          <w:tcPr>
+            <w:tcW w:type="dxa" w:w="9500"/>
+            <w:tcBorders>
+              <w:top w:val="single" w:color="A6A6A6" w:sz="4"/>
+              <w:left w:val="single" w:color="A6A6A6" w:sz="4"/>
+              <w:bottom w:val="single" w:color="A6A6A6" w:sz="4"/>
+              <w:right w:val="single" w:color="A6A6A6" w:sz="4"/>
+            </w:tcBorders>
+            <w:tcMar>
+              <w:top w:type="dxa" w:w="50"/>
+              <w:left w:type="dxa" w:w="60"/>
+              <w:bottom w:type="dxa" w:w="50"/>
+              <w:right w:type="dxa" w:w="60"/>
+            </w:tcMar>
+          </w:tcPr>
+          <w:p>
+            <w:pPr>
+              <w:bidi w:val="false"/>
+              <w:spacing w:after="0" w:line="260"/>
+            </w:pPr>
+            <w:r>
+              <w:rPr>
+                <w:rFonts w:ascii="Arial" w:cs="Arial" w:eastAsia="Arial" w:hAnsi="Arial"/>
+                <w:b w:val="false"/>
+                <w:bCs w:val="false"/>
+                <w:sz w:val="19"/>
+                <w:szCs w:val="19"/>
+                <w:rtl w:val="false"/>
+              </w:rPr>
+              <w:t xml:space="preserve">Source: Otley, D. T., &amp; Pierce, B. J. (1996). Auditor time budget pressure: Consequences and antecedents. Accounting, Auditing &amp; Accountability Journal, 9(1), 31–58. https://doi.org/10.1108/09513579610109969 (Tables II and IV) | Scoring: BT1 (5 = very easy … 1 = impossible), BT2 and BT3 (nearly always = 5 … never = 1); the original paper calls the average/sum of the three questions budget attainability (alpha = .85; correlations .64–.67; sum 3–15, higher = easier). For budget pressure reverse the score (6 − mean). FI1–FI3 (1 = not at all … 5 = very great) are analysed separately; FI3 = influence of clients' expected fees. | All items are direct (attainability direction). | Status: verified; last year → reference engagement is an adaptation; BT3 is sensitive.</w:t>
+            </w:r>
+          </w:p>
+        </w:tc>
+      </w:tr>
+    </w:tbl>
+    <w:p>
+      <w:pPr>
+        <w:spacing w:after="80"/>
+      </w:pPr>
+    </w:p>
     <w:p>
       <w:r>
         <w:br w:type="page"/>
@@ -4877,6 +4980,109 @@
         </w:tc>
       </w:tr>
     </w:tbl>
+    <w:tbl>
+      <w:tblPr>
+        <w:bidiVisual w:val="false"/>
+        <w:tblW w:type="dxa" w:w="9500"/>
+        <w:tblBorders>
+          <w:top w:val="single" w:color="auto" w:sz="4"/>
+          <w:left w:val="single" w:color="auto" w:sz="4"/>
+          <w:bottom w:val="single" w:color="auto" w:sz="4"/>
+          <w:right w:val="single" w:color="auto" w:sz="4"/>
+          <w:insideH w:val="single" w:color="auto" w:sz="4"/>
+          <w:insideV w:val="single" w:color="auto" w:sz="4"/>
+        </w:tblBorders>
+      </w:tblPr>
+      <w:tblGrid>
+        <w:gridCol w:w="9500"/>
+      </w:tblGrid>
+      <w:tr>
+        <w:trPr>
+          <w:cantSplit/>
+          <w:tblHeader/>
+        </w:trPr>
+        <w:tc>
+          <w:tcPr>
+            <w:tcW w:type="dxa" w:w="9500"/>
+            <w:tcBorders>
+              <w:top w:val="single" w:color="A6A6A6" w:sz="4"/>
+              <w:left w:val="single" w:color="A6A6A6" w:sz="4"/>
+              <w:bottom w:val="single" w:color="A6A6A6" w:sz="4"/>
+              <w:right w:val="single" w:color="A6A6A6" w:sz="4"/>
+            </w:tcBorders>
+            <w:shd w:fill="E7E6E6" w:color="auto" w:val="clear"/>
+            <w:tcMar>
+              <w:top w:type="dxa" w:w="50"/>
+              <w:left w:type="dxa" w:w="60"/>
+              <w:bottom w:type="dxa" w:w="50"/>
+              <w:right w:type="dxa" w:w="60"/>
+            </w:tcMar>
+          </w:tcPr>
+          <w:p>
+            <w:pPr>
+              <w:bidi w:val="false"/>
+              <w:spacing w:after="0" w:line="260"/>
+            </w:pPr>
+            <w:r>
+              <w:rPr>
+                <w:rFonts w:ascii="Arial" w:cs="Arial" w:eastAsia="Arial" w:hAnsi="Arial"/>
+                <w:b/>
+                <w:bCs/>
+                <w:sz w:val="19"/>
+                <w:szCs w:val="19"/>
+                <w:rtl w:val="false"/>
+              </w:rPr>
+              <w:t xml:space="preserve">Researcher note (remove from the respondent version)</w:t>
+            </w:r>
+          </w:p>
+        </w:tc>
+      </w:tr>
+      <w:tr>
+        <w:trPr>
+          <w:cantSplit/>
+          <w:tblHeader w:val="false"/>
+        </w:trPr>
+        <w:tc>
+          <w:tcPr>
+            <w:tcW w:type="dxa" w:w="9500"/>
+            <w:tcBorders>
+              <w:top w:val="single" w:color="A6A6A6" w:sz="4"/>
+              <w:left w:val="single" w:color="A6A6A6" w:sz="4"/>
+              <w:bottom w:val="single" w:color="A6A6A6" w:sz="4"/>
+              <w:right w:val="single" w:color="A6A6A6" w:sz="4"/>
+            </w:tcBorders>
+            <w:tcMar>
+              <w:top w:type="dxa" w:w="50"/>
+              <w:left w:type="dxa" w:w="60"/>
+              <w:bottom w:type="dxa" w:w="50"/>
+              <w:right w:type="dxa" w:w="60"/>
+            </w:tcMar>
+          </w:tcPr>
+          <w:p>
+            <w:pPr>
+              <w:bidi w:val="false"/>
+              <w:spacing w:after="0" w:line="260"/>
+            </w:pPr>
+            <w:r>
+              <w:rPr>
+                <w:rFonts w:ascii="Arial" w:cs="Arial" w:eastAsia="Arial" w:hAnsi="Arial"/>
+                <w:b w:val="false"/>
+                <w:bCs w:val="false"/>
+                <w:sz w:val="19"/>
+                <w:szCs w:val="19"/>
+                <w:rtl w:val="false"/>
+              </w:rPr>
+              <w:t xml:space="preserve">Source: Edmondson, A. (1999). Psychological safety and learning behavior in work teams. Administrative Science Quarterly, 44(2), 350–383. https://doi.org/10.2307/2666999 | Scoring: 7-point (1 = very inaccurate … 7 = very accurate). Recode reverse items as (8 − response) and average the 7 items; higher = more psychological safety. | Direct: TS2, TS4, TS6, TS7. | Reverse: TS1, TS3, TS5. | Team level: mean of the other members (leave-one-out). | Status: verified against the paper's appendix; team → audit team is an adaptation.</w:t>
+            </w:r>
+          </w:p>
+        </w:tc>
+      </w:tr>
+    </w:tbl>
+    <w:p>
+      <w:pPr>
+        <w:spacing w:after="80"/>
+      </w:pPr>
+    </w:p>
     <w:p>
       <w:pPr>
         <w:spacing w:after="80"/>
@@ -6211,6 +6417,109 @@
         </w:tc>
       </w:tr>
     </w:tbl>
+    <w:tbl>
+      <w:tblPr>
+        <w:bidiVisual w:val="false"/>
+        <w:tblW w:type="dxa" w:w="9500"/>
+        <w:tblBorders>
+          <w:top w:val="single" w:color="auto" w:sz="4"/>
+          <w:left w:val="single" w:color="auto" w:sz="4"/>
+          <w:bottom w:val="single" w:color="auto" w:sz="4"/>
+          <w:right w:val="single" w:color="auto" w:sz="4"/>
+          <w:insideH w:val="single" w:color="auto" w:sz="4"/>
+          <w:insideV w:val="single" w:color="auto" w:sz="4"/>
+        </w:tblBorders>
+      </w:tblPr>
+      <w:tblGrid>
+        <w:gridCol w:w="9500"/>
+      </w:tblGrid>
+      <w:tr>
+        <w:trPr>
+          <w:cantSplit/>
+          <w:tblHeader/>
+        </w:trPr>
+        <w:tc>
+          <w:tcPr>
+            <w:tcW w:type="dxa" w:w="9500"/>
+            <w:tcBorders>
+              <w:top w:val="single" w:color="A6A6A6" w:sz="4"/>
+              <w:left w:val="single" w:color="A6A6A6" w:sz="4"/>
+              <w:bottom w:val="single" w:color="A6A6A6" w:sz="4"/>
+              <w:right w:val="single" w:color="A6A6A6" w:sz="4"/>
+            </w:tcBorders>
+            <w:shd w:fill="E7E6E6" w:color="auto" w:val="clear"/>
+            <w:tcMar>
+              <w:top w:type="dxa" w:w="50"/>
+              <w:left w:type="dxa" w:w="60"/>
+              <w:bottom w:type="dxa" w:w="50"/>
+              <w:right w:type="dxa" w:w="60"/>
+            </w:tcMar>
+          </w:tcPr>
+          <w:p>
+            <w:pPr>
+              <w:bidi w:val="false"/>
+              <w:spacing w:after="0" w:line="260"/>
+            </w:pPr>
+            <w:r>
+              <w:rPr>
+                <w:rFonts w:ascii="Arial" w:cs="Arial" w:eastAsia="Arial" w:hAnsi="Arial"/>
+                <w:b/>
+                <w:bCs/>
+                <w:sz w:val="19"/>
+                <w:szCs w:val="19"/>
+                <w:rtl w:val="false"/>
+              </w:rPr>
+              <w:t xml:space="preserve">Researcher note (remove from the respondent version)</w:t>
+            </w:r>
+          </w:p>
+        </w:tc>
+      </w:tr>
+      <w:tr>
+        <w:trPr>
+          <w:cantSplit/>
+          <w:tblHeader w:val="false"/>
+        </w:trPr>
+        <w:tc>
+          <w:tcPr>
+            <w:tcW w:type="dxa" w:w="9500"/>
+            <w:tcBorders>
+              <w:top w:val="single" w:color="A6A6A6" w:sz="4"/>
+              <w:left w:val="single" w:color="A6A6A6" w:sz="4"/>
+              <w:bottom w:val="single" w:color="A6A6A6" w:sz="4"/>
+              <w:right w:val="single" w:color="A6A6A6" w:sz="4"/>
+            </w:tcBorders>
+            <w:tcMar>
+              <w:top w:type="dxa" w:w="50"/>
+              <w:left w:type="dxa" w:w="60"/>
+              <w:bottom w:type="dxa" w:w="50"/>
+              <w:right w:type="dxa" w:w="60"/>
+            </w:tcMar>
+          </w:tcPr>
+          <w:p>
+            <w:pPr>
+              <w:bidi w:val="false"/>
+              <w:spacing w:after="0" w:line="260"/>
+            </w:pPr>
+            <w:r>
+              <w:rPr>
+                <w:rFonts w:ascii="Arial" w:cs="Arial" w:eastAsia="Arial" w:hAnsi="Arial"/>
+                <w:b w:val="false"/>
+                <w:bCs w:val="false"/>
+                <w:sz w:val="19"/>
+                <w:szCs w:val="19"/>
+                <w:rtl w:val="false"/>
+              </w:rPr>
+              <w:t xml:space="preserve">Source: Edmondson, A. (1999). Psychological safety and learning behavior in work teams. Administrative Science Quarterly, 44(2), 350–383. https://doi.org/10.2307/2666999 | Scoring: same 7-point scale; mean of 3 items; higher = clearer direction. | Direct: CD1, CD2, CD3. | Reverse: none. | Status: verified against the appendix (Clear direction).</w:t>
+            </w:r>
+          </w:p>
+        </w:tc>
+      </w:tr>
+    </w:tbl>
+    <w:p>
+      <w:pPr>
+        <w:spacing w:after="80"/>
+      </w:pPr>
+    </w:p>
     <w:p>
       <w:pPr>
         <w:spacing w:after="80"/>
@@ -9145,11 +9454,6 @@
         </w:tc>
       </w:tr>
     </w:tbl>
-    <w:p>
-      <w:pPr>
-        <w:spacing w:after="80"/>
-      </w:pPr>
-    </w:p>
     <w:tbl>
       <w:tblPr>
         <w:bidiVisual w:val="false"/>
@@ -9180,7 +9484,7 @@
               <w:bottom w:val="single" w:color="A6A6A6" w:sz="4"/>
               <w:right w:val="single" w:color="A6A6A6" w:sz="4"/>
             </w:tcBorders>
-            <w:shd w:fill="FCE4D6" w:color="auto" w:val="clear"/>
+            <w:shd w:fill="E7E6E6" w:color="auto" w:val="clear"/>
             <w:tcMar>
               <w:top w:type="dxa" w:w="50"/>
               <w:left w:type="dxa" w:w="60"/>
@@ -9202,7 +9506,7 @@
                 <w:szCs w:val="19"/>
                 <w:rtl w:val="false"/>
               </w:rPr>
-              <w:t xml:space="preserve">Placeholder: inattention to collective results</w:t>
+              <w:t xml:space="preserve">Researcher note (remove from the respondent version)</w:t>
             </w:r>
           </w:p>
         </w:tc>
@@ -9242,12 +9546,17 @@
                 <w:szCs w:val="19"/>
                 <w:rtl w:val="false"/>
               </w:rPr>
-              <w:t xml:space="preserve">[No verifiable published instrument was found for this Lencioni dimension. The slot is left blank on purpose; no researcher-made or ill-fitting substitute (such as individual group-orientation scales) has been put in it.]</w:t>
+              <w:t xml:space="preserve">Source: Stewart, V. R., Snyder, D. G., &amp; Kou, C.-Y. (2023). We hold ourselves accountable: A relational view of team accountability. Journal of Business Ethics, 183, 691–712. https://doi.org/10.1007/s10551-021-04969-z | Scoring: 7-point (1 = strongly disagree … 7 = strongly agree); mean of 8 items; higher = more team accountability; for avoidance of accountability read the composite in reverse (8 − mean). | Direct: all TAQ1–TAQ8. | Reverse: none. | Alpha in the paper = .90 (n = 70). | Status: verified against Table 1; items were not reworded.</w:t>
             </w:r>
           </w:p>
         </w:tc>
       </w:tr>
     </w:tbl>
+    <w:p>
+      <w:pPr>
+        <w:spacing w:after="80"/>
+      </w:pPr>
+    </w:p>
     <w:p>
       <w:pPr>
         <w:spacing w:after="80"/>
@@ -11315,6 +11624,109 @@
         </w:tc>
       </w:tr>
     </w:tbl>
+    <w:tbl>
+      <w:tblPr>
+        <w:bidiVisual w:val="false"/>
+        <w:tblW w:type="dxa" w:w="9500"/>
+        <w:tblBorders>
+          <w:top w:val="single" w:color="auto" w:sz="4"/>
+          <w:left w:val="single" w:color="auto" w:sz="4"/>
+          <w:bottom w:val="single" w:color="auto" w:sz="4"/>
+          <w:right w:val="single" w:color="auto" w:sz="4"/>
+          <w:insideH w:val="single" w:color="auto" w:sz="4"/>
+          <w:insideV w:val="single" w:color="auto" w:sz="4"/>
+        </w:tblBorders>
+      </w:tblPr>
+      <w:tblGrid>
+        <w:gridCol w:w="9500"/>
+      </w:tblGrid>
+      <w:tr>
+        <w:trPr>
+          <w:cantSplit/>
+          <w:tblHeader/>
+        </w:trPr>
+        <w:tc>
+          <w:tcPr>
+            <w:tcW w:type="dxa" w:w="9500"/>
+            <w:tcBorders>
+              <w:top w:val="single" w:color="A6A6A6" w:sz="4"/>
+              <w:left w:val="single" w:color="A6A6A6" w:sz="4"/>
+              <w:bottom w:val="single" w:color="A6A6A6" w:sz="4"/>
+              <w:right w:val="single" w:color="A6A6A6" w:sz="4"/>
+            </w:tcBorders>
+            <w:shd w:fill="E7E6E6" w:color="auto" w:val="clear"/>
+            <w:tcMar>
+              <w:top w:type="dxa" w:w="50"/>
+              <w:left w:type="dxa" w:w="60"/>
+              <w:bottom w:type="dxa" w:w="50"/>
+              <w:right w:type="dxa" w:w="60"/>
+            </w:tcMar>
+          </w:tcPr>
+          <w:p>
+            <w:pPr>
+              <w:bidi w:val="false"/>
+              <w:spacing w:after="0" w:line="260"/>
+            </w:pPr>
+            <w:r>
+              <w:rPr>
+                <w:rFonts w:ascii="Arial" w:cs="Arial" w:eastAsia="Arial" w:hAnsi="Arial"/>
+                <w:b/>
+                <w:bCs/>
+                <w:sz w:val="19"/>
+                <w:szCs w:val="19"/>
+                <w:rtl w:val="false"/>
+              </w:rPr>
+              <w:t xml:space="preserve">Researcher note (remove from the respondent version)</w:t>
+            </w:r>
+          </w:p>
+        </w:tc>
+      </w:tr>
+      <w:tr>
+        <w:trPr>
+          <w:cantSplit/>
+          <w:tblHeader w:val="false"/>
+        </w:trPr>
+        <w:tc>
+          <w:tcPr>
+            <w:tcW w:type="dxa" w:w="9500"/>
+            <w:tcBorders>
+              <w:top w:val="single" w:color="A6A6A6" w:sz="4"/>
+              <w:left w:val="single" w:color="A6A6A6" w:sz="4"/>
+              <w:bottom w:val="single" w:color="A6A6A6" w:sz="4"/>
+              <w:right w:val="single" w:color="A6A6A6" w:sz="4"/>
+            </w:tcBorders>
+            <w:tcMar>
+              <w:top w:type="dxa" w:w="50"/>
+              <w:left w:type="dxa" w:w="60"/>
+              <w:bottom w:type="dxa" w:w="50"/>
+              <w:right w:type="dxa" w:w="60"/>
+            </w:tcMar>
+          </w:tcPr>
+          <w:p>
+            <w:pPr>
+              <w:bidi w:val="false"/>
+              <w:spacing w:after="0" w:line="260"/>
+            </w:pPr>
+            <w:r>
+              <w:rPr>
+                <w:rFonts w:ascii="Arial" w:cs="Arial" w:eastAsia="Arial" w:hAnsi="Arial"/>
+                <w:b w:val="false"/>
+                <w:bCs w:val="false"/>
+                <w:sz w:val="19"/>
+                <w:szCs w:val="19"/>
+                <w:rtl w:val="false"/>
+              </w:rPr>
+              <w:t xml:space="preserve">Source: Jehn, K. A. (1995). A multimethod examination of the benefits and detriments of intragroup conflict. Administrative Science Quarterly, 40(2), 256–282. https://doi.org/10.2307/2393638 Scale based on Cosier, R. A., &amp; Dalton, D. R. (1990). Positive effects of conflict: A field assessment. International Journal of Conflict Management, 1(1), 81–92. (details to verify) | Scoring: conflict norms (alpha = .74), 7 items; response format not given in the text (5-point agreement assumed; to be checked). Average after recoding; higher = more openness to conflict. | Direct: CN1, CN5, CN6. | Reverse (asterisked in the paper): CN2, CN3, CN4, CN7. | Status: text of 7 items verified; recheck the reverse direction of CN3.</w:t>
+            </w:r>
+          </w:p>
+        </w:tc>
+      </w:tr>
+    </w:tbl>
+    <w:p>
+      <w:pPr>
+        <w:spacing w:after="80"/>
+      </w:pPr>
+    </w:p>
     <w:p>
       <w:pPr>
         <w:spacing w:after="80"/>
@@ -12615,6 +13027,1624 @@
         </w:tc>
       </w:tr>
     </w:tbl>
+    <w:tbl>
+      <w:tblPr>
+        <w:bidiVisual w:val="false"/>
+        <w:tblW w:type="dxa" w:w="9500"/>
+        <w:tblBorders>
+          <w:top w:val="single" w:color="auto" w:sz="4"/>
+          <w:left w:val="single" w:color="auto" w:sz="4"/>
+          <w:bottom w:val="single" w:color="auto" w:sz="4"/>
+          <w:right w:val="single" w:color="auto" w:sz="4"/>
+          <w:insideH w:val="single" w:color="auto" w:sz="4"/>
+          <w:insideV w:val="single" w:color="auto" w:sz="4"/>
+        </w:tblBorders>
+      </w:tblPr>
+      <w:tblGrid>
+        <w:gridCol w:w="9500"/>
+      </w:tblGrid>
+      <w:tr>
+        <w:trPr>
+          <w:cantSplit/>
+          <w:tblHeader/>
+        </w:trPr>
+        <w:tc>
+          <w:tcPr>
+            <w:tcW w:type="dxa" w:w="9500"/>
+            <w:tcBorders>
+              <w:top w:val="single" w:color="A6A6A6" w:sz="4"/>
+              <w:left w:val="single" w:color="A6A6A6" w:sz="4"/>
+              <w:bottom w:val="single" w:color="A6A6A6" w:sz="4"/>
+              <w:right w:val="single" w:color="A6A6A6" w:sz="4"/>
+            </w:tcBorders>
+            <w:shd w:fill="E7E6E6" w:color="auto" w:val="clear"/>
+            <w:tcMar>
+              <w:top w:type="dxa" w:w="50"/>
+              <w:left w:type="dxa" w:w="60"/>
+              <w:bottom w:type="dxa" w:w="50"/>
+              <w:right w:type="dxa" w:w="60"/>
+            </w:tcMar>
+          </w:tcPr>
+          <w:p>
+            <w:pPr>
+              <w:bidi w:val="false"/>
+              <w:spacing w:after="0" w:line="260"/>
+            </w:pPr>
+            <w:r>
+              <w:rPr>
+                <w:rFonts w:ascii="Arial" w:cs="Arial" w:eastAsia="Arial" w:hAnsi="Arial"/>
+                <w:b/>
+                <w:bCs/>
+                <w:sz w:val="19"/>
+                <w:szCs w:val="19"/>
+                <w:rtl w:val="false"/>
+              </w:rPr>
+              <w:t xml:space="preserve">Researcher note (remove from the respondent version)</w:t>
+            </w:r>
+          </w:p>
+        </w:tc>
+      </w:tr>
+      <w:tr>
+        <w:trPr>
+          <w:cantSplit/>
+          <w:tblHeader w:val="false"/>
+        </w:trPr>
+        <w:tc>
+          <w:tcPr>
+            <w:tcW w:type="dxa" w:w="9500"/>
+            <w:tcBorders>
+              <w:top w:val="single" w:color="A6A6A6" w:sz="4"/>
+              <w:left w:val="single" w:color="A6A6A6" w:sz="4"/>
+              <w:bottom w:val="single" w:color="A6A6A6" w:sz="4"/>
+              <w:right w:val="single" w:color="A6A6A6" w:sz="4"/>
+            </w:tcBorders>
+            <w:tcMar>
+              <w:top w:type="dxa" w:w="50"/>
+              <w:left w:type="dxa" w:w="60"/>
+              <w:bottom w:type="dxa" w:w="50"/>
+              <w:right w:type="dxa" w:w="60"/>
+            </w:tcMar>
+          </w:tcPr>
+          <w:p>
+            <w:pPr>
+              <w:bidi w:val="false"/>
+              <w:spacing w:after="0" w:line="260"/>
+            </w:pPr>
+            <w:r>
+              <w:rPr>
+                <w:rFonts w:ascii="Arial" w:cs="Arial" w:eastAsia="Arial" w:hAnsi="Arial"/>
+                <w:b w:val="false"/>
+                <w:bCs w:val="false"/>
+                <w:sz w:val="19"/>
+                <w:szCs w:val="19"/>
+                <w:rtl w:val="false"/>
+              </w:rPr>
+              <w:t xml:space="preserve">Source: Jehn, K. A. (1995). A multimethod examination of the benefits and detriments of intragroup conflict. Administrative Science Quarterly, 40(2), 256–282. https://doi.org/10.2307/2393638 | Scoring: 5-point (1 = None … 5 = A lot); mean of 4 items; higher = more relationship conflict. The paper had 8 items on the presence of conflict (4 relationship, alpha = .92; 4 task, alpha = .87); only the 4 relationship items are used. | Direct: RC1–RC4. | Reverse: none. | Status: scale and alpha verified; the item text comes from your report, not from Table 1.</w:t>
+            </w:r>
+          </w:p>
+        </w:tc>
+      </w:tr>
+    </w:tbl>
+    <w:p>
+      <w:pPr>
+        <w:spacing w:after="80"/>
+      </w:pPr>
+    </w:p>
+    <w:tbl>
+      <w:tblPr>
+        <w:bidiVisual w:val="false"/>
+        <w:tblW w:type="dxa" w:w="9500"/>
+        <w:tblBorders>
+          <w:top w:val="single" w:color="auto" w:sz="4"/>
+          <w:left w:val="single" w:color="auto" w:sz="4"/>
+          <w:bottom w:val="single" w:color="auto" w:sz="4"/>
+          <w:right w:val="single" w:color="auto" w:sz="4"/>
+          <w:insideH w:val="single" w:color="auto" w:sz="4"/>
+          <w:insideV w:val="single" w:color="auto" w:sz="4"/>
+        </w:tblBorders>
+      </w:tblPr>
+      <w:tblGrid>
+        <w:gridCol w:w="9500"/>
+      </w:tblGrid>
+      <w:tr>
+        <w:trPr>
+          <w:cantSplit/>
+          <w:tblHeader/>
+        </w:trPr>
+        <w:tc>
+          <w:tcPr>
+            <w:tcW w:type="dxa" w:w="9500"/>
+            <w:tcBorders>
+              <w:top w:val="single" w:color="A6A6A6" w:sz="4"/>
+              <w:left w:val="single" w:color="A6A6A6" w:sz="4"/>
+              <w:bottom w:val="single" w:color="A6A6A6" w:sz="4"/>
+              <w:right w:val="single" w:color="A6A6A6" w:sz="4"/>
+            </w:tcBorders>
+            <w:shd w:fill="FCE4D6" w:color="auto" w:val="clear"/>
+            <w:tcMar>
+              <w:top w:type="dxa" w:w="50"/>
+              <w:left w:type="dxa" w:w="60"/>
+              <w:bottom w:type="dxa" w:w="50"/>
+              <w:right w:type="dxa" w:w="60"/>
+            </w:tcMar>
+          </w:tcPr>
+          <w:p>
+            <w:pPr>
+              <w:bidi w:val="false"/>
+              <w:spacing w:after="0" w:line="260"/>
+            </w:pPr>
+            <w:r>
+              <w:rPr>
+                <w:rFonts w:ascii="Arial" w:cs="Arial" w:eastAsia="Arial" w:hAnsi="Arial"/>
+                <w:b/>
+                <w:bCs/>
+                <w:sz w:val="19"/>
+                <w:szCs w:val="19"/>
+                <w:rtl w:val="false"/>
+              </w:rPr>
+              <w:t xml:space="preserve">Lencioni dimension: inattention to collective results — item slots left empty (needs verification)</w:t>
+            </w:r>
+          </w:p>
+        </w:tc>
+      </w:tr>
+      <w:tr>
+        <w:trPr>
+          <w:cantSplit/>
+          <w:tblHeader w:val="false"/>
+        </w:trPr>
+        <w:tc>
+          <w:tcPr>
+            <w:tcW w:type="dxa" w:w="9500"/>
+            <w:tcBorders>
+              <w:top w:val="single" w:color="A6A6A6" w:sz="4"/>
+              <w:left w:val="single" w:color="A6A6A6" w:sz="4"/>
+              <w:bottom w:val="single" w:color="A6A6A6" w:sz="4"/>
+              <w:right w:val="single" w:color="A6A6A6" w:sz="4"/>
+            </w:tcBorders>
+            <w:tcMar>
+              <w:top w:type="dxa" w:w="50"/>
+              <w:left w:type="dxa" w:w="60"/>
+              <w:bottom w:type="dxa" w:w="50"/>
+              <w:right w:type="dxa" w:w="60"/>
+            </w:tcMar>
+          </w:tcPr>
+          <w:p>
+            <w:pPr>
+              <w:bidi w:val="false"/>
+              <w:spacing w:after="0" w:line="260"/>
+            </w:pPr>
+            <w:r>
+              <w:rPr>
+                <w:rFonts w:ascii="Arial" w:cs="Arial" w:eastAsia="Arial" w:hAnsi="Arial"/>
+                <w:b w:val="false"/>
+                <w:bCs w:val="false"/>
+                <w:sz w:val="19"/>
+                <w:szCs w:val="19"/>
+                <w:rtl w:val="false"/>
+              </w:rPr>
+              <w:t xml:space="preserve">No verifiable published instrument was found for this dimension. The slots are deliberately left empty; no researcher-made or ill-fitting substitute has been put in them. Considered and set aside: the Group Orientation Scale (an individual trait) and goal interdependence (item text not found).</w:t>
+            </w:r>
+          </w:p>
+        </w:tc>
+      </w:tr>
+    </w:tbl>
+    <w:tbl>
+      <w:tblPr>
+        <w:bidiVisual w:val="false"/>
+        <w:tblW w:type="dxa" w:w="9500"/>
+        <w:tblBorders>
+          <w:top w:val="single" w:color="auto" w:sz="4"/>
+          <w:left w:val="single" w:color="auto" w:sz="4"/>
+          <w:bottom w:val="single" w:color="auto" w:sz="4"/>
+          <w:right w:val="single" w:color="auto" w:sz="4"/>
+          <w:insideH w:val="single" w:color="auto" w:sz="4"/>
+          <w:insideV w:val="single" w:color="auto" w:sz="4"/>
+        </w:tblBorders>
+      </w:tblPr>
+      <w:tblGrid>
+        <w:gridCol w:w="650"/>
+        <w:gridCol w:w="4930"/>
+        <w:gridCol w:w="560"/>
+        <w:gridCol w:w="560"/>
+        <w:gridCol w:w="560"/>
+        <w:gridCol w:w="560"/>
+        <w:gridCol w:w="560"/>
+        <w:gridCol w:w="560"/>
+        <w:gridCol w:w="560"/>
+      </w:tblGrid>
+      <w:tr>
+        <w:trPr>
+          <w:cantSplit/>
+          <w:tblHeader/>
+        </w:trPr>
+        <w:tc>
+          <w:tcPr>
+            <w:tcW w:type="dxa" w:w="650"/>
+            <w:tcBorders>
+              <w:top w:val="single" w:color="A6A6A6" w:sz="4"/>
+              <w:left w:val="single" w:color="A6A6A6" w:sz="4"/>
+              <w:bottom w:val="single" w:color="A6A6A6" w:sz="4"/>
+              <w:right w:val="single" w:color="A6A6A6" w:sz="4"/>
+            </w:tcBorders>
+            <w:shd w:fill="D9E2F3" w:color="auto" w:val="clear"/>
+            <w:tcMar>
+              <w:top w:type="dxa" w:w="50"/>
+              <w:left w:type="dxa" w:w="60"/>
+              <w:bottom w:type="dxa" w:w="50"/>
+              <w:right w:type="dxa" w:w="60"/>
+            </w:tcMar>
+          </w:tcPr>
+          <w:p>
+            <w:pPr>
+              <w:bidi w:val="false"/>
+              <w:spacing w:after="0" w:line="260"/>
+              <w:jc w:val="center"/>
+            </w:pPr>
+            <w:r>
+              <w:rPr>
+                <w:rFonts w:ascii="Arial" w:cs="Arial" w:eastAsia="Arial" w:hAnsi="Arial"/>
+                <w:b/>
+                <w:bCs/>
+                <w:sz w:val="19"/>
+                <w:szCs w:val="19"/>
+                <w:rtl w:val="false"/>
+              </w:rPr>
+              <w:t xml:space="preserve"/>
+            </w:r>
+          </w:p>
+        </w:tc>
+        <w:tc>
+          <w:tcPr>
+            <w:tcW w:type="dxa" w:w="4930"/>
+            <w:tcBorders>
+              <w:top w:val="single" w:color="A6A6A6" w:sz="4"/>
+              <w:left w:val="single" w:color="A6A6A6" w:sz="4"/>
+              <w:bottom w:val="single" w:color="A6A6A6" w:sz="4"/>
+              <w:right w:val="single" w:color="A6A6A6" w:sz="4"/>
+            </w:tcBorders>
+            <w:shd w:fill="D9E2F3" w:color="auto" w:val="clear"/>
+            <w:tcMar>
+              <w:top w:type="dxa" w:w="50"/>
+              <w:left w:type="dxa" w:w="60"/>
+              <w:bottom w:type="dxa" w:w="50"/>
+              <w:right w:type="dxa" w:w="60"/>
+            </w:tcMar>
+          </w:tcPr>
+          <w:p>
+            <w:pPr>
+              <w:bidi w:val="false"/>
+              <w:spacing w:after="0" w:line="260"/>
+            </w:pPr>
+            <w:r>
+              <w:rPr>
+                <w:rFonts w:ascii="Arial" w:cs="Arial" w:eastAsia="Arial" w:hAnsi="Arial"/>
+                <w:b/>
+                <w:bCs/>
+                <w:sz w:val="19"/>
+                <w:szCs w:val="19"/>
+                <w:rtl w:val="false"/>
+              </w:rPr>
+              <w:t xml:space="preserve">Statement</w:t>
+            </w:r>
+          </w:p>
+        </w:tc>
+        <w:tc>
+          <w:tcPr>
+            <w:tcW w:type="dxa" w:w="560"/>
+            <w:tcBorders>
+              <w:top w:val="single" w:color="A6A6A6" w:sz="4"/>
+              <w:left w:val="single" w:color="A6A6A6" w:sz="4"/>
+              <w:bottom w:val="single" w:color="A6A6A6" w:sz="4"/>
+              <w:right w:val="single" w:color="A6A6A6" w:sz="4"/>
+            </w:tcBorders>
+            <w:shd w:fill="D9E2F3" w:color="auto" w:val="clear"/>
+            <w:tcMar>
+              <w:top w:type="dxa" w:w="50"/>
+              <w:left w:type="dxa" w:w="60"/>
+              <w:bottom w:type="dxa" w:w="50"/>
+              <w:right w:type="dxa" w:w="60"/>
+            </w:tcMar>
+          </w:tcPr>
+          <w:p>
+            <w:pPr>
+              <w:bidi w:val="false"/>
+              <w:spacing w:after="0" w:line="260"/>
+              <w:jc w:val="center"/>
+            </w:pPr>
+            <w:r>
+              <w:rPr>
+                <w:rFonts w:ascii="Arial" w:cs="Arial" w:eastAsia="Arial" w:hAnsi="Arial"/>
+                <w:b/>
+                <w:bCs/>
+                <w:sz w:val="15"/>
+                <w:szCs w:val="15"/>
+                <w:rtl w:val="false"/>
+              </w:rPr>
+              <w:t xml:space="preserve">1</w:t>
+            </w:r>
+          </w:p>
+        </w:tc>
+        <w:tc>
+          <w:tcPr>
+            <w:tcW w:type="dxa" w:w="560"/>
+            <w:tcBorders>
+              <w:top w:val="single" w:color="A6A6A6" w:sz="4"/>
+              <w:left w:val="single" w:color="A6A6A6" w:sz="4"/>
+              <w:bottom w:val="single" w:color="A6A6A6" w:sz="4"/>
+              <w:right w:val="single" w:color="A6A6A6" w:sz="4"/>
+            </w:tcBorders>
+            <w:shd w:fill="D9E2F3" w:color="auto" w:val="clear"/>
+            <w:tcMar>
+              <w:top w:type="dxa" w:w="50"/>
+              <w:left w:type="dxa" w:w="60"/>
+              <w:bottom w:type="dxa" w:w="50"/>
+              <w:right w:type="dxa" w:w="60"/>
+            </w:tcMar>
+          </w:tcPr>
+          <w:p>
+            <w:pPr>
+              <w:bidi w:val="false"/>
+              <w:spacing w:after="0" w:line="260"/>
+              <w:jc w:val="center"/>
+            </w:pPr>
+            <w:r>
+              <w:rPr>
+                <w:rFonts w:ascii="Arial" w:cs="Arial" w:eastAsia="Arial" w:hAnsi="Arial"/>
+                <w:b/>
+                <w:bCs/>
+                <w:sz w:val="15"/>
+                <w:szCs w:val="15"/>
+                <w:rtl w:val="false"/>
+              </w:rPr>
+              <w:t xml:space="preserve">2</w:t>
+            </w:r>
+          </w:p>
+        </w:tc>
+        <w:tc>
+          <w:tcPr>
+            <w:tcW w:type="dxa" w:w="560"/>
+            <w:tcBorders>
+              <w:top w:val="single" w:color="A6A6A6" w:sz="4"/>
+              <w:left w:val="single" w:color="A6A6A6" w:sz="4"/>
+              <w:bottom w:val="single" w:color="A6A6A6" w:sz="4"/>
+              <w:right w:val="single" w:color="A6A6A6" w:sz="4"/>
+            </w:tcBorders>
+            <w:shd w:fill="D9E2F3" w:color="auto" w:val="clear"/>
+            <w:tcMar>
+              <w:top w:type="dxa" w:w="50"/>
+              <w:left w:type="dxa" w:w="60"/>
+              <w:bottom w:type="dxa" w:w="50"/>
+              <w:right w:type="dxa" w:w="60"/>
+            </w:tcMar>
+          </w:tcPr>
+          <w:p>
+            <w:pPr>
+              <w:bidi w:val="false"/>
+              <w:spacing w:after="0" w:line="260"/>
+              <w:jc w:val="center"/>
+            </w:pPr>
+            <w:r>
+              <w:rPr>
+                <w:rFonts w:ascii="Arial" w:cs="Arial" w:eastAsia="Arial" w:hAnsi="Arial"/>
+                <w:b/>
+                <w:bCs/>
+                <w:sz w:val="15"/>
+                <w:szCs w:val="15"/>
+                <w:rtl w:val="false"/>
+              </w:rPr>
+              <w:t xml:space="preserve">3</w:t>
+            </w:r>
+          </w:p>
+        </w:tc>
+        <w:tc>
+          <w:tcPr>
+            <w:tcW w:type="dxa" w:w="560"/>
+            <w:tcBorders>
+              <w:top w:val="single" w:color="A6A6A6" w:sz="4"/>
+              <w:left w:val="single" w:color="A6A6A6" w:sz="4"/>
+              <w:bottom w:val="single" w:color="A6A6A6" w:sz="4"/>
+              <w:right w:val="single" w:color="A6A6A6" w:sz="4"/>
+            </w:tcBorders>
+            <w:shd w:fill="D9E2F3" w:color="auto" w:val="clear"/>
+            <w:tcMar>
+              <w:top w:type="dxa" w:w="50"/>
+              <w:left w:type="dxa" w:w="60"/>
+              <w:bottom w:type="dxa" w:w="50"/>
+              <w:right w:type="dxa" w:w="60"/>
+            </w:tcMar>
+          </w:tcPr>
+          <w:p>
+            <w:pPr>
+              <w:bidi w:val="false"/>
+              <w:spacing w:after="0" w:line="260"/>
+              <w:jc w:val="center"/>
+            </w:pPr>
+            <w:r>
+              <w:rPr>
+                <w:rFonts w:ascii="Arial" w:cs="Arial" w:eastAsia="Arial" w:hAnsi="Arial"/>
+                <w:b/>
+                <w:bCs/>
+                <w:sz w:val="15"/>
+                <w:szCs w:val="15"/>
+                <w:rtl w:val="false"/>
+              </w:rPr>
+              <w:t xml:space="preserve">4</w:t>
+            </w:r>
+          </w:p>
+        </w:tc>
+        <w:tc>
+          <w:tcPr>
+            <w:tcW w:type="dxa" w:w="560"/>
+            <w:tcBorders>
+              <w:top w:val="single" w:color="A6A6A6" w:sz="4"/>
+              <w:left w:val="single" w:color="A6A6A6" w:sz="4"/>
+              <w:bottom w:val="single" w:color="A6A6A6" w:sz="4"/>
+              <w:right w:val="single" w:color="A6A6A6" w:sz="4"/>
+            </w:tcBorders>
+            <w:shd w:fill="D9E2F3" w:color="auto" w:val="clear"/>
+            <w:tcMar>
+              <w:top w:type="dxa" w:w="50"/>
+              <w:left w:type="dxa" w:w="60"/>
+              <w:bottom w:type="dxa" w:w="50"/>
+              <w:right w:type="dxa" w:w="60"/>
+            </w:tcMar>
+          </w:tcPr>
+          <w:p>
+            <w:pPr>
+              <w:bidi w:val="false"/>
+              <w:spacing w:after="0" w:line="260"/>
+              <w:jc w:val="center"/>
+            </w:pPr>
+            <w:r>
+              <w:rPr>
+                <w:rFonts w:ascii="Arial" w:cs="Arial" w:eastAsia="Arial" w:hAnsi="Arial"/>
+                <w:b/>
+                <w:bCs/>
+                <w:sz w:val="15"/>
+                <w:szCs w:val="15"/>
+                <w:rtl w:val="false"/>
+              </w:rPr>
+              <w:t xml:space="preserve">5</w:t>
+            </w:r>
+          </w:p>
+        </w:tc>
+        <w:tc>
+          <w:tcPr>
+            <w:tcW w:type="dxa" w:w="560"/>
+            <w:tcBorders>
+              <w:top w:val="single" w:color="A6A6A6" w:sz="4"/>
+              <w:left w:val="single" w:color="A6A6A6" w:sz="4"/>
+              <w:bottom w:val="single" w:color="A6A6A6" w:sz="4"/>
+              <w:right w:val="single" w:color="A6A6A6" w:sz="4"/>
+            </w:tcBorders>
+            <w:shd w:fill="D9E2F3" w:color="auto" w:val="clear"/>
+            <w:tcMar>
+              <w:top w:type="dxa" w:w="50"/>
+              <w:left w:type="dxa" w:w="60"/>
+              <w:bottom w:type="dxa" w:w="50"/>
+              <w:right w:type="dxa" w:w="60"/>
+            </w:tcMar>
+          </w:tcPr>
+          <w:p>
+            <w:pPr>
+              <w:bidi w:val="false"/>
+              <w:spacing w:after="0" w:line="260"/>
+              <w:jc w:val="center"/>
+            </w:pPr>
+            <w:r>
+              <w:rPr>
+                <w:rFonts w:ascii="Arial" w:cs="Arial" w:eastAsia="Arial" w:hAnsi="Arial"/>
+                <w:b/>
+                <w:bCs/>
+                <w:sz w:val="15"/>
+                <w:szCs w:val="15"/>
+                <w:rtl w:val="false"/>
+              </w:rPr>
+              <w:t xml:space="preserve">6</w:t>
+            </w:r>
+          </w:p>
+        </w:tc>
+        <w:tc>
+          <w:tcPr>
+            <w:tcW w:type="dxa" w:w="560"/>
+            <w:tcBorders>
+              <w:top w:val="single" w:color="A6A6A6" w:sz="4"/>
+              <w:left w:val="single" w:color="A6A6A6" w:sz="4"/>
+              <w:bottom w:val="single" w:color="A6A6A6" w:sz="4"/>
+              <w:right w:val="single" w:color="A6A6A6" w:sz="4"/>
+            </w:tcBorders>
+            <w:shd w:fill="D9E2F3" w:color="auto" w:val="clear"/>
+            <w:tcMar>
+              <w:top w:type="dxa" w:w="50"/>
+              <w:left w:type="dxa" w:w="60"/>
+              <w:bottom w:type="dxa" w:w="50"/>
+              <w:right w:type="dxa" w:w="60"/>
+            </w:tcMar>
+          </w:tcPr>
+          <w:p>
+            <w:pPr>
+              <w:bidi w:val="false"/>
+              <w:spacing w:after="0" w:line="260"/>
+              <w:jc w:val="center"/>
+            </w:pPr>
+            <w:r>
+              <w:rPr>
+                <w:rFonts w:ascii="Arial" w:cs="Arial" w:eastAsia="Arial" w:hAnsi="Arial"/>
+                <w:b/>
+                <w:bCs/>
+                <w:sz w:val="15"/>
+                <w:szCs w:val="15"/>
+                <w:rtl w:val="false"/>
+              </w:rPr>
+              <w:t xml:space="preserve">7</w:t>
+            </w:r>
+          </w:p>
+        </w:tc>
+      </w:tr>
+      <w:tr>
+        <w:trPr>
+          <w:cantSplit/>
+          <w:tblHeader w:val="false"/>
+        </w:trPr>
+        <w:tc>
+          <w:tcPr>
+            <w:tcW w:type="dxa" w:w="650"/>
+            <w:tcBorders>
+              <w:top w:val="single" w:color="A6A6A6" w:sz="4"/>
+              <w:left w:val="single" w:color="A6A6A6" w:sz="4"/>
+              <w:bottom w:val="single" w:color="A6A6A6" w:sz="4"/>
+              <w:right w:val="single" w:color="A6A6A6" w:sz="4"/>
+            </w:tcBorders>
+            <w:tcMar>
+              <w:top w:type="dxa" w:w="50"/>
+              <w:left w:type="dxa" w:w="60"/>
+              <w:bottom w:type="dxa" w:w="50"/>
+              <w:right w:type="dxa" w:w="60"/>
+            </w:tcMar>
+          </w:tcPr>
+          <w:p>
+            <w:pPr>
+              <w:bidi w:val="false"/>
+              <w:spacing w:after="0" w:line="260"/>
+              <w:jc w:val="center"/>
+            </w:pPr>
+            <w:r>
+              <w:rPr>
+                <w:rFonts w:ascii="Arial" w:cs="Arial" w:eastAsia="Arial" w:hAnsi="Arial"/>
+                <w:b w:val="false"/>
+                <w:bCs w:val="false"/>
+                <w:sz w:val="19"/>
+                <w:szCs w:val="19"/>
+                <w:rtl w:val="false"/>
+              </w:rPr>
+              <w:t xml:space="preserve">NR1</w:t>
+            </w:r>
+          </w:p>
+        </w:tc>
+        <w:tc>
+          <w:tcPr>
+            <w:tcW w:type="dxa" w:w="4930"/>
+            <w:tcBorders>
+              <w:top w:val="single" w:color="A6A6A6" w:sz="4"/>
+              <w:left w:val="single" w:color="A6A6A6" w:sz="4"/>
+              <w:bottom w:val="single" w:color="A6A6A6" w:sz="4"/>
+              <w:right w:val="single" w:color="A6A6A6" w:sz="4"/>
+            </w:tcBorders>
+            <w:tcMar>
+              <w:top w:type="dxa" w:w="50"/>
+              <w:left w:type="dxa" w:w="60"/>
+              <w:bottom w:type="dxa" w:w="50"/>
+              <w:right w:type="dxa" w:w="60"/>
+            </w:tcMar>
+          </w:tcPr>
+          <w:p>
+            <w:pPr>
+              <w:bidi w:val="false"/>
+              <w:spacing w:after="0" w:line="260"/>
+            </w:pPr>
+            <w:r>
+              <w:rPr>
+                <w:rFonts w:ascii="Arial" w:cs="Arial" w:eastAsia="Arial" w:hAnsi="Arial"/>
+                <w:b w:val="false"/>
+                <w:bCs w:val="false"/>
+                <w:sz w:val="19"/>
+                <w:szCs w:val="19"/>
+                <w:rtl w:val="false"/>
+              </w:rPr>
+              <w:t xml:space="preserve">[item text — needs verification]</w:t>
+            </w:r>
+          </w:p>
+        </w:tc>
+        <w:tc>
+          <w:tcPr>
+            <w:tcW w:type="dxa" w:w="560"/>
+            <w:tcBorders>
+              <w:top w:val="single" w:color="A6A6A6" w:sz="4"/>
+              <w:left w:val="single" w:color="A6A6A6" w:sz="4"/>
+              <w:bottom w:val="single" w:color="A6A6A6" w:sz="4"/>
+              <w:right w:val="single" w:color="A6A6A6" w:sz="4"/>
+            </w:tcBorders>
+            <w:tcMar>
+              <w:top w:type="dxa" w:w="50"/>
+              <w:left w:type="dxa" w:w="60"/>
+              <w:bottom w:type="dxa" w:w="50"/>
+              <w:right w:type="dxa" w:w="60"/>
+            </w:tcMar>
+          </w:tcPr>
+          <w:p>
+            <w:pPr>
+              <w:bidi w:val="false"/>
+              <w:spacing w:after="0" w:line="260"/>
+              <w:jc w:val="center"/>
+            </w:pPr>
+            <w:r>
+              <w:rPr>
+                <w:rFonts w:ascii="Arial" w:cs="Arial" w:eastAsia="Arial" w:hAnsi="Arial"/>
+                <w:b w:val="false"/>
+                <w:bCs w:val="false"/>
+                <w:sz w:val="19"/>
+                <w:szCs w:val="19"/>
+                <w:rtl w:val="false"/>
+              </w:rPr>
+              <w:t xml:space="preserve">☐</w:t>
+            </w:r>
+          </w:p>
+        </w:tc>
+        <w:tc>
+          <w:tcPr>
+            <w:tcW w:type="dxa" w:w="560"/>
+            <w:tcBorders>
+              <w:top w:val="single" w:color="A6A6A6" w:sz="4"/>
+              <w:left w:val="single" w:color="A6A6A6" w:sz="4"/>
+              <w:bottom w:val="single" w:color="A6A6A6" w:sz="4"/>
+              <w:right w:val="single" w:color="A6A6A6" w:sz="4"/>
+            </w:tcBorders>
+            <w:tcMar>
+              <w:top w:type="dxa" w:w="50"/>
+              <w:left w:type="dxa" w:w="60"/>
+              <w:bottom w:type="dxa" w:w="50"/>
+              <w:right w:type="dxa" w:w="60"/>
+            </w:tcMar>
+          </w:tcPr>
+          <w:p>
+            <w:pPr>
+              <w:bidi w:val="false"/>
+              <w:spacing w:after="0" w:line="260"/>
+              <w:jc w:val="center"/>
+            </w:pPr>
+            <w:r>
+              <w:rPr>
+                <w:rFonts w:ascii="Arial" w:cs="Arial" w:eastAsia="Arial" w:hAnsi="Arial"/>
+                <w:b w:val="false"/>
+                <w:bCs w:val="false"/>
+                <w:sz w:val="19"/>
+                <w:szCs w:val="19"/>
+                <w:rtl w:val="false"/>
+              </w:rPr>
+              <w:t xml:space="preserve">☐</w:t>
+            </w:r>
+          </w:p>
+        </w:tc>
+        <w:tc>
+          <w:tcPr>
+            <w:tcW w:type="dxa" w:w="560"/>
+            <w:tcBorders>
+              <w:top w:val="single" w:color="A6A6A6" w:sz="4"/>
+              <w:left w:val="single" w:color="A6A6A6" w:sz="4"/>
+              <w:bottom w:val="single" w:color="A6A6A6" w:sz="4"/>
+              <w:right w:val="single" w:color="A6A6A6" w:sz="4"/>
+            </w:tcBorders>
+            <w:tcMar>
+              <w:top w:type="dxa" w:w="50"/>
+              <w:left w:type="dxa" w:w="60"/>
+              <w:bottom w:type="dxa" w:w="50"/>
+              <w:right w:type="dxa" w:w="60"/>
+            </w:tcMar>
+          </w:tcPr>
+          <w:p>
+            <w:pPr>
+              <w:bidi w:val="false"/>
+              <w:spacing w:after="0" w:line="260"/>
+              <w:jc w:val="center"/>
+            </w:pPr>
+            <w:r>
+              <w:rPr>
+                <w:rFonts w:ascii="Arial" w:cs="Arial" w:eastAsia="Arial" w:hAnsi="Arial"/>
+                <w:b w:val="false"/>
+                <w:bCs w:val="false"/>
+                <w:sz w:val="19"/>
+                <w:szCs w:val="19"/>
+                <w:rtl w:val="false"/>
+              </w:rPr>
+              <w:t xml:space="preserve">☐</w:t>
+            </w:r>
+          </w:p>
+        </w:tc>
+        <w:tc>
+          <w:tcPr>
+            <w:tcW w:type="dxa" w:w="560"/>
+            <w:tcBorders>
+              <w:top w:val="single" w:color="A6A6A6" w:sz="4"/>
+              <w:left w:val="single" w:color="A6A6A6" w:sz="4"/>
+              <w:bottom w:val="single" w:color="A6A6A6" w:sz="4"/>
+              <w:right w:val="single" w:color="A6A6A6" w:sz="4"/>
+            </w:tcBorders>
+            <w:tcMar>
+              <w:top w:type="dxa" w:w="50"/>
+              <w:left w:type="dxa" w:w="60"/>
+              <w:bottom w:type="dxa" w:w="50"/>
+              <w:right w:type="dxa" w:w="60"/>
+            </w:tcMar>
+          </w:tcPr>
+          <w:p>
+            <w:pPr>
+              <w:bidi w:val="false"/>
+              <w:spacing w:after="0" w:line="260"/>
+              <w:jc w:val="center"/>
+            </w:pPr>
+            <w:r>
+              <w:rPr>
+                <w:rFonts w:ascii="Arial" w:cs="Arial" w:eastAsia="Arial" w:hAnsi="Arial"/>
+                <w:b w:val="false"/>
+                <w:bCs w:val="false"/>
+                <w:sz w:val="19"/>
+                <w:szCs w:val="19"/>
+                <w:rtl w:val="false"/>
+              </w:rPr>
+              <w:t xml:space="preserve">☐</w:t>
+            </w:r>
+          </w:p>
+        </w:tc>
+        <w:tc>
+          <w:tcPr>
+            <w:tcW w:type="dxa" w:w="560"/>
+            <w:tcBorders>
+              <w:top w:val="single" w:color="A6A6A6" w:sz="4"/>
+              <w:left w:val="single" w:color="A6A6A6" w:sz="4"/>
+              <w:bottom w:val="single" w:color="A6A6A6" w:sz="4"/>
+              <w:right w:val="single" w:color="A6A6A6" w:sz="4"/>
+            </w:tcBorders>
+            <w:tcMar>
+              <w:top w:type="dxa" w:w="50"/>
+              <w:left w:type="dxa" w:w="60"/>
+              <w:bottom w:type="dxa" w:w="50"/>
+              <w:right w:type="dxa" w:w="60"/>
+            </w:tcMar>
+          </w:tcPr>
+          <w:p>
+            <w:pPr>
+              <w:bidi w:val="false"/>
+              <w:spacing w:after="0" w:line="260"/>
+              <w:jc w:val="center"/>
+            </w:pPr>
+            <w:r>
+              <w:rPr>
+                <w:rFonts w:ascii="Arial" w:cs="Arial" w:eastAsia="Arial" w:hAnsi="Arial"/>
+                <w:b w:val="false"/>
+                <w:bCs w:val="false"/>
+                <w:sz w:val="19"/>
+                <w:szCs w:val="19"/>
+                <w:rtl w:val="false"/>
+              </w:rPr>
+              <w:t xml:space="preserve">☐</w:t>
+            </w:r>
+          </w:p>
+        </w:tc>
+        <w:tc>
+          <w:tcPr>
+            <w:tcW w:type="dxa" w:w="560"/>
+            <w:tcBorders>
+              <w:top w:val="single" w:color="A6A6A6" w:sz="4"/>
+              <w:left w:val="single" w:color="A6A6A6" w:sz="4"/>
+              <w:bottom w:val="single" w:color="A6A6A6" w:sz="4"/>
+              <w:right w:val="single" w:color="A6A6A6" w:sz="4"/>
+            </w:tcBorders>
+            <w:tcMar>
+              <w:top w:type="dxa" w:w="50"/>
+              <w:left w:type="dxa" w:w="60"/>
+              <w:bottom w:type="dxa" w:w="50"/>
+              <w:right w:type="dxa" w:w="60"/>
+            </w:tcMar>
+          </w:tcPr>
+          <w:p>
+            <w:pPr>
+              <w:bidi w:val="false"/>
+              <w:spacing w:after="0" w:line="260"/>
+              <w:jc w:val="center"/>
+            </w:pPr>
+            <w:r>
+              <w:rPr>
+                <w:rFonts w:ascii="Arial" w:cs="Arial" w:eastAsia="Arial" w:hAnsi="Arial"/>
+                <w:b w:val="false"/>
+                <w:bCs w:val="false"/>
+                <w:sz w:val="19"/>
+                <w:szCs w:val="19"/>
+                <w:rtl w:val="false"/>
+              </w:rPr>
+              <w:t xml:space="preserve">☐</w:t>
+            </w:r>
+          </w:p>
+        </w:tc>
+        <w:tc>
+          <w:tcPr>
+            <w:tcW w:type="dxa" w:w="560"/>
+            <w:tcBorders>
+              <w:top w:val="single" w:color="A6A6A6" w:sz="4"/>
+              <w:left w:val="single" w:color="A6A6A6" w:sz="4"/>
+              <w:bottom w:val="single" w:color="A6A6A6" w:sz="4"/>
+              <w:right w:val="single" w:color="A6A6A6" w:sz="4"/>
+            </w:tcBorders>
+            <w:tcMar>
+              <w:top w:type="dxa" w:w="50"/>
+              <w:left w:type="dxa" w:w="60"/>
+              <w:bottom w:type="dxa" w:w="50"/>
+              <w:right w:type="dxa" w:w="60"/>
+            </w:tcMar>
+          </w:tcPr>
+          <w:p>
+            <w:pPr>
+              <w:bidi w:val="false"/>
+              <w:spacing w:after="0" w:line="260"/>
+              <w:jc w:val="center"/>
+            </w:pPr>
+            <w:r>
+              <w:rPr>
+                <w:rFonts w:ascii="Arial" w:cs="Arial" w:eastAsia="Arial" w:hAnsi="Arial"/>
+                <w:b w:val="false"/>
+                <w:bCs w:val="false"/>
+                <w:sz w:val="19"/>
+                <w:szCs w:val="19"/>
+                <w:rtl w:val="false"/>
+              </w:rPr>
+              <w:t xml:space="preserve">☐</w:t>
+            </w:r>
+          </w:p>
+        </w:tc>
+      </w:tr>
+      <w:tr>
+        <w:trPr>
+          <w:cantSplit/>
+          <w:tblHeader w:val="false"/>
+        </w:trPr>
+        <w:tc>
+          <w:tcPr>
+            <w:tcW w:type="dxa" w:w="650"/>
+            <w:tcBorders>
+              <w:top w:val="single" w:color="A6A6A6" w:sz="4"/>
+              <w:left w:val="single" w:color="A6A6A6" w:sz="4"/>
+              <w:bottom w:val="single" w:color="A6A6A6" w:sz="4"/>
+              <w:right w:val="single" w:color="A6A6A6" w:sz="4"/>
+            </w:tcBorders>
+            <w:tcMar>
+              <w:top w:type="dxa" w:w="50"/>
+              <w:left w:type="dxa" w:w="60"/>
+              <w:bottom w:type="dxa" w:w="50"/>
+              <w:right w:type="dxa" w:w="60"/>
+            </w:tcMar>
+          </w:tcPr>
+          <w:p>
+            <w:pPr>
+              <w:bidi w:val="false"/>
+              <w:spacing w:after="0" w:line="260"/>
+              <w:jc w:val="center"/>
+            </w:pPr>
+            <w:r>
+              <w:rPr>
+                <w:rFonts w:ascii="Arial" w:cs="Arial" w:eastAsia="Arial" w:hAnsi="Arial"/>
+                <w:b w:val="false"/>
+                <w:bCs w:val="false"/>
+                <w:sz w:val="19"/>
+                <w:szCs w:val="19"/>
+                <w:rtl w:val="false"/>
+              </w:rPr>
+              <w:t xml:space="preserve">NR2</w:t>
+            </w:r>
+          </w:p>
+        </w:tc>
+        <w:tc>
+          <w:tcPr>
+            <w:tcW w:type="dxa" w:w="4930"/>
+            <w:tcBorders>
+              <w:top w:val="single" w:color="A6A6A6" w:sz="4"/>
+              <w:left w:val="single" w:color="A6A6A6" w:sz="4"/>
+              <w:bottom w:val="single" w:color="A6A6A6" w:sz="4"/>
+              <w:right w:val="single" w:color="A6A6A6" w:sz="4"/>
+            </w:tcBorders>
+            <w:tcMar>
+              <w:top w:type="dxa" w:w="50"/>
+              <w:left w:type="dxa" w:w="60"/>
+              <w:bottom w:type="dxa" w:w="50"/>
+              <w:right w:type="dxa" w:w="60"/>
+            </w:tcMar>
+          </w:tcPr>
+          <w:p>
+            <w:pPr>
+              <w:bidi w:val="false"/>
+              <w:spacing w:after="0" w:line="260"/>
+            </w:pPr>
+            <w:r>
+              <w:rPr>
+                <w:rFonts w:ascii="Arial" w:cs="Arial" w:eastAsia="Arial" w:hAnsi="Arial"/>
+                <w:b w:val="false"/>
+                <w:bCs w:val="false"/>
+                <w:sz w:val="19"/>
+                <w:szCs w:val="19"/>
+                <w:rtl w:val="false"/>
+              </w:rPr>
+              <w:t xml:space="preserve">[item text — needs verification]</w:t>
+            </w:r>
+          </w:p>
+        </w:tc>
+        <w:tc>
+          <w:tcPr>
+            <w:tcW w:type="dxa" w:w="560"/>
+            <w:tcBorders>
+              <w:top w:val="single" w:color="A6A6A6" w:sz="4"/>
+              <w:left w:val="single" w:color="A6A6A6" w:sz="4"/>
+              <w:bottom w:val="single" w:color="A6A6A6" w:sz="4"/>
+              <w:right w:val="single" w:color="A6A6A6" w:sz="4"/>
+            </w:tcBorders>
+            <w:tcMar>
+              <w:top w:type="dxa" w:w="50"/>
+              <w:left w:type="dxa" w:w="60"/>
+              <w:bottom w:type="dxa" w:w="50"/>
+              <w:right w:type="dxa" w:w="60"/>
+            </w:tcMar>
+          </w:tcPr>
+          <w:p>
+            <w:pPr>
+              <w:bidi w:val="false"/>
+              <w:spacing w:after="0" w:line="260"/>
+              <w:jc w:val="center"/>
+            </w:pPr>
+            <w:r>
+              <w:rPr>
+                <w:rFonts w:ascii="Arial" w:cs="Arial" w:eastAsia="Arial" w:hAnsi="Arial"/>
+                <w:b w:val="false"/>
+                <w:bCs w:val="false"/>
+                <w:sz w:val="19"/>
+                <w:szCs w:val="19"/>
+                <w:rtl w:val="false"/>
+              </w:rPr>
+              <w:t xml:space="preserve">☐</w:t>
+            </w:r>
+          </w:p>
+        </w:tc>
+        <w:tc>
+          <w:tcPr>
+            <w:tcW w:type="dxa" w:w="560"/>
+            <w:tcBorders>
+              <w:top w:val="single" w:color="A6A6A6" w:sz="4"/>
+              <w:left w:val="single" w:color="A6A6A6" w:sz="4"/>
+              <w:bottom w:val="single" w:color="A6A6A6" w:sz="4"/>
+              <w:right w:val="single" w:color="A6A6A6" w:sz="4"/>
+            </w:tcBorders>
+            <w:tcMar>
+              <w:top w:type="dxa" w:w="50"/>
+              <w:left w:type="dxa" w:w="60"/>
+              <w:bottom w:type="dxa" w:w="50"/>
+              <w:right w:type="dxa" w:w="60"/>
+            </w:tcMar>
+          </w:tcPr>
+          <w:p>
+            <w:pPr>
+              <w:bidi w:val="false"/>
+              <w:spacing w:after="0" w:line="260"/>
+              <w:jc w:val="center"/>
+            </w:pPr>
+            <w:r>
+              <w:rPr>
+                <w:rFonts w:ascii="Arial" w:cs="Arial" w:eastAsia="Arial" w:hAnsi="Arial"/>
+                <w:b w:val="false"/>
+                <w:bCs w:val="false"/>
+                <w:sz w:val="19"/>
+                <w:szCs w:val="19"/>
+                <w:rtl w:val="false"/>
+              </w:rPr>
+              <w:t xml:space="preserve">☐</w:t>
+            </w:r>
+          </w:p>
+        </w:tc>
+        <w:tc>
+          <w:tcPr>
+            <w:tcW w:type="dxa" w:w="560"/>
+            <w:tcBorders>
+              <w:top w:val="single" w:color="A6A6A6" w:sz="4"/>
+              <w:left w:val="single" w:color="A6A6A6" w:sz="4"/>
+              <w:bottom w:val="single" w:color="A6A6A6" w:sz="4"/>
+              <w:right w:val="single" w:color="A6A6A6" w:sz="4"/>
+            </w:tcBorders>
+            <w:tcMar>
+              <w:top w:type="dxa" w:w="50"/>
+              <w:left w:type="dxa" w:w="60"/>
+              <w:bottom w:type="dxa" w:w="50"/>
+              <w:right w:type="dxa" w:w="60"/>
+            </w:tcMar>
+          </w:tcPr>
+          <w:p>
+            <w:pPr>
+              <w:bidi w:val="false"/>
+              <w:spacing w:after="0" w:line="260"/>
+              <w:jc w:val="center"/>
+            </w:pPr>
+            <w:r>
+              <w:rPr>
+                <w:rFonts w:ascii="Arial" w:cs="Arial" w:eastAsia="Arial" w:hAnsi="Arial"/>
+                <w:b w:val="false"/>
+                <w:bCs w:val="false"/>
+                <w:sz w:val="19"/>
+                <w:szCs w:val="19"/>
+                <w:rtl w:val="false"/>
+              </w:rPr>
+              <w:t xml:space="preserve">☐</w:t>
+            </w:r>
+          </w:p>
+        </w:tc>
+        <w:tc>
+          <w:tcPr>
+            <w:tcW w:type="dxa" w:w="560"/>
+            <w:tcBorders>
+              <w:top w:val="single" w:color="A6A6A6" w:sz="4"/>
+              <w:left w:val="single" w:color="A6A6A6" w:sz="4"/>
+              <w:bottom w:val="single" w:color="A6A6A6" w:sz="4"/>
+              <w:right w:val="single" w:color="A6A6A6" w:sz="4"/>
+            </w:tcBorders>
+            <w:tcMar>
+              <w:top w:type="dxa" w:w="50"/>
+              <w:left w:type="dxa" w:w="60"/>
+              <w:bottom w:type="dxa" w:w="50"/>
+              <w:right w:type="dxa" w:w="60"/>
+            </w:tcMar>
+          </w:tcPr>
+          <w:p>
+            <w:pPr>
+              <w:bidi w:val="false"/>
+              <w:spacing w:after="0" w:line="260"/>
+              <w:jc w:val="center"/>
+            </w:pPr>
+            <w:r>
+              <w:rPr>
+                <w:rFonts w:ascii="Arial" w:cs="Arial" w:eastAsia="Arial" w:hAnsi="Arial"/>
+                <w:b w:val="false"/>
+                <w:bCs w:val="false"/>
+                <w:sz w:val="19"/>
+                <w:szCs w:val="19"/>
+                <w:rtl w:val="false"/>
+              </w:rPr>
+              <w:t xml:space="preserve">☐</w:t>
+            </w:r>
+          </w:p>
+        </w:tc>
+        <w:tc>
+          <w:tcPr>
+            <w:tcW w:type="dxa" w:w="560"/>
+            <w:tcBorders>
+              <w:top w:val="single" w:color="A6A6A6" w:sz="4"/>
+              <w:left w:val="single" w:color="A6A6A6" w:sz="4"/>
+              <w:bottom w:val="single" w:color="A6A6A6" w:sz="4"/>
+              <w:right w:val="single" w:color="A6A6A6" w:sz="4"/>
+            </w:tcBorders>
+            <w:tcMar>
+              <w:top w:type="dxa" w:w="50"/>
+              <w:left w:type="dxa" w:w="60"/>
+              <w:bottom w:type="dxa" w:w="50"/>
+              <w:right w:type="dxa" w:w="60"/>
+            </w:tcMar>
+          </w:tcPr>
+          <w:p>
+            <w:pPr>
+              <w:bidi w:val="false"/>
+              <w:spacing w:after="0" w:line="260"/>
+              <w:jc w:val="center"/>
+            </w:pPr>
+            <w:r>
+              <w:rPr>
+                <w:rFonts w:ascii="Arial" w:cs="Arial" w:eastAsia="Arial" w:hAnsi="Arial"/>
+                <w:b w:val="false"/>
+                <w:bCs w:val="false"/>
+                <w:sz w:val="19"/>
+                <w:szCs w:val="19"/>
+                <w:rtl w:val="false"/>
+              </w:rPr>
+              <w:t xml:space="preserve">☐</w:t>
+            </w:r>
+          </w:p>
+        </w:tc>
+        <w:tc>
+          <w:tcPr>
+            <w:tcW w:type="dxa" w:w="560"/>
+            <w:tcBorders>
+              <w:top w:val="single" w:color="A6A6A6" w:sz="4"/>
+              <w:left w:val="single" w:color="A6A6A6" w:sz="4"/>
+              <w:bottom w:val="single" w:color="A6A6A6" w:sz="4"/>
+              <w:right w:val="single" w:color="A6A6A6" w:sz="4"/>
+            </w:tcBorders>
+            <w:tcMar>
+              <w:top w:type="dxa" w:w="50"/>
+              <w:left w:type="dxa" w:w="60"/>
+              <w:bottom w:type="dxa" w:w="50"/>
+              <w:right w:type="dxa" w:w="60"/>
+            </w:tcMar>
+          </w:tcPr>
+          <w:p>
+            <w:pPr>
+              <w:bidi w:val="false"/>
+              <w:spacing w:after="0" w:line="260"/>
+              <w:jc w:val="center"/>
+            </w:pPr>
+            <w:r>
+              <w:rPr>
+                <w:rFonts w:ascii="Arial" w:cs="Arial" w:eastAsia="Arial" w:hAnsi="Arial"/>
+                <w:b w:val="false"/>
+                <w:bCs w:val="false"/>
+                <w:sz w:val="19"/>
+                <w:szCs w:val="19"/>
+                <w:rtl w:val="false"/>
+              </w:rPr>
+              <w:t xml:space="preserve">☐</w:t>
+            </w:r>
+          </w:p>
+        </w:tc>
+        <w:tc>
+          <w:tcPr>
+            <w:tcW w:type="dxa" w:w="560"/>
+            <w:tcBorders>
+              <w:top w:val="single" w:color="A6A6A6" w:sz="4"/>
+              <w:left w:val="single" w:color="A6A6A6" w:sz="4"/>
+              <w:bottom w:val="single" w:color="A6A6A6" w:sz="4"/>
+              <w:right w:val="single" w:color="A6A6A6" w:sz="4"/>
+            </w:tcBorders>
+            <w:tcMar>
+              <w:top w:type="dxa" w:w="50"/>
+              <w:left w:type="dxa" w:w="60"/>
+              <w:bottom w:type="dxa" w:w="50"/>
+              <w:right w:type="dxa" w:w="60"/>
+            </w:tcMar>
+          </w:tcPr>
+          <w:p>
+            <w:pPr>
+              <w:bidi w:val="false"/>
+              <w:spacing w:after="0" w:line="260"/>
+              <w:jc w:val="center"/>
+            </w:pPr>
+            <w:r>
+              <w:rPr>
+                <w:rFonts w:ascii="Arial" w:cs="Arial" w:eastAsia="Arial" w:hAnsi="Arial"/>
+                <w:b w:val="false"/>
+                <w:bCs w:val="false"/>
+                <w:sz w:val="19"/>
+                <w:szCs w:val="19"/>
+                <w:rtl w:val="false"/>
+              </w:rPr>
+              <w:t xml:space="preserve">☐</w:t>
+            </w:r>
+          </w:p>
+        </w:tc>
+      </w:tr>
+      <w:tr>
+        <w:trPr>
+          <w:cantSplit/>
+          <w:tblHeader w:val="false"/>
+        </w:trPr>
+        <w:tc>
+          <w:tcPr>
+            <w:tcW w:type="dxa" w:w="650"/>
+            <w:tcBorders>
+              <w:top w:val="single" w:color="A6A6A6" w:sz="4"/>
+              <w:left w:val="single" w:color="A6A6A6" w:sz="4"/>
+              <w:bottom w:val="single" w:color="A6A6A6" w:sz="4"/>
+              <w:right w:val="single" w:color="A6A6A6" w:sz="4"/>
+            </w:tcBorders>
+            <w:tcMar>
+              <w:top w:type="dxa" w:w="50"/>
+              <w:left w:type="dxa" w:w="60"/>
+              <w:bottom w:type="dxa" w:w="50"/>
+              <w:right w:type="dxa" w:w="60"/>
+            </w:tcMar>
+          </w:tcPr>
+          <w:p>
+            <w:pPr>
+              <w:bidi w:val="false"/>
+              <w:spacing w:after="0" w:line="260"/>
+              <w:jc w:val="center"/>
+            </w:pPr>
+            <w:r>
+              <w:rPr>
+                <w:rFonts w:ascii="Arial" w:cs="Arial" w:eastAsia="Arial" w:hAnsi="Arial"/>
+                <w:b w:val="false"/>
+                <w:bCs w:val="false"/>
+                <w:sz w:val="19"/>
+                <w:szCs w:val="19"/>
+                <w:rtl w:val="false"/>
+              </w:rPr>
+              <w:t xml:space="preserve">NR3</w:t>
+            </w:r>
+          </w:p>
+        </w:tc>
+        <w:tc>
+          <w:tcPr>
+            <w:tcW w:type="dxa" w:w="4930"/>
+            <w:tcBorders>
+              <w:top w:val="single" w:color="A6A6A6" w:sz="4"/>
+              <w:left w:val="single" w:color="A6A6A6" w:sz="4"/>
+              <w:bottom w:val="single" w:color="A6A6A6" w:sz="4"/>
+              <w:right w:val="single" w:color="A6A6A6" w:sz="4"/>
+            </w:tcBorders>
+            <w:tcMar>
+              <w:top w:type="dxa" w:w="50"/>
+              <w:left w:type="dxa" w:w="60"/>
+              <w:bottom w:type="dxa" w:w="50"/>
+              <w:right w:type="dxa" w:w="60"/>
+            </w:tcMar>
+          </w:tcPr>
+          <w:p>
+            <w:pPr>
+              <w:bidi w:val="false"/>
+              <w:spacing w:after="0" w:line="260"/>
+            </w:pPr>
+            <w:r>
+              <w:rPr>
+                <w:rFonts w:ascii="Arial" w:cs="Arial" w:eastAsia="Arial" w:hAnsi="Arial"/>
+                <w:b w:val="false"/>
+                <w:bCs w:val="false"/>
+                <w:sz w:val="19"/>
+                <w:szCs w:val="19"/>
+                <w:rtl w:val="false"/>
+              </w:rPr>
+              <w:t xml:space="preserve">[item text — needs verification]</w:t>
+            </w:r>
+          </w:p>
+        </w:tc>
+        <w:tc>
+          <w:tcPr>
+            <w:tcW w:type="dxa" w:w="560"/>
+            <w:tcBorders>
+              <w:top w:val="single" w:color="A6A6A6" w:sz="4"/>
+              <w:left w:val="single" w:color="A6A6A6" w:sz="4"/>
+              <w:bottom w:val="single" w:color="A6A6A6" w:sz="4"/>
+              <w:right w:val="single" w:color="A6A6A6" w:sz="4"/>
+            </w:tcBorders>
+            <w:tcMar>
+              <w:top w:type="dxa" w:w="50"/>
+              <w:left w:type="dxa" w:w="60"/>
+              <w:bottom w:type="dxa" w:w="50"/>
+              <w:right w:type="dxa" w:w="60"/>
+            </w:tcMar>
+          </w:tcPr>
+          <w:p>
+            <w:pPr>
+              <w:bidi w:val="false"/>
+              <w:spacing w:after="0" w:line="260"/>
+              <w:jc w:val="center"/>
+            </w:pPr>
+            <w:r>
+              <w:rPr>
+                <w:rFonts w:ascii="Arial" w:cs="Arial" w:eastAsia="Arial" w:hAnsi="Arial"/>
+                <w:b w:val="false"/>
+                <w:bCs w:val="false"/>
+                <w:sz w:val="19"/>
+                <w:szCs w:val="19"/>
+                <w:rtl w:val="false"/>
+              </w:rPr>
+              <w:t xml:space="preserve">☐</w:t>
+            </w:r>
+          </w:p>
+        </w:tc>
+        <w:tc>
+          <w:tcPr>
+            <w:tcW w:type="dxa" w:w="560"/>
+            <w:tcBorders>
+              <w:top w:val="single" w:color="A6A6A6" w:sz="4"/>
+              <w:left w:val="single" w:color="A6A6A6" w:sz="4"/>
+              <w:bottom w:val="single" w:color="A6A6A6" w:sz="4"/>
+              <w:right w:val="single" w:color="A6A6A6" w:sz="4"/>
+            </w:tcBorders>
+            <w:tcMar>
+              <w:top w:type="dxa" w:w="50"/>
+              <w:left w:type="dxa" w:w="60"/>
+              <w:bottom w:type="dxa" w:w="50"/>
+              <w:right w:type="dxa" w:w="60"/>
+            </w:tcMar>
+          </w:tcPr>
+          <w:p>
+            <w:pPr>
+              <w:bidi w:val="false"/>
+              <w:spacing w:after="0" w:line="260"/>
+              <w:jc w:val="center"/>
+            </w:pPr>
+            <w:r>
+              <w:rPr>
+                <w:rFonts w:ascii="Arial" w:cs="Arial" w:eastAsia="Arial" w:hAnsi="Arial"/>
+                <w:b w:val="false"/>
+                <w:bCs w:val="false"/>
+                <w:sz w:val="19"/>
+                <w:szCs w:val="19"/>
+                <w:rtl w:val="false"/>
+              </w:rPr>
+              <w:t xml:space="preserve">☐</w:t>
+            </w:r>
+          </w:p>
+        </w:tc>
+        <w:tc>
+          <w:tcPr>
+            <w:tcW w:type="dxa" w:w="560"/>
+            <w:tcBorders>
+              <w:top w:val="single" w:color="A6A6A6" w:sz="4"/>
+              <w:left w:val="single" w:color="A6A6A6" w:sz="4"/>
+              <w:bottom w:val="single" w:color="A6A6A6" w:sz="4"/>
+              <w:right w:val="single" w:color="A6A6A6" w:sz="4"/>
+            </w:tcBorders>
+            <w:tcMar>
+              <w:top w:type="dxa" w:w="50"/>
+              <w:left w:type="dxa" w:w="60"/>
+              <w:bottom w:type="dxa" w:w="50"/>
+              <w:right w:type="dxa" w:w="60"/>
+            </w:tcMar>
+          </w:tcPr>
+          <w:p>
+            <w:pPr>
+              <w:bidi w:val="false"/>
+              <w:spacing w:after="0" w:line="260"/>
+              <w:jc w:val="center"/>
+            </w:pPr>
+            <w:r>
+              <w:rPr>
+                <w:rFonts w:ascii="Arial" w:cs="Arial" w:eastAsia="Arial" w:hAnsi="Arial"/>
+                <w:b w:val="false"/>
+                <w:bCs w:val="false"/>
+                <w:sz w:val="19"/>
+                <w:szCs w:val="19"/>
+                <w:rtl w:val="false"/>
+              </w:rPr>
+              <w:t xml:space="preserve">☐</w:t>
+            </w:r>
+          </w:p>
+        </w:tc>
+        <w:tc>
+          <w:tcPr>
+            <w:tcW w:type="dxa" w:w="560"/>
+            <w:tcBorders>
+              <w:top w:val="single" w:color="A6A6A6" w:sz="4"/>
+              <w:left w:val="single" w:color="A6A6A6" w:sz="4"/>
+              <w:bottom w:val="single" w:color="A6A6A6" w:sz="4"/>
+              <w:right w:val="single" w:color="A6A6A6" w:sz="4"/>
+            </w:tcBorders>
+            <w:tcMar>
+              <w:top w:type="dxa" w:w="50"/>
+              <w:left w:type="dxa" w:w="60"/>
+              <w:bottom w:type="dxa" w:w="50"/>
+              <w:right w:type="dxa" w:w="60"/>
+            </w:tcMar>
+          </w:tcPr>
+          <w:p>
+            <w:pPr>
+              <w:bidi w:val="false"/>
+              <w:spacing w:after="0" w:line="260"/>
+              <w:jc w:val="center"/>
+            </w:pPr>
+            <w:r>
+              <w:rPr>
+                <w:rFonts w:ascii="Arial" w:cs="Arial" w:eastAsia="Arial" w:hAnsi="Arial"/>
+                <w:b w:val="false"/>
+                <w:bCs w:val="false"/>
+                <w:sz w:val="19"/>
+                <w:szCs w:val="19"/>
+                <w:rtl w:val="false"/>
+              </w:rPr>
+              <w:t xml:space="preserve">☐</w:t>
+            </w:r>
+          </w:p>
+        </w:tc>
+        <w:tc>
+          <w:tcPr>
+            <w:tcW w:type="dxa" w:w="560"/>
+            <w:tcBorders>
+              <w:top w:val="single" w:color="A6A6A6" w:sz="4"/>
+              <w:left w:val="single" w:color="A6A6A6" w:sz="4"/>
+              <w:bottom w:val="single" w:color="A6A6A6" w:sz="4"/>
+              <w:right w:val="single" w:color="A6A6A6" w:sz="4"/>
+            </w:tcBorders>
+            <w:tcMar>
+              <w:top w:type="dxa" w:w="50"/>
+              <w:left w:type="dxa" w:w="60"/>
+              <w:bottom w:type="dxa" w:w="50"/>
+              <w:right w:type="dxa" w:w="60"/>
+            </w:tcMar>
+          </w:tcPr>
+          <w:p>
+            <w:pPr>
+              <w:bidi w:val="false"/>
+              <w:spacing w:after="0" w:line="260"/>
+              <w:jc w:val="center"/>
+            </w:pPr>
+            <w:r>
+              <w:rPr>
+                <w:rFonts w:ascii="Arial" w:cs="Arial" w:eastAsia="Arial" w:hAnsi="Arial"/>
+                <w:b w:val="false"/>
+                <w:bCs w:val="false"/>
+                <w:sz w:val="19"/>
+                <w:szCs w:val="19"/>
+                <w:rtl w:val="false"/>
+              </w:rPr>
+              <w:t xml:space="preserve">☐</w:t>
+            </w:r>
+          </w:p>
+        </w:tc>
+        <w:tc>
+          <w:tcPr>
+            <w:tcW w:type="dxa" w:w="560"/>
+            <w:tcBorders>
+              <w:top w:val="single" w:color="A6A6A6" w:sz="4"/>
+              <w:left w:val="single" w:color="A6A6A6" w:sz="4"/>
+              <w:bottom w:val="single" w:color="A6A6A6" w:sz="4"/>
+              <w:right w:val="single" w:color="A6A6A6" w:sz="4"/>
+            </w:tcBorders>
+            <w:tcMar>
+              <w:top w:type="dxa" w:w="50"/>
+              <w:left w:type="dxa" w:w="60"/>
+              <w:bottom w:type="dxa" w:w="50"/>
+              <w:right w:type="dxa" w:w="60"/>
+            </w:tcMar>
+          </w:tcPr>
+          <w:p>
+            <w:pPr>
+              <w:bidi w:val="false"/>
+              <w:spacing w:after="0" w:line="260"/>
+              <w:jc w:val="center"/>
+            </w:pPr>
+            <w:r>
+              <w:rPr>
+                <w:rFonts w:ascii="Arial" w:cs="Arial" w:eastAsia="Arial" w:hAnsi="Arial"/>
+                <w:b w:val="false"/>
+                <w:bCs w:val="false"/>
+                <w:sz w:val="19"/>
+                <w:szCs w:val="19"/>
+                <w:rtl w:val="false"/>
+              </w:rPr>
+              <w:t xml:space="preserve">☐</w:t>
+            </w:r>
+          </w:p>
+        </w:tc>
+        <w:tc>
+          <w:tcPr>
+            <w:tcW w:type="dxa" w:w="560"/>
+            <w:tcBorders>
+              <w:top w:val="single" w:color="A6A6A6" w:sz="4"/>
+              <w:left w:val="single" w:color="A6A6A6" w:sz="4"/>
+              <w:bottom w:val="single" w:color="A6A6A6" w:sz="4"/>
+              <w:right w:val="single" w:color="A6A6A6" w:sz="4"/>
+            </w:tcBorders>
+            <w:tcMar>
+              <w:top w:type="dxa" w:w="50"/>
+              <w:left w:type="dxa" w:w="60"/>
+              <w:bottom w:type="dxa" w:w="50"/>
+              <w:right w:type="dxa" w:w="60"/>
+            </w:tcMar>
+          </w:tcPr>
+          <w:p>
+            <w:pPr>
+              <w:bidi w:val="false"/>
+              <w:spacing w:after="0" w:line="260"/>
+              <w:jc w:val="center"/>
+            </w:pPr>
+            <w:r>
+              <w:rPr>
+                <w:rFonts w:ascii="Arial" w:cs="Arial" w:eastAsia="Arial" w:hAnsi="Arial"/>
+                <w:b w:val="false"/>
+                <w:bCs w:val="false"/>
+                <w:sz w:val="19"/>
+                <w:szCs w:val="19"/>
+                <w:rtl w:val="false"/>
+              </w:rPr>
+              <w:t xml:space="preserve">☐</w:t>
+            </w:r>
+          </w:p>
+        </w:tc>
+      </w:tr>
+    </w:tbl>
+    <w:tbl>
+      <w:tblPr>
+        <w:bidiVisual w:val="false"/>
+        <w:tblW w:type="dxa" w:w="9500"/>
+        <w:tblBorders>
+          <w:top w:val="single" w:color="auto" w:sz="4"/>
+          <w:left w:val="single" w:color="auto" w:sz="4"/>
+          <w:bottom w:val="single" w:color="auto" w:sz="4"/>
+          <w:right w:val="single" w:color="auto" w:sz="4"/>
+          <w:insideH w:val="single" w:color="auto" w:sz="4"/>
+          <w:insideV w:val="single" w:color="auto" w:sz="4"/>
+        </w:tblBorders>
+      </w:tblPr>
+      <w:tblGrid>
+        <w:gridCol w:w="9500"/>
+      </w:tblGrid>
+      <w:tr>
+        <w:trPr>
+          <w:cantSplit/>
+          <w:tblHeader/>
+        </w:trPr>
+        <w:tc>
+          <w:tcPr>
+            <w:tcW w:type="dxa" w:w="9500"/>
+            <w:tcBorders>
+              <w:top w:val="single" w:color="A6A6A6" w:sz="4"/>
+              <w:left w:val="single" w:color="A6A6A6" w:sz="4"/>
+              <w:bottom w:val="single" w:color="A6A6A6" w:sz="4"/>
+              <w:right w:val="single" w:color="A6A6A6" w:sz="4"/>
+            </w:tcBorders>
+            <w:shd w:fill="E7E6E6" w:color="auto" w:val="clear"/>
+            <w:tcMar>
+              <w:top w:type="dxa" w:w="50"/>
+              <w:left w:type="dxa" w:w="60"/>
+              <w:bottom w:type="dxa" w:w="50"/>
+              <w:right w:type="dxa" w:w="60"/>
+            </w:tcMar>
+          </w:tcPr>
+          <w:p>
+            <w:pPr>
+              <w:bidi w:val="false"/>
+              <w:spacing w:after="0" w:line="260"/>
+            </w:pPr>
+            <w:r>
+              <w:rPr>
+                <w:rFonts w:ascii="Arial" w:cs="Arial" w:eastAsia="Arial" w:hAnsi="Arial"/>
+                <w:b/>
+                <w:bCs/>
+                <w:sz w:val="19"/>
+                <w:szCs w:val="19"/>
+                <w:rtl w:val="false"/>
+              </w:rPr>
+              <w:t xml:space="preserve">Researcher note (remove from the respondent version)</w:t>
+            </w:r>
+          </w:p>
+        </w:tc>
+      </w:tr>
+      <w:tr>
+        <w:trPr>
+          <w:cantSplit/>
+          <w:tblHeader w:val="false"/>
+        </w:trPr>
+        <w:tc>
+          <w:tcPr>
+            <w:tcW w:type="dxa" w:w="9500"/>
+            <w:tcBorders>
+              <w:top w:val="single" w:color="A6A6A6" w:sz="4"/>
+              <w:left w:val="single" w:color="A6A6A6" w:sz="4"/>
+              <w:bottom w:val="single" w:color="A6A6A6" w:sz="4"/>
+              <w:right w:val="single" w:color="A6A6A6" w:sz="4"/>
+            </w:tcBorders>
+            <w:tcMar>
+              <w:top w:type="dxa" w:w="50"/>
+              <w:left w:type="dxa" w:w="60"/>
+              <w:bottom w:type="dxa" w:w="50"/>
+              <w:right w:type="dxa" w:w="60"/>
+            </w:tcMar>
+          </w:tcPr>
+          <w:p>
+            <w:pPr>
+              <w:bidi w:val="false"/>
+              <w:spacing w:after="0" w:line="260"/>
+            </w:pPr>
+            <w:r>
+              <w:rPr>
+                <w:rFonts w:ascii="Arial" w:cs="Arial" w:eastAsia="Arial" w:hAnsi="Arial"/>
+                <w:b w:val="false"/>
+                <w:bCs w:val="false"/>
+                <w:sz w:val="19"/>
+                <w:szCs w:val="19"/>
+                <w:rtl w:val="false"/>
+              </w:rPr>
+              <w:t xml:space="preserve">Source: not determined | Scoring: not determined (after an instrument is found) | Direct/reverse: not determined | Status: needs verification. Rows NR1–NR3 are only placeholders; the real number of items is unknown.</w:t>
+            </w:r>
+          </w:p>
+        </w:tc>
+      </w:tr>
+    </w:tbl>
+    <w:p>
+      <w:pPr>
+        <w:spacing w:after="80"/>
+      </w:pPr>
+    </w:p>
     <w:p>
       <w:r>
         <w:br w:type="page"/>
@@ -21851,6 +23881,109 @@
         </w:tc>
       </w:tr>
     </w:tbl>
+    <w:tbl>
+      <w:tblPr>
+        <w:bidiVisual w:val="false"/>
+        <w:tblW w:type="dxa" w:w="9500"/>
+        <w:tblBorders>
+          <w:top w:val="single" w:color="auto" w:sz="4"/>
+          <w:left w:val="single" w:color="auto" w:sz="4"/>
+          <w:bottom w:val="single" w:color="auto" w:sz="4"/>
+          <w:right w:val="single" w:color="auto" w:sz="4"/>
+          <w:insideH w:val="single" w:color="auto" w:sz="4"/>
+          <w:insideV w:val="single" w:color="auto" w:sz="4"/>
+        </w:tblBorders>
+      </w:tblPr>
+      <w:tblGrid>
+        <w:gridCol w:w="9500"/>
+      </w:tblGrid>
+      <w:tr>
+        <w:trPr>
+          <w:cantSplit/>
+          <w:tblHeader/>
+        </w:trPr>
+        <w:tc>
+          <w:tcPr>
+            <w:tcW w:type="dxa" w:w="9500"/>
+            <w:tcBorders>
+              <w:top w:val="single" w:color="A6A6A6" w:sz="4"/>
+              <w:left w:val="single" w:color="A6A6A6" w:sz="4"/>
+              <w:bottom w:val="single" w:color="A6A6A6" w:sz="4"/>
+              <w:right w:val="single" w:color="A6A6A6" w:sz="4"/>
+            </w:tcBorders>
+            <w:shd w:fill="E7E6E6" w:color="auto" w:val="clear"/>
+            <w:tcMar>
+              <w:top w:type="dxa" w:w="50"/>
+              <w:left w:type="dxa" w:w="60"/>
+              <w:bottom w:type="dxa" w:w="50"/>
+              <w:right w:type="dxa" w:w="60"/>
+            </w:tcMar>
+          </w:tcPr>
+          <w:p>
+            <w:pPr>
+              <w:bidi w:val="false"/>
+              <w:spacing w:after="0" w:line="260"/>
+            </w:pPr>
+            <w:r>
+              <w:rPr>
+                <w:rFonts w:ascii="Arial" w:cs="Arial" w:eastAsia="Arial" w:hAnsi="Arial"/>
+                <w:b/>
+                <w:bCs/>
+                <w:sz w:val="19"/>
+                <w:szCs w:val="19"/>
+                <w:rtl w:val="false"/>
+              </w:rPr>
+              <w:t xml:space="preserve">Researcher note (remove from the respondent version)</w:t>
+            </w:r>
+          </w:p>
+        </w:tc>
+      </w:tr>
+      <w:tr>
+        <w:trPr>
+          <w:cantSplit/>
+          <w:tblHeader w:val="false"/>
+        </w:trPr>
+        <w:tc>
+          <w:tcPr>
+            <w:tcW w:type="dxa" w:w="9500"/>
+            <w:tcBorders>
+              <w:top w:val="single" w:color="A6A6A6" w:sz="4"/>
+              <w:left w:val="single" w:color="A6A6A6" w:sz="4"/>
+              <w:bottom w:val="single" w:color="A6A6A6" w:sz="4"/>
+              <w:right w:val="single" w:color="A6A6A6" w:sz="4"/>
+            </w:tcBorders>
+            <w:tcMar>
+              <w:top w:type="dxa" w:w="50"/>
+              <w:left w:type="dxa" w:w="60"/>
+              <w:bottom w:type="dxa" w:w="50"/>
+              <w:right w:type="dxa" w:w="60"/>
+            </w:tcMar>
+          </w:tcPr>
+          <w:p>
+            <w:pPr>
+              <w:bidi w:val="false"/>
+              <w:spacing w:after="0" w:line="260"/>
+            </w:pPr>
+            <w:r>
+              <w:rPr>
+                <w:rFonts w:ascii="Arial" w:cs="Arial" w:eastAsia="Arial" w:hAnsi="Arial"/>
+                <w:b w:val="false"/>
+                <w:bCs w:val="false"/>
+                <w:sz w:val="19"/>
+                <w:szCs w:val="19"/>
+                <w:rtl w:val="false"/>
+              </w:rPr>
+              <w:t xml:space="preserve">Source: Meyer, J. P., Allen, N. J., &amp; Smith, C. A. (1993). Commitment to organizations and occupations: Extension and test of a three-component conceptualization. Journal of Applied Psychology, 78(4), 538–551. Organizational scales are modified versions of Allen, N. J., &amp; Meyer, J. P. (1990). The measurement and antecedents of affective, continuance and normative commitment to the organization. Journal of Occupational Psychology, 63(1), 1–18. | Scoring: 7-point (1 = strongly disagree … 7 = strongly agree); average the 6 items of each component after recoding (8 − response). Components: occupation (affective OC, continuance OCC, normative ONM) and organization (affective AC, continuance ACC, normative ANM). | Reverse: OC2, OC4, OC5; OCC5; ONM2; AC3, AC4, AC5; ANM1. | Direct: all other items. | Status: text and keys verified against Table 3; nursing → auditing is an adaptation.</w:t>
+            </w:r>
+          </w:p>
+        </w:tc>
+      </w:tr>
+    </w:tbl>
+    <w:p>
+      <w:pPr>
+        <w:spacing w:after="80"/>
+      </w:pPr>
+    </w:p>
     <w:p>
       <w:pPr>
         <w:spacing w:after="80"/>
@@ -24211,6 +26344,109 @@
         </w:tc>
       </w:tr>
     </w:tbl>
+    <w:tbl>
+      <w:tblPr>
+        <w:bidiVisual w:val="false"/>
+        <w:tblW w:type="dxa" w:w="9500"/>
+        <w:tblBorders>
+          <w:top w:val="single" w:color="auto" w:sz="4"/>
+          <w:left w:val="single" w:color="auto" w:sz="4"/>
+          <w:bottom w:val="single" w:color="auto" w:sz="4"/>
+          <w:right w:val="single" w:color="auto" w:sz="4"/>
+          <w:insideH w:val="single" w:color="auto" w:sz="4"/>
+          <w:insideV w:val="single" w:color="auto" w:sz="4"/>
+        </w:tblBorders>
+      </w:tblPr>
+      <w:tblGrid>
+        <w:gridCol w:w="9500"/>
+      </w:tblGrid>
+      <w:tr>
+        <w:trPr>
+          <w:cantSplit/>
+          <w:tblHeader/>
+        </w:trPr>
+        <w:tc>
+          <w:tcPr>
+            <w:tcW w:type="dxa" w:w="9500"/>
+            <w:tcBorders>
+              <w:top w:val="single" w:color="A6A6A6" w:sz="4"/>
+              <w:left w:val="single" w:color="A6A6A6" w:sz="4"/>
+              <w:bottom w:val="single" w:color="A6A6A6" w:sz="4"/>
+              <w:right w:val="single" w:color="A6A6A6" w:sz="4"/>
+            </w:tcBorders>
+            <w:shd w:fill="E7E6E6" w:color="auto" w:val="clear"/>
+            <w:tcMar>
+              <w:top w:type="dxa" w:w="50"/>
+              <w:left w:type="dxa" w:w="60"/>
+              <w:bottom w:type="dxa" w:w="50"/>
+              <w:right w:type="dxa" w:w="60"/>
+            </w:tcMar>
+          </w:tcPr>
+          <w:p>
+            <w:pPr>
+              <w:bidi w:val="false"/>
+              <w:spacing w:after="0" w:line="260"/>
+            </w:pPr>
+            <w:r>
+              <w:rPr>
+                <w:rFonts w:ascii="Arial" w:cs="Arial" w:eastAsia="Arial" w:hAnsi="Arial"/>
+                <w:b/>
+                <w:bCs/>
+                <w:sz w:val="19"/>
+                <w:szCs w:val="19"/>
+                <w:rtl w:val="false"/>
+              </w:rPr>
+              <w:t xml:space="preserve">Researcher note (remove from the respondent version)</w:t>
+            </w:r>
+          </w:p>
+        </w:tc>
+      </w:tr>
+      <w:tr>
+        <w:trPr>
+          <w:cantSplit/>
+          <w:tblHeader w:val="false"/>
+        </w:trPr>
+        <w:tc>
+          <w:tcPr>
+            <w:tcW w:type="dxa" w:w="9500"/>
+            <w:tcBorders>
+              <w:top w:val="single" w:color="A6A6A6" w:sz="4"/>
+              <w:left w:val="single" w:color="A6A6A6" w:sz="4"/>
+              <w:bottom w:val="single" w:color="A6A6A6" w:sz="4"/>
+              <w:right w:val="single" w:color="A6A6A6" w:sz="4"/>
+            </w:tcBorders>
+            <w:tcMar>
+              <w:top w:type="dxa" w:w="50"/>
+              <w:left w:type="dxa" w:w="60"/>
+              <w:bottom w:type="dxa" w:w="50"/>
+              <w:right w:type="dxa" w:w="60"/>
+            </w:tcMar>
+          </w:tcPr>
+          <w:p>
+            <w:pPr>
+              <w:bidi w:val="false"/>
+              <w:spacing w:after="0" w:line="260"/>
+            </w:pPr>
+            <w:r>
+              <w:rPr>
+                <w:rFonts w:ascii="Arial" w:cs="Arial" w:eastAsia="Arial" w:hAnsi="Arial"/>
+                <w:b w:val="false"/>
+                <w:bCs w:val="false"/>
+                <w:sz w:val="19"/>
+                <w:szCs w:val="19"/>
+                <w:rtl w:val="false"/>
+              </w:rPr>
+              <w:t xml:space="preserve">Source: Kristensen, T. S., Borritz, M., Villadsen, E., &amp; Christensen, K. B. (2005). The Copenhagen Burnout Inventory: A new tool for the assessment of burnout. Work &amp; Stress, 19(3), 192–207. https://doi.org/10.1080/02678370500297720 | Scoring (work-related burnout): convert answers to 100 / 75 / 50 / 25 / 0 (Always or To a very high degree = 100 … Never/almost never or To a very low degree = 0; i.e. (response 1–5 − 1) × 25). Mean of the 7 items = 0–100; higher = more burnout; alpha in the paper = .87. | Response type: EX1–EX3 intensity, EX4–EX7 frequency. | Direct: EX1–EX6. | Reverse: EX7 (100 − score). | Status: text and response types verified against Table II of the paper. The subscale is called work-related burnout, not emotional exhaustion.</w:t>
+            </w:r>
+          </w:p>
+        </w:tc>
+      </w:tr>
+    </w:tbl>
+    <w:p>
+      <w:pPr>
+        <w:spacing w:after="80"/>
+      </w:pPr>
+    </w:p>
     <w:p>
       <w:pPr>
         <w:spacing w:after="80"/>
@@ -27182,6 +29418,109 @@
         </w:tc>
       </w:tr>
     </w:tbl>
+    <w:tbl>
+      <w:tblPr>
+        <w:bidiVisual w:val="false"/>
+        <w:tblW w:type="dxa" w:w="9500"/>
+        <w:tblBorders>
+          <w:top w:val="single" w:color="auto" w:sz="4"/>
+          <w:left w:val="single" w:color="auto" w:sz="4"/>
+          <w:bottom w:val="single" w:color="auto" w:sz="4"/>
+          <w:right w:val="single" w:color="auto" w:sz="4"/>
+          <w:insideH w:val="single" w:color="auto" w:sz="4"/>
+          <w:insideV w:val="single" w:color="auto" w:sz="4"/>
+        </w:tblBorders>
+      </w:tblPr>
+      <w:tblGrid>
+        <w:gridCol w:w="9500"/>
+      </w:tblGrid>
+      <w:tr>
+        <w:trPr>
+          <w:cantSplit/>
+          <w:tblHeader/>
+        </w:trPr>
+        <w:tc>
+          <w:tcPr>
+            <w:tcW w:type="dxa" w:w="9500"/>
+            <w:tcBorders>
+              <w:top w:val="single" w:color="A6A6A6" w:sz="4"/>
+              <w:left w:val="single" w:color="A6A6A6" w:sz="4"/>
+              <w:bottom w:val="single" w:color="A6A6A6" w:sz="4"/>
+              <w:right w:val="single" w:color="A6A6A6" w:sz="4"/>
+            </w:tcBorders>
+            <w:shd w:fill="E7E6E6" w:color="auto" w:val="clear"/>
+            <w:tcMar>
+              <w:top w:type="dxa" w:w="50"/>
+              <w:left w:type="dxa" w:w="60"/>
+              <w:bottom w:type="dxa" w:w="50"/>
+              <w:right w:type="dxa" w:w="60"/>
+            </w:tcMar>
+          </w:tcPr>
+          <w:p>
+            <w:pPr>
+              <w:bidi w:val="false"/>
+              <w:spacing w:after="0" w:line="260"/>
+            </w:pPr>
+            <w:r>
+              <w:rPr>
+                <w:rFonts w:ascii="Arial" w:cs="Arial" w:eastAsia="Arial" w:hAnsi="Arial"/>
+                <w:b/>
+                <w:bCs/>
+                <w:sz w:val="19"/>
+                <w:szCs w:val="19"/>
+                <w:rtl w:val="false"/>
+              </w:rPr>
+              <w:t xml:space="preserve">Researcher note (remove from the respondent version)</w:t>
+            </w:r>
+          </w:p>
+        </w:tc>
+      </w:tr>
+      <w:tr>
+        <w:trPr>
+          <w:cantSplit/>
+          <w:tblHeader w:val="false"/>
+        </w:trPr>
+        <w:tc>
+          <w:tcPr>
+            <w:tcW w:type="dxa" w:w="9500"/>
+            <w:tcBorders>
+              <w:top w:val="single" w:color="A6A6A6" w:sz="4"/>
+              <w:left w:val="single" w:color="A6A6A6" w:sz="4"/>
+              <w:bottom w:val="single" w:color="A6A6A6" w:sz="4"/>
+              <w:right w:val="single" w:color="A6A6A6" w:sz="4"/>
+            </w:tcBorders>
+            <w:tcMar>
+              <w:top w:type="dxa" w:w="50"/>
+              <w:left w:type="dxa" w:w="60"/>
+              <w:bottom w:type="dxa" w:w="50"/>
+              <w:right w:type="dxa" w:w="60"/>
+            </w:tcMar>
+          </w:tcPr>
+          <w:p>
+            <w:pPr>
+              <w:bidi w:val="false"/>
+              <w:spacing w:after="0" w:line="260"/>
+            </w:pPr>
+            <w:r>
+              <w:rPr>
+                <w:rFonts w:ascii="Arial" w:cs="Arial" w:eastAsia="Arial" w:hAnsi="Arial"/>
+                <w:b w:val="false"/>
+                <w:bCs w:val="false"/>
+                <w:sz w:val="19"/>
+                <w:szCs w:val="19"/>
+                <w:rtl w:val="false"/>
+              </w:rPr>
+              <w:t xml:space="preserve">Source: Moore, C., Detert, J. R., Treviño, L. K., Baker, V. L., &amp; Mayer, D. M. (2012). Why employees do bad things: Moral disengagement and unethical organizational behavior. Personnel Psychology, 65(1), 1–48. https://doi.org/10.1111/j.1744-6570.2011.01237.x | Scoring: 7-point (1 = strongly disagree … 7 = strongly agree); mean of 8 items; higher = greater propensity to morally disengage. | Direct: all MD1–MD8 (items are worded as justifying statements). | Reverse: none. | Each item taps one Bandura mechanism (MD1 moral justification, MD2 euphemistic labelling, MD3 advantageous comparison, MD4 displacement of responsibility, MD5 diffusion of responsibility, MD6 distortion of consequences, MD7 dehumanization, MD8 attribution of blame). | Status: text verified against Appendix A.</w:t>
+            </w:r>
+          </w:p>
+        </w:tc>
+      </w:tr>
+    </w:tbl>
+    <w:p>
+      <w:pPr>
+        <w:spacing w:after="80"/>
+      </w:pPr>
+    </w:p>
     <w:p>
       <w:r>
         <w:br w:type="page"/>
@@ -29496,6 +31835,109 @@
         </w:tc>
       </w:tr>
     </w:tbl>
+    <w:tbl>
+      <w:tblPr>
+        <w:bidiVisual w:val="false"/>
+        <w:tblW w:type="dxa" w:w="9500"/>
+        <w:tblBorders>
+          <w:top w:val="single" w:color="auto" w:sz="4"/>
+          <w:left w:val="single" w:color="auto" w:sz="4"/>
+          <w:bottom w:val="single" w:color="auto" w:sz="4"/>
+          <w:right w:val="single" w:color="auto" w:sz="4"/>
+          <w:insideH w:val="single" w:color="auto" w:sz="4"/>
+          <w:insideV w:val="single" w:color="auto" w:sz="4"/>
+        </w:tblBorders>
+      </w:tblPr>
+      <w:tblGrid>
+        <w:gridCol w:w="9500"/>
+      </w:tblGrid>
+      <w:tr>
+        <w:trPr>
+          <w:cantSplit/>
+          <w:tblHeader/>
+        </w:trPr>
+        <w:tc>
+          <w:tcPr>
+            <w:tcW w:type="dxa" w:w="9500"/>
+            <w:tcBorders>
+              <w:top w:val="single" w:color="A6A6A6" w:sz="4"/>
+              <w:left w:val="single" w:color="A6A6A6" w:sz="4"/>
+              <w:bottom w:val="single" w:color="A6A6A6" w:sz="4"/>
+              <w:right w:val="single" w:color="A6A6A6" w:sz="4"/>
+            </w:tcBorders>
+            <w:shd w:fill="E7E6E6" w:color="auto" w:val="clear"/>
+            <w:tcMar>
+              <w:top w:type="dxa" w:w="50"/>
+              <w:left w:type="dxa" w:w="60"/>
+              <w:bottom w:type="dxa" w:w="50"/>
+              <w:right w:type="dxa" w:w="60"/>
+            </w:tcMar>
+          </w:tcPr>
+          <w:p>
+            <w:pPr>
+              <w:bidi w:val="false"/>
+              <w:spacing w:after="0" w:line="260"/>
+            </w:pPr>
+            <w:r>
+              <w:rPr>
+                <w:rFonts w:ascii="Arial" w:cs="Arial" w:eastAsia="Arial" w:hAnsi="Arial"/>
+                <w:b/>
+                <w:bCs/>
+                <w:sz w:val="19"/>
+                <w:szCs w:val="19"/>
+                <w:rtl w:val="false"/>
+              </w:rPr>
+              <w:t xml:space="preserve">Researcher note (remove from the respondent version)</w:t>
+            </w:r>
+          </w:p>
+        </w:tc>
+      </w:tr>
+      <w:tr>
+        <w:trPr>
+          <w:cantSplit/>
+          <w:tblHeader w:val="false"/>
+        </w:trPr>
+        <w:tc>
+          <w:tcPr>
+            <w:tcW w:type="dxa" w:w="9500"/>
+            <w:tcBorders>
+              <w:top w:val="single" w:color="A6A6A6" w:sz="4"/>
+              <w:left w:val="single" w:color="A6A6A6" w:sz="4"/>
+              <w:bottom w:val="single" w:color="A6A6A6" w:sz="4"/>
+              <w:right w:val="single" w:color="A6A6A6" w:sz="4"/>
+            </w:tcBorders>
+            <w:tcMar>
+              <w:top w:type="dxa" w:w="50"/>
+              <w:left w:type="dxa" w:w="60"/>
+              <w:bottom w:type="dxa" w:w="50"/>
+              <w:right w:type="dxa" w:w="60"/>
+            </w:tcMar>
+          </w:tcPr>
+          <w:p>
+            <w:pPr>
+              <w:bidi w:val="false"/>
+              <w:spacing w:after="0" w:line="260"/>
+            </w:pPr>
+            <w:r>
+              <w:rPr>
+                <w:rFonts w:ascii="Arial" w:cs="Arial" w:eastAsia="Arial" w:hAnsi="Arial"/>
+                <w:b w:val="false"/>
+                <w:bCs w:val="false"/>
+                <w:sz w:val="19"/>
+                <w:szCs w:val="19"/>
+                <w:rtl w:val="false"/>
+              </w:rPr>
+              <w:t xml:space="preserve">Source: Otley, D. T., &amp; Pierce, B. J. (1996). Auditor time budget pressure: Consequences and antecedents. Accounting, Auditing &amp; Accountability Journal, 9(1), 31–58. https://doi.org/10.1108/09513579610109969 (wording of the five behaviours from its Appendix; origin: Kelley &amp; Margheim, 1990) | Scoring: 5-point frequency (never = 1 … nearly always = 5); Not applicable and Prefer not to answer = missing; mean of PN1–PN5 (core) = perceived team DAB norm; PN6 separately. | Direct: all. | Reverse: none. | Status: PN1–PN5 are the five source behaviours with the referent changed to other team members (an adaptation); PN6 is ours.</w:t>
+            </w:r>
+          </w:p>
+        </w:tc>
+      </w:tr>
+    </w:tbl>
+    <w:p>
+      <w:pPr>
+        <w:spacing w:after="80"/>
+      </w:pPr>
+    </w:p>
     <w:p>
       <w:pPr>
         <w:spacing w:after="80"/>
@@ -32130,6 +34572,109 @@
         </w:tc>
       </w:tr>
     </w:tbl>
+    <w:tbl>
+      <w:tblPr>
+        <w:bidiVisual w:val="false"/>
+        <w:tblW w:type="dxa" w:w="9500"/>
+        <w:tblBorders>
+          <w:top w:val="single" w:color="auto" w:sz="4"/>
+          <w:left w:val="single" w:color="auto" w:sz="4"/>
+          <w:bottom w:val="single" w:color="auto" w:sz="4"/>
+          <w:right w:val="single" w:color="auto" w:sz="4"/>
+          <w:insideH w:val="single" w:color="auto" w:sz="4"/>
+          <w:insideV w:val="single" w:color="auto" w:sz="4"/>
+        </w:tblBorders>
+      </w:tblPr>
+      <w:tblGrid>
+        <w:gridCol w:w="9500"/>
+      </w:tblGrid>
+      <w:tr>
+        <w:trPr>
+          <w:cantSplit/>
+          <w:tblHeader/>
+        </w:trPr>
+        <w:tc>
+          <w:tcPr>
+            <w:tcW w:type="dxa" w:w="9500"/>
+            <w:tcBorders>
+              <w:top w:val="single" w:color="A6A6A6" w:sz="4"/>
+              <w:left w:val="single" w:color="A6A6A6" w:sz="4"/>
+              <w:bottom w:val="single" w:color="A6A6A6" w:sz="4"/>
+              <w:right w:val="single" w:color="A6A6A6" w:sz="4"/>
+            </w:tcBorders>
+            <w:shd w:fill="E7E6E6" w:color="auto" w:val="clear"/>
+            <w:tcMar>
+              <w:top w:type="dxa" w:w="50"/>
+              <w:left w:type="dxa" w:w="60"/>
+              <w:bottom w:type="dxa" w:w="50"/>
+              <w:right w:type="dxa" w:w="60"/>
+            </w:tcMar>
+          </w:tcPr>
+          <w:p>
+            <w:pPr>
+              <w:bidi w:val="false"/>
+              <w:spacing w:after="0" w:line="260"/>
+            </w:pPr>
+            <w:r>
+              <w:rPr>
+                <w:rFonts w:ascii="Arial" w:cs="Arial" w:eastAsia="Arial" w:hAnsi="Arial"/>
+                <w:b/>
+                <w:bCs/>
+                <w:sz w:val="19"/>
+                <w:szCs w:val="19"/>
+                <w:rtl w:val="false"/>
+              </w:rPr>
+              <w:t xml:space="preserve">Researcher note (remove from the respondent version)</w:t>
+            </w:r>
+          </w:p>
+        </w:tc>
+      </w:tr>
+      <w:tr>
+        <w:trPr>
+          <w:cantSplit/>
+          <w:tblHeader w:val="false"/>
+        </w:trPr>
+        <w:tc>
+          <w:tcPr>
+            <w:tcW w:type="dxa" w:w="9500"/>
+            <w:tcBorders>
+              <w:top w:val="single" w:color="A6A6A6" w:sz="4"/>
+              <w:left w:val="single" w:color="A6A6A6" w:sz="4"/>
+              <w:bottom w:val="single" w:color="A6A6A6" w:sz="4"/>
+              <w:right w:val="single" w:color="A6A6A6" w:sz="4"/>
+            </w:tcBorders>
+            <w:tcMar>
+              <w:top w:type="dxa" w:w="50"/>
+              <w:left w:type="dxa" w:w="60"/>
+              <w:bottom w:type="dxa" w:w="50"/>
+              <w:right w:type="dxa" w:w="60"/>
+            </w:tcMar>
+          </w:tcPr>
+          <w:p>
+            <w:pPr>
+              <w:bidi w:val="false"/>
+              <w:spacing w:after="0" w:line="260"/>
+            </w:pPr>
+            <w:r>
+              <w:rPr>
+                <w:rFonts w:ascii="Arial" w:cs="Arial" w:eastAsia="Arial" w:hAnsi="Arial"/>
+                <w:b w:val="false"/>
+                <w:bCs w:val="false"/>
+                <w:sz w:val="19"/>
+                <w:szCs w:val="19"/>
+                <w:rtl w:val="false"/>
+              </w:rPr>
+              <w:t xml:space="preserve">Source: Otley, D. T., &amp; Pierce, B. J. (1996). Auditor time budget pressure: Consequences and antecedents. Accounting, Auditing &amp; Accountability Journal, 9(1), 31–58. https://doi.org/10.1108/09513579610109969 (Appendix, questions 6–7; behaviours based on Kelley &amp; Margheim, 1990; URT after Kelley &amp; Seiler, 1982, Table VIII) | Scoring: 5-point frequency (Never = 1, Rarely = 2, Sometimes = 3, Often = 4, Nearly always = 5); mean of DB1–DB5 = audit quality reduction behaviour; DB6–DB7 = under-reporting of time (URT), kept separate. | Direct: all. | Reverse: none. | Status: DB1–DB5 verbatim from the Appendix; DB6–DB7 wording is ours, based on the labels of Table VIII (structure verified, wording not). Not applicable = missing.</w:t>
+            </w:r>
+          </w:p>
+        </w:tc>
+      </w:tr>
+    </w:tbl>
+    <w:p>
+      <w:pPr>
+        <w:spacing w:after="80"/>
+      </w:pPr>
+    </w:p>
     <w:p>
       <w:r>
         <w:br w:type="page"/>
@@ -33731,6 +36276,109 @@
         </w:tc>
       </w:tr>
     </w:tbl>
+    <w:tbl>
+      <w:tblPr>
+        <w:bidiVisual w:val="false"/>
+        <w:tblW w:type="dxa" w:w="9500"/>
+        <w:tblBorders>
+          <w:top w:val="single" w:color="auto" w:sz="4"/>
+          <w:left w:val="single" w:color="auto" w:sz="4"/>
+          <w:bottom w:val="single" w:color="auto" w:sz="4"/>
+          <w:right w:val="single" w:color="auto" w:sz="4"/>
+          <w:insideH w:val="single" w:color="auto" w:sz="4"/>
+          <w:insideV w:val="single" w:color="auto" w:sz="4"/>
+        </w:tblBorders>
+      </w:tblPr>
+      <w:tblGrid>
+        <w:gridCol w:w="9500"/>
+      </w:tblGrid>
+      <w:tr>
+        <w:trPr>
+          <w:cantSplit/>
+          <w:tblHeader/>
+        </w:trPr>
+        <w:tc>
+          <w:tcPr>
+            <w:tcW w:type="dxa" w:w="9500"/>
+            <w:tcBorders>
+              <w:top w:val="single" w:color="A6A6A6" w:sz="4"/>
+              <w:left w:val="single" w:color="A6A6A6" w:sz="4"/>
+              <w:bottom w:val="single" w:color="A6A6A6" w:sz="4"/>
+              <w:right w:val="single" w:color="A6A6A6" w:sz="4"/>
+            </w:tcBorders>
+            <w:shd w:fill="E7E6E6" w:color="auto" w:val="clear"/>
+            <w:tcMar>
+              <w:top w:type="dxa" w:w="50"/>
+              <w:left w:type="dxa" w:w="60"/>
+              <w:bottom w:type="dxa" w:w="50"/>
+              <w:right w:type="dxa" w:w="60"/>
+            </w:tcMar>
+          </w:tcPr>
+          <w:p>
+            <w:pPr>
+              <w:bidi w:val="false"/>
+              <w:spacing w:after="0" w:line="260"/>
+            </w:pPr>
+            <w:r>
+              <w:rPr>
+                <w:rFonts w:ascii="Arial" w:cs="Arial" w:eastAsia="Arial" w:hAnsi="Arial"/>
+                <w:b/>
+                <w:bCs/>
+                <w:sz w:val="19"/>
+                <w:szCs w:val="19"/>
+                <w:rtl w:val="false"/>
+              </w:rPr>
+              <w:t xml:space="preserve">Researcher note (remove from the respondent version)</w:t>
+            </w:r>
+          </w:p>
+        </w:tc>
+      </w:tr>
+      <w:tr>
+        <w:trPr>
+          <w:cantSplit/>
+          <w:tblHeader w:val="false"/>
+        </w:trPr>
+        <w:tc>
+          <w:tcPr>
+            <w:tcW w:type="dxa" w:w="9500"/>
+            <w:tcBorders>
+              <w:top w:val="single" w:color="A6A6A6" w:sz="4"/>
+              <w:left w:val="single" w:color="A6A6A6" w:sz="4"/>
+              <w:bottom w:val="single" w:color="A6A6A6" w:sz="4"/>
+              <w:right w:val="single" w:color="A6A6A6" w:sz="4"/>
+            </w:tcBorders>
+            <w:tcMar>
+              <w:top w:type="dxa" w:w="50"/>
+              <w:left w:type="dxa" w:w="60"/>
+              <w:bottom w:type="dxa" w:w="50"/>
+              <w:right w:type="dxa" w:w="60"/>
+            </w:tcMar>
+          </w:tcPr>
+          <w:p>
+            <w:pPr>
+              <w:bidi w:val="false"/>
+              <w:spacing w:after="0" w:line="260"/>
+            </w:pPr>
+            <w:r>
+              <w:rPr>
+                <w:rFonts w:ascii="Arial" w:cs="Arial" w:eastAsia="Arial" w:hAnsi="Arial"/>
+                <w:b w:val="false"/>
+                <w:bCs w:val="false"/>
+                <w:sz w:val="19"/>
+                <w:szCs w:val="19"/>
+                <w:rtl w:val="false"/>
+              </w:rPr>
+              <w:t xml:space="preserve">Source: researcher-made experimental scenario (no published instrument) | Scoring: V1a–V1c 7-point (1 = not at all likely … 7 = very likely); mean = intention to behave improperly; V1d = estimated percentage of peers. | Direct: all. | Reverse: none. | Randomised factors: team trust (high/low) × time pressure (high/low). | Status: researcher-made; only a manipulation check is needed.</w:t>
+            </w:r>
+          </w:p>
+        </w:tc>
+      </w:tr>
+    </w:tbl>
+    <w:p>
+      <w:pPr>
+        <w:spacing w:after="80"/>
+      </w:pPr>
+    </w:p>
     <w:p>
       <w:pPr>
         <w:bidi w:val="false"/>
@@ -34004,6 +36652,109 @@
         <w:t xml:space="preserve">Manipulation checks (1 = Not at all … 7 = Very): V2m1: How much pressure did you feel to accept the CFO's proposal?  V2m2: Who recommended accepting the proposal? ☐ Nobody  ☐ A peer senior  ☐ The partner</w:t>
       </w:r>
     </w:p>
+    <w:tbl>
+      <w:tblPr>
+        <w:bidiVisual w:val="false"/>
+        <w:tblW w:type="dxa" w:w="9500"/>
+        <w:tblBorders>
+          <w:top w:val="single" w:color="auto" w:sz="4"/>
+          <w:left w:val="single" w:color="auto" w:sz="4"/>
+          <w:bottom w:val="single" w:color="auto" w:sz="4"/>
+          <w:right w:val="single" w:color="auto" w:sz="4"/>
+          <w:insideH w:val="single" w:color="auto" w:sz="4"/>
+          <w:insideV w:val="single" w:color="auto" w:sz="4"/>
+        </w:tblBorders>
+      </w:tblPr>
+      <w:tblGrid>
+        <w:gridCol w:w="9500"/>
+      </w:tblGrid>
+      <w:tr>
+        <w:trPr>
+          <w:cantSplit/>
+          <w:tblHeader/>
+        </w:trPr>
+        <w:tc>
+          <w:tcPr>
+            <w:tcW w:type="dxa" w:w="9500"/>
+            <w:tcBorders>
+              <w:top w:val="single" w:color="A6A6A6" w:sz="4"/>
+              <w:left w:val="single" w:color="A6A6A6" w:sz="4"/>
+              <w:bottom w:val="single" w:color="A6A6A6" w:sz="4"/>
+              <w:right w:val="single" w:color="A6A6A6" w:sz="4"/>
+            </w:tcBorders>
+            <w:shd w:fill="E7E6E6" w:color="auto" w:val="clear"/>
+            <w:tcMar>
+              <w:top w:type="dxa" w:w="50"/>
+              <w:left w:type="dxa" w:w="60"/>
+              <w:bottom w:type="dxa" w:w="50"/>
+              <w:right w:type="dxa" w:w="60"/>
+            </w:tcMar>
+          </w:tcPr>
+          <w:p>
+            <w:pPr>
+              <w:bidi w:val="false"/>
+              <w:spacing w:after="0" w:line="260"/>
+            </w:pPr>
+            <w:r>
+              <w:rPr>
+                <w:rFonts w:ascii="Arial" w:cs="Arial" w:eastAsia="Arial" w:hAnsi="Arial"/>
+                <w:b/>
+                <w:bCs/>
+                <w:sz w:val="19"/>
+                <w:szCs w:val="19"/>
+                <w:rtl w:val="false"/>
+              </w:rPr>
+              <w:t xml:space="preserve">Researcher note (remove from the respondent version)</w:t>
+            </w:r>
+          </w:p>
+        </w:tc>
+      </w:tr>
+      <w:tr>
+        <w:trPr>
+          <w:cantSplit/>
+          <w:tblHeader w:val="false"/>
+        </w:trPr>
+        <w:tc>
+          <w:tcPr>
+            <w:tcW w:type="dxa" w:w="9500"/>
+            <w:tcBorders>
+              <w:top w:val="single" w:color="A6A6A6" w:sz="4"/>
+              <w:left w:val="single" w:color="A6A6A6" w:sz="4"/>
+              <w:bottom w:val="single" w:color="A6A6A6" w:sz="4"/>
+              <w:right w:val="single" w:color="A6A6A6" w:sz="4"/>
+            </w:tcBorders>
+            <w:tcMar>
+              <w:top w:type="dxa" w:w="50"/>
+              <w:left w:type="dxa" w:w="60"/>
+              <w:bottom w:type="dxa" w:w="50"/>
+              <w:right w:type="dxa" w:w="60"/>
+            </w:tcMar>
+          </w:tcPr>
+          <w:p>
+            <w:pPr>
+              <w:bidi w:val="false"/>
+              <w:spacing w:after="0" w:line="260"/>
+            </w:pPr>
+            <w:r>
+              <w:rPr>
+                <w:rFonts w:ascii="Arial" w:cs="Arial" w:eastAsia="Arial" w:hAnsi="Arial"/>
+                <w:b w:val="false"/>
+                <w:bCs w:val="false"/>
+                <w:sz w:val="19"/>
+                <w:szCs w:val="19"/>
+                <w:rtl w:val="false"/>
+              </w:rPr>
+              <w:t xml:space="preserve">Source: Lord, A. T., &amp; DeZoort, F. T. (2001). The impact of commitment and moral reasoning on auditors' responses to social influence pressure. Accounting, Organizations and Society, 26(3), 215–235. https://doi.org/10.1016/S0361-3682(00)00022-2 (Appendix A, scenario) | Scoring: dependent variable = net Equipment balance you would sign off (V2; million rials); lower amount = more resistance to pressure (signing 20,000 = accepting the CFO's proposal). Randomised factor: no pressure / conformity / obedience. | Direct/reverse: not applicable (a single numeric variable). | Status: scenario verbatim with amounts and years adjusted; the no-pressure condition is our assumption.</w:t>
+            </w:r>
+          </w:p>
+        </w:tc>
+      </w:tr>
+    </w:tbl>
+    <w:p>
+      <w:pPr>
+        <w:spacing w:after="80"/>
+      </w:pPr>
+    </w:p>
     <w:p>
       <w:r>
         <w:br w:type="page"/>
@@ -35591,6 +38342,109 @@
         </w:tc>
       </w:tr>
     </w:tbl>
+    <w:tbl>
+      <w:tblPr>
+        <w:bidiVisual w:val="false"/>
+        <w:tblW w:type="dxa" w:w="9500"/>
+        <w:tblBorders>
+          <w:top w:val="single" w:color="auto" w:sz="4"/>
+          <w:left w:val="single" w:color="auto" w:sz="4"/>
+          <w:bottom w:val="single" w:color="auto" w:sz="4"/>
+          <w:right w:val="single" w:color="auto" w:sz="4"/>
+          <w:insideH w:val="single" w:color="auto" w:sz="4"/>
+          <w:insideV w:val="single" w:color="auto" w:sz="4"/>
+        </w:tblBorders>
+      </w:tblPr>
+      <w:tblGrid>
+        <w:gridCol w:w="9500"/>
+      </w:tblGrid>
+      <w:tr>
+        <w:trPr>
+          <w:cantSplit/>
+          <w:tblHeader/>
+        </w:trPr>
+        <w:tc>
+          <w:tcPr>
+            <w:tcW w:type="dxa" w:w="9500"/>
+            <w:tcBorders>
+              <w:top w:val="single" w:color="A6A6A6" w:sz="4"/>
+              <w:left w:val="single" w:color="A6A6A6" w:sz="4"/>
+              <w:bottom w:val="single" w:color="A6A6A6" w:sz="4"/>
+              <w:right w:val="single" w:color="A6A6A6" w:sz="4"/>
+            </w:tcBorders>
+            <w:shd w:fill="E7E6E6" w:color="auto" w:val="clear"/>
+            <w:tcMar>
+              <w:top w:type="dxa" w:w="50"/>
+              <w:left w:type="dxa" w:w="60"/>
+              <w:bottom w:type="dxa" w:w="50"/>
+              <w:right w:type="dxa" w:w="60"/>
+            </w:tcMar>
+          </w:tcPr>
+          <w:p>
+            <w:pPr>
+              <w:bidi w:val="false"/>
+              <w:spacing w:after="0" w:line="260"/>
+            </w:pPr>
+            <w:r>
+              <w:rPr>
+                <w:rFonts w:ascii="Arial" w:cs="Arial" w:eastAsia="Arial" w:hAnsi="Arial"/>
+                <w:b/>
+                <w:bCs/>
+                <w:sz w:val="19"/>
+                <w:szCs w:val="19"/>
+                <w:rtl w:val="false"/>
+              </w:rPr>
+              <w:t xml:space="preserve">Researcher note (remove from the respondent version)</w:t>
+            </w:r>
+          </w:p>
+        </w:tc>
+      </w:tr>
+      <w:tr>
+        <w:trPr>
+          <w:cantSplit/>
+          <w:tblHeader w:val="false"/>
+        </w:trPr>
+        <w:tc>
+          <w:tcPr>
+            <w:tcW w:type="dxa" w:w="9500"/>
+            <w:tcBorders>
+              <w:top w:val="single" w:color="A6A6A6" w:sz="4"/>
+              <w:left w:val="single" w:color="A6A6A6" w:sz="4"/>
+              <w:bottom w:val="single" w:color="A6A6A6" w:sz="4"/>
+              <w:right w:val="single" w:color="A6A6A6" w:sz="4"/>
+            </w:tcBorders>
+            <w:tcMar>
+              <w:top w:type="dxa" w:w="50"/>
+              <w:left w:type="dxa" w:w="60"/>
+              <w:bottom w:type="dxa" w:w="50"/>
+              <w:right w:type="dxa" w:w="60"/>
+            </w:tcMar>
+          </w:tcPr>
+          <w:p>
+            <w:pPr>
+              <w:bidi w:val="false"/>
+              <w:spacing w:after="0" w:line="260"/>
+            </w:pPr>
+            <w:r>
+              <w:rPr>
+                <w:rFonts w:ascii="Arial" w:cs="Arial" w:eastAsia="Arial" w:hAnsi="Arial"/>
+                <w:b w:val="false"/>
+                <w:bCs w:val="false"/>
+                <w:sz w:val="19"/>
+                <w:szCs w:val="19"/>
+                <w:rtl w:val="false"/>
+              </w:rPr>
+              <w:t xml:space="preserve">Source: Aquino, K., &amp; Reed, A., II. (2002). The self-importance of moral identity. Journal of Personality and Social Psychology, 83(6), 1423–1440. https://doi.org/10.1037/0022-3514.83.6.1423 | Scoring: 5-point (1 = strongly disagree … 5 = strongly agree). Internalization = mean of MI1–MI5 (alpha in the paper = .78), symbolization = mean of MIS1–MIS5 (alpha = .69); higher = more important/visible moral identity. | Direct: MI1, MI2, MI5, MIS1–MIS5. | Reverse (recode 6 − response): MI3, MI4. | Status: the 10 final items verified against the paper (Table 3). Symbolization is not in the short version.</w:t>
+            </w:r>
+          </w:p>
+        </w:tc>
+      </w:tr>
+    </w:tbl>
+    <w:p>
+      <w:pPr>
+        <w:spacing w:after="80"/>
+      </w:pPr>
+    </w:p>
     <w:p>
       <w:pPr>
         <w:spacing w:after="80"/>
@@ -36927,6 +39781,109 @@
         </w:tc>
       </w:tr>
     </w:tbl>
+    <w:tbl>
+      <w:tblPr>
+        <w:bidiVisual w:val="false"/>
+        <w:tblW w:type="dxa" w:w="9500"/>
+        <w:tblBorders>
+          <w:top w:val="single" w:color="auto" w:sz="4"/>
+          <w:left w:val="single" w:color="auto" w:sz="4"/>
+          <w:bottom w:val="single" w:color="auto" w:sz="4"/>
+          <w:right w:val="single" w:color="auto" w:sz="4"/>
+          <w:insideH w:val="single" w:color="auto" w:sz="4"/>
+          <w:insideV w:val="single" w:color="auto" w:sz="4"/>
+        </w:tblBorders>
+      </w:tblPr>
+      <w:tblGrid>
+        <w:gridCol w:w="9500"/>
+      </w:tblGrid>
+      <w:tr>
+        <w:trPr>
+          <w:cantSplit/>
+          <w:tblHeader/>
+        </w:trPr>
+        <w:tc>
+          <w:tcPr>
+            <w:tcW w:type="dxa" w:w="9500"/>
+            <w:tcBorders>
+              <w:top w:val="single" w:color="A6A6A6" w:sz="4"/>
+              <w:left w:val="single" w:color="A6A6A6" w:sz="4"/>
+              <w:bottom w:val="single" w:color="A6A6A6" w:sz="4"/>
+              <w:right w:val="single" w:color="A6A6A6" w:sz="4"/>
+            </w:tcBorders>
+            <w:shd w:fill="E7E6E6" w:color="auto" w:val="clear"/>
+            <w:tcMar>
+              <w:top w:type="dxa" w:w="50"/>
+              <w:left w:type="dxa" w:w="60"/>
+              <w:bottom w:type="dxa" w:w="50"/>
+              <w:right w:type="dxa" w:w="60"/>
+            </w:tcMar>
+          </w:tcPr>
+          <w:p>
+            <w:pPr>
+              <w:bidi w:val="false"/>
+              <w:spacing w:after="0" w:line="260"/>
+            </w:pPr>
+            <w:r>
+              <w:rPr>
+                <w:rFonts w:ascii="Arial" w:cs="Arial" w:eastAsia="Arial" w:hAnsi="Arial"/>
+                <w:b/>
+                <w:bCs/>
+                <w:sz w:val="19"/>
+                <w:szCs w:val="19"/>
+                <w:rtl w:val="false"/>
+              </w:rPr>
+              <w:t xml:space="preserve">Researcher note (remove from the respondent version)</w:t>
+            </w:r>
+          </w:p>
+        </w:tc>
+      </w:tr>
+      <w:tr>
+        <w:trPr>
+          <w:cantSplit/>
+          <w:tblHeader w:val="false"/>
+        </w:trPr>
+        <w:tc>
+          <w:tcPr>
+            <w:tcW w:type="dxa" w:w="9500"/>
+            <w:tcBorders>
+              <w:top w:val="single" w:color="A6A6A6" w:sz="4"/>
+              <w:left w:val="single" w:color="A6A6A6" w:sz="4"/>
+              <w:bottom w:val="single" w:color="A6A6A6" w:sz="4"/>
+              <w:right w:val="single" w:color="A6A6A6" w:sz="4"/>
+            </w:tcBorders>
+            <w:tcMar>
+              <w:top w:type="dxa" w:w="50"/>
+              <w:left w:type="dxa" w:w="60"/>
+              <w:bottom w:type="dxa" w:w="50"/>
+              <w:right w:type="dxa" w:w="60"/>
+            </w:tcMar>
+          </w:tcPr>
+          <w:p>
+            <w:pPr>
+              <w:bidi w:val="false"/>
+              <w:spacing w:after="0" w:line="260"/>
+            </w:pPr>
+            <w:r>
+              <w:rPr>
+                <w:rFonts w:ascii="Arial" w:cs="Arial" w:eastAsia="Arial" w:hAnsi="Arial"/>
+                <w:b w:val="false"/>
+                <w:bCs w:val="false"/>
+                <w:sz w:val="19"/>
+                <w:szCs w:val="19"/>
+                <w:rtl w:val="false"/>
+              </w:rPr>
+              <w:t xml:space="preserve">Source: researcher-made marker items (no published instrument) | Scoring: 7-point; mean; used only to assess common-method variance. | All items direct; no reverse items. | Status: researcher-made and deliberately unrelated to the topic.</w:t>
+            </w:r>
+          </w:p>
+        </w:tc>
+      </w:tr>
+    </w:tbl>
+    <w:p>
+      <w:pPr>
+        <w:spacing w:after="80"/>
+      </w:pPr>
+    </w:p>
     <w:p>
       <w:pPr>
         <w:spacing w:after="80"/>
@@ -37730,6 +40687,182 @@
                 <w:szCs w:val="19"/>
                 <w:rtl w:val="false"/>
               </w:rPr>
+              <w:t xml:space="preserve">Inattention to collective results (Lencioni)</w:t>
+            </w:r>
+          </w:p>
+        </w:tc>
+        <w:tc>
+          <w:tcPr>
+            <w:tcW w:type="dxa" w:w="2200"/>
+            <w:tcBorders>
+              <w:top w:val="single" w:color="A6A6A6" w:sz="4"/>
+              <w:left w:val="single" w:color="A6A6A6" w:sz="4"/>
+              <w:bottom w:val="single" w:color="A6A6A6" w:sz="4"/>
+              <w:right w:val="single" w:color="A6A6A6" w:sz="4"/>
+            </w:tcBorders>
+            <w:tcMar>
+              <w:top w:type="dxa" w:w="50"/>
+              <w:left w:type="dxa" w:w="60"/>
+              <w:bottom w:type="dxa" w:w="50"/>
+              <w:right w:type="dxa" w:w="60"/>
+            </w:tcMar>
+          </w:tcPr>
+          <w:p>
+            <w:pPr>
+              <w:bidi w:val="false"/>
+              <w:spacing w:after="0" w:line="260"/>
+            </w:pPr>
+            <w:r>
+              <w:rPr>
+                <w:rFonts w:ascii="Arial" w:cs="Arial" w:eastAsia="Arial" w:hAnsi="Arial"/>
+                <w:b w:val="false"/>
+                <w:bCs w:val="false"/>
+                <w:sz w:val="19"/>
+                <w:szCs w:val="19"/>
+                <w:rtl w:val="false"/>
+              </w:rPr>
+              <w:t xml:space="preserve">Not determined</w:t>
+            </w:r>
+          </w:p>
+        </w:tc>
+        <w:tc>
+          <w:tcPr>
+            <w:tcW w:type="dxa" w:w="800"/>
+            <w:tcBorders>
+              <w:top w:val="single" w:color="A6A6A6" w:sz="4"/>
+              <w:left w:val="single" w:color="A6A6A6" w:sz="4"/>
+              <w:bottom w:val="single" w:color="A6A6A6" w:sz="4"/>
+              <w:right w:val="single" w:color="A6A6A6" w:sz="4"/>
+            </w:tcBorders>
+            <w:tcMar>
+              <w:top w:type="dxa" w:w="50"/>
+              <w:left w:type="dxa" w:w="60"/>
+              <w:bottom w:type="dxa" w:w="50"/>
+              <w:right w:type="dxa" w:w="60"/>
+            </w:tcMar>
+          </w:tcPr>
+          <w:p>
+            <w:pPr>
+              <w:bidi w:val="false"/>
+              <w:spacing w:after="0" w:line="260"/>
+            </w:pPr>
+            <w:r>
+              <w:rPr>
+                <w:rFonts w:ascii="Arial" w:cs="Arial" w:eastAsia="Arial" w:hAnsi="Arial"/>
+                <w:b w:val="false"/>
+                <w:bCs w:val="false"/>
+                <w:sz w:val="19"/>
+                <w:szCs w:val="19"/>
+                <w:rtl w:val="false"/>
+              </w:rPr>
+              <w:t xml:space="preserve">3 slots</w:t>
+            </w:r>
+          </w:p>
+        </w:tc>
+        <w:tc>
+          <w:tcPr>
+            <w:tcW w:type="dxa" w:w="3000"/>
+            <w:tcBorders>
+              <w:top w:val="single" w:color="A6A6A6" w:sz="4"/>
+              <w:left w:val="single" w:color="A6A6A6" w:sz="4"/>
+              <w:bottom w:val="single" w:color="A6A6A6" w:sz="4"/>
+              <w:right w:val="single" w:color="A6A6A6" w:sz="4"/>
+            </w:tcBorders>
+            <w:tcMar>
+              <w:top w:type="dxa" w:w="50"/>
+              <w:left w:type="dxa" w:w="60"/>
+              <w:bottom w:type="dxa" w:w="50"/>
+              <w:right w:type="dxa" w:w="60"/>
+            </w:tcMar>
+          </w:tcPr>
+          <w:p>
+            <w:pPr>
+              <w:bidi w:val="false"/>
+              <w:spacing w:after="0" w:line="260"/>
+            </w:pPr>
+            <w:r>
+              <w:rPr>
+                <w:rFonts w:ascii="Arial" w:cs="Arial" w:eastAsia="Arial" w:hAnsi="Arial"/>
+                <w:b w:val="false"/>
+                <w:bCs w:val="false"/>
+                <w:sz w:val="19"/>
+                <w:szCs w:val="19"/>
+                <w:rtl w:val="false"/>
+              </w:rPr>
+              <w:t xml:space="preserve">No verifiable instrument found; slots left empty</w:t>
+            </w:r>
+          </w:p>
+        </w:tc>
+        <w:tc>
+          <w:tcPr>
+            <w:tcW w:type="dxa" w:w="2000"/>
+            <w:tcBorders>
+              <w:top w:val="single" w:color="A6A6A6" w:sz="4"/>
+              <w:left w:val="single" w:color="A6A6A6" w:sz="4"/>
+              <w:bottom w:val="single" w:color="A6A6A6" w:sz="4"/>
+              <w:right w:val="single" w:color="A6A6A6" w:sz="4"/>
+            </w:tcBorders>
+            <w:tcMar>
+              <w:top w:type="dxa" w:w="50"/>
+              <w:left w:type="dxa" w:w="60"/>
+              <w:bottom w:type="dxa" w:w="50"/>
+              <w:right w:type="dxa" w:w="60"/>
+            </w:tcMar>
+          </w:tcPr>
+          <w:p>
+            <w:pPr>
+              <w:bidi w:val="false"/>
+              <w:spacing w:after="0" w:line="260"/>
+            </w:pPr>
+            <w:r>
+              <w:rPr>
+                <w:rFonts w:ascii="Arial" w:cs="Arial" w:eastAsia="Arial" w:hAnsi="Arial"/>
+                <w:b w:val="false"/>
+                <w:bCs w:val="false"/>
+                <w:sz w:val="19"/>
+                <w:szCs w:val="19"/>
+                <w:rtl w:val="false"/>
+              </w:rPr>
+              <w:t xml:space="preserve">Needs checking</w:t>
+            </w:r>
+          </w:p>
+        </w:tc>
+      </w:tr>
+      <w:tr>
+        <w:trPr>
+          <w:cantSplit/>
+          <w:tblHeader w:val="false"/>
+        </w:trPr>
+        <w:tc>
+          <w:tcPr>
+            <w:tcW w:type="dxa" w:w="1500"/>
+            <w:tcBorders>
+              <w:top w:val="single" w:color="A6A6A6" w:sz="4"/>
+              <w:left w:val="single" w:color="A6A6A6" w:sz="4"/>
+              <w:bottom w:val="single" w:color="A6A6A6" w:sz="4"/>
+              <w:right w:val="single" w:color="A6A6A6" w:sz="4"/>
+            </w:tcBorders>
+            <w:tcMar>
+              <w:top w:type="dxa" w:w="50"/>
+              <w:left w:type="dxa" w:w="60"/>
+              <w:bottom w:type="dxa" w:w="50"/>
+              <w:right w:type="dxa" w:w="60"/>
+            </w:tcMar>
+          </w:tcPr>
+          <w:p>
+            <w:pPr>
+              <w:bidi w:val="false"/>
+              <w:spacing w:after="0" w:line="260"/>
+            </w:pPr>
+            <w:r>
+              <w:rPr>
+                <w:rFonts w:ascii="Arial" w:cs="Arial" w:eastAsia="Arial" w:hAnsi="Arial"/>
+                <w:b w:val="false"/>
+                <w:bCs w:val="false"/>
+                <w:sz w:val="19"/>
+                <w:szCs w:val="19"/>
+                <w:rtl w:val="false"/>
+              </w:rPr>
               <w:t xml:space="preserve">DAB (self and peers)</w:t>
             </w:r>
           </w:p>
@@ -42634,6 +45767,216 @@
                 <w:szCs w:val="19"/>
                 <w:rtl w:val="false"/>
               </w:rPr>
+              <w:t xml:space="preserve">Inattention to collective results</w:t>
+            </w:r>
+          </w:p>
+        </w:tc>
+        <w:tc>
+          <w:tcPr>
+            <w:tcW w:type="dxa" w:w="1700"/>
+            <w:tcBorders>
+              <w:top w:val="single" w:color="A6A6A6" w:sz="4"/>
+              <w:left w:val="single" w:color="A6A6A6" w:sz="4"/>
+              <w:bottom w:val="single" w:color="A6A6A6" w:sz="4"/>
+              <w:right w:val="single" w:color="A6A6A6" w:sz="4"/>
+            </w:tcBorders>
+            <w:tcMar>
+              <w:top w:type="dxa" w:w="50"/>
+              <w:left w:type="dxa" w:w="60"/>
+              <w:bottom w:type="dxa" w:w="50"/>
+              <w:right w:type="dxa" w:w="60"/>
+            </w:tcMar>
+          </w:tcPr>
+          <w:p>
+            <w:pPr>
+              <w:bidi w:val="false"/>
+              <w:spacing w:after="0" w:line="260"/>
+            </w:pPr>
+            <w:r>
+              <w:rPr>
+                <w:rFonts w:ascii="Arial" w:cs="Arial" w:eastAsia="Arial" w:hAnsi="Arial"/>
+                <w:b w:val="false"/>
+                <w:bCs w:val="false"/>
+                <w:sz w:val="19"/>
+                <w:szCs w:val="19"/>
+                <w:rtl w:val="false"/>
+              </w:rPr>
+              <w:t xml:space="preserve">NR1–NR3</w:t>
+            </w:r>
+          </w:p>
+        </w:tc>
+        <w:tc>
+          <w:tcPr>
+            <w:tcW w:type="dxa" w:w="700"/>
+            <w:tcBorders>
+              <w:top w:val="single" w:color="A6A6A6" w:sz="4"/>
+              <w:left w:val="single" w:color="A6A6A6" w:sz="4"/>
+              <w:bottom w:val="single" w:color="A6A6A6" w:sz="4"/>
+              <w:right w:val="single" w:color="A6A6A6" w:sz="4"/>
+            </w:tcBorders>
+            <w:tcMar>
+              <w:top w:type="dxa" w:w="50"/>
+              <w:left w:type="dxa" w:w="60"/>
+              <w:bottom w:type="dxa" w:w="50"/>
+              <w:right w:type="dxa" w:w="60"/>
+            </w:tcMar>
+          </w:tcPr>
+          <w:p>
+            <w:pPr>
+              <w:bidi w:val="false"/>
+              <w:spacing w:after="0" w:line="260"/>
+            </w:pPr>
+            <w:r>
+              <w:rPr>
+                <w:rFonts w:ascii="Arial" w:cs="Arial" w:eastAsia="Arial" w:hAnsi="Arial"/>
+                <w:b w:val="false"/>
+                <w:bCs w:val="false"/>
+                <w:sz w:val="19"/>
+                <w:szCs w:val="19"/>
+                <w:rtl w:val="false"/>
+              </w:rPr>
+              <w:t xml:space="preserve">3 slots</w:t>
+            </w:r>
+          </w:p>
+        </w:tc>
+        <w:tc>
+          <w:tcPr>
+            <w:tcW w:type="dxa" w:w="1700"/>
+            <w:tcBorders>
+              <w:top w:val="single" w:color="A6A6A6" w:sz="4"/>
+              <w:left w:val="single" w:color="A6A6A6" w:sz="4"/>
+              <w:bottom w:val="single" w:color="A6A6A6" w:sz="4"/>
+              <w:right w:val="single" w:color="A6A6A6" w:sz="4"/>
+            </w:tcBorders>
+            <w:tcMar>
+              <w:top w:type="dxa" w:w="50"/>
+              <w:left w:type="dxa" w:w="60"/>
+              <w:bottom w:type="dxa" w:w="50"/>
+              <w:right w:type="dxa" w:w="60"/>
+            </w:tcMar>
+          </w:tcPr>
+          <w:p>
+            <w:pPr>
+              <w:bidi w:val="false"/>
+              <w:spacing w:after="0" w:line="260"/>
+            </w:pPr>
+            <w:r>
+              <w:rPr>
+                <w:rFonts w:ascii="Arial" w:cs="Arial" w:eastAsia="Arial" w:hAnsi="Arial"/>
+                <w:b w:val="false"/>
+                <w:bCs w:val="false"/>
+                <w:sz w:val="19"/>
+                <w:szCs w:val="19"/>
+                <w:rtl w:val="false"/>
+              </w:rPr>
+              <w:t xml:space="preserve">—</w:t>
+            </w:r>
+          </w:p>
+        </w:tc>
+        <w:tc>
+          <w:tcPr>
+            <w:tcW w:type="dxa" w:w="1700"/>
+            <w:tcBorders>
+              <w:top w:val="single" w:color="A6A6A6" w:sz="4"/>
+              <w:left w:val="single" w:color="A6A6A6" w:sz="4"/>
+              <w:bottom w:val="single" w:color="A6A6A6" w:sz="4"/>
+              <w:right w:val="single" w:color="A6A6A6" w:sz="4"/>
+            </w:tcBorders>
+            <w:tcMar>
+              <w:top w:type="dxa" w:w="50"/>
+              <w:left w:type="dxa" w:w="60"/>
+              <w:bottom w:type="dxa" w:w="50"/>
+              <w:right w:type="dxa" w:w="60"/>
+            </w:tcMar>
+          </w:tcPr>
+          <w:p>
+            <w:pPr>
+              <w:bidi w:val="false"/>
+              <w:spacing w:after="0" w:line="260"/>
+            </w:pPr>
+            <w:r>
+              <w:rPr>
+                <w:rFonts w:ascii="Arial" w:cs="Arial" w:eastAsia="Arial" w:hAnsi="Arial"/>
+                <w:b w:val="false"/>
+                <w:bCs w:val="false"/>
+                <w:sz w:val="19"/>
+                <w:szCs w:val="19"/>
+                <w:rtl w:val="false"/>
+              </w:rPr>
+              <w:t xml:space="preserve">Team (leave-one-out)</w:t>
+            </w:r>
+          </w:p>
+        </w:tc>
+        <w:tc>
+          <w:tcPr>
+            <w:tcW w:type="dxa" w:w="2000"/>
+            <w:tcBorders>
+              <w:top w:val="single" w:color="A6A6A6" w:sz="4"/>
+              <w:left w:val="single" w:color="A6A6A6" w:sz="4"/>
+              <w:bottom w:val="single" w:color="A6A6A6" w:sz="4"/>
+              <w:right w:val="single" w:color="A6A6A6" w:sz="4"/>
+            </w:tcBorders>
+            <w:tcMar>
+              <w:top w:type="dxa" w:w="50"/>
+              <w:left w:type="dxa" w:w="60"/>
+              <w:bottom w:type="dxa" w:w="50"/>
+              <w:right w:type="dxa" w:w="60"/>
+            </w:tcMar>
+          </w:tcPr>
+          <w:p>
+            <w:pPr>
+              <w:bidi w:val="false"/>
+              <w:spacing w:after="0" w:line="260"/>
+            </w:pPr>
+            <w:r>
+              <w:rPr>
+                <w:rFonts w:ascii="Arial" w:cs="Arial" w:eastAsia="Arial" w:hAnsi="Arial"/>
+                <w:b w:val="false"/>
+                <w:bCs w:val="false"/>
+                <w:sz w:val="19"/>
+                <w:szCs w:val="19"/>
+                <w:rtl w:val="false"/>
+              </w:rPr>
+              <w:t xml:space="preserve">Not determined</w:t>
+            </w:r>
+          </w:p>
+        </w:tc>
+      </w:tr>
+      <w:tr>
+        <w:trPr>
+          <w:cantSplit/>
+          <w:tblHeader w:val="false"/>
+        </w:trPr>
+        <w:tc>
+          <w:tcPr>
+            <w:tcW w:type="dxa" w:w="1700"/>
+            <w:tcBorders>
+              <w:top w:val="single" w:color="A6A6A6" w:sz="4"/>
+              <w:left w:val="single" w:color="A6A6A6" w:sz="4"/>
+              <w:bottom w:val="single" w:color="A6A6A6" w:sz="4"/>
+              <w:right w:val="single" w:color="A6A6A6" w:sz="4"/>
+            </w:tcBorders>
+            <w:tcMar>
+              <w:top w:type="dxa" w:w="50"/>
+              <w:left w:type="dxa" w:w="60"/>
+              <w:bottom w:type="dxa" w:w="50"/>
+              <w:right w:type="dxa" w:w="60"/>
+            </w:tcMar>
+          </w:tcPr>
+          <w:p>
+            <w:pPr>
+              <w:bidi w:val="false"/>
+              <w:spacing w:after="0" w:line="260"/>
+            </w:pPr>
+            <w:r>
+              <w:rPr>
+                <w:rFonts w:ascii="Arial" w:cs="Arial" w:eastAsia="Arial" w:hAnsi="Arial"/>
+                <w:b w:val="false"/>
+                <w:bCs w:val="false"/>
+                <w:sz w:val="19"/>
+                <w:szCs w:val="19"/>
+                <w:rtl w:val="false"/>
+              </w:rPr>
               <w:t xml:space="preserve">Work-related burnout</w:t>
             </w:r>
           </w:p>
@@ -44797,7 +48140,7 @@
                 <w:szCs w:val="19"/>
                 <w:rtl w:val="false"/>
               </w:rPr>
-              <w:t xml:space="preserve">This short version (about 117 items, 18–21 minutes) is for the main data collection. Compared with the full version these are removed: continuance commitment, occupation and organization (12 items); moral-identity symbolization (5); client-related burnout (6); intent to remain (3); leader coaching (3); goal similarity (3); conflict resolution (3); liking (4); team learning (7); team performance (5); psychological capital PCQ-24 (24, once licensed). Appendix tables are filtered for the removed rows; the commitment rows (which still mention continuance) and the Lencioni coverage table are identical to the full version.</w:t>
+              <w:t xml:space="preserve">This short version (about 117 items, 18–21 minutes) is for the main data collection. Compared with the full version these are removed: continuance commitment, occupation and organization (12 items); moral-identity symbolization (5); client-related burnout (6); intention to leave (6); the voice/loyalty/neglect/citizenship/obligation/satisfaction slots; leader coaching (3); goal similarity (3); conflict resolution (3); liking (4); team learning (7); team performance (5); psychological capital PCQ-24 (24, once licensed). Appendix tables are filtered for the removed rows; the commitment rows (which still mention continuance) and the Lencioni coverage table are identical to the full version.</w:t>
             </w:r>
           </w:p>
         </w:tc>

</xml_diff>

<commit_message>
Remove licensed PsyCap placeholder, state published-items-only principle, add candidate sources for collective-results slot
Co-Authored-By: Claude Sonnet 5.5 <noreply@anthropic.com>
Claude-Session: https://claude.ai/code/session_0117HPg2G3CcnRnb2QXnVBy9
</commit_message>
<xml_diff>
--- a/questionnaire-v3-short-en.docx
+++ b/questionnaire-v3-short-en.docx
@@ -130,7 +130,7 @@
                 <w:szCs w:val="19"/>
                 <w:rtl w:val="false"/>
               </w:rPr>
-              <w:t xml:space="preserve">Part 1 is the respondent-facing text. Part 2 is the researcher appendix and must not be shown to respondents. The commitment items (AC, OC) and the DAB behaviours (DB1–DB5) are reproduced verbatim from the table and appendix you supplied. All other instruments come from my own knowledge and have not yet been matched to the original papers; Table 2-1 gives the status of each instrument.</w:t>
+              <w:t xml:space="preserve">Part 1 is the respondent text and Part 2 is the researcher appendix; the grey notes under each instrument (source, scoring, direct and reverse items, status) and the Part 2 appendix must not be shown to respondents. Most instruments are verbatim from published papers, and the status of each is given in the note beneath it. Only Situation 1, the marker items and items DB6, DB7 and PN6 are researcher-made. Empty slots are marked as needing verification.</w:t>
             </w:r>
           </w:p>
         </w:tc>
@@ -13222,7 +13222,7 @@
                 <w:szCs w:val="19"/>
                 <w:rtl w:val="false"/>
               </w:rPr>
-              <w:t xml:space="preserve">No verifiable published instrument was found for this dimension. The slots are deliberately left empty; no researcher-made or ill-fitting substitute has been put in them. Considered and set aside: the Group Orientation Scale (an individual trait) and goal interdependence (item text not found).</w:t>
+              <w:t xml:space="preserve">No verifiable published instrument was found for this dimension. The slots are deliberately left empty; no researcher-made or ill-fitting substitute has been put in them. Candidates searched whose item text was not available to me: the Effort subscale of Hoegl and Gemuenden (2001, Organization Science 12(4), 435–449, DOI 10.1287/orsc.12.4.435.10635; the items should be in the paper appendix) and the cooperative-goals scale of Alper, Tjosvold and Law (2000, Personnel Psychology). Considered and set aside: the Group Orientation Scale (an individual trait). Bring the appendix items of Hoegl and Gemuenden so the slots can be filled.</w:t>
             </w:r>
           </w:p>
         </w:tc>
@@ -40079,6 +40079,109 @@
         <w:t xml:space="preserve">Part 2: Researcher appendix (not shown to respondents)</w:t>
       </w:r>
     </w:p>
+    <w:tbl>
+      <w:tblPr>
+        <w:bidiVisual w:val="false"/>
+        <w:tblW w:type="dxa" w:w="9500"/>
+        <w:tblBorders>
+          <w:top w:val="single" w:color="auto" w:sz="4"/>
+          <w:left w:val="single" w:color="auto" w:sz="4"/>
+          <w:bottom w:val="single" w:color="auto" w:sz="4"/>
+          <w:right w:val="single" w:color="auto" w:sz="4"/>
+          <w:insideH w:val="single" w:color="auto" w:sz="4"/>
+          <w:insideV w:val="single" w:color="auto" w:sz="4"/>
+        </w:tblBorders>
+      </w:tblPr>
+      <w:tblGrid>
+        <w:gridCol w:w="9500"/>
+      </w:tblGrid>
+      <w:tr>
+        <w:trPr>
+          <w:cantSplit/>
+          <w:tblHeader/>
+        </w:trPr>
+        <w:tc>
+          <w:tcPr>
+            <w:tcW w:type="dxa" w:w="9500"/>
+            <w:tcBorders>
+              <w:top w:val="single" w:color="A6A6A6" w:sz="4"/>
+              <w:left w:val="single" w:color="A6A6A6" w:sz="4"/>
+              <w:bottom w:val="single" w:color="A6A6A6" w:sz="4"/>
+              <w:right w:val="single" w:color="A6A6A6" w:sz="4"/>
+            </w:tcBorders>
+            <w:shd w:fill="E2EFDA" w:color="auto" w:val="clear"/>
+            <w:tcMar>
+              <w:top w:type="dxa" w:w="50"/>
+              <w:left w:type="dxa" w:w="60"/>
+              <w:bottom w:type="dxa" w:w="50"/>
+              <w:right w:type="dxa" w:w="60"/>
+            </w:tcMar>
+          </w:tcPr>
+          <w:p>
+            <w:pPr>
+              <w:bidi w:val="false"/>
+              <w:spacing w:after="0" w:line="260"/>
+            </w:pPr>
+            <w:r>
+              <w:rPr>
+                <w:rFonts w:ascii="Arial" w:cs="Arial" w:eastAsia="Arial" w:hAnsi="Arial"/>
+                <w:b/>
+                <w:bCs/>
+                <w:sz w:val="19"/>
+                <w:szCs w:val="19"/>
+                <w:rtl w:val="false"/>
+              </w:rPr>
+              <w:t xml:space="preserve">Principle for choosing instruments</w:t>
+            </w:r>
+          </w:p>
+        </w:tc>
+      </w:tr>
+      <w:tr>
+        <w:trPr>
+          <w:cantSplit/>
+          <w:tblHeader w:val="false"/>
+        </w:trPr>
+        <w:tc>
+          <w:tcPr>
+            <w:tcW w:type="dxa" w:w="9500"/>
+            <w:tcBorders>
+              <w:top w:val="single" w:color="A6A6A6" w:sz="4"/>
+              <w:left w:val="single" w:color="A6A6A6" w:sz="4"/>
+              <w:bottom w:val="single" w:color="A6A6A6" w:sz="4"/>
+              <w:right w:val="single" w:color="A6A6A6" w:sz="4"/>
+            </w:tcBorders>
+            <w:tcMar>
+              <w:top w:type="dxa" w:w="50"/>
+              <w:left w:type="dxa" w:w="60"/>
+              <w:bottom w:type="dxa" w:w="50"/>
+              <w:right w:type="dxa" w:w="60"/>
+            </w:tcMar>
+          </w:tcPr>
+          <w:p>
+            <w:pPr>
+              <w:bidi w:val="false"/>
+              <w:spacing w:after="0" w:line="260"/>
+            </w:pPr>
+            <w:r>
+              <w:rPr>
+                <w:rFonts w:ascii="Arial" w:cs="Arial" w:eastAsia="Arial" w:hAnsi="Arial"/>
+                <w:b w:val="false"/>
+                <w:bCs w:val="false"/>
+                <w:sz w:val="19"/>
+                <w:szCs w:val="19"/>
+                <w:rtl w:val="false"/>
+              </w:rPr>
+              <w:t xml:space="preserve">Only items whose text is printed in a published paper are used, with a full citation of that paper; no licence or separate permission has been requested for any construct. For this reason commercial or licensed instruments (PCQ, MBI, the Lencioni assessment) were set aside and psychological capital is currently not in the questionnaire. An honest note: printing an item in a paper does not release the copyright; common academic practice is to cite the paper in full, but if a journal asks for permission, that decision rests with the authors.</w:t>
+            </w:r>
+          </w:p>
+        </w:tc>
+      </w:tr>
+    </w:tbl>
+    <w:p>
+      <w:pPr>
+        <w:spacing w:after="80"/>
+      </w:pPr>
+    </w:p>
     <w:p>
       <w:pPr>
         <w:pStyle w:val="Heading2"/>
@@ -40471,7 +40574,7 @@
                 <w:szCs w:val="19"/>
                 <w:rtl w:val="false"/>
               </w:rPr>
-              <w:t xml:space="preserve">Notify/permission; report the adaptation from nursing to auditing</w:t>
+              <w:t xml:space="preserve">Report the adaptation from nursing to auditing</w:t>
             </w:r>
           </w:p>
         </w:tc>
@@ -40647,7 +40750,7 @@
                 <w:szCs w:val="19"/>
                 <w:rtl w:val="false"/>
               </w:rPr>
-              <w:t xml:space="preserve">Notify/permission</w:t>
+              <w:t xml:space="preserve">Full citation of the paper</w:t>
             </w:r>
           </w:p>
         </w:tc>
@@ -41175,7 +41278,7 @@
                 <w:szCs w:val="19"/>
                 <w:rtl w:val="false"/>
               </w:rPr>
-              <w:t xml:space="preserve">Match wording to paper; permission</w:t>
+              <w:t xml:space="preserve">Match wording to the paper</w:t>
             </w:r>
           </w:p>
         </w:tc>
@@ -42231,7 +42334,7 @@
                 <w:szCs w:val="19"/>
                 <w:rtl w:val="false"/>
               </w:rPr>
-              <w:t xml:space="preserve">Check terms of use</w:t>
+              <w:t xml:space="preserve">Full citation of the paper</w:t>
             </w:r>
           </w:p>
         </w:tc>
@@ -42407,7 +42510,7 @@
                 <w:szCs w:val="19"/>
                 <w:rtl w:val="false"/>
               </w:rPr>
-              <w:t xml:space="preserve">Permission/notify the authors</w:t>
+              <w:t xml:space="preserve">Full citation of the paper</w:t>
             </w:r>
           </w:p>
         </w:tc>
@@ -48140,7 +48243,7 @@
                 <w:szCs w:val="19"/>
                 <w:rtl w:val="false"/>
               </w:rPr>
-              <w:t xml:space="preserve">This short version (about 117 items, 18–21 minutes) is for the main data collection. Compared with the full version these are removed: continuance commitment, occupation and organization (12 items); moral-identity symbolization (5); client-related burnout (6); intention to leave (6); the voice/loyalty/neglect/citizenship/obligation/satisfaction slots; leader coaching (3); goal similarity (3); conflict resolution (3); liking (4); team learning (7); team performance (5); psychological capital PCQ-24 (24, once licensed). Appendix tables are filtered for the removed rows; the commitment rows (which still mention continuance) and the Lencioni coverage table are identical to the full version.</w:t>
+              <w:t xml:space="preserve">This short version (about 117 items, 18–21 minutes) is for the main data collection. Compared with the full version these are removed: continuance commitment, occupation and organization (12 items); moral-identity symbolization (5); client-related burnout (6); intention to leave (6); the voice/loyalty/neglect/citizenship/obligation/satisfaction slots; leader coaching (3); goal similarity (3); conflict resolution (3); liking (4); team learning (7); team performance (5). Appendix tables are filtered for the removed rows; the commitment rows (which still mention continuance) and the Lencioni coverage table are identical to the full version.</w:t>
             </w:r>
           </w:p>
         </w:tc>

</xml_diff>